<commit_message>
docs: drop the horizontal rules pandoc drew between sections
The authored source separates its parts with `---`. pandoc turns each one
into `<w:pict><v:rect o:hr="t">`, a Word horizontal rule, and ten of them
were printing across the submitted report. One sat at the top of an
otherwise empty half page, which is what made it visible.

`drop_horizontal_rules` filters thematic breaks out during assembly, so
the source keeps its separators and the report does not. It skips lines
inside fenced code blocks, where a row of dashes is content.

Rendered check: 89 pages, zero `w:pict`, no page below 45 percent of the
median character count except the cover and the four figure pages.

Co-Authored-By: Claude Opus 5 <noreply@anthropic.com>
Claude-Session: https://claude.ai/code/session_01SzJTThV64VAErHN4L42mg9
</commit_message>
<xml_diff>
--- a/docs/project/Nhom9_TruyVetToanVenVanBan.docx
+++ b/docs/project/Nhom9_TruyVetToanVenVanBan.docx
@@ -4412,13 +4412,6 @@
         <w:t xml:space="preserve">Ứng dụng thủy vân bán dễ vỡ trong phát hiện và định vị sửa đổi (Tamper Detection &amp; Localization).</w:t>
       </w:r>
     </w:p>
-    <w:p>
-      <w:r>
-        <w:pict>
-          <v:rect style="width:0;height:1.5pt" o:hralign="center" o:hrstd="t" o:hr="t"/>
-        </w:pict>
-      </w:r>
-    </w:p>
     <w:bookmarkStart w:id="27" w:name="X309070127ac9b595d19338b9992d494ea1f4902"/>
     <w:p>
       <w:pPr>
@@ -5766,13 +5759,6 @@
       </w:r>
       <w:r>
         <w:t xml:space="preserve">Thuật toán chứng minh tính khả thi của việc nhúng định danh 128-bit với độ trung thực tín hiệu cao trên mảng điểm ảnh, nhưng còn hạn chế trước các biến đổi phi tuyến và nén lossy nặng. Một hướng nghiên cứu tiếp theo có thể xem xét là Deep Watermarking (như kiến trúc HiDDeN, StegaStamp) kết hợp mạng nơ-ron tích chập tự mã hóa (Autoencoder) bên cạnh việc tối ưu hóa bước lượng tử hóa thích nghi theo đặc trưng cục bộ.</w:t>
-      </w:r>
-    </w:p>
-    <w:p>
-      <w:r>
-        <w:pict>
-          <v:rect style="width:0;height:1.5pt" o:hralign="center" o:hrstd="t" o:hr="t"/>
-        </w:pict>
       </w:r>
     </w:p>
     <w:bookmarkEnd w:id="26"/>
@@ -7306,13 +7292,6 @@
         <w:t xml:space="preserve">Đây vẫn là năng lực chưa qua cổng phát hành mà nhóm tự đặt: mọi kết quả truy vết đều mang nhãn giới hạn về độ thu hồi, do chính hệ thống gắn vào chứ không phải do người viết báo cáo thêm vào.</w:t>
       </w:r>
     </w:p>
-    <w:p>
-      <w:r>
-        <w:pict>
-          <v:rect style="width:0;height:1.5pt" o:hralign="center" o:hrstd="t" o:hr="t"/>
-        </w:pict>
-      </w:r>
-    </w:p>
     <w:bookmarkEnd w:id="34"/>
     <w:bookmarkStart w:id="35" w:name="kiến-trúc-hồ-sơ-toàn-vẹn-signed-manifest"/>
     <w:p>
@@ -7696,13 +7675,6 @@
       </w:r>
       <w:r>
         <w:t xml:space="preserve">Tạo biểu diễn JSON xác định / chuẩn tắc (canonical representation) độc lập với thư viện tuần tự hóa, bảo đảm đầu vào của hàm băm và chữ ký số luôn ổn định, lặp lại được (deterministic input for hashing and signing).</w:t>
-      </w:r>
-    </w:p>
-    <w:p>
-      <w:r>
-        <w:pict>
-          <v:rect style="width:0;height:1.5pt" o:hralign="center" o:hrstd="t" o:hr="t"/>
-        </w:pict>
       </w:r>
     </w:p>
     <w:bookmarkEnd w:id="35"/>
@@ -8337,13 +8309,6 @@
         <w:t xml:space="preserve">Hai cơ chế không triệt tiêu nhau mà tạo thành Hai tầng phòng thủ bổ trợ nhau (Defense-in-Depth).</w:t>
       </w:r>
     </w:p>
-    <w:p>
-      <w:r>
-        <w:pict>
-          <v:rect style="width:0;height:1.5pt" o:hralign="center" o:hrstd="t" o:hr="t"/>
-        </w:pict>
-      </w:r>
-    </w:p>
     <w:bookmarkEnd w:id="36"/>
     <w:bookmarkStart w:id="37" w:name="X0312fa8f0b5c3bf9d42aa6b97dc89cc58c0c60c"/>
     <w:p>
@@ -9599,13 +9564,6 @@
         </w:tc>
       </w:tr>
     </w:tbl>
-    <w:p>
-      <w:r>
-        <w:pict>
-          <v:rect style="width:0;height:1.5pt" o:hralign="center" o:hrstd="t" o:hr="t"/>
-        </w:pict>
-      </w:r>
-    </w:p>
     <w:bookmarkEnd w:id="39"/>
     <w:bookmarkStart w:id="42" w:name="Xe7db50e2b15f38fb2460a20c566d37b6de66f7f"/>
     <w:p>
@@ -11496,13 +11454,6 @@
         </w:tc>
       </w:tr>
     </w:tbl>
-    <w:p>
-      <w:r>
-        <w:pict>
-          <v:rect style="width:0;height:1.5pt" o:hralign="center" o:hrstd="t" o:hr="t"/>
-        </w:pict>
-      </w:r>
-    </w:p>
     <w:bookmarkStart w:id="52" w:name="X2dc8171bf5516aa1ce2ed0a2f6469e7ddf0161c"/>
     <w:p>
       <w:pPr>
@@ -13538,13 +13489,6 @@
       </w:r>
       <w:r>
         <w:t xml:space="preserve">mà không nói rõ đó là thế hệ V1. Trên cùng corpus, thế hệ nghiên cứu hiện tại đạt 0.750 ở JPEG-70.</w:t>
-      </w:r>
-    </w:p>
-    <w:p>
-      <w:r>
-        <w:pict>
-          <v:rect style="width:0;height:1.5pt" o:hralign="center" o:hrstd="t" o:hr="t"/>
-        </w:pict>
       </w:r>
     </w:p>
     <w:bookmarkEnd w:id="51"/>
@@ -23695,13 +23639,6 @@
         <w:t xml:space="preserve">Trước thay đổi này, mã chọn hồ sơ bằng cách lấy phần tử đầu của lưới ứng viên rồi mới đối chiếu định danh. Thứ tự của một tệp hợp đồng vì thế quyết định thuật toán nào thực sự chạy trên hệ thống thật, một sự phụ thuộc không được ghi ở đâu cả. Nay mã tra hồ sơ theo định danh, nên hợp đồng có sắp xếp lại thì hành vi vẫn giữ nguyên.</w:t>
       </w:r>
     </w:p>
-    <w:p>
-      <w:r>
-        <w:pict>
-          <v:rect style="width:0;height:1.5pt" o:hralign="center" o:hrstd="t" o:hr="t"/>
-        </w:pict>
-      </w:r>
-    </w:p>
     <w:bookmarkEnd w:id="80"/>
     <w:bookmarkEnd w:id="81"/>
     <w:bookmarkStart w:id="86" w:name="Xaa532e4a1fa2fd6b350d447a5422868d3bab935"/>
@@ -24011,13 +23948,6 @@
       </w:r>
       <w:r>
         <w:t xml:space="preserve">Bốn điều trên là kết luận rút ra từ việc đọc mã nguồn, không phải từ phép đo của nhóm. Chưa điều nào được cài đặt và đo trong dự án này, nên chúng là đề xuất có căn cứ chứ chưa phải kết quả.</w:t>
-      </w:r>
-    </w:p>
-    <w:p>
-      <w:r>
-        <w:pict>
-          <v:rect style="width:0;height:1.5pt" o:hralign="center" o:hrstd="t" o:hr="t"/>
-        </w:pict>
       </w:r>
     </w:p>
     <w:bookmarkEnd w:id="85"/>

</xml_diff>

<commit_message>
docs: drop the sentence explaining how the reference list is ordered
The ordering rule belongs to the layout form, not to the report. A reader
does not need to be told that Vietnamese sources come first and are sorted
by given name; they can see it.

Co-Authored-By: Claude Opus 5 <noreply@anthropic.com>
Claude-Session: https://claude.ai/code/session_01SzJTThV64VAErHN4L42mg9
</commit_message>
<xml_diff>
--- a/docs/project/Nhom9_TruyVetToanVenVanBan.docx
+++ b/docs/project/Nhom9_TruyVetToanVenVanBan.docx
@@ -24977,14 +24977,6 @@
     <w:p>
       <w:pPr>
         <w:pStyle w:val="FirstParagraph"/>
-      </w:pPr>
-      <w:r>
-        <w:t xml:space="preserve">Danh mục xếp theo khối ngôn ngữ, khối tiếng Việt trước rồi tới khối tiếng Anh. Trong mỗi khối, tài liệu xếp theo thứ tự ABC: tác giả Việt Nam xếp theo tên, tác giả nước ngoài xếp theo họ, tài liệu không có tác giả xếp theo tên cơ quan ban hành. Số thứ tự đánh liên tục từ 1 qua cả hai khối.</w:t>
-      </w:r>
-    </w:p>
-    <w:p>
-      <w:pPr>
-        <w:pStyle w:val="BodyText"/>
       </w:pPr>
       <w:r>
         <w:rPr>

</xml_diff>

<commit_message>
docs: three wrong values in the Mendeley records, found by checking Crossref
Read the library back out of Mendeley's own database and checked every
record that carries a DOI against api.crossref.org.

- HiDDeN: pages were 657-672, Crossref gives 682-697 for the ECCV
  proceedings the DOI resolves to.
- StegaStamp: pages were 2117-2126, Crossref gives 2114-2123.
- Douglas et al.: the first author is Mandy Douglas, not Mangala. The
  IEEE rendering shows only the initial so the output never revealed it;
  a style that spells names out would have.

Chen and Wornell, Fang et al., and Hamid et al. checked clean. All 22
records are present with the right titles, authors and years.

Co-Authored-By: Claude Opus 5 <noreply@anthropic.com>
Claude-Session: https://claude.ai/code/session_01SzJTThV64VAErHN4L42mg9
</commit_message>
<xml_diff>
--- a/docs/project/Nhom9_TruyVetToanVenVanBan.docx
+++ b/docs/project/Nhom9_TruyVetToanVenVanBan.docx
@@ -24979,19 +24979,7 @@
         <w:pStyle w:val="FirstParagraph"/>
       </w:pPr>
       <w:r>
-        <w:t xml:space="preserve">[1] Adobe Research,</w:t>
-      </w:r>
-      <w:r>
-        <w:t xml:space="preserve"> </w:t>
-      </w:r>
-      <w:r>
-        <w:t xml:space="preserve">“TrustMark: Universal Watermarking for Arbitrary Resolution Images,”</w:t>
-      </w:r>
-      <w:r>
-        <w:t xml:space="preserve"> </w:t>
-      </w:r>
-      <w:r>
-        <w:t xml:space="preserve">2026, GitHub. [Online]. Available: https://github.com/adobe/trustmark</w:t>
+        <w:t xml:space="preserve">[1] Adobe Research, “TrustMark: Universal Watermarking for Arbitrary Resolution Images,” 2026, GitHub. [Online]. Available: https://github.com/adobe/trustmark</w:t>
       </w:r>
     </w:p>
     <w:p>
@@ -24999,19 +24987,7 @@
         <w:pStyle w:val="BodyText"/>
       </w:pPr>
       <w:r>
-        <w:t xml:space="preserve">[2] B. Chen and G. W. Wornell,</w:t>
-      </w:r>
-      <w:r>
-        <w:t xml:space="preserve"> </w:t>
-      </w:r>
-      <w:r>
-        <w:t xml:space="preserve">“Quantization index modulation: a class of provably good methods for digital watermarking and information embedding,”</w:t>
-      </w:r>
-      <w:r>
-        <w:t xml:space="preserve"> </w:t>
-      </w:r>
-      <w:r>
-        <w:t xml:space="preserve">IEEE Transactions on Information Theory, vol. 47, no. 4, pp. 1423-1443, 2001, doi: 10.1109/18.923725.</w:t>
+        <w:t xml:space="preserve">[2] B. Chen and G. W. Wornell, “Quantization index modulation: a class of provably good methods for digital watermarking and information embedding,” IEEE Transactions on Information Theory, vol. 47, no. 4, pp. 1423-1443, 2001, doi: 10.1109/18.923725.</w:t>
       </w:r>
     </w:p>
     <w:p>
@@ -25027,19 +25003,7 @@
         <w:pStyle w:val="BodyText"/>
       </w:pPr>
       <w:r>
-        <w:t xml:space="preserve">[4] M. Douglas, K. Bailey, M. Leeney, and K. Curran,</w:t>
-      </w:r>
-      <w:r>
-        <w:t xml:space="preserve"> </w:t>
-      </w:r>
-      <w:r>
-        <w:t xml:space="preserve">“An overview of steganography techniques applied to the protection of biometric data,”</w:t>
-      </w:r>
-      <w:r>
-        <w:t xml:space="preserve"> </w:t>
-      </w:r>
-      <w:r>
-        <w:t xml:space="preserve">Multimedia Tools and Applications, vol. 77, no. 13, pp. 17333-17373, 2018, doi: 10.1007/s11042-017-5308-3.</w:t>
+        <w:t xml:space="preserve">[4] M. Douglas, K. Bailey, M. Leeney, and K. Curran, “An overview of steganography techniques applied to the protection of biometric data,” Multimedia Tools and Applications, vol. 77, no. 13, pp. 17333-17373, 2018, doi: 10.1007/s11042-017-5308-3.</w:t>
       </w:r>
     </w:p>
     <w:p>
@@ -25047,19 +25011,7 @@
         <w:pStyle w:val="BodyText"/>
       </w:pPr>
       <w:r>
-        <w:t xml:space="preserve">[5] H. Fang, W. Zhang, H. Zhou, H. Cui, and N. Yu,</w:t>
-      </w:r>
-      <w:r>
-        <w:t xml:space="preserve"> </w:t>
-      </w:r>
-      <w:r>
-        <w:t xml:space="preserve">“Screen-shooting resilient watermarking,”</w:t>
-      </w:r>
-      <w:r>
-        <w:t xml:space="preserve"> </w:t>
-      </w:r>
-      <w:r>
-        <w:t xml:space="preserve">IEEE Transactions on Information Forensics and Security, vol. 14, no. 6, pp. 1403-1418, 2019, doi: 10.1109/TIFS.2018.2878541.</w:t>
+        <w:t xml:space="preserve">[5] H. Fang, W. Zhang, H. Zhou, H. Cui, and N. Yu, “Screen-shooting resilient watermarking,” IEEE Transactions on Information Forensics and Security, vol. 14, no. 6, pp. 1403-1418, 2019, doi: 10.1109/TIFS.2018.2878541.</w:t>
       </w:r>
     </w:p>
     <w:p>
@@ -25067,19 +25019,7 @@
         <w:pStyle w:val="BodyText"/>
       </w:pPr>
       <w:r>
-        <w:t xml:space="preserve">[6] gslxr,</w:t>
-      </w:r>
-      <w:r>
-        <w:t xml:space="preserve"> </w:t>
-      </w:r>
-      <w:r>
-        <w:t xml:space="preserve">“Screen-Shooting-Resilient-Document-Image-Watermarking,”</w:t>
-      </w:r>
-      <w:r>
-        <w:t xml:space="preserve"> </w:t>
-      </w:r>
-      <w:r>
-        <w:t xml:space="preserve">2024, GitHub. [Online]. Available: https://github.com/gslxr/Screen-Shooting-Resilient-Document-Image-Watermarking</w:t>
+        <w:t xml:space="preserve">[6] gslxr, “Screen-Shooting-Resilient-Document-Image-Watermarking,” 2024, GitHub. [Online]. Available: https://github.com/gslxr/Screen-Shooting-Resilient-Document-Image-Watermarking</w:t>
       </w:r>
     </w:p>
     <w:p>
@@ -25087,19 +25027,7 @@
         <w:pStyle w:val="BodyText"/>
       </w:pPr>
       <w:r>
-        <w:t xml:space="preserve">[7] Guo Fei,</w:t>
-      </w:r>
-      <w:r>
-        <w:t xml:space="preserve"> </w:t>
-      </w:r>
-      <w:r>
-        <w:t xml:space="preserve">“blind_watermark: blind and invisible image watermark,”</w:t>
-      </w:r>
-      <w:r>
-        <w:t xml:space="preserve"> </w:t>
-      </w:r>
-      <w:r>
-        <w:t xml:space="preserve">2025, GitHub. [Online]. Available: https://github.com/guofei9987/blind_watermark</w:t>
+        <w:t xml:space="preserve">[7] Guo Fei, “blind_watermark: blind and invisible image watermark,” 2025, GitHub. [Online]. Available: https://github.com/guofei9987/blind_watermark</w:t>
       </w:r>
     </w:p>
     <w:p>
@@ -25107,19 +25035,7 @@
         <w:pStyle w:val="BodyText"/>
       </w:pPr>
       <w:r>
-        <w:t xml:space="preserve">[8] N. Hamid, A. Yahya, R. B. Ahmad, and O. M. Al-Qershi,</w:t>
-      </w:r>
-      <w:r>
-        <w:t xml:space="preserve"> </w:t>
-      </w:r>
-      <w:r>
-        <w:t xml:space="preserve">“Image Steganography Techniques: An Overview,”</w:t>
-      </w:r>
-      <w:r>
-        <w:t xml:space="preserve"> </w:t>
-      </w:r>
-      <w:r>
-        <w:t xml:space="preserve">International Journal of Computer Science and Security, vol. 6, no. 3, pp. 168-187, 2012.</w:t>
+        <w:t xml:space="preserve">[8] N. Hamid, A. Yahya, R. B. Ahmad, and O. M. Al-Qershi, “Image Steganography Techniques: An Overview,” International Journal of Computer Science and Security, vol. 6, no. 3, pp. 168-187, 2012.</w:t>
       </w:r>
     </w:p>
     <w:p>
@@ -25135,19 +25051,7 @@
         <w:pStyle w:val="BodyText"/>
       </w:pPr>
       <w:r>
-        <w:t xml:space="preserve">[10] S. Josefsson and I. Liusvaara,</w:t>
-      </w:r>
-      <w:r>
-        <w:t xml:space="preserve"> </w:t>
-      </w:r>
-      <w:r>
-        <w:t xml:space="preserve">“Edwards-Curve Digital Signature Algorithm (EdDSA), RFC 8032,”</w:t>
-      </w:r>
-      <w:r>
-        <w:t xml:space="preserve"> </w:t>
-      </w:r>
-      <w:r>
-        <w:t xml:space="preserve">Internet Engineering Task Force, 2017. [Online]. Available: https://www.rfc-editor.org/rfc/rfc8032</w:t>
+        <w:t xml:space="preserve">[10] S. Josefsson and I. Liusvaara, “Edwards-Curve Digital Signature Algorithm (EdDSA), RFC 8032,” Internet Engineering Task Force, 2017. [Online]. Available: https://www.rfc-editor.org/rfc/rfc8032</w:t>
       </w:r>
     </w:p>
     <w:p>
@@ -25155,19 +25059,7 @@
         <w:pStyle w:val="BodyText"/>
       </w:pPr>
       <w:r>
-        <w:t xml:space="preserve">[11] H. Krawczyk, M. Bellare, and R. Canetti,</w:t>
-      </w:r>
-      <w:r>
-        <w:t xml:space="preserve"> </w:t>
-      </w:r>
-      <w:r>
-        <w:t xml:space="preserve">“HMAC: Keyed-Hashing for Message Authentication, RFC 2104,”</w:t>
-      </w:r>
-      <w:r>
-        <w:t xml:space="preserve"> </w:t>
-      </w:r>
-      <w:r>
-        <w:t xml:space="preserve">Internet Engineering Task Force, 1997. [Online]. Available: https://www.rfc-editor.org/rfc/rfc2104</w:t>
+        <w:t xml:space="preserve">[11] H. Krawczyk, M. Bellare, and R. Canetti, “HMAC: Keyed-Hashing for Message Authentication, RFC 2104,” Internet Engineering Task Force, 1997. [Online]. Available: https://www.rfc-editor.org/rfc/rfc2104</w:t>
       </w:r>
     </w:p>
     <w:p>
@@ -25175,19 +25067,7 @@
         <w:pStyle w:val="BodyText"/>
       </w:pPr>
       <w:r>
-        <w:t xml:space="preserve">[12] National Institute of Standards and Technology,</w:t>
-      </w:r>
-      <w:r>
-        <w:t xml:space="preserve"> </w:t>
-      </w:r>
-      <w:r>
-        <w:t xml:space="preserve">“Implementation Guidance for FIPS 140-3 and the Cryptographic Module Verification Program,”</w:t>
-      </w:r>
-      <w:r>
-        <w:t xml:space="preserve"> </w:t>
-      </w:r>
-      <w:r>
-        <w:t xml:space="preserve">NIST Computer Security Resource Center, 2026. [Online]. Available: https://csrc.nist.gov/projects/cryptographic-module-validation-program/fips-140-3-ig-announcements</w:t>
+        <w:t xml:space="preserve">[12] National Institute of Standards and Technology, “Implementation Guidance for FIPS 140-3 and the Cryptographic Module Verification Program,” NIST Computer Security Resource Center, 2026. [Online]. Available: https://csrc.nist.gov/projects/cryptographic-module-validation-program/fips-140-3-ig-announcements</w:t>
       </w:r>
     </w:p>
     <w:p>
@@ -25195,19 +25075,7 @@
         <w:pStyle w:val="BodyText"/>
       </w:pPr>
       <w:r>
-        <w:t xml:space="preserve">[13] National Institute of Standards and Technology,</w:t>
-      </w:r>
-      <w:r>
-        <w:t xml:space="preserve"> </w:t>
-      </w:r>
-      <w:r>
-        <w:t xml:space="preserve">“Secure Hash Standard (SHS), FIPS PUB 180-4,”</w:t>
-      </w:r>
-      <w:r>
-        <w:t xml:space="preserve"> </w:t>
-      </w:r>
-      <w:r>
-        <w:t xml:space="preserve">National Institute of Standards and Technology, Gaithersburg, 2015. doi: 10.6028/NIST.FIPS.180-4.</w:t>
+        <w:t xml:space="preserve">[13] National Institute of Standards and Technology, “Secure Hash Standard (SHS), FIPS PUB 180-4,” National Institute of Standards and Technology, Gaithersburg, 2015. doi: 10.6028/NIST.FIPS.180-4.</w:t>
       </w:r>
     </w:p>
     <w:p>
@@ -25215,19 +25083,7 @@
         <w:pStyle w:val="BodyText"/>
       </w:pPr>
       <w:r>
-        <w:t xml:space="preserve">[14] National Institute of Standards and Technology,</w:t>
-      </w:r>
-      <w:r>
-        <w:t xml:space="preserve"> </w:t>
-      </w:r>
-      <w:r>
-        <w:t xml:space="preserve">“The Keyed-Hash Message Authentication Code (HMAC), FIPS PUB 198-1,”</w:t>
-      </w:r>
-      <w:r>
-        <w:t xml:space="preserve"> </w:t>
-      </w:r>
-      <w:r>
-        <w:t xml:space="preserve">National Institute of Standards and Technology, Gaithersburg, 2008. doi: 10.6028/NIST.FIPS.198-1.</w:t>
+        <w:t xml:space="preserve">[14] National Institute of Standards and Technology, “The Keyed-Hash Message Authentication Code (HMAC), FIPS PUB 198-1,” National Institute of Standards and Technology, Gaithersburg, 2008. doi: 10.6028/NIST.FIPS.198-1.</w:t>
       </w:r>
     </w:p>
     <w:p>
@@ -25235,19 +25091,7 @@
         <w:pStyle w:val="BodyText"/>
       </w:pPr>
       <w:r>
-        <w:t xml:space="preserve">[15] A. Rundgren, B. Jordan, and S. Erdtman,</w:t>
-      </w:r>
-      <w:r>
-        <w:t xml:space="preserve"> </w:t>
-      </w:r>
-      <w:r>
-        <w:t xml:space="preserve">“JSON Canonicalization Scheme (JCS), RFC 8785,”</w:t>
-      </w:r>
-      <w:r>
-        <w:t xml:space="preserve"> </w:t>
-      </w:r>
-      <w:r>
-        <w:t xml:space="preserve">Internet Engineering Task Force, 2020. [Online]. Available: https://www.rfc-editor.org/rfc/rfc8785</w:t>
+        <w:t xml:space="preserve">[15] A. Rundgren, B. Jordan, and S. Erdtman, “JSON Canonicalization Scheme (JCS), RFC 8785,” Internet Engineering Task Force, 2020. [Online]. Available: https://www.rfc-editor.org/rfc/rfc8785</w:t>
       </w:r>
     </w:p>
     <w:p>
@@ -25255,19 +25099,7 @@
         <w:pStyle w:val="BodyText"/>
       </w:pPr>
       <w:r>
-        <w:t xml:space="preserve">[16] T. Sander, P. Fernandez, A. Durmus, M. Douze, and T. Furon,</w:t>
-      </w:r>
-      <w:r>
-        <w:t xml:space="preserve"> </w:t>
-      </w:r>
-      <w:r>
-        <w:t xml:space="preserve">“Watermark Anything with Localized Messages,”</w:t>
-      </w:r>
-      <w:r>
-        <w:t xml:space="preserve"> </w:t>
-      </w:r>
-      <w:r>
-        <w:t xml:space="preserve">2025, Meta AI Research. [Online]. Available: https://github.com/facebookresearch/watermark-anything</w:t>
+        <w:t xml:space="preserve">[16] T. Sander, P. Fernandez, A. Durmus, M. Douze, and T. Furon, “Watermark Anything with Localized Messages,” 2025, Meta AI Research. [Online]. Available: https://github.com/facebookresearch/watermark-anything</w:t>
       </w:r>
     </w:p>
     <w:p>
@@ -25275,19 +25107,7 @@
         <w:pStyle w:val="BodyText"/>
       </w:pPr>
       <w:r>
-        <w:t xml:space="preserve">[17] ShieldMnt,</w:t>
-      </w:r>
-      <w:r>
-        <w:t xml:space="preserve"> </w:t>
-      </w:r>
-      <w:r>
-        <w:t xml:space="preserve">“invisible-watermark: python library for invisible image watermark,”</w:t>
-      </w:r>
-      <w:r>
-        <w:t xml:space="preserve"> </w:t>
-      </w:r>
-      <w:r>
-        <w:t xml:space="preserve">2024, GitHub. [Online]. Available: https://github.com/ShieldMnt/invisible-watermark</w:t>
+        <w:t xml:space="preserve">[17] ShieldMnt, “invisible-watermark: python library for invisible image watermark,” 2024, GitHub. [Online]. Available: https://github.com/ShieldMnt/invisible-watermark</w:t>
       </w:r>
     </w:p>
     <w:p>
@@ -25303,19 +25123,7 @@
         <w:pStyle w:val="BodyText"/>
       </w:pPr>
       <w:r>
-        <w:t xml:space="preserve">[19] M. Tancik, B. Mildenhall, and R. Ng,</w:t>
-      </w:r>
-      <w:r>
-        <w:t xml:space="preserve"> </w:t>
-      </w:r>
-      <w:r>
-        <w:t xml:space="preserve">“StegaStamp: Invisible Hyperlinks in Physical Photographs,”</w:t>
-      </w:r>
-      <w:r>
-        <w:t xml:space="preserve"> </w:t>
-      </w:r>
-      <w:r>
-        <w:t xml:space="preserve">in Proceedings of the IEEE/CVF Conference on Computer Vision and Pattern Recognition, Seattle, 2020, pp. 2117-2126. doi: 10.1109/CVPR42600.2020.00219.</w:t>
+        <w:t xml:space="preserve">[19] M. Tancik, B. Mildenhall, and R. Ng, “StegaStamp: Invisible Hyperlinks in Physical Photographs,” in Proceedings of the IEEE/CVF Conference on Computer Vision and Pattern Recognition, Seattle, 2020, pp. 2114-2123. doi: 10.1109/CVPR42600.2020.00219.</w:t>
       </w:r>
     </w:p>
     <w:p>
@@ -25331,19 +25139,7 @@
         <w:pStyle w:val="BodyText"/>
       </w:pPr>
       <w:r>
-        <w:t xml:space="preserve">[21] wmbench contributors,</w:t>
-      </w:r>
-      <w:r>
-        <w:t xml:space="preserve"> </w:t>
-      </w:r>
-      <w:r>
-        <w:t xml:space="preserve">“wmbench: image watermarking benchmark,”</w:t>
-      </w:r>
-      <w:r>
-        <w:t xml:space="preserve"> </w:t>
-      </w:r>
-      <w:r>
-        <w:t xml:space="preserve">2026, GitHub. [Online]. Available: https://github.com/alexandersolonsky/wmbench</w:t>
+        <w:t xml:space="preserve">[21] wmbench contributors, “wmbench: image watermarking benchmark,” 2026, GitHub. [Online]. Available: https://github.com/alexandersolonsky/wmbench</w:t>
       </w:r>
     </w:p>
     <w:p>
@@ -25351,19 +25147,7 @@
         <w:pStyle w:val="BodyText"/>
       </w:pPr>
       <w:r>
-        <w:t xml:space="preserve">[22] J. Zhu, R. Kaplan, J. Johnson, and L. Fei-Fei,</w:t>
-      </w:r>
-      <w:r>
-        <w:t xml:space="preserve"> </w:t>
-      </w:r>
-      <w:r>
-        <w:t xml:space="preserve">“HiDDeN: Hiding Data with Deep Networks,”</w:t>
-      </w:r>
-      <w:r>
-        <w:t xml:space="preserve"> </w:t>
-      </w:r>
-      <w:r>
-        <w:t xml:space="preserve">in Proceedings of the European Conference on Computer Vision, Munich, 2018, pp. 657-672. doi: 10.1007/978-3-030-01267-0_40.</w:t>
+        <w:t xml:space="preserve">[22] J. Zhu, R. Kaplan, J. Johnson, and L. Fei-Fei, “HiDDeN: Hiding Data with Deep Networks,” in Proceedings of the European Conference on Computer Vision, Munich, 2018, pp. 682-697. doi: 10.1007/978-3-030-01267-0_40.</w:t>
       </w:r>
     </w:p>
     <w:bookmarkEnd w:id="117"/>

</xml_diff>

<commit_message>
docs: cite the ten sources that were listed but never referenced
The bibliography held 22 entries while only 12 carried an in-text marker.
The other ten were named in prose - RFC 8032, RFC 2104, RFC 8785, the three
NIST standards, Chen and Wornell on QIM, HiDDeN, StegaStamp and the Vietnamese
textbook - without a citation, so a generated bibliography would have dropped
them. Each now has a live Mendeley field at the sentence it supports.

Spacing was cleaned with narrow Find/Replace patterns rather than blanket ones,
because ' .' also matches the .pdf and .png filenames in the text and ' :'
matches the manifest diagram.

Co-Authored-By: Claude Opus 5 <noreply@anthropic.com>
Claude-Session: https://claude.ai/code/session_01SzJTThV64VAErHN4L42mg9
</commit_message>
<xml_diff>
--- a/docs/project/Nhom9_TruyVetToanVenVanBan.docx
+++ b/docs/project/Nhom9_TruyVetToanVenVanBan.docx
@@ -8464,8 +8464,25 @@
         <w:t>Lý thuyết đã công bố</w:t>
       </w:r>
       <w:r>
-        <w:t xml:space="preserve"> (Chen &amp; Wornell, IEEE Transactions on Information Theory, 2001)</w:t>
-      </w:r>
+        <w:t xml:space="preserve"> </w:t>
+      </w:r>
+      <w:sdt>
+        <w:sdtPr>
+          <w:tag w:val="MENDELEY_CITATION_v3_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"/>
+          <w:id w:val="1005628158"/>
+          <w:placeholder>
+            <w:docPart w:val="DefaultPlaceholder_-1854013440"/>
+          </w:placeholder>
+        </w:sdtPr>
+        <w:sdtContent>
+          <w:r>
+            <w:rPr>
+              <w:color w:val="000000"/>
+            </w:rPr>
+            <w:t>[3]</w:t>
+          </w:r>
+        </w:sdtContent>
+      </w:sdt>
     </w:p>
     <w:p>
       <w:pPr>
@@ -8726,7 +8743,6 @@
       <w:bookmarkEnd w:id="15"/>
       <w:bookmarkEnd w:id="27"/>
       <w:r>
-        <w:lastRenderedPageBreak/>
         <w:t>CHƯƠNG 2. ỨNG DỤNG THỦY VÂN TRONG TRUY VẾT VÀ TOÀN VẸN HÌNH ẢNH</w:t>
       </w:r>
       <w:bookmarkEnd w:id="28"/>
@@ -8746,7 +8762,11 @@
         <w:t>Bài toán A:</w:t>
       </w:r>
       <w:r>
-        <w:t xml:space="preserve"> Ứng dụng thủy vân bền vững trong truy vết nguồn phát hành (traitor tracing). 2. </w:t>
+        <w:t xml:space="preserve"> Ứng dụng thủy vân bền vững trong truy </w:t>
+      </w:r>
+      <w:r>
+        <w:lastRenderedPageBreak/>
+        <w:t xml:space="preserve">vết nguồn phát hành (traitor tracing). 2. </w:t>
       </w:r>
       <w:r>
         <w:rPr>
@@ -9092,13 +9112,54 @@
           <w:ilvl w:val="0"/>
           <w:numId w:val="18"/>
         </w:numPr>
-      </w:pPr>
-      <w:r>
         <w:rPr>
           <w:b/>
           <w:bCs/>
         </w:rPr>
-        <w:t>Lưu ý học thuật về phân định vai trò an ninh giữa các thành phần:</w:t>
+      </w:pPr>
+      <w:r>
+        <w:rPr>
+          <w:b/>
+          <w:bCs/>
+        </w:rPr>
+        <w:t>Lưu ý học thuật về phân định vai trò an ninh giữa các thành phần</w:t>
+      </w:r>
+      <w:r>
+        <w:rPr>
+          <w:b/>
+          <w:bCs/>
+        </w:rPr>
+        <w:t xml:space="preserve"> </w:t>
+      </w:r>
+      <w:sdt>
+        <w:sdtPr>
+          <w:rPr>
+            <w:b/>
+            <w:bCs/>
+          </w:rPr>
+          <w:tag w:val="MENDELEY_CITATION_v3_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"/>
+          <w:id w:val="1737199929"/>
+          <w:placeholder>
+            <w:docPart w:val="DefaultPlaceholder_-1854013440"/>
+          </w:placeholder>
+        </w:sdtPr>
+        <w:sdtContent>
+          <w:r>
+            <w:rPr>
+              <w:b/>
+              <w:bCs/>
+              <w:color w:val="000000"/>
+            </w:rPr>
+            <w:t>[4]</w:t>
+          </w:r>
+        </w:sdtContent>
+      </w:sdt>
+      <w:r>
+        <w:rPr>
+          <w:b/>
+          <w:bCs/>
+        </w:rPr>
+        <w:t>:</w:t>
       </w:r>
     </w:p>
     <w:p>
@@ -9116,11 +9177,7 @@
         <w:t>CRC-32</w:t>
       </w:r>
       <w:r>
-        <w:t xml:space="preserve">: Chỉ đóng vai trò phát hiện lỗi ngẫu nhiên trong kênh truyền và giải mã tín hiệu (transmission error detection), giúp bộ giải mã phát </w:t>
-      </w:r>
-      <w:r>
-        <w:lastRenderedPageBreak/>
-        <w:t>hiện các trường hợp sai lệch bit; CRC-32 không dùng khóa và hoàn toàn không cung cấp tính toàn vẹn mật mã hay khả năng chống giả mạo.</w:t>
+        <w:t>: Chỉ đóng vai trò phát hiện lỗi ngẫu nhiên trong kênh truyền và giải mã tín hiệu (transmission error detection), giúp bộ giải mã phát hiện các trường hợp sai lệch bit; CRC-32 không dùng khóa và hoàn toàn không cung cấp tính toàn vẹn mật mã hay khả năng chống giả mạo.</w:t>
       </w:r>
     </w:p>
     <w:p>
@@ -9135,10 +9192,34 @@
         <w:rPr>
           <w:rStyle w:val="VerbatimChar"/>
         </w:rPr>
+        <w:lastRenderedPageBreak/>
         <w:t>HMAC</w:t>
       </w:r>
       <w:r>
-        <w:t>: Cung cấp cơ chế xác thực nguồn gốc và toàn vẹn có khóa (keyed authentication, integrity) cho các thẻ xác thực trong thuật toán bán dễ vỡ.</w:t>
+        <w:t>: Cung cấp cơ chế xác thực nguồn gốc và toàn vẹn có khóa (keyed authentication, integrity) cho các thẻ xác thực trong thuật toán bán dễ vỡ</w:t>
+      </w:r>
+      <w:r>
+        <w:t xml:space="preserve"> </w:t>
+      </w:r>
+      <w:sdt>
+        <w:sdtPr>
+          <w:tag w:val="MENDELEY_CITATION_v3_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"/>
+          <w:id w:val="-1780938993"/>
+          <w:placeholder>
+            <w:docPart w:val="DefaultPlaceholder_-1854013440"/>
+          </w:placeholder>
+        </w:sdtPr>
+        <w:sdtContent>
+          <w:r>
+            <w:rPr>
+              <w:color w:val="000000"/>
+            </w:rPr>
+            <w:t>[5]</w:t>
+          </w:r>
+        </w:sdtContent>
+      </w:sdt>
+      <w:r>
+        <w:t>.</w:t>
       </w:r>
     </w:p>
     <w:p>
@@ -9355,11 +9436,7 @@
         <w:t>HH</w:t>
       </w:r>
       <w:r>
-        <w:t xml:space="preserve">. </w:t>
-      </w:r>
-      <w:r>
-        <w:lastRenderedPageBreak/>
-        <w:t xml:space="preserve">Chọn </w:t>
+        <w:t xml:space="preserve">. Chọn </w:t>
       </w:r>
       <w:r>
         <w:rPr>
@@ -9427,6 +9504,7 @@
         </w:numPr>
       </w:pPr>
       <w:r>
+        <w:lastRenderedPageBreak/>
         <w:t>Mã hóa payload cùng mã sửa lỗi Reed-Solomon (khả năng tự sửa lỗi bit) và nhúng vào hệ số DCT bằng Parity-QIM.</w:t>
       </w:r>
     </w:p>
@@ -9708,11 +9786,14 @@
           <w:b/>
           <w:bCs/>
         </w:rPr>
+        <w:t>Tỷ lệ gán sai nguồn (false attribution rate):</w:t>
+      </w:r>
+      <w:r>
+        <w:t xml:space="preserve"> 0.00% (0 / 682 hàng) trên toàn bộ 48 ứng viên. Trong 682 trường hợp benchmark đã xét, không quan sát thấy trường hợp false attribution nào (hệ thống trích xuất chính xác định </w:t>
+      </w:r>
+      <w:r>
         <w:lastRenderedPageBreak/>
-        <w:t>Tỷ lệ gán sai nguồn (false attribution rate):</w:t>
-      </w:r>
-      <w:r>
-        <w:t xml:space="preserve"> 0.00% (0 / 682 hàng) trên toàn bộ 48 ứng viên. Trong 682 trường hợp benchmark đã xét, không quan sát thấy trường hợp false attribution nào (hệ thống trích xuất chính xác định danh người nhận hoặc báo lỗi kiểm tra CRC-32 / Reed-Solomon và từ chối giải mã, không gán nhầm sang định danh người nhận khác).</w:t>
+        <w:t>danh người nhận hoặc báo lỗi kiểm tra CRC-32 / Reed-Solomon và từ chối giải mã, không gán nhầm sang định danh người nhận khác).</w:t>
       </w:r>
     </w:p>
     <w:p>
@@ -9959,11 +10040,7 @@
         <w:pStyle w:val="FirstParagraph"/>
       </w:pPr>
       <w:r>
-        <w:t xml:space="preserve">Ba ranh giới trên là số đo của thế hệ V1 và đã thay đổi. Một nguyên nhân khiến JPEG-70 và Resize-0.75 thất bại nằm ở cách bên nhận đếm số ký hiệu bị khai là xoá, chứ không ở vật mang; sau khi sửa phép đếm đó, cả hai ca này giải mã được trên bộ khung nghiên cứu, và ca ảnh chụp màn hình cũng vậy. Cần nói rõ phạm vi: đó là số đo của bộ khung nghiên cứu, còn trên đường đi thật của dịch vụ thì vật mang mới là yếu tố quyết định, và với trang chữ nét mảnh thì nén JPEG-70 vẫn chưa truy được. Số đo </w:t>
-      </w:r>
-      <w:r>
-        <w:lastRenderedPageBreak/>
-        <w:t xml:space="preserve">sau khi sửa cùng chẩn đoán đầy đủ nằm ở Mục 4.2.4, phần đo trên dịch vụ ở Mục 4.2.4.5. Giữ nguyên các con số V1 ở đây vì chúng là mốc so sánh của quá trình, không phải mô tả hiện trạng. * </w:t>
+        <w:t xml:space="preserve">Ba ranh giới trên là số đo của thế hệ V1 và đã thay đổi. Một nguyên nhân khiến JPEG-70 và Resize-0.75 thất bại nằm ở cách bên nhận đếm số ký hiệu bị khai là xoá, chứ không ở vật mang; sau khi sửa phép đếm đó, cả hai ca này giải mã được trên bộ khung nghiên cứu, và ca ảnh chụp màn hình cũng vậy. Cần nói rõ phạm vi: đó là số đo của bộ khung nghiên cứu, còn trên đường đi thật của dịch vụ thì vật mang mới là yếu tố quyết định, và với trang chữ nét mảnh thì nén JPEG-70 vẫn chưa truy được. Số đo sau khi sửa cùng chẩn đoán đầy đủ nằm ở Mục 4.2.4, phần đo trên dịch vụ ở Mục 4.2.4.5. Giữ nguyên các con số V1 ở đây vì chúng là mốc so sánh của quá trình, không phải mô tả hiện trạng. * </w:t>
       </w:r>
       <w:r>
         <w:rPr>
@@ -9973,7 +10050,63 @@
         <w:t>Kết luận học thuật:</w:t>
       </w:r>
       <w:r>
-        <w:t xml:space="preserve"> Thuật toán chứng minh tính khả thi của việc nhúng định danh 128-bit với độ trung thực tín hiệu cao trên mảng điểm ảnh, nhưng còn hạn chế trước các biến đổi phi tuyến và nén có tổn hao ở mức mạnh. Một hướng nghiên cứu tiếp theo có thể xem xét là thủy vân học sâu (deep watermarking), như kiến trúc HiDDeN hoặc StegaStamp, kết hợp mạng nơ-ron tích chập tự mã hóa (Autoencoder) bên cạnh việc tối ưu hóa bước lượng tử hóa thích nghi theo đặc trưng cục bộ.</w:t>
+        <w:t xml:space="preserve"> Thuật toán chứng minh tính khả thi của </w:t>
+      </w:r>
+      <w:r>
+        <w:lastRenderedPageBreak/>
+        <w:t>việc nhúng định danh 128-bit với độ trung thực tín hiệu cao trên mảng điểm ảnh, nhưng còn hạn chế trước các biến đổi phi tuyến và nén có tổn hao ở mức mạnh. Một hướng nghiên cứu tiếp theo có thể xem xét là thủy vân học sâu (deep watermarking), như kiến trúc HiDDeN</w:t>
+      </w:r>
+      <w:r>
+        <w:t xml:space="preserve"> </w:t>
+      </w:r>
+      <w:sdt>
+        <w:sdtPr>
+          <w:tag w:val="MENDELEY_CITATION_v3_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"/>
+          <w:id w:val="1012722233"/>
+          <w:placeholder>
+            <w:docPart w:val="DefaultPlaceholder_-1854013440"/>
+          </w:placeholder>
+        </w:sdtPr>
+        <w:sdtContent>
+          <w:r>
+            <w:rPr>
+              <w:color w:val="000000"/>
+            </w:rPr>
+            <w:t>[6]</w:t>
+          </w:r>
+        </w:sdtContent>
+      </w:sdt>
+      <w:r>
+        <w:t xml:space="preserve"> hoặc</w:t>
+      </w:r>
+      <w:r>
+        <w:t xml:space="preserve"> StegaStamp</w:t>
+      </w:r>
+      <w:r>
+        <w:t xml:space="preserve"> </w:t>
+      </w:r>
+      <w:sdt>
+        <w:sdtPr>
+          <w:tag w:val="MENDELEY_CITATION_v3_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"/>
+          <w:id w:val="624808428"/>
+          <w:placeholder>
+            <w:docPart w:val="DefaultPlaceholder_-1854013440"/>
+          </w:placeholder>
+        </w:sdtPr>
+        <w:sdtContent>
+          <w:r>
+            <w:rPr>
+              <w:color w:val="000000"/>
+            </w:rPr>
+            <w:t>[7]</w:t>
+          </w:r>
+        </w:sdtContent>
+      </w:sdt>
+      <w:r>
+        <w:t>,</w:t>
+      </w:r>
+      <w:r>
+        <w:t xml:space="preserve"> kết hợp mạng nơ-ron tích chập tự mã hóa (Autoencoder) bên cạnh việc tối ưu hóa bước lượng tử hóa thích nghi theo đặc trưng cục bộ.</w:t>
       </w:r>
     </w:p>
     <w:p>
@@ -10335,11 +10468,63 @@
         <w:t>Lưu ý về biên an toàn mật mã (security margin):</w:t>
       </w:r>
       <w:r>
-        <w:t xml:space="preserve"> Thẻ HMAC-SHA256 được cắt ngắn xuống 4 byte (32 bit) để phù hợp với dung lượng nhúng giới hạn của từng khối ảnh. Về mặt tiêu chuẩn kỹ thuật, </w:t>
+        <w:t xml:space="preserve"> Thẻ HMAC-SHA256 được cắt ngắn xuống 4 byte (32 bit) để phù hợp với dung lượng nhúng giới hạn của từng khối ảnh. Về mặt tiêu chuẩn kỹ thuật, RFC 2104 khuyến nghị thẻ xác thực rút gọn không nên dưới 80 bit</w:t>
+      </w:r>
+      <w:r>
+        <w:t xml:space="preserve"> </w:t>
+      </w:r>
+      <w:sdt>
+        <w:sdtPr>
+          <w:tag w:val="MENDELEY_CITATION_v3_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"/>
+          <w:id w:val="-134954915"/>
+          <w:placeholder>
+            <w:docPart w:val="DefaultPlaceholder_-1854013440"/>
+          </w:placeholder>
+        </w:sdtPr>
+        <w:sdtContent>
+          <w:r>
+            <w:rPr>
+              <w:color w:val="000000"/>
+            </w:rPr>
+            <w:t>[8]</w:t>
+          </w:r>
+        </w:sdtContent>
+      </w:sdt>
+      <w:r>
+        <w:t>;</w:t>
+      </w:r>
+      <w:r>
+        <w:t xml:space="preserve"> hướng dẫn NIST cho phép cắt ngắn trong các môi trường tài nguyên hạn chế nhưng lưu ý độ dài dưới 64 bit không được khuyến </w:t>
       </w:r>
       <w:r>
         <w:lastRenderedPageBreak/>
-        <w:t xml:space="preserve">RFC 2104 khuyến nghị thẻ xác thực rút gọn không nên dưới 80 bit; hướng dẫn NIST cho phép cắt ngắn trong các môi trường tài nguyên hạn chế nhưng lưu ý độ dài dưới 64 bit không được khuyến khích rộng rãi cho ứng dụng an ninh cao. Trong prototype nghiên cứu của SplitBind, việc giữ bí mật khóa </w:t>
+        <w:t>khích rộng rãi cho ứng dụng an ninh cao</w:t>
+      </w:r>
+      <w:r>
+        <w:t xml:space="preserve"> </w:t>
+      </w:r>
+      <w:sdt>
+        <w:sdtPr>
+          <w:tag w:val="MENDELEY_CITATION_v3_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"/>
+          <w:id w:val="-129550511"/>
+          <w:placeholder>
+            <w:docPart w:val="DefaultPlaceholder_-1854013440"/>
+          </w:placeholder>
+        </w:sdtPr>
+        <w:sdtContent>
+          <w:r>
+            <w:rPr>
+              <w:color w:val="000000"/>
+            </w:rPr>
+            <w:t>[9]</w:t>
+          </w:r>
+        </w:sdtContent>
+      </w:sdt>
+      <w:r>
+        <w:t xml:space="preserve">. </w:t>
+      </w:r>
+      <w:r>
+        <w:t xml:space="preserve">Trong prototype nghiên cứu của SplitBind, việc giữ bí mật khóa </w:t>
       </w:r>
       <m:oMath>
         <m:r>
@@ -10660,7 +10845,6 @@
           <w:b/>
           <w:bCs/>
         </w:rPr>
-        <w:lastRenderedPageBreak/>
         <w:t>Bốn loại tấn công can thiệp được đánh giá:</w:t>
       </w:r>
     </w:p>
@@ -10694,6 +10878,7 @@
         <w:rPr>
           <w:rStyle w:val="VerbatimChar"/>
         </w:rPr>
+        <w:lastRenderedPageBreak/>
         <w:t>cover_region</w:t>
       </w:r>
       <w:r>
@@ -11104,7 +11289,6 @@
         </w:numPr>
       </w:pPr>
       <w:r>
-        <w:lastRenderedPageBreak/>
         <w:t>Khi cơ chế này kích hoạt, hệ thống chủ động xóa danh sách vùng nghi vấn (</w:t>
       </w:r>
       <w:r>
@@ -11126,6 +11310,7 @@
         </w:numPr>
       </w:pPr>
       <w:r>
+        <w:lastRenderedPageBreak/>
         <w:t>Trong thực nghiệm, do các phép tấn công can thiệp chiếm diện tích đáng kể, 38 trên tổng số 48 hàng thử nghiệm đã kích hoạt cơ chế hạn chế này, làm giảm mạnh giá trị IoU trung bình toàn bộ tập mẫu.</w:t>
       </w:r>
     </w:p>
@@ -11286,11 +11471,7 @@
         <w:t>primary key</w:t>
       </w:r>
       <w:r>
-        <w:t xml:space="preserve">) liên kết trực tiếp tới bản ghi cấp </w:t>
-      </w:r>
-      <w:r>
-        <w:lastRenderedPageBreak/>
-        <w:t>phát (</w:t>
+        <w:t>) liên kết trực tiếp tới bản ghi cấp phát (</w:t>
       </w:r>
       <w:r>
         <w:rPr>
@@ -11315,6 +11496,7 @@
           <w:b/>
           <w:bCs/>
         </w:rPr>
+        <w:lastRenderedPageBreak/>
         <w:t>Cấp độ C, năng lực trên hệ thống thật:</w:t>
       </w:r>
       <w:r>
@@ -11414,11 +11596,14 @@
         <w:rPr>
           <w:rStyle w:val="VerbatimChar"/>
         </w:rPr>
+        <w:t>services/api/splitbind/documents/views.py: L200-L203</w:t>
+      </w:r>
+      <w:r>
+        <w:t xml:space="preserve">). Việc truy vết chưa bao giờ bị ảnh hưởng, vì bên nhận nhận dạng định dạng </w:t>
+      </w:r>
+      <w:r>
         <w:lastRenderedPageBreak/>
-        <w:t>services/api/splitbind/documents/views.py: L200-L203</w:t>
-      </w:r>
-      <w:r>
-        <w:t>). Việc truy vết chưa bao giờ bị ảnh hưởng, vì bên nhận nhận dạng định dạng bằng chuỗi byte mở đầu tệp chứ không bằng phần mở rộng (</w:t>
+        <w:t>bằng chuỗi byte mở đầu tệp chứ không bằng phần mở rộng (</w:t>
       </w:r>
       <w:r>
         <w:rPr>
@@ -11960,52 +12145,52 @@
         <w:rPr>
           <w:rStyle w:val="VerbatimChar"/>
         </w:rPr>
+        <w:t xml:space="preserve">     </w:t>
+      </w:r>
+      <w:r>
+        <w:rPr>
+          <w:rStyle w:val="VerbatimChar"/>
+        </w:rPr>
+        <w:t>▼</w:t>
+      </w:r>
+      <w:r>
+        <w:br/>
+      </w:r>
+      <w:r>
+        <w:rPr>
+          <w:rStyle w:val="VerbatimChar"/>
+        </w:rPr>
+        <w:t xml:space="preserve">   </w:t>
+      </w:r>
+      <w:r>
+        <w:rPr>
+          <w:rStyle w:val="VerbatimChar"/>
+        </w:rPr>
+        <w:t xml:space="preserve"> Ed25519 Private Key Signing</w:t>
+      </w:r>
+      <w:r>
+        <w:br/>
+      </w:r>
+      <w:r>
+        <w:rPr>
+          <w:rStyle w:val="VerbatimChar"/>
+        </w:rPr>
+        <w:t xml:space="preserve">     </w:t>
+      </w:r>
+      <w:r>
+        <w:rPr>
+          <w:rStyle w:val="VerbatimChar"/>
+        </w:rPr>
+        <w:t>│</w:t>
+      </w:r>
+      <w:r>
+        <w:br/>
+      </w:r>
+      <w:r>
+        <w:rPr>
+          <w:rStyle w:val="VerbatimChar"/>
+        </w:rPr>
         <w:lastRenderedPageBreak/>
-        <w:t xml:space="preserve">     </w:t>
-      </w:r>
-      <w:r>
-        <w:rPr>
-          <w:rStyle w:val="VerbatimChar"/>
-        </w:rPr>
-        <w:t>▼</w:t>
-      </w:r>
-      <w:r>
-        <w:br/>
-      </w:r>
-      <w:r>
-        <w:rPr>
-          <w:rStyle w:val="VerbatimChar"/>
-        </w:rPr>
-        <w:t xml:space="preserve">   </w:t>
-      </w:r>
-      <w:r>
-        <w:rPr>
-          <w:rStyle w:val="VerbatimChar"/>
-        </w:rPr>
-        <w:t xml:space="preserve"> Ed25519 Private Key Signing</w:t>
-      </w:r>
-      <w:r>
-        <w:br/>
-      </w:r>
-      <w:r>
-        <w:rPr>
-          <w:rStyle w:val="VerbatimChar"/>
-        </w:rPr>
-        <w:t xml:space="preserve">     </w:t>
-      </w:r>
-      <w:r>
-        <w:rPr>
-          <w:rStyle w:val="VerbatimChar"/>
-        </w:rPr>
-        <w:t>│</w:t>
-      </w:r>
-      <w:r>
-        <w:br/>
-      </w:r>
-      <w:r>
-        <w:rPr>
-          <w:rStyle w:val="VerbatimChar"/>
-        </w:rPr>
         <w:t xml:space="preserve">     </w:t>
       </w:r>
       <w:r>
@@ -12064,7 +12249,33 @@
         <w:t>output_sha256</w:t>
       </w:r>
       <w:r>
-        <w:t>). Dưới các giả định an toàn mật mã của SHA-256 (hiệu ứng thác lũ và tính kháng va chạm), bất kỳ sự thay đổi bit nào trên tệp PDF đều được kỳ vọng về mặt thống kê sẽ tạo ra bản tóm lược (digest) khác biệt hoàn toàn.</w:t>
+        <w:t>)</w:t>
+      </w:r>
+      <w:r>
+        <w:t xml:space="preserve"> </w:t>
+      </w:r>
+      <w:sdt>
+        <w:sdtPr>
+          <w:tag w:val="MENDELEY_CITATION_v3_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"/>
+          <w:id w:val="1570762893"/>
+          <w:placeholder>
+            <w:docPart w:val="DefaultPlaceholder_-1854013440"/>
+          </w:placeholder>
+        </w:sdtPr>
+        <w:sdtContent>
+          <w:r>
+            <w:rPr>
+              <w:color w:val="000000"/>
+            </w:rPr>
+            <w:t>[10]</w:t>
+          </w:r>
+        </w:sdtContent>
+      </w:sdt>
+      <w:r>
+        <w:t xml:space="preserve">. </w:t>
+      </w:r>
+      <w:r>
+        <w:t>Dưới các giả định an toàn mật mã của SHA-256 (hiệu ứng thác lũ và tính kháng va chạm), bất kỳ sự thay đổi bit nào trên tệp PDF đều được kỳ vọng về mặt thống kê sẽ tạo ra bản tóm lược (digest) khác biệt hoàn toàn.</w:t>
       </w:r>
     </w:p>
     <w:p>
@@ -12083,7 +12294,33 @@
         <w:t>Vai trò của Ed25519:</w:t>
       </w:r>
       <w:r>
-        <w:t xml:space="preserve"> Chữ ký số hiệu năng cao trên đường cong Edwards 25519 (RFC 8032). Ký trên biểu diễn chuẩn hóa RFC 8785 để xác thực nguồn gốc cơ quan phát hành và bảo vệ tính toàn vẹn của hồ sơ truy vết. Về mặt mật mã học, chữ ký số cung cấp đặc tính chống chối bỏ kỹ thuật (cryptographic non-repudiation); giá trị chứng cứ pháp lý ràng buộc trong thực tế phụ thuộc vào quy trình định danh chủ thể, quản lý khóa riêng và chính sách chứng thư theo khuôn khổ pháp luật hiện hành.</w:t>
+        <w:t xml:space="preserve"> Chữ ký số hiệu năng cao trên đường cong Edwards 25519 (RFC 8032)</w:t>
+      </w:r>
+      <w:r>
+        <w:t xml:space="preserve"> </w:t>
+      </w:r>
+      <w:sdt>
+        <w:sdtPr>
+          <w:tag w:val="MENDELEY_CITATION_v3_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"/>
+          <w:id w:val="629443298"/>
+          <w:placeholder>
+            <w:docPart w:val="DefaultPlaceholder_-1854013440"/>
+          </w:placeholder>
+        </w:sdtPr>
+        <w:sdtContent>
+          <w:r>
+            <w:rPr>
+              <w:color w:val="000000"/>
+            </w:rPr>
+            <w:t>[11]</w:t>
+          </w:r>
+        </w:sdtContent>
+      </w:sdt>
+      <w:r>
+        <w:t xml:space="preserve">. </w:t>
+      </w:r>
+      <w:r>
+        <w:t>Ký trên biểu diễn chuẩn hóa RFC 8785 để xác thực nguồn gốc cơ quan phát hành và bảo vệ tính toàn vẹn của hồ sơ truy vết. Về mặt mật mã học, chữ ký số cung cấp đặc tính chống chối bỏ kỹ thuật (cryptographic non-repudiation); giá trị chứng cứ pháp lý ràng buộc trong thực tế phụ thuộc vào quy trình định danh chủ thể, quản lý khóa riêng và chính sách chứng thư theo khuôn khổ pháp luật hiện hành.</w:t>
       </w:r>
     </w:p>
     <w:p>
@@ -12102,7 +12339,30 @@
         <w:t>Chuẩn hóa RFC 8785 JCS:</w:t>
       </w:r>
       <w:r>
-        <w:t xml:space="preserve"> Tạo biểu diễn JSON xác định / chuẩn tắc (canonical representation) độc lập với thư viện tuần tự hóa, bảo đảm đầu vào của hàm băm và chữ ký số luôn ổn định, lặp lại được (deterministic input for hashing and signing).</w:t>
+        <w:t xml:space="preserve"> Tạo biểu diễn JSON xác định / chuẩn tắc (canonical representation) độc lập với thư viện tuần tự hóa, bảo đảm đầu vào của hàm băm và chữ ký số luôn ổn định, lặp lại được (deterministic input for hashing and signing)</w:t>
+      </w:r>
+      <w:r>
+        <w:t xml:space="preserve"> </w:t>
+      </w:r>
+      <w:sdt>
+        <w:sdtPr>
+          <w:tag w:val="MENDELEY_CITATION_v3_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"/>
+          <w:id w:val="-1779482534"/>
+          <w:placeholder>
+            <w:docPart w:val="DefaultPlaceholder_-1854013440"/>
+          </w:placeholder>
+        </w:sdtPr>
+        <w:sdtContent>
+          <w:r>
+            <w:rPr>
+              <w:color w:val="000000"/>
+            </w:rPr>
+            <w:t>[12]</w:t>
+          </w:r>
+        </w:sdtContent>
+      </w:sdt>
+      <w:r>
+        <w:t>.</w:t>
       </w:r>
     </w:p>
     <w:p>
@@ -12187,11 +12447,14 @@
           <w:b/>
           <w:bCs/>
         </w:rPr>
+        <w:t>Không có mâu thuẫn về thứ tự thực thi trong kiến trúc tích hợp đề xuất:</w:t>
+      </w:r>
+      <w:r>
+        <w:t xml:space="preserve"> Quy trình cấp phát nhúng thủy vân vào tài liệu trước, sau đó mới tính toán mã băm SHA-256 trên tài liệu đã mang thủy vân, đóng </w:t>
+      </w:r>
+      <w:r>
         <w:lastRenderedPageBreak/>
-        <w:t>Không có mâu thuẫn về thứ tự thực thi trong kiến trúc tích hợp đề xuất:</w:t>
-      </w:r>
-      <w:r>
-        <w:t xml:space="preserve"> Quy trình cấp phát nhúng thủy vân vào tài liệu trước, sau đó mới tính toán mã băm SHA-256 trên tài liệu đã mang thủy vân, đóng gói vào manifest và thực hiện ký số Ed25519 trên biểu diễn chuẩn tắc RFC 8785:</w:t>
+        <w:t>gói vào manifest và thực hiện ký số Ed25519 trên biểu diễn chuẩn tắc RFC 8785:</w:t>
       </w:r>
     </w:p>
     <w:p>
@@ -12677,20 +12940,20 @@
         <w:t>Kênh rò rỉ có biến đổi:</w:t>
       </w:r>
       <w:r>
-        <w:t xml:space="preserve"> Nếu tài liệu bị in ra giấy, chụp màn hình, hoặc nén gửi qua mạng xã hội, tệp bị biến đổi các byte </w:t>
+        <w:t xml:space="preserve"> Nếu tài liệu bị in ra giấy, chụp màn hình, hoặc nén gửi qua mạng xã hội, tệp bị biến đổi các byte nhị phân thô nên mã băm của tệp nghi vấn sẽ không còn khớp với </w:t>
+      </w:r>
+      <w:r>
+        <w:rPr>
+          <w:rStyle w:val="VerbatimChar"/>
+        </w:rPr>
+        <w:t>output_sha256</w:t>
+      </w:r>
+      <w:r>
+        <w:t xml:space="preserve"> ghi trong manifest. Bản thân chữ ký Ed25519 trên manifest gốc vẫn hoàn toàn hợp lệ (chứng minh </w:t>
       </w:r>
       <w:r>
         <w:lastRenderedPageBreak/>
-        <w:t xml:space="preserve">nhị phân thô nên mã băm của tệp nghi vấn sẽ không còn khớp với </w:t>
-      </w:r>
-      <w:r>
-        <w:rPr>
-          <w:rStyle w:val="VerbatimChar"/>
-        </w:rPr>
-        <w:t>output_sha256</w:t>
-      </w:r>
-      <w:r>
-        <w:t xml:space="preserve"> ghi trong manifest. Bản thân chữ ký Ed25519 trên manifest gốc vẫn hoàn toàn hợp lệ (chứng minh manifest không bị giả mạo), nhưng giá trị hash trong đó xác nhận tệp nghi vấn không phải là tệp nguyên bản phát hành. Về mặt lý thuyết thiết kế, thủy vân số bền vững được kỳ vọng đóng vai trò là cơ chế chủ động (proactive) sống sót qua biến đổi tín hiệu để trích xuất lại </w:t>
+        <w:t xml:space="preserve">manifest không bị giả mạo), nhưng giá trị hash trong đó xác nhận tệp nghi vấn không phải là tệp nguyên bản phát hành. Về mặt lý thuyết thiết kế, thủy vân số bền vững được kỳ vọng đóng vai trò là cơ chế chủ động (proactive) sống sót qua biến đổi tín hiệu để trích xuất lại </w:t>
       </w:r>
       <w:r>
         <w:rPr>
@@ -12790,7 +13053,6 @@
         </w:numPr>
       </w:pPr>
       <w:r>
-        <w:lastRenderedPageBreak/>
         <w:t xml:space="preserve">Khi phân hệ thủy vân đang bật, như trên hệ thống hiện chạy, mã hạn chế là </w:t>
       </w:r>
       <w:r>
@@ -12812,6 +13074,7 @@
         </w:numPr>
       </w:pPr>
       <w:r>
+        <w:lastRenderedPageBreak/>
         <w:t xml:space="preserve">Khi phân hệ thủy vân tắt, mã hạn chế là </w:t>
       </w:r>
       <w:r>
@@ -12972,11 +13235,7 @@
         <w:t>:</w:t>
       </w:r>
       <w:r>
-        <w:t xml:space="preserve"> trong một giai đoạn, câu thông báo phạm vi nói thiếu so với việc hệ thống thực sự làm. Giao diện được đóng gói trước khi phân hệ truy vết được bật nên chỉ nhắc tới SHA-256 và chữ ký, trong khi phía sau đã chạy thêm bộ giải mã thủy vân ở mỗi lần xác minh. Bản đang chạy sửa điều đó, và sửa theo hướng không cứng nhắc: câu thông báo phạm vi được chọn ngay lúc hiển thị dựa trên danh sách mã hạn chế mà chính hệ thống trả về, chứ không phải một câu viết cứng trong giao diện. Khi </w:t>
-      </w:r>
-      <w:r>
-        <w:lastRenderedPageBreak/>
-        <w:t>phân hệ thủy vân bật, giao diện nói rõ nó làm hai việc là đối chiếu mã băm và đọc thủy vân; khi tắt, nó trở lại câu cũ. Nhờ vậy giao diện không thể mô tả sai năng lực của hệ thống, kể cả khi cấu hình đổi về sau.</w:t>
+        <w:t xml:space="preserve"> trong một giai đoạn, câu thông báo phạm vi nói thiếu so với việc hệ thống thực sự làm. Giao diện được đóng gói trước khi phân hệ truy vết được bật nên chỉ nhắc tới SHA-256 và chữ ký, trong khi phía sau đã chạy thêm bộ giải mã thủy vân ở mỗi lần xác minh. Bản đang chạy sửa điều đó, và sửa theo hướng không cứng nhắc: câu thông báo phạm vi được chọn ngay lúc hiển thị dựa trên danh sách mã hạn chế mà chính hệ thống trả về, chứ không phải một câu viết cứng trong giao diện. Khi phân hệ thủy vân bật, giao diện nói rõ nó làm hai việc là đối chiếu mã băm và đọc thủy vân; khi tắt, nó trở lại câu cũ. Nhờ vậy giao diện không thể mô tả sai năng lực của hệ thống, kể cả khi cấu hình đổi về sau.</w:t>
       </w:r>
     </w:p>
     <w:p>
@@ -12988,6 +13247,7 @@
       <w:bookmarkEnd w:id="53"/>
       <w:bookmarkEnd w:id="61"/>
       <w:r>
+        <w:lastRenderedPageBreak/>
         <w:t>3.2. So sánh với các kỹ thuật xác minh bảo vệ tính toàn vẹn khác</w:t>
       </w:r>
       <w:bookmarkEnd w:id="62"/>
@@ -13008,7 +13268,7 @@
       </w:r>
       <w:sdt>
         <w:sdtPr>
-          <w:tag w:val="MENDELEY_CITATION_v3_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"/>
+          <w:tag w:val="MENDELEY_CITATION_v3_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"/>
           <w:id w:val="425471643"/>
           <w:placeholder>
             <w:docPart w:val="DefaultPlaceholder_-1854013440"/>
@@ -13019,7 +13279,7 @@
             <w:rPr>
               <w:color w:val="000000"/>
             </w:rPr>
-            <w:t>[3]</w:t>
+            <w:t>[13]</w:t>
           </w:r>
         </w:sdtContent>
       </w:sdt>
@@ -13054,7 +13314,7 @@
       </w:r>
       <w:sdt>
         <w:sdtPr>
-          <w:tag w:val="MENDELEY_CITATION_v3_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"/>
+          <w:tag w:val="MENDELEY_CITATION_v3_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"/>
           <w:id w:val="402492951"/>
           <w:placeholder>
             <w:docPart w:val="DefaultPlaceholder_-1854013440"/>
@@ -13065,7 +13325,7 @@
             <w:rPr>
               <w:color w:val="000000"/>
             </w:rPr>
-            <w:t>[4]</w:t>
+            <w:t>[14]</w:t>
           </w:r>
         </w:sdtContent>
       </w:sdt>
@@ -13077,7 +13337,7 @@
       </w:r>
       <w:sdt>
         <w:sdtPr>
-          <w:tag w:val="MENDELEY_CITATION_v3_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"/>
+          <w:tag w:val="MENDELEY_CITATION_v3_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"/>
           <w:id w:val="-457031465"/>
           <w:placeholder>
             <w:docPart w:val="DefaultPlaceholder_-1854013440"/>
@@ -13088,7 +13348,7 @@
             <w:rPr>
               <w:color w:val="000000"/>
             </w:rPr>
-            <w:t>[5]</w:t>
+            <w:t>[15]</w:t>
           </w:r>
         </w:sdtContent>
       </w:sdt>
@@ -13389,11 +13649,7 @@
               <w:spacing w:line="240" w:lineRule="auto"/>
             </w:pPr>
             <w:r>
-              <w:t xml:space="preserve">Không chịu được biến đổi thông điệp: tag cũ sẽ không còn xác minh cho thông điệp mới dưới giả định an </w:t>
-            </w:r>
-            <w:r>
-              <w:lastRenderedPageBreak/>
-              <w:t>toàn của MAC.</w:t>
+              <w:t>Không chịu được biến đổi thông điệp: tag cũ sẽ không còn xác minh cho thông điệp mới dưới giả định an toàn của MAC.</w:t>
             </w:r>
           </w:p>
         </w:tc>
@@ -13407,7 +13663,6 @@
               <w:spacing w:line="240" w:lineRule="auto"/>
             </w:pPr>
             <w:r>
-              <w:lastRenderedPageBreak/>
               <w:t>Không: Phép xác minh tệp thất bại khi có bất kỳ biến đổi byte nào (digest không khớp).</w:t>
             </w:r>
           </w:p>
@@ -13470,7 +13725,15 @@
                 <w:b/>
                 <w:bCs/>
               </w:rPr>
-              <w:t>3. Khả năng định vị vùng sửa</w:t>
+              <w:t xml:space="preserve">3. Khả năng </w:t>
+            </w:r>
+            <w:r>
+              <w:rPr>
+                <w:b/>
+                <w:bCs/>
+              </w:rPr>
+              <w:lastRenderedPageBreak/>
+              <w:t>định vị vùng sửa</w:t>
             </w:r>
           </w:p>
         </w:tc>
@@ -13484,7 +13747,12 @@
               <w:spacing w:line="240" w:lineRule="auto"/>
             </w:pPr>
             <w:r>
-              <w:t>Không hỗ trợ (chỉ biết mã băm không khớp).</w:t>
+              <w:lastRenderedPageBreak/>
+              <w:t xml:space="preserve">Không hỗ trợ (chỉ biết mã </w:t>
+            </w:r>
+            <w:r>
+              <w:lastRenderedPageBreak/>
+              <w:t>băm không khớp).</w:t>
             </w:r>
           </w:p>
         </w:tc>
@@ -13498,7 +13766,12 @@
               <w:spacing w:line="240" w:lineRule="auto"/>
             </w:pPr>
             <w:r>
-              <w:t>Không hỗ trợ (chỉ biết thẻ MAC không hợp lệ).</w:t>
+              <w:lastRenderedPageBreak/>
+              <w:t xml:space="preserve">Không hỗ trợ (chỉ biết thẻ </w:t>
+            </w:r>
+            <w:r>
+              <w:lastRenderedPageBreak/>
+              <w:t>MAC không hợp lệ).</w:t>
             </w:r>
           </w:p>
         </w:tc>
@@ -13512,7 +13785,12 @@
               <w:spacing w:line="240" w:lineRule="auto"/>
             </w:pPr>
             <w:r>
-              <w:t>Không hỗ trợ (chỉ biết chữ ký không hợp lệ).</w:t>
+              <w:lastRenderedPageBreak/>
+              <w:t xml:space="preserve">Không hỗ trợ (chỉ biết chữ </w:t>
+            </w:r>
+            <w:r>
+              <w:lastRenderedPageBreak/>
+              <w:t>ký không hợp lệ).</w:t>
             </w:r>
           </w:p>
         </w:tc>
@@ -13526,7 +13804,12 @@
               <w:spacing w:line="240" w:lineRule="auto"/>
             </w:pPr>
             <w:r>
-              <w:t>Không hỗ trợ (chỉ giải mã định danh nhúng).</w:t>
+              <w:lastRenderedPageBreak/>
+              <w:t xml:space="preserve">Không hỗ trợ (chỉ giải mã </w:t>
+            </w:r>
+            <w:r>
+              <w:lastRenderedPageBreak/>
+              <w:t>định danh nhúng).</w:t>
             </w:r>
           </w:p>
         </w:tc>
@@ -13540,7 +13823,12 @@
               <w:spacing w:line="240" w:lineRule="auto"/>
             </w:pPr>
             <w:r>
-              <w:t>Có hỗ trợ: Xuất tọa độ vùng nghi vấn.</w:t>
+              <w:lastRenderedPageBreak/>
+              <w:t xml:space="preserve">Có hỗ trợ: Xuất tọa độ </w:t>
+            </w:r>
+            <w:r>
+              <w:lastRenderedPageBreak/>
+              <w:t>vùng nghi vấn.</w:t>
             </w:r>
           </w:p>
         </w:tc>
@@ -13554,6 +13842,7 @@
               <w:spacing w:line="240" w:lineRule="auto"/>
             </w:pPr>
             <w:r>
+              <w:lastRenderedPageBreak/>
               <w:t>Không hỗ trợ.</w:t>
             </w:r>
           </w:p>
@@ -13706,11 +13995,7 @@
               <w:spacing w:line="240" w:lineRule="auto"/>
             </w:pPr>
             <w:r>
-              <w:t xml:space="preserve">Cố định theo hàm băm nền (HMAC-SHA256: 32 B, có </w:t>
-            </w:r>
-            <w:r>
-              <w:lastRenderedPageBreak/>
-              <w:t>thể cắt ngắn thẻ).</w:t>
+              <w:t>Cố định theo hàm băm nền (HMAC-SHA256: 32 B, có thể cắt ngắn thẻ).</w:t>
             </w:r>
           </w:p>
         </w:tc>
@@ -13724,12 +14009,7 @@
               <w:spacing w:line="240" w:lineRule="auto"/>
             </w:pPr>
             <w:r>
-              <w:lastRenderedPageBreak/>
-              <w:t>Cố định theo thuật toán (Ed25519: 64 B; RSA-</w:t>
-            </w:r>
-            <w:r>
-              <w:lastRenderedPageBreak/>
-              <w:t>2048: 256 B).</w:t>
+              <w:t>Cố định theo thuật toán (Ed25519: 64 B; RSA-2048: 256 B).</w:t>
             </w:r>
           </w:p>
         </w:tc>
@@ -13743,12 +14023,7 @@
               <w:spacing w:line="240" w:lineRule="auto"/>
             </w:pPr>
             <w:r>
-              <w:lastRenderedPageBreak/>
-              <w:t>Rất nhỏ (vài byte đến vài chục byte; SplitBind</w:t>
-            </w:r>
-            <w:r>
-              <w:lastRenderedPageBreak/>
-              <w:t>: 23 bytes).</w:t>
+              <w:t>Rất nhỏ (vài byte đến vài chục byte; SplitBind: 23 bytes).</w:t>
             </w:r>
           </w:p>
         </w:tc>
@@ -13762,7 +14037,6 @@
               <w:spacing w:line="240" w:lineRule="auto"/>
             </w:pPr>
             <w:r>
-              <w:lastRenderedPageBreak/>
               <w:t xml:space="preserve">Nhỏ đến trung bình (thẻ xác thực theo khối </w:t>
             </w:r>
             <m:oMath>
@@ -13770,7 +14044,6 @@
                 <w:rPr>
                   <w:rFonts w:ascii="Cambria Math" w:hAnsi="Cambria Math"/>
                 </w:rPr>
-                <w:lastRenderedPageBreak/>
                 <m:t>128</m:t>
               </m:r>
               <m:r>
@@ -13804,12 +14077,11 @@
               <w:spacing w:line="240" w:lineRule="auto"/>
             </w:pPr>
             <w:r>
+              <w:t xml:space="preserve">Linh hoạt theo thiết kế (tối ưu hóa đánh đổi giữa dung lượng và khả năng chống phân tích ẩn mật / </w:t>
+            </w:r>
+            <w:r>
               <w:lastRenderedPageBreak/>
-              <w:t xml:space="preserve">Linh hoạt theo thiết kế (tối ưu hóa đánh đổi giữa dung </w:t>
-            </w:r>
-            <w:r>
-              <w:lastRenderedPageBreak/>
-              <w:t>lượng và khả năng chống phân tích ẩn mật / steganalysis).</w:t>
+              <w:t>steganalysis).</w:t>
             </w:r>
           </w:p>
         </w:tc>
@@ -14032,7 +14304,6 @@
       <w:bookmarkStart w:id="67" w:name="Xe7db50e2b15f38fb2460a20c566d37b6de66f7f"/>
       <w:bookmarkEnd w:id="65"/>
       <w:r>
-        <w:lastRenderedPageBreak/>
         <w:t>3.2.2. Phân tích tương phản chuyên sâu giữa các cặp kỹ thuật</w:t>
       </w:r>
       <w:bookmarkEnd w:id="66"/>
@@ -14094,6 +14365,7 @@
           <w:i/>
           <w:iCs/>
         </w:rPr>
+        <w:lastRenderedPageBreak/>
         <w:t>Giấu tin mật:</w:t>
       </w:r>
       <w:r>
@@ -14164,11 +14436,11 @@
         <w:t>Thủy vân số:</w:t>
       </w:r>
       <w:r>
-        <w:t xml:space="preserve"> Tồn tại trên kênh tín hiệu trực quan. Về mặt lý thuyết thiết kế, thủy vân bền vững hướng tới cung cấp cơ chế trích xuất định danh để làm cầu nối đối chiếu ngay cả khi tài liệu đã bị biến đổi qua kênh tương tự: cắt xén, in ra rồi quét lại, chụp lại màn hình. Trong thực nghiệm của SplitBind, </w:t>
+        <w:t xml:space="preserve"> Tồn tại trên kênh tín hiệu trực quan. Về mặt lý thuyết thiết kế, thủy vân bền vững hướng tới cung cấp cơ chế trích xuất định danh để làm cầu nối đối chiếu ngay cả khi tài liệu đã bị biến đổi qua kênh tương tự: cắt xén, in ra rồi quét lại, chụp lại màn hình. Trong thực nghiệm của SplitBind, năng lực này phụ thuộc thế hệ thuật toán. Ở thế hệ V1, giải mã bị phá vỡ hoàn toàn trước JPEG-70 và Resize-0.75 (0/12 cả hai) và chỉ khôi phục một phần dưới Crop-0.25. Ở thế hệ nghiên cứu V3, đo trên đúng cùng corpus và cùng bộ cổng, giải mã đạt 9/12 với JPEG-70, 9/12 với Crop-0.25 và 8/12 với Resize-0.75; đáng chú ý là JPEG-70 và Crop-0.25 không gây mất mát nào so với kênh không bị tấn công (chi tiết phân rã ở Mục 4.2.1). Dù vậy V3 vẫn </w:t>
       </w:r>
       <w:r>
         <w:lastRenderedPageBreak/>
-        <w:t xml:space="preserve">năng lực này phụ thuộc thế hệ thuật toán. Ở thế hệ V1, giải mã bị phá vỡ hoàn toàn trước JPEG-70 và Resize-0.75 (0/12 cả hai) và chỉ khôi phục một phần dưới Crop-0.25. Ở thế hệ nghiên cứu V3, đo trên đúng cùng corpus và cùng bộ cổng, giải mã đạt 9/12 với JPEG-70, 9/12 với Crop-0.25 và 8/12 với Resize-0.75; đáng chú ý là JPEG-70 và Crop-0.25 không gây mất mát nào so với kênh không bị tấn công (chi tiết phân rã ở Mục 4.2.1). Dù vậy V3 vẫn không đạt cổng phát hành 0.95 và mang phạm vi bằng chứng </w:t>
+        <w:t xml:space="preserve">không đạt cổng phát hành 0.95 và mang phạm vi bằng chứng </w:t>
       </w:r>
       <w:r>
         <w:rPr>
@@ -14435,262 +14707,262 @@
         <w:rPr>
           <w:rStyle w:val="VerbatimChar"/>
         </w:rPr>
+        <w:t xml:space="preserve"> </w:t>
+      </w:r>
+      <w:r>
+        <w:rPr>
+          <w:rStyle w:val="VerbatimChar"/>
+        </w:rPr>
+        <w:t xml:space="preserve"> (apps/web - Vite)</w:t>
+      </w:r>
+      <w:r>
+        <w:rPr>
+          <w:rStyle w:val="VerbatimChar"/>
+        </w:rPr>
+        <w:t xml:space="preserve">  </w:t>
+      </w:r>
+      <w:r>
+        <w:rPr>
+          <w:rStyle w:val="VerbatimChar"/>
+        </w:rPr>
+        <w:t xml:space="preserve"> </w:t>
+      </w:r>
+      <w:r>
+        <w:rPr>
+          <w:rStyle w:val="VerbatimChar"/>
+        </w:rPr>
+        <w:t>(services/api)</w:t>
+      </w:r>
+      <w:r>
+        <w:br/>
+      </w:r>
+      <w:r>
+        <w:rPr>
+          <w:rStyle w:val="VerbatimChar"/>
+        </w:rPr>
+        <w:t xml:space="preserve">  </w:t>
+      </w:r>
+      <w:r>
+        <w:rPr>
+          <w:rStyle w:val="VerbatimChar"/>
+        </w:rPr>
+        <w:t xml:space="preserve"> </w:t>
+      </w:r>
+      <w:r>
+        <w:rPr>
+          <w:rStyle w:val="VerbatimChar"/>
+        </w:rPr>
+        <w:t>│</w:t>
+      </w:r>
+      <w:r>
+        <w:rPr>
+          <w:rStyle w:val="VerbatimChar"/>
+        </w:rPr>
+        <w:t xml:space="preserve">    </w:t>
+      </w:r>
+      <w:r>
+        <w:rPr>
+          <w:rStyle w:val="VerbatimChar"/>
+        </w:rPr>
+        <w:t xml:space="preserve"> </w:t>
+      </w:r>
+      <w:r>
+        <w:rPr>
+          <w:rStyle w:val="VerbatimChar"/>
+        </w:rPr>
+        <w:t>│</w:t>
+      </w:r>
+      <w:r>
+        <w:br/>
+      </w:r>
+      <w:r>
+        <w:rPr>
+          <w:rStyle w:val="VerbatimChar"/>
+        </w:rPr>
+        <w:t xml:space="preserve">  </w:t>
+      </w:r>
+      <w:r>
+        <w:rPr>
+          <w:rStyle w:val="VerbatimChar"/>
+        </w:rPr>
+        <w:t xml:space="preserve"> </w:t>
+      </w:r>
+      <w:r>
+        <w:rPr>
+          <w:rStyle w:val="VerbatimChar"/>
+        </w:rPr>
+        <w:t>│</w:t>
+      </w:r>
+      <w:r>
+        <w:rPr>
+          <w:rStyle w:val="VerbatimChar"/>
+        </w:rPr>
+        <w:t xml:space="preserve">   </w:t>
+      </w:r>
+      <w:r>
+        <w:rPr>
+          <w:rStyle w:val="VerbatimChar"/>
+        </w:rPr>
+        <w:t xml:space="preserve"> </w:t>
+      </w:r>
+      <w:r>
+        <w:rPr>
+          <w:rStyle w:val="VerbatimChar"/>
+        </w:rPr>
+        <w:t>Database Queries</w:t>
+      </w:r>
+      <w:r>
+        <w:br/>
+      </w:r>
+      <w:r>
+        <w:rPr>
+          <w:rStyle w:val="VerbatimChar"/>
+        </w:rPr>
+        <w:t xml:space="preserve">  </w:t>
+      </w:r>
+      <w:r>
+        <w:rPr>
+          <w:rStyle w:val="VerbatimChar"/>
+        </w:rPr>
+        <w:t xml:space="preserve"> </w:t>
+      </w:r>
+      <w:r>
+        <w:rPr>
+          <w:rStyle w:val="VerbatimChar"/>
+        </w:rPr>
+        <w:t>│</w:t>
+      </w:r>
+      <w:r>
+        <w:rPr>
+          <w:rStyle w:val="VerbatimChar"/>
+        </w:rPr>
+        <w:t xml:space="preserve">    </w:t>
+      </w:r>
+      <w:r>
+        <w:rPr>
+          <w:rStyle w:val="VerbatimChar"/>
+        </w:rPr>
+        <w:t xml:space="preserve"> </w:t>
+      </w:r>
+      <w:r>
+        <w:rPr>
+          <w:rStyle w:val="VerbatimChar"/>
+        </w:rPr>
+        <w:t>▼</w:t>
+      </w:r>
+      <w:r>
+        <w:br/>
+      </w:r>
+      <w:r>
+        <w:rPr>
+          <w:rStyle w:val="VerbatimChar"/>
+        </w:rPr>
+        <w:t xml:space="preserve">  </w:t>
+      </w:r>
+      <w:r>
+        <w:rPr>
+          <w:rStyle w:val="VerbatimChar"/>
+        </w:rPr>
+        <w:t xml:space="preserve"> </w:t>
+      </w:r>
+      <w:r>
+        <w:rPr>
+          <w:rStyle w:val="VerbatimChar"/>
+        </w:rPr>
+        <w:t>│</w:t>
+      </w:r>
+      <w:r>
+        <w:rPr>
+          <w:rStyle w:val="VerbatimChar"/>
+        </w:rPr>
+        <w:t xml:space="preserve">   </w:t>
+      </w:r>
+      <w:r>
+        <w:rPr>
+          <w:rStyle w:val="VerbatimChar"/>
+        </w:rPr>
+        <w:t>[ Neon PostgreSQL 18 ]</w:t>
+      </w:r>
+      <w:r>
+        <w:br/>
+      </w:r>
+      <w:r>
+        <w:rPr>
+          <w:rStyle w:val="VerbatimChar"/>
+        </w:rPr>
+        <w:t xml:space="preserve">  </w:t>
+      </w:r>
+      <w:r>
+        <w:rPr>
+          <w:rStyle w:val="VerbatimChar"/>
+        </w:rPr>
+        <w:t xml:space="preserve"> </w:t>
+      </w:r>
+      <w:r>
+        <w:rPr>
+          <w:rStyle w:val="VerbatimChar"/>
+        </w:rPr>
+        <w:t>│</w:t>
+      </w:r>
+      <w:r>
+        <w:rPr>
+          <w:rStyle w:val="VerbatimChar"/>
+        </w:rPr>
+        <w:t xml:space="preserve">   </w:t>
+      </w:r>
+      <w:r>
+        <w:rPr>
+          <w:rStyle w:val="VerbatimChar"/>
+        </w:rPr>
+        <w:t xml:space="preserve"> (Metadata &amp; Manifests)</w:t>
+      </w:r>
+      <w:r>
+        <w:br/>
+      </w:r>
+      <w:r>
+        <w:rPr>
+          <w:rStyle w:val="VerbatimChar"/>
+        </w:rPr>
+        <w:t xml:space="preserve">  </w:t>
+      </w:r>
+      <w:r>
+        <w:rPr>
+          <w:rStyle w:val="VerbatimChar"/>
+        </w:rPr>
+        <w:t xml:space="preserve"> </w:t>
+      </w:r>
+      <w:r>
+        <w:rPr>
+          <w:rStyle w:val="VerbatimChar"/>
+        </w:rPr>
+        <w:t>│</w:t>
+      </w:r>
+      <w:r>
+        <w:rPr>
+          <w:rStyle w:val="VerbatimChar"/>
+        </w:rPr>
+        <w:t xml:space="preserve">    </w:t>
+      </w:r>
+      <w:r>
+        <w:rPr>
+          <w:rStyle w:val="VerbatimChar"/>
+        </w:rPr>
+        <w:t xml:space="preserve"> </w:t>
+      </w:r>
+      <w:r>
+        <w:rPr>
+          <w:rStyle w:val="VerbatimChar"/>
+        </w:rPr>
+        <w:t>│</w:t>
+      </w:r>
+      <w:r>
+        <w:br/>
+      </w:r>
+      <w:r>
+        <w:rPr>
+          <w:rStyle w:val="VerbatimChar"/>
+        </w:rPr>
         <w:lastRenderedPageBreak/>
-        <w:t xml:space="preserve"> </w:t>
-      </w:r>
-      <w:r>
-        <w:rPr>
-          <w:rStyle w:val="VerbatimChar"/>
-        </w:rPr>
-        <w:t xml:space="preserve"> (apps/web - Vite)</w:t>
-      </w:r>
-      <w:r>
-        <w:rPr>
-          <w:rStyle w:val="VerbatimChar"/>
-        </w:rPr>
-        <w:t xml:space="preserve">  </w:t>
-      </w:r>
-      <w:r>
-        <w:rPr>
-          <w:rStyle w:val="VerbatimChar"/>
-        </w:rPr>
-        <w:t xml:space="preserve"> </w:t>
-      </w:r>
-      <w:r>
-        <w:rPr>
-          <w:rStyle w:val="VerbatimChar"/>
-        </w:rPr>
-        <w:t>(services/api)</w:t>
-      </w:r>
-      <w:r>
-        <w:br/>
-      </w:r>
-      <w:r>
-        <w:rPr>
-          <w:rStyle w:val="VerbatimChar"/>
-        </w:rPr>
-        <w:t xml:space="preserve">  </w:t>
-      </w:r>
-      <w:r>
-        <w:rPr>
-          <w:rStyle w:val="VerbatimChar"/>
-        </w:rPr>
-        <w:t xml:space="preserve"> </w:t>
-      </w:r>
-      <w:r>
-        <w:rPr>
-          <w:rStyle w:val="VerbatimChar"/>
-        </w:rPr>
-        <w:t>│</w:t>
-      </w:r>
-      <w:r>
-        <w:rPr>
-          <w:rStyle w:val="VerbatimChar"/>
-        </w:rPr>
-        <w:t xml:space="preserve">    </w:t>
-      </w:r>
-      <w:r>
-        <w:rPr>
-          <w:rStyle w:val="VerbatimChar"/>
-        </w:rPr>
-        <w:t xml:space="preserve"> </w:t>
-      </w:r>
-      <w:r>
-        <w:rPr>
-          <w:rStyle w:val="VerbatimChar"/>
-        </w:rPr>
-        <w:t>│</w:t>
-      </w:r>
-      <w:r>
-        <w:br/>
-      </w:r>
-      <w:r>
-        <w:rPr>
-          <w:rStyle w:val="VerbatimChar"/>
-        </w:rPr>
-        <w:t xml:space="preserve">  </w:t>
-      </w:r>
-      <w:r>
-        <w:rPr>
-          <w:rStyle w:val="VerbatimChar"/>
-        </w:rPr>
-        <w:t xml:space="preserve"> </w:t>
-      </w:r>
-      <w:r>
-        <w:rPr>
-          <w:rStyle w:val="VerbatimChar"/>
-        </w:rPr>
-        <w:t>│</w:t>
-      </w:r>
-      <w:r>
-        <w:rPr>
-          <w:rStyle w:val="VerbatimChar"/>
-        </w:rPr>
-        <w:t xml:space="preserve">   </w:t>
-      </w:r>
-      <w:r>
-        <w:rPr>
-          <w:rStyle w:val="VerbatimChar"/>
-        </w:rPr>
-        <w:t xml:space="preserve"> </w:t>
-      </w:r>
-      <w:r>
-        <w:rPr>
-          <w:rStyle w:val="VerbatimChar"/>
-        </w:rPr>
-        <w:t>Database Queries</w:t>
-      </w:r>
-      <w:r>
-        <w:br/>
-      </w:r>
-      <w:r>
-        <w:rPr>
-          <w:rStyle w:val="VerbatimChar"/>
-        </w:rPr>
-        <w:t xml:space="preserve">  </w:t>
-      </w:r>
-      <w:r>
-        <w:rPr>
-          <w:rStyle w:val="VerbatimChar"/>
-        </w:rPr>
-        <w:t xml:space="preserve"> </w:t>
-      </w:r>
-      <w:r>
-        <w:rPr>
-          <w:rStyle w:val="VerbatimChar"/>
-        </w:rPr>
-        <w:t>│</w:t>
-      </w:r>
-      <w:r>
-        <w:rPr>
-          <w:rStyle w:val="VerbatimChar"/>
-        </w:rPr>
-        <w:t xml:space="preserve">    </w:t>
-      </w:r>
-      <w:r>
-        <w:rPr>
-          <w:rStyle w:val="VerbatimChar"/>
-        </w:rPr>
-        <w:t xml:space="preserve"> </w:t>
-      </w:r>
-      <w:r>
-        <w:rPr>
-          <w:rStyle w:val="VerbatimChar"/>
-        </w:rPr>
-        <w:t>▼</w:t>
-      </w:r>
-      <w:r>
-        <w:br/>
-      </w:r>
-      <w:r>
-        <w:rPr>
-          <w:rStyle w:val="VerbatimChar"/>
-        </w:rPr>
-        <w:t xml:space="preserve">  </w:t>
-      </w:r>
-      <w:r>
-        <w:rPr>
-          <w:rStyle w:val="VerbatimChar"/>
-        </w:rPr>
-        <w:t xml:space="preserve"> </w:t>
-      </w:r>
-      <w:r>
-        <w:rPr>
-          <w:rStyle w:val="VerbatimChar"/>
-        </w:rPr>
-        <w:t>│</w:t>
-      </w:r>
-      <w:r>
-        <w:rPr>
-          <w:rStyle w:val="VerbatimChar"/>
-        </w:rPr>
-        <w:t xml:space="preserve">   </w:t>
-      </w:r>
-      <w:r>
-        <w:rPr>
-          <w:rStyle w:val="VerbatimChar"/>
-        </w:rPr>
-        <w:t>[ Neon PostgreSQL 18 ]</w:t>
-      </w:r>
-      <w:r>
-        <w:br/>
-      </w:r>
-      <w:r>
-        <w:rPr>
-          <w:rStyle w:val="VerbatimChar"/>
-        </w:rPr>
-        <w:t xml:space="preserve">  </w:t>
-      </w:r>
-      <w:r>
-        <w:rPr>
-          <w:rStyle w:val="VerbatimChar"/>
-        </w:rPr>
-        <w:t xml:space="preserve"> </w:t>
-      </w:r>
-      <w:r>
-        <w:rPr>
-          <w:rStyle w:val="VerbatimChar"/>
-        </w:rPr>
-        <w:t>│</w:t>
-      </w:r>
-      <w:r>
-        <w:rPr>
-          <w:rStyle w:val="VerbatimChar"/>
-        </w:rPr>
-        <w:t xml:space="preserve">   </w:t>
-      </w:r>
-      <w:r>
-        <w:rPr>
-          <w:rStyle w:val="VerbatimChar"/>
-        </w:rPr>
-        <w:t xml:space="preserve"> (Metadata &amp; Manifests)</w:t>
-      </w:r>
-      <w:r>
-        <w:br/>
-      </w:r>
-      <w:r>
-        <w:rPr>
-          <w:rStyle w:val="VerbatimChar"/>
-        </w:rPr>
-        <w:t xml:space="preserve">  </w:t>
-      </w:r>
-      <w:r>
-        <w:rPr>
-          <w:rStyle w:val="VerbatimChar"/>
-        </w:rPr>
-        <w:t xml:space="preserve"> </w:t>
-      </w:r>
-      <w:r>
-        <w:rPr>
-          <w:rStyle w:val="VerbatimChar"/>
-        </w:rPr>
-        <w:t>│</w:t>
-      </w:r>
-      <w:r>
-        <w:rPr>
-          <w:rStyle w:val="VerbatimChar"/>
-        </w:rPr>
-        <w:t xml:space="preserve">    </w:t>
-      </w:r>
-      <w:r>
-        <w:rPr>
-          <w:rStyle w:val="VerbatimChar"/>
-        </w:rPr>
-        <w:t xml:space="preserve"> </w:t>
-      </w:r>
-      <w:r>
-        <w:rPr>
-          <w:rStyle w:val="VerbatimChar"/>
-        </w:rPr>
-        <w:t>│</w:t>
-      </w:r>
-      <w:r>
-        <w:br/>
-      </w:r>
-      <w:r>
-        <w:rPr>
-          <w:rStyle w:val="VerbatimChar"/>
-        </w:rPr>
         <w:t xml:space="preserve">  </w:t>
       </w:r>
       <w:r>
@@ -15063,27 +15335,27 @@
         </w:numPr>
       </w:pPr>
       <w:r>
+        <w:t xml:space="preserve">Khi cấu hình tắt phân hệ thủy vân, hệ thống chuyển sang in một nhãn cấp phát nhìn thấy được lên mỗi trang, dạng </w:t>
+      </w:r>
+      <w:r>
+        <w:rPr>
+          <w:rStyle w:val="VerbatimChar"/>
+        </w:rPr>
+        <w:t>SB1-</w:t>
+      </w:r>
+      <w:r>
+        <w:t xml:space="preserve"> ghép với 20 ký tự đầu của mã cấp phát mã hoá base32 thay cho thủy vân ẩn. Đây là đường dự phòng, không phải cấu hình đang chạy trên môi trường production.</w:t>
+      </w:r>
+    </w:p>
+    <w:p>
+      <w:pPr>
+        <w:pStyle w:val="FirstParagraph"/>
+      </w:pPr>
+      <w:r>
+        <w:rPr>
+          <w:noProof/>
+        </w:rPr>
         <w:lastRenderedPageBreak/>
-        <w:t xml:space="preserve">Khi cấu hình tắt phân hệ thủy vân, hệ thống chuyển sang in một nhãn cấp phát nhìn thấy được lên mỗi trang, dạng </w:t>
-      </w:r>
-      <w:r>
-        <w:rPr>
-          <w:rStyle w:val="VerbatimChar"/>
-        </w:rPr>
-        <w:t>SB1-</w:t>
-      </w:r>
-      <w:r>
-        <w:t xml:space="preserve"> ghép với 20 ký tự đầu của mã cấp phát mã hoá base32 thay cho thủy vân ẩn. Đây là đường dự phòng, không phải cấu hình đang chạy trên môi trường production.</w:t>
-      </w:r>
-    </w:p>
-    <w:p>
-      <w:pPr>
-        <w:pStyle w:val="FirstParagraph"/>
-      </w:pPr>
-      <w:r>
-        <w:rPr>
-          <w:noProof/>
-        </w:rPr>
         <w:drawing>
           <wp:inline distT="0" distB="0" distL="0" distR="0" wp14:anchorId="087EA717" wp14:editId="7DDCDD91">
             <wp:extent cx="5575300" cy="3075505"/>
@@ -18508,7 +18780,7 @@
       </w:r>
       <w:sdt>
         <w:sdtPr>
-          <w:tag w:val="MENDELEY_CITATION_v3_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"/>
+          <w:tag w:val="MENDELEY_CITATION_v3_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"/>
           <w:id w:val="1146158083"/>
           <w:placeholder>
             <w:docPart w:val="DefaultPlaceholder_-1854013440"/>
@@ -18519,7 +18791,7 @@
             <w:rPr>
               <w:color w:val="000000"/>
             </w:rPr>
-            <w:t>[6]</w:t>
+            <w:t>[16]</w:t>
           </w:r>
         </w:sdtContent>
       </w:sdt>
@@ -18531,7 +18803,7 @@
       </w:r>
       <w:sdt>
         <w:sdtPr>
-          <w:tag w:val="MENDELEY_CITATION_v3_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"/>
+          <w:tag w:val="MENDELEY_CITATION_v3_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"/>
           <w:id w:val="807287595"/>
           <w:placeholder>
             <w:docPart w:val="DefaultPlaceholder_-1854013440"/>
@@ -18542,7 +18814,7 @@
             <w:rPr>
               <w:color w:val="000000"/>
             </w:rPr>
-            <w:t>[7]</w:t>
+            <w:t>[17]</w:t>
           </w:r>
         </w:sdtContent>
       </w:sdt>
@@ -18554,7 +18826,7 @@
       </w:r>
       <w:sdt>
         <w:sdtPr>
-          <w:tag w:val="MENDELEY_CITATION_v3_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"/>
+          <w:tag w:val="MENDELEY_CITATION_v3_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"/>
           <w:id w:val="1267117504"/>
           <w:placeholder>
             <w:docPart w:val="DefaultPlaceholder_-1854013440"/>
@@ -18565,7 +18837,7 @@
             <w:rPr>
               <w:color w:val="000000"/>
             </w:rPr>
-            <w:t>[8]</w:t>
+            <w:t>[18]</w:t>
           </w:r>
         </w:sdtContent>
       </w:sdt>
@@ -18573,11 +18845,11 @@
         <w:t xml:space="preserve"> </w:t>
       </w:r>
       <w:r>
-        <w:t xml:space="preserve">trên 18 ảnh, dưới 38 phép biến đổi. Điều khiến bộ đo này so sánh được trực tiếp với công trình của nhóm là tiêu chí thành công của nó trùng </w:t>
+        <w:t xml:space="preserve">trên 18 ảnh, dưới 38 phép biến đổi. Điều khiến bộ đo này so sánh được trực tiếp với công trình của nhóm là tiêu chí thành công của nó </w:t>
       </w:r>
       <w:r>
         <w:lastRenderedPageBreak/>
-        <w:t>khít với cổng phát hành mà nhóm tự đặt ra: một lần giải mã chỉ được tính là thành công khi khôi phục chính xác toàn bộ payload, sai một bit cũng bị tính là trượt. Đây không phải độ chính xác theo bit.</w:t>
+        <w:t>trùng khít với cổng phát hành mà nhóm tự đặt ra: một lần giải mã chỉ được tính là thành công khi khôi phục chính xác toàn bộ payload, sai một bit cũng bị tính là trượt. Đây không phải độ chính xác theo bit.</w:t>
       </w:r>
     </w:p>
     <w:p>
@@ -19209,7 +19481,7 @@
       </w:r>
       <w:sdt>
         <w:sdtPr>
-          <w:tag w:val="MENDELEY_CITATION_v3_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"/>
+          <w:tag w:val="MENDELEY_CITATION_v3_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"/>
           <w:id w:val="-216355728"/>
           <w:placeholder>
             <w:docPart w:val="DefaultPlaceholder_-1854013440"/>
@@ -19220,7 +19492,7 @@
             <w:rPr>
               <w:color w:val="000000"/>
             </w:rPr>
-            <w:t>[6]</w:t>
+            <w:t>[16]</w:t>
           </w:r>
         </w:sdtContent>
       </w:sdt>
@@ -19254,7 +19526,7 @@
       </w:r>
       <w:sdt>
         <w:sdtPr>
-          <w:tag w:val="MENDELEY_CITATION_v3_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"/>
+          <w:tag w:val="MENDELEY_CITATION_v3_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"/>
           <w:id w:val="-6595755"/>
           <w:placeholder>
             <w:docPart w:val="DefaultPlaceholder_-1854013440"/>
@@ -19265,7 +19537,7 @@
             <w:rPr>
               <w:color w:val="000000"/>
             </w:rPr>
-            <w:t>[9]</w:t>
+            <w:t>[19]</w:t>
           </w:r>
         </w:sdtContent>
       </w:sdt>
@@ -19707,7 +19979,7 @@
       </w:r>
       <w:sdt>
         <w:sdtPr>
-          <w:tag w:val="MENDELEY_CITATION_v3_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"/>
+          <w:tag w:val="MENDELEY_CITATION_v3_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"/>
           <w:id w:val="-1898202787"/>
           <w:placeholder>
             <w:docPart w:val="DefaultPlaceholder_-1854013440"/>
@@ -19718,7 +19990,7 @@
             <w:rPr>
               <w:color w:val="000000"/>
             </w:rPr>
-            <w:t>[9]</w:t>
+            <w:t>[19]</w:t>
           </w:r>
         </w:sdtContent>
       </w:sdt>
@@ -20351,7 +20623,7 @@
       </w:r>
       <w:sdt>
         <w:sdtPr>
-          <w:tag w:val="MENDELEY_CITATION_v3_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"/>
+          <w:tag w:val="MENDELEY_CITATION_v3_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"/>
           <w:id w:val="129672607"/>
           <w:placeholder>
             <w:docPart w:val="DefaultPlaceholder_-1854013440"/>
@@ -20362,7 +20634,7 @@
             <w:rPr>
               <w:color w:val="000000"/>
             </w:rPr>
-            <w:t>[9]</w:t>
+            <w:t>[19]</w:t>
           </w:r>
         </w:sdtContent>
       </w:sdt>
@@ -28650,7 +28922,7 @@
       </w:r>
       <w:sdt>
         <w:sdtPr>
-          <w:tag w:val="MENDELEY_CITATION_v3_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"/>
+          <w:tag w:val="MENDELEY_CITATION_v3_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"/>
           <w:id w:val="1638837913"/>
           <w:placeholder>
             <w:docPart w:val="DefaultPlaceholder_-1854013440"/>
@@ -28658,7 +28930,7 @@
         </w:sdtPr>
         <w:sdtContent>
           <w:r>
-            <w:t>[10]</w:t>
+            <w:t>[20]</w:t>
           </w:r>
         </w:sdtContent>
       </w:sdt>
@@ -28730,7 +29002,7 @@
       </w:r>
       <w:sdt>
         <w:sdtPr>
-          <w:tag w:val="MENDELEY_CITATION_v3_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"/>
+          <w:tag w:val="MENDELEY_CITATION_v3_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"/>
           <w:id w:val="954444240"/>
           <w:placeholder>
             <w:docPart w:val="DefaultPlaceholder_-1854013440"/>
@@ -28738,7 +29010,7 @@
         </w:sdtPr>
         <w:sdtContent>
           <w:r>
-            <w:t>[11]</w:t>
+            <w:t>[21]</w:t>
           </w:r>
         </w:sdtContent>
       </w:sdt>
@@ -28805,7 +29077,7 @@
       </w:r>
       <w:sdt>
         <w:sdtPr>
-          <w:tag w:val="MENDELEY_CITATION_v3_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"/>
+          <w:tag w:val="MENDELEY_CITATION_v3_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"/>
           <w:id w:val="-437914011"/>
           <w:placeholder>
             <w:docPart w:val="DefaultPlaceholder_-1854013440"/>
@@ -28813,7 +29085,7 @@
         </w:sdtPr>
         <w:sdtContent>
           <w:r>
-            <w:t>[12]</w:t>
+            <w:t>[22]</w:t>
           </w:r>
         </w:sdtContent>
       </w:sdt>
@@ -30989,7 +31261,7 @@
             </w:r>
             <w:sdt>
               <w:sdtPr>
-                <w:tag w:val="MENDELEY_CITATION_v3_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"/>
+                <w:tag w:val="MENDELEY_CITATION_v3_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"/>
                 <w:id w:val="-82386927"/>
                 <w:placeholder>
                   <w:docPart w:val="DefaultPlaceholder_-1854013440"/>
@@ -31000,7 +31272,7 @@
                   <w:rPr>
                     <w:color w:val="000000"/>
                   </w:rPr>
-                  <w:t>[9]</w:t>
+                  <w:t>[19]</w:t>
                 </w:r>
               </w:sdtContent>
             </w:sdt>
@@ -31162,7 +31434,7 @@
             </w:r>
             <w:sdt>
               <w:sdtPr>
-                <w:tag w:val="MENDELEY_CITATION_v3_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"/>
+                <w:tag w:val="MENDELEY_CITATION_v3_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"/>
                 <w:id w:val="-916555382"/>
                 <w:placeholder>
                   <w:docPart w:val="DefaultPlaceholder_-1854013440"/>
@@ -31173,7 +31445,7 @@
                   <w:rPr>
                     <w:color w:val="000000"/>
                   </w:rPr>
-                  <w:t>[6]</w:t>
+                  <w:t>[16]</w:t>
                 </w:r>
               </w:sdtContent>
             </w:sdt>
@@ -34849,9 +35121,9 @@
   </w:compat>
   <w:rsids>
     <w:rsidRoot w:val="001F3D7D"/>
-    <w:rsid w:val="00101E64"/>
     <w:rsid w:val="001F3D7D"/>
     <w:rsid w:val="00C24EF1"/>
+    <w:rsid w:val="00C311DC"/>
   </w:rsids>
   <m:mathPr>
     <m:mathFont m:val="Cambria Math"/>
@@ -35632,7 +35904,7 @@
   <we:properties>
     <we:property name="MENDELEY_BIBLIOGRAPHY_IS_DIRTY" value="true"/>
     <we:property name="MENDELEY_BIBLIOGRAPHY_LAST_MODIFIED" value="1789453680208"/>
-    <we:property name="MENDELEY_CITATIONS" value="[{&quot;citationID&quot;:&quot;MENDELEY_CITATION_5eb07e95-3047-426e-8775-91ce826872d7&quot;,&quot;properties&quot;:{&quot;noteIndex&quot;:0},&quot;isEdited&quot;:false,&quot;manualOverride&quot;:{&quot;isManuallyOverridden&quot;:false,&quot;citeprocText&quot;:&quot;[1]&quot;,&quot;manualOverrideText&quot;:&quot;&quot;},&quot;citationTag&quot;:&quot;MENDELEY_CITATION_v3_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&quot;,&quot;citationItems&quot;:[{&quot;id&quot;:&quot;294dfdf4-c0cd-3237-9ca0-fa7e37df1a19&quot;,&quot;itemData&quot;:{&quot;type&quot;:&quot;book&quot;,&quot;id&quot;:&quot;294dfdf4-c0cd-3237-9ca0-fa7e37df1a19&quot;,&quot;title&quot;:&quot;Digital Watermarking and Steganography&quot;,&quot;author&quot;:[{&quot;family&quot;:&quot;Cox&quot;,&quot;given&quot;:&quot;Ingemar J&quot;,&quot;parse-names&quot;:false,&quot;dropping-particle&quot;:&quot;&quot;,&quot;non-dropping-particle&quot;:&quot;&quot;},{&quot;family&quot;:&quot;Miller&quot;,&quot;given&quot;:&quot;Matthew L&quot;,&quot;parse-names&quot;:false,&quot;dropping-particle&quot;:&quot;&quot;,&quot;non-dropping-particle&quot;:&quot;&quot;},{&quot;family&quot;:&quot;Bloom&quot;,&quot;given&quot;:&quot;Jeffrey A&quot;,&quot;parse-names&quot;:false,&quot;dropping-particle&quot;:&quot;&quot;,&quot;non-dropping-particle&quot;:&quot;&quot;},{&quot;family&quot;:&quot;Fridrich&quot;,&quot;given&quot;:&quot;Jessica&quot;,&quot;parse-names&quot;:false,&quot;dropping-particle&quot;:&quot;&quot;,&quot;non-dropping-particle&quot;:&quot;&quot;},{&quot;family&quot;:&quot;Kalker&quot;,&quot;given&quot;:&quot;Ton&quot;,&quot;parse-names&quot;:false,&quot;dropping-particle&quot;:&quot;&quot;,&quot;non-dropping-particle&quot;:&quot;&quot;}],&quot;issued&quot;:{&quot;date-parts&quot;:[[2007]]},&quot;publisher-place&quot;:&quot;Burlington&quot;,&quot;language&quot;:&quot;en&quot;,&quot;edition&quot;:&quot;2&quot;,&quot;publisher&quot;:&quot;Morgan Kaufmann&quot;,&quot;container-title-short&quot;:&quot;&quot;},&quot;isTemporary&quot;:false,&quot;suppress-author&quot;:false,&quot;composite&quot;:false,&quot;author-only&quot;:false}]},{&quot;citationID&quot;:&quot;MENDELEY_CITATION_62dd3644-635e-43ab-845b-2935118ee677&quot;,&quot;properties&quot;:{&quot;noteIndex&quot;:0},&quot;isEdited&quot;:false,&quot;manualOverride&quot;:{&quot;isManuallyOverridden&quot;:false,&quot;citeprocText&quot;:&quot;[2]&quot;,&quot;manualOverrideText&quot;:&quot;&quot;},&quot;citationTag&quot;:&quot;MENDELEY_CITATION_v3_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&quot;,&quot;citationItems&quot;:[{&quot;id&quot;:&quot;922976b0-f51f-387c-a571-e8aab84cd72a&quot;,&quot;itemData&quot;:{&quot;type&quot;:&quot;book&quot;,&quot;id&quot;:&quot;922976b0-f51f-387c-a571-e8aab84cd72a&quot;,&quot;title&quot;:&quot;Giáo trình Cơ sở An toàn Thông tin&quot;,&quot;author&quot;:[{&quot;family&quot;:&quot;Hoàng Xuân Dậu&quot;,&quot;given&quot;:&quot;&quot;,&quot;parse-names&quot;:false,&quot;dropping-particle&quot;:&quot;&quot;,&quot;non-dropping-particle&quot;:&quot;&quot;}],&quot;issued&quot;:{&quot;date-parts&quot;:[[2020]]},&quot;publisher-place&quot;:&quot;Hà Nội&quot;,&quot;language&quot;:&quot;vi&quot;,&quot;publisher&quot;:&quot;Học viện Công nghệ Bưu chính Viễn thông&quot;,&quot;container-title-short&quot;:&quot;&quot;},&quot;isTemporary&quot;:false,&quot;suppress-author&quot;:false,&quot;composite&quot;:false,&quot;author-only&quot;:false}]},{&quot;citationID&quot;:&quot;MENDELEY_CITATION_e482f74f-8ef8-4da6-949a-9949bd2f3fcc&quot;,&quot;properties&quot;:{&quot;noteIndex&quot;:0},&quot;isEdited&quot;:false,&quot;manualOverride&quot;:{&quot;isManuallyOverridden&quot;:false,&quot;citeprocText&quot;:&quot;[3]&quot;,&quot;manualOverrideText&quot;:&quot;&quot;},&quot;citationTag&quot;:&quot;MENDELEY_CITATION_v3_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&quot;,&quot;citationItems&quot;:[{&quot;id&quot;:&quot;2c89b2a8-aeb5-34f1-840f-bafbff8aaf47&quot;,&quot;itemData&quot;:{&quot;type&quot;:&quot;book&quot;,&quot;id&quot;:&quot;2c89b2a8-aeb5-34f1-840f-bafbff8aaf47&quot;,&quot;title&quot;:&quot;Cryptography and Network Security: Principles and Practice&quot;,&quot;author&quot;:[{&quot;family&quot;:&quot;Stallings&quot;,&quot;given&quot;:&quot;William&quot;,&quot;parse-names&quot;:false,&quot;dropping-particle&quot;:&quot;&quot;,&quot;non-dropping-particle&quot;:&quot;&quot;}],&quot;issued&quot;:{&quot;date-parts&quot;:[[2017]]},&quot;publisher-place&quot;:&quot;Boston&quot;,&quot;language&quot;:&quot;en&quot;,&quot;edition&quot;:&quot;7&quot;,&quot;publisher&quot;:&quot;Pearson&quot;,&quot;container-title-short&quot;:&quot;&quot;},&quot;isTemporary&quot;:false,&quot;suppress-author&quot;:false,&quot;composite&quot;:false,&quot;author-only&quot;:false}]},{&quot;citationID&quot;:&quot;MENDELEY_CITATION_7e33c668-1bd8-4adc-931c-77d199e80410&quot;,&quot;properties&quot;:{&quot;noteIndex&quot;:0},&quot;isEdited&quot;:false,&quot;manualOverride&quot;:{&quot;isManuallyOverridden&quot;:false,&quot;citeprocText&quot;:&quot;[1]&quot;,&quot;manualOverrideText&quot;:&quot;&quot;},&quot;citationTag&quot;:&quot;MENDELEY_CITATION_v3_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&quot;,&quot;citationItems&quot;:[{&quot;id&quot;:&quot;294dfdf4-c0cd-3237-9ca0-fa7e37df1a19&quot;,&quot;itemData&quot;:{&quot;type&quot;:&quot;book&quot;,&quot;id&quot;:&quot;294dfdf4-c0cd-3237-9ca0-fa7e37df1a19&quot;,&quot;title&quot;:&quot;Digital Watermarking and Steganography&quot;,&quot;author&quot;:[{&quot;family&quot;:&quot;Cox&quot;,&quot;given&quot;:&quot;Ingemar J&quot;,&quot;parse-names&quot;:false,&quot;dropping-particle&quot;:&quot;&quot;,&quot;non-dropping-particle&quot;:&quot;&quot;},{&quot;family&quot;:&quot;Miller&quot;,&quot;given&quot;:&quot;Matthew L&quot;,&quot;parse-names&quot;:false,&quot;dropping-particle&quot;:&quot;&quot;,&quot;non-dropping-particle&quot;:&quot;&quot;},{&quot;family&quot;:&quot;Bloom&quot;,&quot;given&quot;:&quot;Jeffrey A&quot;,&quot;parse-names&quot;:false,&quot;dropping-particle&quot;:&quot;&quot;,&quot;non-dropping-particle&quot;:&quot;&quot;},{&quot;family&quot;:&quot;Fridrich&quot;,&quot;given&quot;:&quot;Jessica&quot;,&quot;parse-names&quot;:false,&quot;dropping-particle&quot;:&quot;&quot;,&quot;non-dropping-particle&quot;:&quot;&quot;},{&quot;family&quot;:&quot;Kalker&quot;,&quot;given&quot;:&quot;Ton&quot;,&quot;parse-names&quot;:false,&quot;dropping-particle&quot;:&quot;&quot;,&quot;non-dropping-particle&quot;:&quot;&quot;}],&quot;issued&quot;:{&quot;date-parts&quot;:[[2007]]},&quot;publisher-place&quot;:&quot;Burlington&quot;,&quot;language&quot;:&quot;en&quot;,&quot;edition&quot;:&quot;2&quot;,&quot;publisher&quot;:&quot;Morgan Kaufmann&quot;,&quot;container-title-short&quot;:&quot;&quot;},&quot;isTemporary&quot;:false,&quot;suppress-author&quot;:false,&quot;composite&quot;:false,&quot;author-only&quot;:false}]},{&quot;citationID&quot;:&quot;MENDELEY_CITATION_cd31db8c-eda7-4389-95b0-5f1a7051b6e6&quot;,&quot;properties&quot;:{&quot;noteIndex&quot;:0},&quot;isEdited&quot;:false,&quot;manualOverride&quot;:{&quot;isManuallyOverridden&quot;:false,&quot;citeprocText&quot;:&quot;[4]&quot;,&quot;manualOverrideText&quot;:&quot;&quot;},&quot;citationTag&quot;:&quot;MENDELEY_CITATION_v3_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&quot;,&quot;citationItems&quot;:[{&quot;id&quot;:&quot;4e85f1b3-471c-381e-8da1-057ddb9ebe95&quot;,&quot;itemData&quot;:{&quot;type&quot;:&quot;article-journal&quot;,&quot;id&quot;:&quot;4e85f1b3-471c-381e-8da1-057ddb9ebe95&quot;,&quot;title&quot;:&quot;Image Steganography Techniques: An Overview&quot;,&quot;author&quot;:[{&quot;family&quot;:&quot;Hamid&quot;,&quot;given&quot;:&quot;Nagham&quot;,&quot;parse-names&quot;:false,&quot;dropping-particle&quot;:&quot;&quot;,&quot;non-dropping-particle&quot;:&quot;&quot;},{&quot;family&quot;:&quot;Yahya&quot;,&quot;given&quot;:&quot;Abid&quot;,&quot;parse-names&quot;:false,&quot;dropping-particle&quot;:&quot;&quot;,&quot;non-dropping-particle&quot;:&quot;&quot;},{&quot;family&quot;:&quot;Ahmad&quot;,&quot;given&quot;:&quot;R Badlishah&quot;,&quot;parse-names&quot;:false,&quot;dropping-particle&quot;:&quot;&quot;,&quot;non-dropping-particle&quot;:&quot;&quot;},{&quot;family&quot;:&quot;Al-Qershi&quot;,&quot;given&quot;:&quot;Osamah M&quot;,&quot;parse-names&quot;:false,&quot;dropping-particle&quot;:&quot;&quot;,&quot;non-dropping-particle&quot;:&quot;&quot;}],&quot;container-title&quot;:&quot;International Journal of Computer Science and Security&quot;,&quot;issued&quot;:{&quot;date-parts&quot;:[[2012]]},&quot;page&quot;:&quot;168-187&quot;,&quot;language&quot;:&quot;en&quot;,&quot;issue&quot;:&quot;3&quot;,&quot;volume&quot;:&quot;6&quot;,&quot;container-title-short&quot;:&quot;&quot;},&quot;isTemporary&quot;:false,&quot;suppress-author&quot;:false,&quot;composite&quot;:false,&quot;author-only&quot;:false}]},{&quot;citationID&quot;:&quot;MENDELEY_CITATION_60d90cba-9f76-4564-875d-a3175cc98434&quot;,&quot;properties&quot;:{&quot;noteIndex&quot;:0},&quot;isEdited&quot;:false,&quot;manualOverride&quot;:{&quot;isManuallyOverridden&quot;:false,&quot;citeprocText&quot;:&quot;[5]&quot;,&quot;manualOverrideText&quot;:&quot;&quot;},&quot;citationTag&quot;:&quot;MENDELEY_CITATION_v3_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&quot;,&quot;citationItems&quot;:[{&quot;id&quot;:&quot;a769938a-cc3b-3483-9cbb-6dbf35d0ae05&quot;,&quot;itemData&quot;:{&quot;type&quot;:&quot;article-journal&quot;,&quot;id&quot;:&quot;a769938a-cc3b-3483-9cbb-6dbf35d0ae05&quot;,&quot;title&quot;:&quot;An overview of steganography techniques applied to the protection of biometric data&quot;,&quot;author&quot;:[{&quot;family&quot;:&quot;Douglas&quot;,&quot;given&quot;:&quot;Mandy&quot;,&quot;parse-names&quot;:false,&quot;dropping-particle&quot;:&quot;&quot;,&quot;non-dropping-particle&quot;:&quot;&quot;},{&quot;family&quot;:&quot;Bailey&quot;,&quot;given&quot;:&quot;Karen&quot;,&quot;parse-names&quot;:false,&quot;dropping-particle&quot;:&quot;&quot;,&quot;non-dropping-particle&quot;:&quot;&quot;},{&quot;family&quot;:&quot;Leeney&quot;,&quot;given&quot;:&quot;Mark&quot;,&quot;parse-names&quot;:false,&quot;dropping-particle&quot;:&quot;&quot;,&quot;non-dropping-particle&quot;:&quot;&quot;},{&quot;family&quot;:&quot;Curran&quot;,&quot;given&quot;:&quot;Kevin&quot;,&quot;parse-names&quot;:false,&quot;dropping-particle&quot;:&quot;&quot;,&quot;non-dropping-particle&quot;:&quot;&quot;}],&quot;container-title&quot;:&quot;Multimedia Tools and Applications&quot;,&quot;container-title-short&quot;:&quot;Multimed. Tools Appl.&quot;,&quot;DOI&quot;:&quot;10.1007/s11042-017-5308-3&quot;,&quot;issued&quot;:{&quot;date-parts&quot;:[[2018]]},&quot;page&quot;:&quot;17333-17373&quot;,&quot;language&quot;:&quot;en&quot;,&quot;issue&quot;:&quot;13&quot;,&quot;volume&quot;:&quot;77&quot;},&quot;isTemporary&quot;:false,&quot;suppress-author&quot;:false,&quot;composite&quot;:false,&quot;author-only&quot;:false}]},{&quot;citationID&quot;:&quot;MENDELEY_CITATION_e85272e5-f412-4954-9fc4-2ebf8c86668d&quot;,&quot;properties&quot;:{&quot;noteIndex&quot;:0},&quot;isEdited&quot;:false,&quot;manualOverride&quot;:{&quot;isManuallyOverridden&quot;:false,&quot;citeprocText&quot;:&quot;[6]&quot;,&quot;manualOverrideText&quot;:&quot;&quot;},&quot;citationTag&quot;:&quot;MENDELEY_CITATION_v3_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&quot;,&quot;citationItems&quot;:[{&quot;id&quot;:&quot;873f3fbf-2370-3c67-af39-f81d75bdc7f9&quot;,&quot;itemData&quot;:{&quot;type&quot;:&quot;article&quot;,&quot;id&quot;:&quot;873f3fbf-2370-3c67-af39-f81d75bdc7f9&quot;,&quot;title&quot;:&quot;wmbench: image watermarking benchmark&quot;,&quot;author&quot;:[{&quot;family&quot;:&quot;wmbench contributors&quot;,&quot;given&quot;:&quot;&quot;,&quot;parse-names&quot;:false,&quot;dropping-particle&quot;:&quot;&quot;,&quot;non-dropping-particle&quot;:&quot;&quot;}],&quot;URL&quot;:&quot;https://github.com/alexandersolonsky/wmbench&quot;,&quot;issued&quot;:{&quot;date-parts&quot;:[[2026]]},&quot;language&quot;:&quot;en&quot;,&quot;publisher&quot;:&quot;GitHub&quot;,&quot;container-title-short&quot;:&quot;&quot;},&quot;isTemporary&quot;:false,&quot;suppress-author&quot;:false,&quot;composite&quot;:false,&quot;author-only&quot;:false}]},{&quot;citationID&quot;:&quot;MENDELEY_CITATION_b9991ea2-e07a-455c-9938-8f6a658640a6&quot;,&quot;properties&quot;:{&quot;noteIndex&quot;:0},&quot;isEdited&quot;:false,&quot;manualOverride&quot;:{&quot;isManuallyOverridden&quot;:false,&quot;citeprocText&quot;:&quot;[7]&quot;,&quot;manualOverrideText&quot;:&quot;&quot;},&quot;citationTag&quot;:&quot;MENDELEY_CITATION_v3_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&quot;,&quot;citationItems&quot;:[{&quot;id&quot;:&quot;e093bbd2-c3cf-31d8-a3a6-627f57db7d63&quot;,&quot;itemData&quot;:{&quot;type&quot;:&quot;article&quot;,&quot;id&quot;:&quot;e093bbd2-c3cf-31d8-a3a6-627f57db7d63&quot;,&quot;title&quot;:&quot;TrustMark: Universal Watermarking for Arbitrary Resolution Images&quot;,&quot;author&quot;:[{&quot;family&quot;:&quot;Adobe Research&quot;,&quot;given&quot;:&quot;&quot;,&quot;parse-names&quot;:false,&quot;dropping-particle&quot;:&quot;&quot;,&quot;non-dropping-particle&quot;:&quot;&quot;}],&quot;URL&quot;:&quot;https://github.com/adobe/trustmark&quot;,&quot;issued&quot;:{&quot;date-parts&quot;:[[2026]]},&quot;language&quot;:&quot;en&quot;,&quot;publisher&quot;:&quot;GitHub&quot;,&quot;container-title-short&quot;:&quot;&quot;},&quot;isTemporary&quot;:false,&quot;suppress-author&quot;:false,&quot;composite&quot;:false,&quot;author-only&quot;:false}]},{&quot;citationID&quot;:&quot;MENDELEY_CITATION_bb9b00c2-7f23-4487-a25e-e688949357df&quot;,&quot;properties&quot;:{&quot;noteIndex&quot;:0},&quot;isEdited&quot;:false,&quot;manualOverride&quot;:{&quot;isManuallyOverridden&quot;:false,&quot;citeprocText&quot;:&quot;[8]&quot;,&quot;manualOverrideText&quot;:&quot;&quot;},&quot;citationTag&quot;:&quot;MENDELEY_CITATION_v3_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&quot;,&quot;citationItems&quot;:[{&quot;id&quot;:&quot;c166265a-81d0-36ed-9fc4-27ce957fc0da&quot;,&quot;itemData&quot;:{&quot;type&quot;:&quot;article&quot;,&quot;id&quot;:&quot;c166265a-81d0-36ed-9fc4-27ce957fc0da&quot;,&quot;title&quot;:&quot;Watermark Anything with Localized Messages&quot;,&quot;author&quot;:[{&quot;family&quot;:&quot;Sander&quot;,&quot;given&quot;:&quot;Tom&quot;,&quot;parse-names&quot;:false,&quot;dropping-particle&quot;:&quot;&quot;,&quot;non-dropping-particle&quot;:&quot;&quot;},{&quot;family&quot;:&quot;Fernandez&quot;,&quot;given&quot;:&quot;Pierre&quot;,&quot;parse-names&quot;:false,&quot;dropping-particle&quot;:&quot;&quot;,&quot;non-dropping-particle&quot;:&quot;&quot;},{&quot;family&quot;:&quot;Durmus&quot;,&quot;given&quot;:&quot;Alain&quot;,&quot;parse-names&quot;:false,&quot;dropping-particle&quot;:&quot;&quot;,&quot;non-dropping-particle&quot;:&quot;&quot;},{&quot;family&quot;:&quot;Douze&quot;,&quot;given&quot;:&quot;Matthijs&quot;,&quot;parse-names&quot;:false,&quot;dropping-particle&quot;:&quot;&quot;,&quot;non-dropping-particle&quot;:&quot;&quot;},{&quot;family&quot;:&quot;Furon&quot;,&quot;given&quot;:&quot;Teddy&quot;,&quot;parse-names&quot;:false,&quot;dropping-particle&quot;:&quot;&quot;,&quot;non-dropping-particle&quot;:&quot;&quot;}],&quot;URL&quot;:&quot;https://github.com/facebookresearch/watermark-anything&quot;,&quot;issued&quot;:{&quot;date-parts&quot;:[[2025]]},&quot;language&quot;:&quot;en&quot;,&quot;publisher&quot;:&quot;Meta AI Research&quot;,&quot;container-title-short&quot;:&quot;&quot;},&quot;isTemporary&quot;:false,&quot;suppress-author&quot;:false,&quot;composite&quot;:false,&quot;author-only&quot;:false}]},{&quot;citationID&quot;:&quot;MENDELEY_CITATION_a0432d76-f6aa-4192-9639-44b7ff844d0c&quot;,&quot;properties&quot;:{&quot;noteIndex&quot;:0},&quot;isEdited&quot;:false,&quot;manualOverride&quot;:{&quot;isManuallyOverridden&quot;:false,&quot;citeprocText&quot;:&quot;[6]&quot;,&quot;manualOverrideText&quot;:&quot;&quot;},&quot;citationTag&quot;:&quot;MENDELEY_CITATION_v3_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&quot;,&quot;citationItems&quot;:[{&quot;id&quot;:&quot;873f3fbf-2370-3c67-af39-f81d75bdc7f9&quot;,&quot;itemData&quot;:{&quot;type&quot;:&quot;article&quot;,&quot;id&quot;:&quot;873f3fbf-2370-3c67-af39-f81d75bdc7f9&quot;,&quot;title&quot;:&quot;wmbench: image watermarking benchmark&quot;,&quot;author&quot;:[{&quot;family&quot;:&quot;wmbench contributors&quot;,&quot;given&quot;:&quot;&quot;,&quot;parse-names&quot;:false,&quot;dropping-particle&quot;:&quot;&quot;,&quot;non-dropping-particle&quot;:&quot;&quot;}],&quot;URL&quot;:&quot;https://github.com/alexandersolonsky/wmbench&quot;,&quot;issued&quot;:{&quot;date-parts&quot;:[[2026]]},&quot;language&quot;:&quot;en&quot;,&quot;publisher&quot;:&quot;GitHub&quot;,&quot;container-title-short&quot;:&quot;&quot;},&quot;isTemporary&quot;:false,&quot;suppress-author&quot;:false,&quot;composite&quot;:false,&quot;author-only&quot;:false}]},{&quot;citationID&quot;:&quot;MENDELEY_CITATION_0b6ce9cf-57cb-437b-acdb-e9690ff1488f&quot;,&quot;properties&quot;:{&quot;noteIndex&quot;:0},&quot;isEdited&quot;:false,&quot;manualOverride&quot;:{&quot;isManuallyOverridden&quot;:false,&quot;citeprocText&quot;:&quot;[9]&quot;,&quot;manualOverrideText&quot;:&quot;&quot;},&quot;citationTag&quot;:&quot;MENDELEY_CITATION_v3_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&quot;,&quot;citationItems&quot;:[{&quot;id&quot;:&quot;30f3db65-f1e0-3547-a850-0309ca77212e&quot;,&quot;itemData&quot;:{&quot;type&quot;:&quot;article&quot;,&quot;id&quot;:&quot;30f3db65-f1e0-3547-a850-0309ca77212e&quot;,&quot;title&quot;:&quot;blind_watermark: blind and invisible image watermark&quot;,&quot;author&quot;:[{&quot;family&quot;:&quot;Guo Fei&quot;,&quot;given&quot;:&quot;&quot;,&quot;parse-names&quot;:false,&quot;dropping-particle&quot;:&quot;&quot;,&quot;non-dropping-particle&quot;:&quot;&quot;}],&quot;URL&quot;:&quot;https://github.com/guofei9987/blind_watermark&quot;,&quot;issued&quot;:{&quot;date-parts&quot;:[[2025]]},&quot;language&quot;:&quot;en&quot;,&quot;publisher&quot;:&quot;GitHub&quot;,&quot;container-title-short&quot;:&quot;&quot;},&quot;isTemporary&quot;:false,&quot;suppress-author&quot;:false,&quot;composite&quot;:false,&quot;author-only&quot;:false}]},{&quot;citationID&quot;:&quot;MENDELEY_CITATION_39733519-d913-49ab-bf18-6b89d147838f&quot;,&quot;properties&quot;:{&quot;noteIndex&quot;:0},&quot;isEdited&quot;:false,&quot;manualOverride&quot;:{&quot;isManuallyOverridden&quot;:false,&quot;citeprocText&quot;:&quot;[9]&quot;,&quot;manualOverrideText&quot;:&quot;&quot;},&quot;citationTag&quot;:&quot;MENDELEY_CITATION_v3_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&quot;,&quot;citationItems&quot;:[{&quot;id&quot;:&quot;30f3db65-f1e0-3547-a850-0309ca77212e&quot;,&quot;itemData&quot;:{&quot;type&quot;:&quot;article&quot;,&quot;id&quot;:&quot;30f3db65-f1e0-3547-a850-0309ca77212e&quot;,&quot;title&quot;:&quot;blind_watermark: blind and invisible image watermark&quot;,&quot;author&quot;:[{&quot;family&quot;:&quot;Guo Fei&quot;,&quot;given&quot;:&quot;&quot;,&quot;parse-names&quot;:false,&quot;dropping-particle&quot;:&quot;&quot;,&quot;non-dropping-particle&quot;:&quot;&quot;}],&quot;URL&quot;:&quot;https://github.com/guofei9987/blind_watermark&quot;,&quot;issued&quot;:{&quot;date-parts&quot;:[[2025]]},&quot;language&quot;:&quot;en&quot;,&quot;publisher&quot;:&quot;GitHub&quot;,&quot;container-title-short&quot;:&quot;&quot;},&quot;isTemporary&quot;:false,&quot;suppress-author&quot;:false,&quot;composite&quot;:false,&quot;author-only&quot;:false}]},{&quot;citationID&quot;:&quot;MENDELEY_CITATION_043d774a-7053-4dd1-96ba-2fbfa540c020&quot;,&quot;properties&quot;:{&quot;noteIndex&quot;:0},&quot;isEdited&quot;:false,&quot;manualOverride&quot;:{&quot;isManuallyOverridden&quot;:false,&quot;citeprocText&quot;:&quot;[9]&quot;,&quot;manualOverrideText&quot;:&quot;&quot;},&quot;citationTag&quot;:&quot;MENDELEY_CITATION_v3_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&quot;,&quot;citationItems&quot;:[{&quot;id&quot;:&quot;30f3db65-f1e0-3547-a850-0309ca77212e&quot;,&quot;itemData&quot;:{&quot;type&quot;:&quot;article&quot;,&quot;id&quot;:&quot;30f3db65-f1e0-3547-a850-0309ca77212e&quot;,&quot;title&quot;:&quot;blind_watermark: blind and invisible image watermark&quot;,&quot;author&quot;:[{&quot;family&quot;:&quot;Guo Fei&quot;,&quot;given&quot;:&quot;&quot;,&quot;parse-names&quot;:false,&quot;dropping-particle&quot;:&quot;&quot;,&quot;non-dropping-particle&quot;:&quot;&quot;}],&quot;URL&quot;:&quot;https://github.com/guofei9987/blind_watermark&quot;,&quot;issued&quot;:{&quot;date-parts&quot;:[[2025]]},&quot;language&quot;:&quot;en&quot;,&quot;publisher&quot;:&quot;GitHub&quot;,&quot;container-title-short&quot;:&quot;&quot;},&quot;isTemporary&quot;:false,&quot;suppress-author&quot;:false,&quot;composite&quot;:false,&quot;author-only&quot;:false}]},{&quot;citationID&quot;:&quot;MENDELEY_CITATION_ee378cba-17c5-4730-9d12-d215c85ab2ae&quot;,&quot;properties&quot;:{&quot;noteIndex&quot;:0},&quot;isEdited&quot;:false,&quot;manualOverride&quot;:{&quot;isManuallyOverridden&quot;:false,&quot;citeprocText&quot;:&quot;[10]&quot;,&quot;manualOverrideText&quot;:&quot;&quot;},&quot;citationTag&quot;:&quot;MENDELEY_CITATION_v3_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&quot;,&quot;citationItems&quot;:[{&quot;id&quot;:&quot;aa355de9-58fc-3184-b1ee-994847e37269&quot;,&quot;itemData&quot;:{&quot;type&quot;:&quot;article&quot;,&quot;id&quot;:&quot;aa355de9-58fc-3184-b1ee-994847e37269&quot;,&quot;title&quot;:&quot;Screen-Shooting-Resilient-Document-Image-Watermarking&quot;,&quot;author&quot;:[{&quot;family&quot;:&quot;gslxr&quot;,&quot;given&quot;:&quot;&quot;,&quot;parse-names&quot;:false,&quot;dropping-particle&quot;:&quot;&quot;,&quot;non-dropping-particle&quot;:&quot;&quot;}],&quot;URL&quot;:&quot;https://github.com/gslxr/Screen-Shooting-Resilient-Document-Image-Watermarking&quot;,&quot;issued&quot;:{&quot;date-parts&quot;:[[2024]]},&quot;language&quot;:&quot;en&quot;,&quot;publisher&quot;:&quot;GitHub&quot;,&quot;container-title-short&quot;:&quot;&quot;},&quot;isTemporary&quot;:false,&quot;suppress-author&quot;:false,&quot;composite&quot;:false,&quot;author-only&quot;:false}]},{&quot;citationID&quot;:&quot;MENDELEY_CITATION_fce4d0ca-e339-477c-882e-0cb15c99b2a7&quot;,&quot;properties&quot;:{&quot;noteIndex&quot;:0},&quot;isEdited&quot;:false,&quot;manualOverride&quot;:{&quot;isManuallyOverridden&quot;:false,&quot;citeprocText&quot;:&quot;[11]&quot;,&quot;manualOverrideText&quot;:&quot;&quot;},&quot;citationTag&quot;:&quot;MENDELEY_CITATION_v3_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&quot;,&quot;citationItems&quot;:[{&quot;id&quot;:&quot;cb51eba7-8a4b-3ef9-95eb-baca01fbfa22&quot;,&quot;itemData&quot;:{&quot;type&quot;:&quot;article-journal&quot;,&quot;id&quot;:&quot;cb51eba7-8a4b-3ef9-95eb-baca01fbfa22&quot;,&quot;title&quot;:&quot;Screen-shooting resilient watermarking&quot;,&quot;author&quot;:[{&quot;family&quot;:&quot;Fang&quot;,&quot;given&quot;:&quot;Han&quot;,&quot;parse-names&quot;:false,&quot;dropping-particle&quot;:&quot;&quot;,&quot;non-dropping-particle&quot;:&quot;&quot;},{&quot;family&quot;:&quot;Zhang&quot;,&quot;given&quot;:&quot;Weiming&quot;,&quot;parse-names&quot;:false,&quot;dropping-particle&quot;:&quot;&quot;,&quot;non-dropping-particle&quot;:&quot;&quot;},{&quot;family&quot;:&quot;Zhou&quot;,&quot;given&quot;:&quot;Hang&quot;,&quot;parse-names&quot;:false,&quot;dropping-particle&quot;:&quot;&quot;,&quot;non-dropping-particle&quot;:&quot;&quot;},{&quot;family&quot;:&quot;Cui&quot;,&quot;given&quot;:&quot;Hao&quot;,&quot;parse-names&quot;:false,&quot;dropping-particle&quot;:&quot;&quot;,&quot;non-dropping-particle&quot;:&quot;&quot;},{&quot;family&quot;:&quot;Yu&quot;,&quot;given&quot;:&quot;Nenghai&quot;,&quot;parse-names&quot;:false,&quot;dropping-particle&quot;:&quot;&quot;,&quot;non-dropping-particle&quot;:&quot;&quot;}],&quot;container-title&quot;:&quot;IEEE Transactions on Information Forensics and Security&quot;,&quot;DOI&quot;:&quot;10.1109/TIFS.2018.2878541&quot;,&quot;issued&quot;:{&quot;date-parts&quot;:[[2019]]},&quot;page&quot;:&quot;1403-1418&quot;,&quot;language&quot;:&quot;en&quot;,&quot;issue&quot;:&quot;6&quot;,&quot;volume&quot;:&quot;14&quot;,&quot;container-title-short&quot;:&quot;&quot;},&quot;isTemporary&quot;:false,&quot;suppress-author&quot;:false,&quot;composite&quot;:false,&quot;author-only&quot;:false}]},{&quot;citationID&quot;:&quot;MENDELEY_CITATION_ac6d344b-b4e5-4e36-974d-54918accafb1&quot;,&quot;properties&quot;:{&quot;noteIndex&quot;:0},&quot;isEdited&quot;:false,&quot;manualOverride&quot;:{&quot;isManuallyOverridden&quot;:false,&quot;citeprocText&quot;:&quot;[12]&quot;,&quot;manualOverrideText&quot;:&quot;&quot;},&quot;citationTag&quot;:&quot;MENDELEY_CITATION_v3_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&quot;,&quot;citationItems&quot;:[{&quot;id&quot;:&quot;5b2133e5-ae10-359b-93d5-685dd4d2d77d&quot;,&quot;itemData&quot;:{&quot;type&quot;:&quot;article&quot;,&quot;id&quot;:&quot;5b2133e5-ae10-359b-93d5-685dd4d2d77d&quot;,&quot;title&quot;:&quot;invisible-watermark: python library for invisible image watermark&quot;,&quot;author&quot;:[{&quot;family&quot;:&quot;ShieldMnt&quot;,&quot;given&quot;:&quot;&quot;,&quot;parse-names&quot;:false,&quot;dropping-particle&quot;:&quot;&quot;,&quot;non-dropping-particle&quot;:&quot;&quot;}],&quot;URL&quot;:&quot;https://github.com/ShieldMnt/invisible-watermark&quot;,&quot;issued&quot;:{&quot;date-parts&quot;:[[2024]]},&quot;language&quot;:&quot;en&quot;,&quot;publisher&quot;:&quot;GitHub&quot;,&quot;container-title-short&quot;:&quot;&quot;},&quot;isTemporary&quot;:false,&quot;suppress-author&quot;:false,&quot;composite&quot;:false,&quot;author-only&quot;:false}]},{&quot;citationID&quot;:&quot;MENDELEY_CITATION_80c47e8c-a008-4654-8edf-c76ec3844241&quot;,&quot;properties&quot;:{&quot;noteIndex&quot;:0},&quot;isEdited&quot;:false,&quot;manualOverride&quot;:{&quot;isManuallyOverridden&quot;:false,&quot;citeprocText&quot;:&quot;[9]&quot;,&quot;manualOverrideText&quot;:&quot;&quot;},&quot;citationTag&quot;:&quot;MENDELEY_CITATION_v3_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&quot;,&quot;citationItems&quot;:[{&quot;id&quot;:&quot;30f3db65-f1e0-3547-a850-0309ca77212e&quot;,&quot;itemData&quot;:{&quot;type&quot;:&quot;article&quot;,&quot;id&quot;:&quot;30f3db65-f1e0-3547-a850-0309ca77212e&quot;,&quot;title&quot;:&quot;blind_watermark: blind and invisible image watermark&quot;,&quot;author&quot;:[{&quot;family&quot;:&quot;Guo Fei&quot;,&quot;given&quot;:&quot;&quot;,&quot;parse-names&quot;:false,&quot;dropping-particle&quot;:&quot;&quot;,&quot;non-dropping-particle&quot;:&quot;&quot;}],&quot;URL&quot;:&quot;https://github.com/guofei9987/blind_watermark&quot;,&quot;issued&quot;:{&quot;date-parts&quot;:[[2025]]},&quot;language&quot;:&quot;en&quot;,&quot;publisher&quot;:&quot;GitHub&quot;,&quot;container-title-short&quot;:&quot;&quot;},&quot;isTemporary&quot;:false,&quot;suppress-author&quot;:false,&quot;composite&quot;:false,&quot;author-only&quot;:false}]},{&quot;citationID&quot;:&quot;MENDELEY_CITATION_31c20283-c8dd-46ca-918c-3d846816f550&quot;,&quot;properties&quot;:{&quot;noteIndex&quot;:0},&quot;isEdited&quot;:false,&quot;manualOverride&quot;:{&quot;isManuallyOverridden&quot;:false,&quot;citeprocText&quot;:&quot;[6]&quot;,&quot;manualOverrideText&quot;:&quot;&quot;},&quot;citationTag&quot;:&quot;MENDELEY_CITATION_v3_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&quot;,&quot;citationItems&quot;:[{&quot;id&quot;:&quot;873f3fbf-2370-3c67-af39-f81d75bdc7f9&quot;,&quot;itemData&quot;:{&quot;type&quot;:&quot;article&quot;,&quot;id&quot;:&quot;873f3fbf-2370-3c67-af39-f81d75bdc7f9&quot;,&quot;title&quot;:&quot;wmbench: image watermarking benchmark&quot;,&quot;author&quot;:[{&quot;family&quot;:&quot;wmbench contributors&quot;,&quot;given&quot;:&quot;&quot;,&quot;parse-names&quot;:false,&quot;dropping-particle&quot;:&quot;&quot;,&quot;non-dropping-particle&quot;:&quot;&quot;}],&quot;URL&quot;:&quot;https://github.com/alexandersolonsky/wmbench&quot;,&quot;issued&quot;:{&quot;date-parts&quot;:[[2026]]},&quot;language&quot;:&quot;en&quot;,&quot;publisher&quot;:&quot;GitHub&quot;,&quot;container-title-short&quot;:&quot;&quot;},&quot;isTemporary&quot;:false,&quot;suppress-author&quot;:false,&quot;composite&quot;:false,&quot;author-only&quot;:false}]}]"/>
+    <we:property name="MENDELEY_CITATIONS" value="[{&quot;citationID&quot;:&quot;MENDELEY_CITATION_5eb07e95-3047-426e-8775-91ce826872d7&quot;,&quot;properties&quot;:{&quot;noteIndex&quot;:0},&quot;isEdited&quot;:false,&quot;manualOverride&quot;:{&quot;isManuallyOverridden&quot;:false,&quot;citeprocText&quot;:&quot;[1]&quot;,&quot;manualOverrideText&quot;:&quot;&quot;},&quot;citationTag&quot;:&quot;MENDELEY_CITATION_v3_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&quot;,&quot;citationItems&quot;:[{&quot;id&quot;:&quot;294dfdf4-c0cd-3237-9ca0-fa7e37df1a19&quot;,&quot;itemData&quot;:{&quot;type&quot;:&quot;book&quot;,&quot;id&quot;:&quot;294dfdf4-c0cd-3237-9ca0-fa7e37df1a19&quot;,&quot;title&quot;:&quot;Digital Watermarking and Steganography&quot;,&quot;author&quot;:[{&quot;family&quot;:&quot;Cox&quot;,&quot;given&quot;:&quot;Ingemar J&quot;,&quot;parse-names&quot;:false,&quot;dropping-particle&quot;:&quot;&quot;,&quot;non-dropping-particle&quot;:&quot;&quot;},{&quot;family&quot;:&quot;Miller&quot;,&quot;given&quot;:&quot;Matthew L&quot;,&quot;parse-names&quot;:false,&quot;dropping-particle&quot;:&quot;&quot;,&quot;non-dropping-particle&quot;:&quot;&quot;},{&quot;family&quot;:&quot;Bloom&quot;,&quot;given&quot;:&quot;Jeffrey A&quot;,&quot;parse-names&quot;:false,&quot;dropping-particle&quot;:&quot;&quot;,&quot;non-dropping-particle&quot;:&quot;&quot;},{&quot;family&quot;:&quot;Fridrich&quot;,&quot;given&quot;:&quot;Jessica&quot;,&quot;parse-names&quot;:false,&quot;dropping-particle&quot;:&quot;&quot;,&quot;non-dropping-particle&quot;:&quot;&quot;},{&quot;family&quot;:&quot;Kalker&quot;,&quot;given&quot;:&quot;Ton&quot;,&quot;parse-names&quot;:false,&quot;dropping-particle&quot;:&quot;&quot;,&quot;non-dropping-particle&quot;:&quot;&quot;}],&quot;issued&quot;:{&quot;date-parts&quot;:[[2007]]},&quot;publisher-place&quot;:&quot;Burlington&quot;,&quot;language&quot;:&quot;en&quot;,&quot;edition&quot;:&quot;2&quot;,&quot;publisher&quot;:&quot;Morgan Kaufmann&quot;,&quot;container-title-short&quot;:&quot;&quot;},&quot;isTemporary&quot;:false,&quot;suppress-author&quot;:false,&quot;composite&quot;:false,&quot;author-only&quot;:false}]},{&quot;citationID&quot;:&quot;MENDELEY_CITATION_62dd3644-635e-43ab-845b-2935118ee677&quot;,&quot;properties&quot;:{&quot;noteIndex&quot;:0},&quot;isEdited&quot;:false,&quot;manualOverride&quot;:{&quot;isManuallyOverridden&quot;:false,&quot;citeprocText&quot;:&quot;[2]&quot;,&quot;manualOverrideText&quot;:&quot;&quot;},&quot;citationTag&quot;:&quot;MENDELEY_CITATION_v3_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&quot;,&quot;citationItems&quot;:[{&quot;id&quot;:&quot;922976b0-f51f-387c-a571-e8aab84cd72a&quot;,&quot;itemData&quot;:{&quot;type&quot;:&quot;book&quot;,&quot;id&quot;:&quot;922976b0-f51f-387c-a571-e8aab84cd72a&quot;,&quot;title&quot;:&quot;Giáo trình Cơ sở An toàn Thông tin&quot;,&quot;author&quot;:[{&quot;family&quot;:&quot;Hoàng Xuân Dậu&quot;,&quot;given&quot;:&quot;&quot;,&quot;parse-names&quot;:false,&quot;dropping-particle&quot;:&quot;&quot;,&quot;non-dropping-particle&quot;:&quot;&quot;}],&quot;issued&quot;:{&quot;date-parts&quot;:[[2020]]},&quot;publisher-place&quot;:&quot;Hà Nội&quot;,&quot;language&quot;:&quot;vi&quot;,&quot;publisher&quot;:&quot;Học viện Công nghệ Bưu chính Viễn thông&quot;,&quot;container-title-short&quot;:&quot;&quot;},&quot;isTemporary&quot;:false,&quot;suppress-author&quot;:false,&quot;composite&quot;:false,&quot;author-only&quot;:false}]},{&quot;citationID&quot;:&quot;MENDELEY_CITATION_8cd43b92-32a1-4690-a505-795236767652&quot;,&quot;properties&quot;:{&quot;noteIndex&quot;:0},&quot;isEdited&quot;:false,&quot;manualOverride&quot;:{&quot;isManuallyOverridden&quot;:false,&quot;citeprocText&quot;:&quot;[3]&quot;,&quot;manualOverrideText&quot;:&quot;&quot;},&quot;citationTag&quot;:&quot;MENDELEY_CITATION_v3_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&quot;,&quot;citationItems&quot;:[{&quot;id&quot;:&quot;4f868c29-ff2c-35e7-94ef-583be40b1e87&quot;,&quot;itemData&quot;:{&quot;type&quot;:&quot;article-journal&quot;,&quot;id&quot;:&quot;4f868c29-ff2c-35e7-94ef-583be40b1e87&quot;,&quot;title&quot;:&quot;Quantization index modulation: a class of provably good methods for digital watermarking and information embedding&quot;,&quot;author&quot;:[{&quot;family&quot;:&quot;Chen&quot;,&quot;given&quot;:&quot;Brian&quot;,&quot;parse-names&quot;:false,&quot;dropping-particle&quot;:&quot;&quot;,&quot;non-dropping-particle&quot;:&quot;&quot;},{&quot;family&quot;:&quot;Wornell&quot;,&quot;given&quot;:&quot;Gregory W&quot;,&quot;parse-names&quot;:false,&quot;dropping-particle&quot;:&quot;&quot;,&quot;non-dropping-particle&quot;:&quot;&quot;}],&quot;container-title&quot;:&quot;IEEE Transactions on Information Theory&quot;,&quot;container-title-short&quot;:&quot;IEEE Trans. Inf. Theory&quot;,&quot;DOI&quot;:&quot;10.1109/18.923725&quot;,&quot;issued&quot;:{&quot;date-parts&quot;:[[2001]]},&quot;page&quot;:&quot;1423-1443&quot;,&quot;language&quot;:&quot;en&quot;,&quot;issue&quot;:&quot;4&quot;,&quot;volume&quot;:&quot;47&quot;},&quot;isTemporary&quot;:false,&quot;suppress-author&quot;:false,&quot;composite&quot;:false,&quot;author-only&quot;:false}]},{&quot;citationID&quot;:&quot;MENDELEY_CITATION_c7a063c8-aa07-40d9-a104-83f5cad77bbe&quot;,&quot;properties&quot;:{&quot;noteIndex&quot;:0},&quot;isEdited&quot;:false,&quot;manualOverride&quot;:{&quot;isManuallyOverridden&quot;:false,&quot;citeprocText&quot;:&quot;[4]&quot;,&quot;manualOverrideText&quot;:&quot;&quot;},&quot;citationTag&quot;:&quot;MENDELEY_CITATION_v3_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&quot;,&quot;citationItems&quot;:[{&quot;id&quot;:&quot;acf11bac-5fec-34a3-b4e3-d38bfa8b246f&quot;,&quot;itemData&quot;:{&quot;type&quot;:&quot;book&quot;,&quot;id&quot;:&quot;acf11bac-5fec-34a3-b4e3-d38bfa8b246f&quot;,&quot;title&quot;:&quot;Giáo trình Mật mã học và Hệ thống Thông tin An toàn&quot;,&quot;author&quot;:[{&quot;family&quot;:&quot;Thái Thanh Tùng&quot;,&quot;given&quot;:&quot;&quot;,&quot;parse-names&quot;:false,&quot;dropping-particle&quot;:&quot;&quot;,&quot;non-dropping-particle&quot;:&quot;&quot;}],&quot;issued&quot;:{&quot;date-parts&quot;:[[2011]]},&quot;publisher-place&quot;:&quot;Hà Nội&quot;,&quot;language&quot;:&quot;vi&quot;,&quot;publisher&quot;:&quot;Nhà xuất bản Thông tin và Truyền thông&quot;,&quot;container-title-short&quot;:&quot;&quot;},&quot;isTemporary&quot;:false,&quot;suppress-author&quot;:false,&quot;composite&quot;:false,&quot;author-only&quot;:false}]},{&quot;citationID&quot;:&quot;MENDELEY_CITATION_ec89d61c-a2e7-42e3-a1fd-d9fbe28d450e&quot;,&quot;properties&quot;:{&quot;noteIndex&quot;:0},&quot;isEdited&quot;:false,&quot;manualOverride&quot;:{&quot;isManuallyOverridden&quot;:false,&quot;citeprocText&quot;:&quot;[5]&quot;,&quot;manualOverrideText&quot;:&quot;&quot;},&quot;citationTag&quot;:&quot;MENDELEY_CITATION_v3_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&quot;,&quot;citationItems&quot;:[{&quot;id&quot;:&quot;ccdcbff0-2fb2-3398-a1ca-4dd142d11eb0&quot;,&quot;itemData&quot;:{&quot;type&quot;:&quot;report&quot;,&quot;id&quot;:&quot;ccdcbff0-2fb2-3398-a1ca-4dd142d11eb0&quot;,&quot;title&quot;:&quot;The Keyed-Hash Message Authentication Code (HMAC), FIPS PUB 198-1&quot;,&quot;author&quot;:[{&quot;family&quot;:&quot;National Institute of Standards and Technology&quot;,&quot;given&quot;:&quot;&quot;,&quot;parse-names&quot;:false,&quot;dropping-particle&quot;:&quot;&quot;,&quot;non-dropping-particle&quot;:&quot;&quot;}],&quot;container-title&quot;:&quot;Federal Information Processing Standards Publication 198-1&quot;,&quot;DOI&quot;:&quot;10.6028/NIST.FIPS.198-1&quot;,&quot;issued&quot;:{&quot;date-parts&quot;:[[2008]]},&quot;publisher-place&quot;:&quot;Gaithersburg&quot;,&quot;language&quot;:&quot;en&quot;,&quot;publisher&quot;:&quot;National Institute of Standards and Technology&quot;,&quot;container-title-short&quot;:&quot;&quot;},&quot;isTemporary&quot;:false,&quot;suppress-author&quot;:false,&quot;composite&quot;:false,&quot;author-only&quot;:false}]},{&quot;citationID&quot;:&quot;MENDELEY_CITATION_afa14d02-442a-4442-9895-2c516970e993&quot;,&quot;properties&quot;:{&quot;noteIndex&quot;:0},&quot;isEdited&quot;:false,&quot;manualOverride&quot;:{&quot;isManuallyOverridden&quot;:false,&quot;citeprocText&quot;:&quot;[6]&quot;,&quot;manualOverrideText&quot;:&quot;&quot;},&quot;citationTag&quot;:&quot;MENDELEY_CITATION_v3_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&quot;,&quot;citationItems&quot;:[{&quot;id&quot;:&quot;c80d4153-fe82-3c71-8aeb-27d5ad5360a8&quot;,&quot;itemData&quot;:{&quot;type&quot;:&quot;paper-conference&quot;,&quot;id&quot;:&quot;c80d4153-fe82-3c71-8aeb-27d5ad5360a8&quot;,&quot;title&quot;:&quot;HiDDeN: Hiding Data with Deep Networks&quot;,&quot;author&quot;:[{&quot;family&quot;:&quot;Zhu&quot;,&quot;given&quot;:&quot;Jiren&quot;,&quot;parse-names&quot;:false,&quot;dropping-particle&quot;:&quot;&quot;,&quot;non-dropping-particle&quot;:&quot;&quot;},{&quot;family&quot;:&quot;Kaplan&quot;,&quot;given&quot;:&quot;Russell&quot;,&quot;parse-names&quot;:false,&quot;dropping-particle&quot;:&quot;&quot;,&quot;non-dropping-particle&quot;:&quot;&quot;},{&quot;family&quot;:&quot;Johnson&quot;,&quot;given&quot;:&quot;Justin&quot;,&quot;parse-names&quot;:false,&quot;dropping-particle&quot;:&quot;&quot;,&quot;non-dropping-particle&quot;:&quot;&quot;},{&quot;family&quot;:&quot;Fei-Fei&quot;,&quot;given&quot;:&quot;Li&quot;,&quot;parse-names&quot;:false,&quot;dropping-particle&quot;:&quot;&quot;,&quot;non-dropping-particle&quot;:&quot;&quot;}],&quot;container-title&quot;:&quot;Proceedings of the European Conference on Computer Vision&quot;,&quot;DOI&quot;:&quot;10.1007/978-3-030-01267-0_40&quot;,&quot;issued&quot;:{&quot;date-parts&quot;:[[2018]]},&quot;publisher-place&quot;:&quot;Munich&quot;,&quot;page&quot;:&quot;682-697&quot;,&quot;language&quot;:&quot;en&quot;,&quot;container-title-short&quot;:&quot;&quot;},&quot;isTemporary&quot;:false,&quot;suppress-author&quot;:false,&quot;composite&quot;:false,&quot;author-only&quot;:false}]},{&quot;citationID&quot;:&quot;MENDELEY_CITATION_9789b8aa-8ce5-4292-ace6-30af86efd645&quot;,&quot;properties&quot;:{&quot;noteIndex&quot;:0},&quot;isEdited&quot;:false,&quot;manualOverride&quot;:{&quot;isManuallyOverridden&quot;:false,&quot;citeprocText&quot;:&quot;[7]&quot;,&quot;manualOverrideText&quot;:&quot;&quot;},&quot;citationTag&quot;:&quot;MENDELEY_CITATION_v3_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&quot;,&quot;citationItems&quot;:[{&quot;id&quot;:&quot;4effade4-380c-3d9d-8d56-248b96964861&quot;,&quot;itemData&quot;:{&quot;type&quot;:&quot;paper-conference&quot;,&quot;id&quot;:&quot;4effade4-380c-3d9d-8d56-248b96964861&quot;,&quot;title&quot;:&quot;StegaStamp: Invisible Hyperlinks in Physical Photographs&quot;,&quot;author&quot;:[{&quot;family&quot;:&quot;Tancik&quot;,&quot;given&quot;:&quot;Matthew&quot;,&quot;parse-names&quot;:false,&quot;dropping-particle&quot;:&quot;&quot;,&quot;non-dropping-particle&quot;:&quot;&quot;},{&quot;family&quot;:&quot;Mildenhall&quot;,&quot;given&quot;:&quot;Ben&quot;,&quot;parse-names&quot;:false,&quot;dropping-particle&quot;:&quot;&quot;,&quot;non-dropping-particle&quot;:&quot;&quot;},{&quot;family&quot;:&quot;Ng&quot;,&quot;given&quot;:&quot;Ren&quot;,&quot;parse-names&quot;:false,&quot;dropping-particle&quot;:&quot;&quot;,&quot;non-dropping-particle&quot;:&quot;&quot;}],&quot;container-title&quot;:&quot;Proceedings of the IEEE/CVF Conference on Computer Vision and Pattern Recognition&quot;,&quot;DOI&quot;:&quot;10.1109/CVPR42600.2020.00219&quot;,&quot;issued&quot;:{&quot;date-parts&quot;:[[2020]]},&quot;publisher-place&quot;:&quot;Seattle&quot;,&quot;page&quot;:&quot;2114-2123&quot;,&quot;language&quot;:&quot;en&quot;,&quot;container-title-short&quot;:&quot;&quot;},&quot;isTemporary&quot;:false,&quot;suppress-author&quot;:false,&quot;composite&quot;:false,&quot;author-only&quot;:false}]},{&quot;citationID&quot;:&quot;MENDELEY_CITATION_447bdc70-b85a-4d94-b7e7-f567da18ae3f&quot;,&quot;properties&quot;:{&quot;noteIndex&quot;:0},&quot;isEdited&quot;:false,&quot;manualOverride&quot;:{&quot;isManuallyOverridden&quot;:false,&quot;citeprocText&quot;:&quot;[8]&quot;,&quot;manualOverrideText&quot;:&quot;&quot;},&quot;citationTag&quot;:&quot;MENDELEY_CITATION_v3_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&quot;,&quot;citationItems&quot;:[{&quot;id&quot;:&quot;33d4b502-bc61-3ff1-9602-7ad3834e3c37&quot;,&quot;itemData&quot;:{&quot;type&quot;:&quot;report&quot;,&quot;id&quot;:&quot;33d4b502-bc61-3ff1-9602-7ad3834e3c37&quot;,&quot;title&quot;:&quot;HMAC: Keyed-Hashing for Message Authentication, RFC 2104&quot;,&quot;author&quot;:[{&quot;family&quot;:&quot;Krawczyk&quot;,&quot;given&quot;:&quot;Hugo&quot;,&quot;parse-names&quot;:false,&quot;dropping-particle&quot;:&quot;&quot;,&quot;non-dropping-particle&quot;:&quot;&quot;},{&quot;family&quot;:&quot;Bellare&quot;,&quot;given&quot;:&quot;Mihir&quot;,&quot;parse-names&quot;:false,&quot;dropping-particle&quot;:&quot;&quot;,&quot;non-dropping-particle&quot;:&quot;&quot;},{&quot;family&quot;:&quot;Canetti&quot;,&quot;given&quot;:&quot;Ran&quot;,&quot;parse-names&quot;:false,&quot;dropping-particle&quot;:&quot;&quot;,&quot;non-dropping-particle&quot;:&quot;&quot;}],&quot;container-title&quot;:&quot;RFC 2104&quot;,&quot;URL&quot;:&quot;https://www.rfc-editor.org/rfc/rfc2104&quot;,&quot;issued&quot;:{&quot;date-parts&quot;:[[1997]]},&quot;language&quot;:&quot;en&quot;,&quot;publisher&quot;:&quot;Internet Engineering Task Force&quot;,&quot;container-title-short&quot;:&quot;&quot;},&quot;isTemporary&quot;:false,&quot;suppress-author&quot;:false,&quot;composite&quot;:false,&quot;author-only&quot;:false}]},{&quot;citationID&quot;:&quot;MENDELEY_CITATION_9016843e-eb1d-45be-bf85-466c6c398648&quot;,&quot;properties&quot;:{&quot;noteIndex&quot;:0},&quot;isEdited&quot;:false,&quot;manualOverride&quot;:{&quot;isManuallyOverridden&quot;:false,&quot;citeprocText&quot;:&quot;[9]&quot;,&quot;manualOverrideText&quot;:&quot;&quot;},&quot;citationTag&quot;:&quot;MENDELEY_CITATION_v3_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&quot;,&quot;citationItems&quot;:[{&quot;id&quot;:&quot;a50bfe76-5d58-3add-9049-d573a27f4a8a&quot;,&quot;itemData&quot;:{&quot;type&quot;:&quot;report&quot;,&quot;id&quot;:&quot;a50bfe76-5d58-3add-9049-d573a27f4a8a&quot;,&quot;title&quot;:&quot;Implementation Guidance for FIPS 140-3 and the Cryptographic Module Verification Program&quot;,&quot;author&quot;:[{&quot;family&quot;:&quot;National Institute of Standards and Technology&quot;,&quot;given&quot;:&quot;&quot;,&quot;parse-names&quot;:false,&quot;dropping-particle&quot;:&quot;&quot;,&quot;non-dropping-particle&quot;:&quot;&quot;}],&quot;URL&quot;:&quot;https://csrc.nist.gov/projects/cryptographic-module-validation-program/fips-140-3-ig-announcements&quot;,&quot;issued&quot;:{&quot;date-parts&quot;:[[2026]]},&quot;language&quot;:&quot;en&quot;,&quot;publisher&quot;:&quot;NIST Computer Security Resource Center&quot;,&quot;container-title-short&quot;:&quot;&quot;},&quot;isTemporary&quot;:false,&quot;suppress-author&quot;:false,&quot;composite&quot;:false,&quot;author-only&quot;:false}]},{&quot;citationID&quot;:&quot;MENDELEY_CITATION_e734feb1-075a-4b39-be7a-895dea8e0d51&quot;,&quot;properties&quot;:{&quot;noteIndex&quot;:0},&quot;isEdited&quot;:false,&quot;manualOverride&quot;:{&quot;isManuallyOverridden&quot;:false,&quot;citeprocText&quot;:&quot;[10]&quot;,&quot;manualOverrideText&quot;:&quot;&quot;},&quot;citationTag&quot;:&quot;MENDELEY_CITATION_v3_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&quot;,&quot;citationItems&quot;:[{&quot;id&quot;:&quot;857f447e-fa99-3b72-a554-024726609fed&quot;,&quot;itemData&quot;:{&quot;type&quot;:&quot;report&quot;,&quot;id&quot;:&quot;857f447e-fa99-3b72-a554-024726609fed&quot;,&quot;title&quot;:&quot;Secure Hash Standard (SHS), FIPS PUB 180-4&quot;,&quot;author&quot;:[{&quot;family&quot;:&quot;National Institute of Standards and Technology&quot;,&quot;given&quot;:&quot;&quot;,&quot;parse-names&quot;:false,&quot;dropping-particle&quot;:&quot;&quot;,&quot;non-dropping-particle&quot;:&quot;&quot;}],&quot;container-title&quot;:&quot;Federal Information Processing Standards Publication 180-4&quot;,&quot;DOI&quot;:&quot;10.6028/NIST.FIPS.180-4&quot;,&quot;issued&quot;:{&quot;date-parts&quot;:[[2015]]},&quot;publisher-place&quot;:&quot;Gaithersburg&quot;,&quot;language&quot;:&quot;en&quot;,&quot;publisher&quot;:&quot;National Institute of Standards and Technology&quot;,&quot;container-title-short&quot;:&quot;&quot;},&quot;isTemporary&quot;:false,&quot;suppress-author&quot;:false,&quot;composite&quot;:false,&quot;author-only&quot;:false}]},{&quot;citationID&quot;:&quot;MENDELEY_CITATION_4a295454-6d6c-41cf-9d2d-4b0a4ac3c27a&quot;,&quot;properties&quot;:{&quot;noteIndex&quot;:0},&quot;isEdited&quot;:false,&quot;manualOverride&quot;:{&quot;isManuallyOverridden&quot;:false,&quot;citeprocText&quot;:&quot;[11]&quot;,&quot;manualOverrideText&quot;:&quot;&quot;},&quot;citationTag&quot;:&quot;MENDELEY_CITATION_v3_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&quot;,&quot;citationItems&quot;:[{&quot;id&quot;:&quot;4fdd4fb1-f197-3e1e-92f3-099fca54e317&quot;,&quot;itemData&quot;:{&quot;type&quot;:&quot;report&quot;,&quot;id&quot;:&quot;4fdd4fb1-f197-3e1e-92f3-099fca54e317&quot;,&quot;title&quot;:&quot;Edwards-Curve Digital Signature Algorithm (EdDSA), RFC 8032&quot;,&quot;author&quot;:[{&quot;family&quot;:&quot;Josefsson&quot;,&quot;given&quot;:&quot;Simon&quot;,&quot;parse-names&quot;:false,&quot;dropping-particle&quot;:&quot;&quot;,&quot;non-dropping-particle&quot;:&quot;&quot;},{&quot;family&quot;:&quot;Liusvaara&quot;,&quot;given&quot;:&quot;Ilari&quot;,&quot;parse-names&quot;:false,&quot;dropping-particle&quot;:&quot;&quot;,&quot;non-dropping-particle&quot;:&quot;&quot;}],&quot;container-title&quot;:&quot;RFC 8032&quot;,&quot;URL&quot;:&quot;https://www.rfc-editor.org/rfc/rfc8032&quot;,&quot;issued&quot;:{&quot;date-parts&quot;:[[2017]]},&quot;language&quot;:&quot;en&quot;,&quot;publisher&quot;:&quot;Internet Engineering Task Force&quot;,&quot;container-title-short&quot;:&quot;&quot;},&quot;isTemporary&quot;:false,&quot;suppress-author&quot;:false,&quot;composite&quot;:false,&quot;author-only&quot;:false}]},{&quot;citationID&quot;:&quot;MENDELEY_CITATION_a5c106e8-aaf1-4d48-9f06-f7f602def46b&quot;,&quot;properties&quot;:{&quot;noteIndex&quot;:0},&quot;isEdited&quot;:false,&quot;manualOverride&quot;:{&quot;isManuallyOverridden&quot;:false,&quot;citeprocText&quot;:&quot;[12]&quot;,&quot;manualOverrideText&quot;:&quot;&quot;},&quot;citationTag&quot;:&quot;MENDELEY_CITATION_v3_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&quot;,&quot;citationItems&quot;:[{&quot;id&quot;:&quot;7a6137c4-65c3-30ba-a8f8-5285a40be139&quot;,&quot;itemData&quot;:{&quot;type&quot;:&quot;report&quot;,&quot;id&quot;:&quot;7a6137c4-65c3-30ba-a8f8-5285a40be139&quot;,&quot;title&quot;:&quot;JSON Canonicalization Scheme (JCS), RFC 8785&quot;,&quot;author&quot;:[{&quot;family&quot;:&quot;Rundgren&quot;,&quot;given&quot;:&quot;Anders&quot;,&quot;parse-names&quot;:false,&quot;dropping-particle&quot;:&quot;&quot;,&quot;non-dropping-particle&quot;:&quot;&quot;},{&quot;family&quot;:&quot;Jordan&quot;,&quot;given&quot;:&quot;Bret&quot;,&quot;parse-names&quot;:false,&quot;dropping-particle&quot;:&quot;&quot;,&quot;non-dropping-particle&quot;:&quot;&quot;},{&quot;family&quot;:&quot;Erdtman&quot;,&quot;given&quot;:&quot;Samuel&quot;,&quot;parse-names&quot;:false,&quot;dropping-particle&quot;:&quot;&quot;,&quot;non-dropping-particle&quot;:&quot;&quot;}],&quot;container-title&quot;:&quot;RFC 8785&quot;,&quot;URL&quot;:&quot;https://www.rfc-editor.org/rfc/rfc8785&quot;,&quot;issued&quot;:{&quot;date-parts&quot;:[[2020]]},&quot;language&quot;:&quot;en&quot;,&quot;publisher&quot;:&quot;Internet Engineering Task Force&quot;,&quot;container-title-short&quot;:&quot;&quot;},&quot;isTemporary&quot;:false,&quot;suppress-author&quot;:false,&quot;composite&quot;:false,&quot;author-only&quot;:false}]},{&quot;citationID&quot;:&quot;MENDELEY_CITATION_e482f74f-8ef8-4da6-949a-9949bd2f3fcc&quot;,&quot;properties&quot;:{&quot;noteIndex&quot;:0},&quot;isEdited&quot;:false,&quot;manualOverride&quot;:{&quot;isManuallyOverridden&quot;:false,&quot;citeprocText&quot;:&quot;[13]&quot;,&quot;manualOverrideText&quot;:&quot;&quot;},&quot;citationTag&quot;:&quot;MENDELEY_CITATION_v3_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&quot;,&quot;citationItems&quot;:[{&quot;id&quot;:&quot;2c89b2a8-aeb5-34f1-840f-bafbff8aaf47&quot;,&quot;itemData&quot;:{&quot;type&quot;:&quot;book&quot;,&quot;id&quot;:&quot;2c89b2a8-aeb5-34f1-840f-bafbff8aaf47&quot;,&quot;title&quot;:&quot;Cryptography and Network Security: Principles and Practice&quot;,&quot;author&quot;:[{&quot;family&quot;:&quot;Stallings&quot;,&quot;given&quot;:&quot;William&quot;,&quot;parse-names&quot;:false,&quot;dropping-particle&quot;:&quot;&quot;,&quot;non-dropping-particle&quot;:&quot;&quot;}],&quot;issued&quot;:{&quot;date-parts&quot;:[[2017]]},&quot;publisher-place&quot;:&quot;Boston&quot;,&quot;language&quot;:&quot;en&quot;,&quot;edition&quot;:&quot;7&quot;,&quot;publisher&quot;:&quot;Pearson&quot;,&quot;container-title-short&quot;:&quot;&quot;},&quot;isTemporary&quot;:false,&quot;suppress-author&quot;:false,&quot;composite&quot;:false,&quot;author-only&quot;:false}]},{&quot;citationID&quot;:&quot;MENDELEY_CITATION_7e33c668-1bd8-4adc-931c-77d199e80410&quot;,&quot;properties&quot;:{&quot;noteIndex&quot;:0},&quot;isEdited&quot;:false,&quot;manualOverride&quot;:{&quot;isManuallyOverridden&quot;:false,&quot;citeprocText&quot;:&quot;[1]&quot;,&quot;manualOverrideText&quot;:&quot;&quot;},&quot;citationTag&quot;:&quot;MENDELEY_CITATION_v3_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&quot;,&quot;citationItems&quot;:[{&quot;id&quot;:&quot;294dfdf4-c0cd-3237-9ca0-fa7e37df1a19&quot;,&quot;itemData&quot;:{&quot;type&quot;:&quot;book&quot;,&quot;id&quot;:&quot;294dfdf4-c0cd-3237-9ca0-fa7e37df1a19&quot;,&quot;title&quot;:&quot;Digital Watermarking and Steganography&quot;,&quot;author&quot;:[{&quot;family&quot;:&quot;Cox&quot;,&quot;given&quot;:&quot;Ingemar J&quot;,&quot;parse-names&quot;:false,&quot;dropping-particle&quot;:&quot;&quot;,&quot;non-dropping-particle&quot;:&quot;&quot;},{&quot;family&quot;:&quot;Miller&quot;,&quot;given&quot;:&quot;Matthew L&quot;,&quot;parse-names&quot;:false,&quot;dropping-particle&quot;:&quot;&quot;,&quot;non-dropping-particle&quot;:&quot;&quot;},{&quot;family&quot;:&quot;Bloom&quot;,&quot;given&quot;:&quot;Jeffrey A&quot;,&quot;parse-names&quot;:false,&quot;dropping-particle&quot;:&quot;&quot;,&quot;non-dropping-particle&quot;:&quot;&quot;},{&quot;family&quot;:&quot;Fridrich&quot;,&quot;given&quot;:&quot;Jessica&quot;,&quot;parse-names&quot;:false,&quot;dropping-particle&quot;:&quot;&quot;,&quot;non-dropping-particle&quot;:&quot;&quot;},{&quot;family&quot;:&quot;Kalker&quot;,&quot;given&quot;:&quot;Ton&quot;,&quot;parse-names&quot;:false,&quot;dropping-particle&quot;:&quot;&quot;,&quot;non-dropping-particle&quot;:&quot;&quot;}],&quot;issued&quot;:{&quot;date-parts&quot;:[[2007]]},&quot;publisher-place&quot;:&quot;Burlington&quot;,&quot;language&quot;:&quot;en&quot;,&quot;edition&quot;:&quot;2&quot;,&quot;publisher&quot;:&quot;Morgan Kaufmann&quot;,&quot;container-title-short&quot;:&quot;&quot;},&quot;isTemporary&quot;:false,&quot;suppress-author&quot;:false,&quot;composite&quot;:false,&quot;author-only&quot;:false}]},{&quot;citationID&quot;:&quot;MENDELEY_CITATION_cd31db8c-eda7-4389-95b0-5f1a7051b6e6&quot;,&quot;properties&quot;:{&quot;noteIndex&quot;:0},&quot;isEdited&quot;:false,&quot;manualOverride&quot;:{&quot;isManuallyOverridden&quot;:false,&quot;citeprocText&quot;:&quot;[14]&quot;,&quot;manualOverrideText&quot;:&quot;&quot;},&quot;citationTag&quot;:&quot;MENDELEY_CITATION_v3_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&quot;,&quot;citationItems&quot;:[{&quot;id&quot;:&quot;4e85f1b3-471c-381e-8da1-057ddb9ebe95&quot;,&quot;itemData&quot;:{&quot;type&quot;:&quot;article-journal&quot;,&quot;id&quot;:&quot;4e85f1b3-471c-381e-8da1-057ddb9ebe95&quot;,&quot;title&quot;:&quot;Image Steganography Techniques: An Overview&quot;,&quot;author&quot;:[{&quot;family&quot;:&quot;Hamid&quot;,&quot;given&quot;:&quot;Nagham&quot;,&quot;parse-names&quot;:false,&quot;dropping-particle&quot;:&quot;&quot;,&quot;non-dropping-particle&quot;:&quot;&quot;},{&quot;family&quot;:&quot;Yahya&quot;,&quot;given&quot;:&quot;Abid&quot;,&quot;parse-names&quot;:false,&quot;dropping-particle&quot;:&quot;&quot;,&quot;non-dropping-particle&quot;:&quot;&quot;},{&quot;family&quot;:&quot;Ahmad&quot;,&quot;given&quot;:&quot;R Badlishah&quot;,&quot;parse-names&quot;:false,&quot;dropping-particle&quot;:&quot;&quot;,&quot;non-dropping-particle&quot;:&quot;&quot;},{&quot;family&quot;:&quot;Al-Qershi&quot;,&quot;given&quot;:&quot;Osamah M&quot;,&quot;parse-names&quot;:false,&quot;dropping-particle&quot;:&quot;&quot;,&quot;non-dropping-particle&quot;:&quot;&quot;}],&quot;container-title&quot;:&quot;International Journal of Computer Science and Security&quot;,&quot;issued&quot;:{&quot;date-parts&quot;:[[2012]]},&quot;page&quot;:&quot;168-187&quot;,&quot;language&quot;:&quot;en&quot;,&quot;issue&quot;:&quot;3&quot;,&quot;volume&quot;:&quot;6&quot;,&quot;container-title-short&quot;:&quot;&quot;},&quot;isTemporary&quot;:false,&quot;suppress-author&quot;:false,&quot;composite&quot;:false,&quot;author-only&quot;:false}]},{&quot;citationID&quot;:&quot;MENDELEY_CITATION_60d90cba-9f76-4564-875d-a3175cc98434&quot;,&quot;properties&quot;:{&quot;noteIndex&quot;:0},&quot;isEdited&quot;:false,&quot;manualOverride&quot;:{&quot;isManuallyOverridden&quot;:false,&quot;citeprocText&quot;:&quot;[15]&quot;,&quot;manualOverrideText&quot;:&quot;&quot;},&quot;citationTag&quot;:&quot;MENDELEY_CITATION_v3_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&quot;,&quot;citationItems&quot;:[{&quot;id&quot;:&quot;a769938a-cc3b-3483-9cbb-6dbf35d0ae05&quot;,&quot;itemData&quot;:{&quot;type&quot;:&quot;article-journal&quot;,&quot;id&quot;:&quot;a769938a-cc3b-3483-9cbb-6dbf35d0ae05&quot;,&quot;title&quot;:&quot;An overview of steganography techniques applied to the protection of biometric data&quot;,&quot;author&quot;:[{&quot;family&quot;:&quot;Douglas&quot;,&quot;given&quot;:&quot;Mandy&quot;,&quot;parse-names&quot;:false,&quot;dropping-particle&quot;:&quot;&quot;,&quot;non-dropping-particle&quot;:&quot;&quot;},{&quot;family&quot;:&quot;Bailey&quot;,&quot;given&quot;:&quot;Karen&quot;,&quot;parse-names&quot;:false,&quot;dropping-particle&quot;:&quot;&quot;,&quot;non-dropping-particle&quot;:&quot;&quot;},{&quot;family&quot;:&quot;Leeney&quot;,&quot;given&quot;:&quot;Mark&quot;,&quot;parse-names&quot;:false,&quot;dropping-particle&quot;:&quot;&quot;,&quot;non-dropping-particle&quot;:&quot;&quot;},{&quot;family&quot;:&quot;Curran&quot;,&quot;given&quot;:&quot;Kevin&quot;,&quot;parse-names&quot;:false,&quot;dropping-particle&quot;:&quot;&quot;,&quot;non-dropping-particle&quot;:&quot;&quot;}],&quot;container-title&quot;:&quot;Multimedia Tools and Applications&quot;,&quot;container-title-short&quot;:&quot;Multimed. Tools Appl.&quot;,&quot;DOI&quot;:&quot;10.1007/s11042-017-5308-3&quot;,&quot;issued&quot;:{&quot;date-parts&quot;:[[2018]]},&quot;page&quot;:&quot;17333-17373&quot;,&quot;language&quot;:&quot;en&quot;,&quot;issue&quot;:&quot;13&quot;,&quot;volume&quot;:&quot;77&quot;},&quot;isTemporary&quot;:false,&quot;suppress-author&quot;:false,&quot;composite&quot;:false,&quot;author-only&quot;:false}]},{&quot;citationID&quot;:&quot;MENDELEY_CITATION_e85272e5-f412-4954-9fc4-2ebf8c86668d&quot;,&quot;properties&quot;:{&quot;noteIndex&quot;:0},&quot;isEdited&quot;:false,&quot;manualOverride&quot;:{&quot;isManuallyOverridden&quot;:false,&quot;citeprocText&quot;:&quot;[16]&quot;,&quot;manualOverrideText&quot;:&quot;&quot;},&quot;citationTag&quot;:&quot;MENDELEY_CITATION_v3_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&quot;,&quot;citationItems&quot;:[{&quot;id&quot;:&quot;873f3fbf-2370-3c67-af39-f81d75bdc7f9&quot;,&quot;itemData&quot;:{&quot;type&quot;:&quot;article&quot;,&quot;id&quot;:&quot;873f3fbf-2370-3c67-af39-f81d75bdc7f9&quot;,&quot;title&quot;:&quot;wmbench: image watermarking benchmark&quot;,&quot;author&quot;:[{&quot;family&quot;:&quot;wmbench contributors&quot;,&quot;given&quot;:&quot;&quot;,&quot;parse-names&quot;:false,&quot;dropping-particle&quot;:&quot;&quot;,&quot;non-dropping-particle&quot;:&quot;&quot;}],&quot;URL&quot;:&quot;https://github.com/alexandersolonsky/wmbench&quot;,&quot;issued&quot;:{&quot;date-parts&quot;:[[2026]]},&quot;language&quot;:&quot;en&quot;,&quot;publisher&quot;:&quot;GitHub&quot;,&quot;container-title-short&quot;:&quot;&quot;},&quot;isTemporary&quot;:false,&quot;suppress-author&quot;:false,&quot;composite&quot;:false,&quot;author-only&quot;:false}]},{&quot;citationID&quot;:&quot;MENDELEY_CITATION_b9991ea2-e07a-455c-9938-8f6a658640a6&quot;,&quot;properties&quot;:{&quot;noteIndex&quot;:0},&quot;isEdited&quot;:false,&quot;manualOverride&quot;:{&quot;isManuallyOverridden&quot;:false,&quot;citeprocText&quot;:&quot;[17]&quot;,&quot;manualOverrideText&quot;:&quot;&quot;},&quot;citationTag&quot;:&quot;MENDELEY_CITATION_v3_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&quot;,&quot;citationItems&quot;:[{&quot;id&quot;:&quot;e093bbd2-c3cf-31d8-a3a6-627f57db7d63&quot;,&quot;itemData&quot;:{&quot;type&quot;:&quot;article&quot;,&quot;id&quot;:&quot;e093bbd2-c3cf-31d8-a3a6-627f57db7d63&quot;,&quot;title&quot;:&quot;TrustMark: Universal Watermarking for Arbitrary Resolution Images&quot;,&quot;author&quot;:[{&quot;family&quot;:&quot;Adobe Research&quot;,&quot;given&quot;:&quot;&quot;,&quot;parse-names&quot;:false,&quot;dropping-particle&quot;:&quot;&quot;,&quot;non-dropping-particle&quot;:&quot;&quot;}],&quot;URL&quot;:&quot;https://github.com/adobe/trustmark&quot;,&quot;issued&quot;:{&quot;date-parts&quot;:[[2026]]},&quot;language&quot;:&quot;en&quot;,&quot;publisher&quot;:&quot;GitHub&quot;,&quot;container-title-short&quot;:&quot;&quot;},&quot;isTemporary&quot;:false,&quot;suppress-author&quot;:false,&quot;composite&quot;:false,&quot;author-only&quot;:false}]},{&quot;citationID&quot;:&quot;MENDELEY_CITATION_bb9b00c2-7f23-4487-a25e-e688949357df&quot;,&quot;properties&quot;:{&quot;noteIndex&quot;:0},&quot;isEdited&quot;:false,&quot;manualOverride&quot;:{&quot;isManuallyOverridden&quot;:false,&quot;citeprocText&quot;:&quot;[18]&quot;,&quot;manualOverrideText&quot;:&quot;&quot;},&quot;citationTag&quot;:&quot;MENDELEY_CITATION_v3_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&quot;,&quot;citationItems&quot;:[{&quot;id&quot;:&quot;c166265a-81d0-36ed-9fc4-27ce957fc0da&quot;,&quot;itemData&quot;:{&quot;type&quot;:&quot;article&quot;,&quot;id&quot;:&quot;c166265a-81d0-36ed-9fc4-27ce957fc0da&quot;,&quot;title&quot;:&quot;Watermark Anything with Localized Messages&quot;,&quot;author&quot;:[{&quot;family&quot;:&quot;Sander&quot;,&quot;given&quot;:&quot;Tom&quot;,&quot;parse-names&quot;:false,&quot;dropping-particle&quot;:&quot;&quot;,&quot;non-dropping-particle&quot;:&quot;&quot;},{&quot;family&quot;:&quot;Fernandez&quot;,&quot;given&quot;:&quot;Pierre&quot;,&quot;parse-names&quot;:false,&quot;dropping-particle&quot;:&quot;&quot;,&quot;non-dropping-particle&quot;:&quot;&quot;},{&quot;family&quot;:&quot;Durmus&quot;,&quot;given&quot;:&quot;Alain&quot;,&quot;parse-names&quot;:false,&quot;dropping-particle&quot;:&quot;&quot;,&quot;non-dropping-particle&quot;:&quot;&quot;},{&quot;family&quot;:&quot;Douze&quot;,&quot;given&quot;:&quot;Matthijs&quot;,&quot;parse-names&quot;:false,&quot;dropping-particle&quot;:&quot;&quot;,&quot;non-dropping-particle&quot;:&quot;&quot;},{&quot;family&quot;:&quot;Furon&quot;,&quot;given&quot;:&quot;Teddy&quot;,&quot;parse-names&quot;:false,&quot;dropping-particle&quot;:&quot;&quot;,&quot;non-dropping-particle&quot;:&quot;&quot;}],&quot;URL&quot;:&quot;https://github.com/facebookresearch/watermark-anything&quot;,&quot;issued&quot;:{&quot;date-parts&quot;:[[2025]]},&quot;language&quot;:&quot;en&quot;,&quot;publisher&quot;:&quot;Meta AI Research&quot;,&quot;container-title-short&quot;:&quot;&quot;},&quot;isTemporary&quot;:false,&quot;suppress-author&quot;:false,&quot;composite&quot;:false,&quot;author-only&quot;:false}]},{&quot;citationID&quot;:&quot;MENDELEY_CITATION_a0432d76-f6aa-4192-9639-44b7ff844d0c&quot;,&quot;properties&quot;:{&quot;noteIndex&quot;:0},&quot;isEdited&quot;:false,&quot;manualOverride&quot;:{&quot;isManuallyOverridden&quot;:false,&quot;citeprocText&quot;:&quot;[16]&quot;,&quot;manualOverrideText&quot;:&quot;&quot;},&quot;citationTag&quot;:&quot;MENDELEY_CITATION_v3_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&quot;,&quot;citationItems&quot;:[{&quot;id&quot;:&quot;873f3fbf-2370-3c67-af39-f81d75bdc7f9&quot;,&quot;itemData&quot;:{&quot;type&quot;:&quot;article&quot;,&quot;id&quot;:&quot;873f3fbf-2370-3c67-af39-f81d75bdc7f9&quot;,&quot;title&quot;:&quot;wmbench: image watermarking benchmark&quot;,&quot;author&quot;:[{&quot;family&quot;:&quot;wmbench contributors&quot;,&quot;given&quot;:&quot;&quot;,&quot;parse-names&quot;:false,&quot;dropping-particle&quot;:&quot;&quot;,&quot;non-dropping-particle&quot;:&quot;&quot;}],&quot;URL&quot;:&quot;https://github.com/alexandersolonsky/wmbench&quot;,&quot;issued&quot;:{&quot;date-parts&quot;:[[2026]]},&quot;language&quot;:&quot;en&quot;,&quot;publisher&quot;:&quot;GitHub&quot;,&quot;container-title-short&quot;:&quot;&quot;},&quot;isTemporary&quot;:false,&quot;suppress-author&quot;:false,&quot;composite&quot;:false,&quot;author-only&quot;:false}]},{&quot;citationID&quot;:&quot;MENDELEY_CITATION_0b6ce9cf-57cb-437b-acdb-e9690ff1488f&quot;,&quot;properties&quot;:{&quot;noteIndex&quot;:0},&quot;isEdited&quot;:false,&quot;manualOverride&quot;:{&quot;isManuallyOverridden&quot;:false,&quot;citeprocText&quot;:&quot;[19]&quot;,&quot;manualOverrideText&quot;:&quot;&quot;},&quot;citationTag&quot;:&quot;MENDELEY_CITATION_v3_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&quot;,&quot;citationItems&quot;:[{&quot;id&quot;:&quot;30f3db65-f1e0-3547-a850-0309ca77212e&quot;,&quot;itemData&quot;:{&quot;type&quot;:&quot;article&quot;,&quot;id&quot;:&quot;30f3db65-f1e0-3547-a850-0309ca77212e&quot;,&quot;title&quot;:&quot;blind_watermark: blind and invisible image watermark&quot;,&quot;author&quot;:[{&quot;family&quot;:&quot;Guo Fei&quot;,&quot;given&quot;:&quot;&quot;,&quot;parse-names&quot;:false,&quot;dropping-particle&quot;:&quot;&quot;,&quot;non-dropping-particle&quot;:&quot;&quot;}],&quot;URL&quot;:&quot;https://github.com/guofei9987/blind_watermark&quot;,&quot;issued&quot;:{&quot;date-parts&quot;:[[2025]]},&quot;language&quot;:&quot;en&quot;,&quot;publisher&quot;:&quot;GitHub&quot;,&quot;container-title-short&quot;:&quot;&quot;},&quot;isTemporary&quot;:false,&quot;suppress-author&quot;:false,&quot;composite&quot;:false,&quot;author-only&quot;:false}]},{&quot;citationID&quot;:&quot;MENDELEY_CITATION_39733519-d913-49ab-bf18-6b89d147838f&quot;,&quot;properties&quot;:{&quot;noteIndex&quot;:0},&quot;isEdited&quot;:false,&quot;manualOverride&quot;:{&quot;isManuallyOverridden&quot;:false,&quot;citeprocText&quot;:&quot;[19]&quot;,&quot;manualOverrideText&quot;:&quot;&quot;},&quot;citationTag&quot;:&quot;MENDELEY_CITATION_v3_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&quot;,&quot;citationItems&quot;:[{&quot;id&quot;:&quot;30f3db65-f1e0-3547-a850-0309ca77212e&quot;,&quot;itemData&quot;:{&quot;type&quot;:&quot;article&quot;,&quot;id&quot;:&quot;30f3db65-f1e0-3547-a850-0309ca77212e&quot;,&quot;title&quot;:&quot;blind_watermark: blind and invisible image watermark&quot;,&quot;author&quot;:[{&quot;family&quot;:&quot;Guo Fei&quot;,&quot;given&quot;:&quot;&quot;,&quot;parse-names&quot;:false,&quot;dropping-particle&quot;:&quot;&quot;,&quot;non-dropping-particle&quot;:&quot;&quot;}],&quot;URL&quot;:&quot;https://github.com/guofei9987/blind_watermark&quot;,&quot;issued&quot;:{&quot;date-parts&quot;:[[2025]]},&quot;language&quot;:&quot;en&quot;,&quot;publisher&quot;:&quot;GitHub&quot;,&quot;container-title-short&quot;:&quot;&quot;},&quot;isTemporary&quot;:false,&quot;suppress-author&quot;:false,&quot;composite&quot;:false,&quot;author-only&quot;:false}]},{&quot;citationID&quot;:&quot;MENDELEY_CITATION_043d774a-7053-4dd1-96ba-2fbfa540c020&quot;,&quot;properties&quot;:{&quot;noteIndex&quot;:0},&quot;isEdited&quot;:false,&quot;manualOverride&quot;:{&quot;isManuallyOverridden&quot;:false,&quot;citeprocText&quot;:&quot;[19]&quot;,&quot;manualOverrideText&quot;:&quot;&quot;},&quot;citationTag&quot;:&quot;MENDELEY_CITATION_v3_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&quot;,&quot;citationItems&quot;:[{&quot;id&quot;:&quot;30f3db65-f1e0-3547-a850-0309ca77212e&quot;,&quot;itemData&quot;:{&quot;type&quot;:&quot;article&quot;,&quot;id&quot;:&quot;30f3db65-f1e0-3547-a850-0309ca77212e&quot;,&quot;title&quot;:&quot;blind_watermark: blind and invisible image watermark&quot;,&quot;author&quot;:[{&quot;family&quot;:&quot;Guo Fei&quot;,&quot;given&quot;:&quot;&quot;,&quot;parse-names&quot;:false,&quot;dropping-particle&quot;:&quot;&quot;,&quot;non-dropping-particle&quot;:&quot;&quot;}],&quot;URL&quot;:&quot;https://github.com/guofei9987/blind_watermark&quot;,&quot;issued&quot;:{&quot;date-parts&quot;:[[2025]]},&quot;language&quot;:&quot;en&quot;,&quot;publisher&quot;:&quot;GitHub&quot;,&quot;container-title-short&quot;:&quot;&quot;},&quot;isTemporary&quot;:false,&quot;suppress-author&quot;:false,&quot;composite&quot;:false,&quot;author-only&quot;:false}]},{&quot;citationID&quot;:&quot;MENDELEY_CITATION_ee378cba-17c5-4730-9d12-d215c85ab2ae&quot;,&quot;properties&quot;:{&quot;noteIndex&quot;:0},&quot;isEdited&quot;:false,&quot;manualOverride&quot;:{&quot;isManuallyOverridden&quot;:false,&quot;citeprocText&quot;:&quot;[20]&quot;,&quot;manualOverrideText&quot;:&quot;&quot;},&quot;citationTag&quot;:&quot;MENDELEY_CITATION_v3_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&quot;,&quot;citationItems&quot;:[{&quot;id&quot;:&quot;aa355de9-58fc-3184-b1ee-994847e37269&quot;,&quot;itemData&quot;:{&quot;type&quot;:&quot;article&quot;,&quot;id&quot;:&quot;aa355de9-58fc-3184-b1ee-994847e37269&quot;,&quot;title&quot;:&quot;Screen-Shooting-Resilient-Document-Image-Watermarking&quot;,&quot;author&quot;:[{&quot;family&quot;:&quot;gslxr&quot;,&quot;given&quot;:&quot;&quot;,&quot;parse-names&quot;:false,&quot;dropping-particle&quot;:&quot;&quot;,&quot;non-dropping-particle&quot;:&quot;&quot;}],&quot;URL&quot;:&quot;https://github.com/gslxr/Screen-Shooting-Resilient-Document-Image-Watermarking&quot;,&quot;issued&quot;:{&quot;date-parts&quot;:[[2024]]},&quot;language&quot;:&quot;en&quot;,&quot;publisher&quot;:&quot;GitHub&quot;,&quot;container-title-short&quot;:&quot;&quot;},&quot;isTemporary&quot;:false,&quot;suppress-author&quot;:false,&quot;composite&quot;:false,&quot;author-only&quot;:false}]},{&quot;citationID&quot;:&quot;MENDELEY_CITATION_fce4d0ca-e339-477c-882e-0cb15c99b2a7&quot;,&quot;properties&quot;:{&quot;noteIndex&quot;:0},&quot;isEdited&quot;:false,&quot;manualOverride&quot;:{&quot;isManuallyOverridden&quot;:false,&quot;citeprocText&quot;:&quot;[21]&quot;,&quot;manualOverrideText&quot;:&quot;&quot;},&quot;citationTag&quot;:&quot;MENDELEY_CITATION_v3_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&quot;,&quot;citationItems&quot;:[{&quot;id&quot;:&quot;cb51eba7-8a4b-3ef9-95eb-baca01fbfa22&quot;,&quot;itemData&quot;:{&quot;type&quot;:&quot;article-journal&quot;,&quot;id&quot;:&quot;cb51eba7-8a4b-3ef9-95eb-baca01fbfa22&quot;,&quot;title&quot;:&quot;Screen-shooting resilient watermarking&quot;,&quot;author&quot;:[{&quot;family&quot;:&quot;Fang&quot;,&quot;given&quot;:&quot;Han&quot;,&quot;parse-names&quot;:false,&quot;dropping-particle&quot;:&quot;&quot;,&quot;non-dropping-particle&quot;:&quot;&quot;},{&quot;family&quot;:&quot;Zhang&quot;,&quot;given&quot;:&quot;Weiming&quot;,&quot;parse-names&quot;:false,&quot;dropping-particle&quot;:&quot;&quot;,&quot;non-dropping-particle&quot;:&quot;&quot;},{&quot;family&quot;:&quot;Zhou&quot;,&quot;given&quot;:&quot;Hang&quot;,&quot;parse-names&quot;:false,&quot;dropping-particle&quot;:&quot;&quot;,&quot;non-dropping-particle&quot;:&quot;&quot;},{&quot;family&quot;:&quot;Cui&quot;,&quot;given&quot;:&quot;Hao&quot;,&quot;parse-names&quot;:false,&quot;dropping-particle&quot;:&quot;&quot;,&quot;non-dropping-particle&quot;:&quot;&quot;},{&quot;family&quot;:&quot;Yu&quot;,&quot;given&quot;:&quot;Nenghai&quot;,&quot;parse-names&quot;:false,&quot;dropping-particle&quot;:&quot;&quot;,&quot;non-dropping-particle&quot;:&quot;&quot;}],&quot;container-title&quot;:&quot;IEEE Transactions on Information Forensics and Security&quot;,&quot;DOI&quot;:&quot;10.1109/TIFS.2018.2878541&quot;,&quot;issued&quot;:{&quot;date-parts&quot;:[[2019]]},&quot;page&quot;:&quot;1403-1418&quot;,&quot;language&quot;:&quot;en&quot;,&quot;issue&quot;:&quot;6&quot;,&quot;volume&quot;:&quot;14&quot;,&quot;container-title-short&quot;:&quot;&quot;},&quot;isTemporary&quot;:false,&quot;suppress-author&quot;:false,&quot;composite&quot;:false,&quot;author-only&quot;:false}]},{&quot;citationID&quot;:&quot;MENDELEY_CITATION_ac6d344b-b4e5-4e36-974d-54918accafb1&quot;,&quot;properties&quot;:{&quot;noteIndex&quot;:0},&quot;isEdited&quot;:false,&quot;manualOverride&quot;:{&quot;isManuallyOverridden&quot;:false,&quot;citeprocText&quot;:&quot;[22]&quot;,&quot;manualOverrideText&quot;:&quot;&quot;},&quot;citationTag&quot;:&quot;MENDELEY_CITATION_v3_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&quot;,&quot;citationItems&quot;:[{&quot;id&quot;:&quot;5b2133e5-ae10-359b-93d5-685dd4d2d77d&quot;,&quot;itemData&quot;:{&quot;type&quot;:&quot;article&quot;,&quot;id&quot;:&quot;5b2133e5-ae10-359b-93d5-685dd4d2d77d&quot;,&quot;title&quot;:&quot;invisible-watermark: python library for invisible image watermark&quot;,&quot;author&quot;:[{&quot;family&quot;:&quot;ShieldMnt&quot;,&quot;given&quot;:&quot;&quot;,&quot;parse-names&quot;:false,&quot;dropping-particle&quot;:&quot;&quot;,&quot;non-dropping-particle&quot;:&quot;&quot;}],&quot;URL&quot;:&quot;https://github.com/ShieldMnt/invisible-watermark&quot;,&quot;issued&quot;:{&quot;date-parts&quot;:[[2024]]},&quot;language&quot;:&quot;en&quot;,&quot;publisher&quot;:&quot;GitHub&quot;,&quot;container-title-short&quot;:&quot;&quot;},&quot;isTemporary&quot;:false,&quot;suppress-author&quot;:false,&quot;composite&quot;:false,&quot;author-only&quot;:false}]},{&quot;citationID&quot;:&quot;MENDELEY_CITATION_80c47e8c-a008-4654-8edf-c76ec3844241&quot;,&quot;properties&quot;:{&quot;noteIndex&quot;:0},&quot;isEdited&quot;:false,&quot;manualOverride&quot;:{&quot;isManuallyOverridden&quot;:false,&quot;citeprocText&quot;:&quot;[19]&quot;,&quot;manualOverrideText&quot;:&quot;&quot;},&quot;citationTag&quot;:&quot;MENDELEY_CITATION_v3_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&quot;,&quot;citationItems&quot;:[{&quot;id&quot;:&quot;30f3db65-f1e0-3547-a850-0309ca77212e&quot;,&quot;itemData&quot;:{&quot;type&quot;:&quot;article&quot;,&quot;id&quot;:&quot;30f3db65-f1e0-3547-a850-0309ca77212e&quot;,&quot;title&quot;:&quot;blind_watermark: blind and invisible image watermark&quot;,&quot;author&quot;:[{&quot;family&quot;:&quot;Guo Fei&quot;,&quot;given&quot;:&quot;&quot;,&quot;parse-names&quot;:false,&quot;dropping-particle&quot;:&quot;&quot;,&quot;non-dropping-particle&quot;:&quot;&quot;}],&quot;URL&quot;:&quot;https://github.com/guofei9987/blind_watermark&quot;,&quot;issued&quot;:{&quot;date-parts&quot;:[[2025]]},&quot;language&quot;:&quot;en&quot;,&quot;publisher&quot;:&quot;GitHub&quot;,&quot;container-title-short&quot;:&quot;&quot;},&quot;isTemporary&quot;:false,&quot;suppress-author&quot;:false,&quot;composite&quot;:false,&quot;author-only&quot;:false}]},{&quot;citationID&quot;:&quot;MENDELEY_CITATION_31c20283-c8dd-46ca-918c-3d846816f550&quot;,&quot;properties&quot;:{&quot;noteIndex&quot;:0},&quot;isEdited&quot;:false,&quot;manualOverride&quot;:{&quot;isManuallyOverridden&quot;:false,&quot;citeprocText&quot;:&quot;[16]&quot;,&quot;manualOverrideText&quot;:&quot;&quot;},&quot;citationTag&quot;:&quot;MENDELEY_CITATION_v3_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&quot;,&quot;citationItems&quot;:[{&quot;id&quot;:&quot;873f3fbf-2370-3c67-af39-f81d75bdc7f9&quot;,&quot;itemData&quot;:{&quot;type&quot;:&quot;article&quot;,&quot;id&quot;:&quot;873f3fbf-2370-3c67-af39-f81d75bdc7f9&quot;,&quot;title&quot;:&quot;wmbench: image watermarking benchmark&quot;,&quot;author&quot;:[{&quot;family&quot;:&quot;wmbench contributors&quot;,&quot;given&quot;:&quot;&quot;,&quot;parse-names&quot;:false,&quot;dropping-particle&quot;:&quot;&quot;,&quot;non-dropping-particle&quot;:&quot;&quot;}],&quot;URL&quot;:&quot;https://github.com/alexandersolonsky/wmbench&quot;,&quot;issued&quot;:{&quot;date-parts&quot;:[[2026]]},&quot;language&quot;:&quot;en&quot;,&quot;publisher&quot;:&quot;GitHub&quot;,&quot;container-title-short&quot;:&quot;&quot;},&quot;isTemporary&quot;:false,&quot;suppress-author&quot;:false,&quot;composite&quot;:false,&quot;author-only&quot;:false}]}]"/>
     <we:property name="MENDELEY_CITATIONS_STYLE" value="{&quot;id&quot;:&quot;http://www.zotero.org/styles/ieee&quot;,&quot;title&quot;:&quot;IEEE Reference Guide version 11.29.2023&quot;,&quot;format&quot;:&quot;numeric&quot;,&quot;defaultLocale&quot;:null,&quot;isLocaleCodeValid&quot;:true}"/>
   </we:properties>
   <we:bindings/>

</xml_diff>

<commit_message>
docs: replace the hand-built bibliography with the one Mendeley generates
The static list was alphabetical and numbered 1-22 while the live citations
number by order of appearance, so the two disagreed on every number. The
generated list is a MENDELEY_BIBLIOGRAPHY content control holding the same 22
sources, now in citation order and matching the in-text markers.

Updates are set to manual: on a 95-page file live updates make Word recompute
the list on every edit.

Co-Authored-By: Claude Opus 5 <noreply@anthropic.com>
Claude-Session: https://claude.ai/code/session_01SzJTThV64VAErHN4L42mg9
</commit_message>
<xml_diff>
--- a/docs/project/Nhom9_TruyVetToanVenVanBan.docx
+++ b/docs/project/Nhom9_TruyVetToanVenVanBan.docx
@@ -29536,184 +29536,786 @@
       </w:r>
       <w:bookmarkEnd w:id="137"/>
     </w:p>
-    <w:p>
-      <w:pPr>
-        <w:pStyle w:val="FirstParagraph"/>
-      </w:pPr>
-      <w:r>
-        <w:t>[1] Adobe Research, “TrustMark: Universal Watermarking for Arbitrary Resolution Images,” 2026, GitHub. [Online]. Available: https://github.com/adobe/trustmark</w:t>
-      </w:r>
-    </w:p>
-    <w:p>
-      <w:pPr>
-        <w:pStyle w:val="BodyText"/>
-      </w:pPr>
-      <w:r>
-        <w:t>[2] B. Chen and G. W. Wornell, “Quantization index modulation: a class of provably good methods for digital watermarking and information embedding,” IEEE Transactions on Information Theory, vol. 47, no. 4, pp. 1423-1443, 2001, doi: 10.1109/18.923725.</w:t>
-      </w:r>
-    </w:p>
-    <w:p>
-      <w:pPr>
-        <w:pStyle w:val="BodyText"/>
-      </w:pPr>
-      <w:r>
-        <w:t>[3] I. J. Cox, M. L. Miller, J. A. Bloom, J. Fridrich, and T. Kalker, Digital Watermarking and Steganography, 2nd ed. Burlington: Morgan Kaufmann, 2007.</w:t>
-      </w:r>
-    </w:p>
-    <w:p>
-      <w:pPr>
-        <w:pStyle w:val="BodyText"/>
-      </w:pPr>
-      <w:r>
-        <w:t>[4] M. Douglas, K. Bailey, M. Leeney, and K. Curran, “An overview of steganography techniques applied to the protection of biometric data,” Multimedia Tools and Applications, vol. 77, no. 13, pp. 17333-17373, 2018, doi: 10.1007/s11042-017-5308-3.</w:t>
-      </w:r>
-    </w:p>
-    <w:p>
-      <w:pPr>
-        <w:pStyle w:val="BodyText"/>
-      </w:pPr>
-      <w:r>
-        <w:t>[5] H. Fang, W. Zhang, H. Zhou, H. Cui, and N. Yu, “Screen-shooting resilient watermarking,” IEEE Transactions on Information Forensics and Security, vol. 14, no. 6, pp. 1403-1418, 2019, doi: 10.1109/TIFS.2018.2878541.</w:t>
-      </w:r>
-    </w:p>
-    <w:p>
-      <w:pPr>
-        <w:pStyle w:val="BodyText"/>
-      </w:pPr>
-      <w:r>
-        <w:t>[6] gslxr, “Screen-Shooting-Resilient-Document-Image-Watermarking,” 2024, GitHub. [Online]. Available: https://github.com/gslxr/Screen-Shooting-Resilient-Document-Image-Watermarking</w:t>
-      </w:r>
-    </w:p>
-    <w:p>
-      <w:pPr>
-        <w:pStyle w:val="BodyText"/>
-      </w:pPr>
-      <w:r>
-        <w:t>[7] Guo Fei, “blind_watermark: blind and invisible image watermark,” 2025, GitHub. [Online]. Available: https://github.com/guofei9987/blind_watermark</w:t>
-      </w:r>
-    </w:p>
-    <w:p>
-      <w:pPr>
-        <w:pStyle w:val="BodyText"/>
-      </w:pPr>
-      <w:r>
-        <w:t>[8] N. Hamid, A. Yahya, R. B. Ahmad, and O. M. Al-Qershi, “Image Steganography Techniques: An Overview,” International Journal of Computer Science and Security, vol. 6, no. 3, pp. 168-187, 2012.</w:t>
-      </w:r>
-    </w:p>
-    <w:p>
-      <w:pPr>
-        <w:pStyle w:val="BodyText"/>
-      </w:pPr>
-      <w:r>
-        <w:t>[9] Hoàng Xuân Dậu, Giáo trình Cơ sở An toàn Thông tin. Hà Nội: Học viện Công nghệ Bưu chính Viễn thông, 2020.</w:t>
-      </w:r>
-    </w:p>
-    <w:p>
-      <w:pPr>
-        <w:pStyle w:val="BodyText"/>
-      </w:pPr>
-      <w:r>
-        <w:lastRenderedPageBreak/>
-        <w:t>[10] S. Josefsson and I. Liusvaara, “Edwards-Curve Digital Signature Algorithm (EdDSA), RFC 8032,” Internet Engineering Task Force, 2017. [Online]. Available: https://www.rfc-editor.org/rfc/rfc8032</w:t>
-      </w:r>
-    </w:p>
-    <w:p>
-      <w:pPr>
-        <w:pStyle w:val="BodyText"/>
-      </w:pPr>
-      <w:r>
-        <w:t>[11] H. Krawczyk, M. Bellare, and R. Canetti, “HMAC: Keyed-Hashing for Message Authentication, RFC 2104,” Internet Engineering Task Force, 1997. [Online]. Available: https://www.rfc-editor.org/rfc/rfc2104</w:t>
-      </w:r>
-    </w:p>
-    <w:p>
-      <w:pPr>
-        <w:pStyle w:val="BodyText"/>
-      </w:pPr>
-      <w:r>
-        <w:t>[12] National Institute of Standards and Technology, “Implementation Guidance for FIPS 140-3 and the Cryptographic Module Verification Program,” NIST Computer Security Resource Center, 2026. [Online]. Available: https://csrc.nist.gov/projects/cryptographic-module-validation-program/fips-140-3-ig-announcements</w:t>
-      </w:r>
-    </w:p>
-    <w:p>
-      <w:pPr>
-        <w:pStyle w:val="BodyText"/>
-      </w:pPr>
-      <w:r>
-        <w:t>[13] National Institute of Standards and Technology, “Secure Hash Standard (SHS), FIPS PUB 180-4,” National Institute of Standards and Technology, Gaithersburg, 2015. doi: 10.6028/NIST.FIPS.180-4.</w:t>
-      </w:r>
-    </w:p>
-    <w:p>
-      <w:pPr>
-        <w:pStyle w:val="BodyText"/>
-      </w:pPr>
-      <w:r>
-        <w:t>[14] National Institute of Standards and Technology, “The Keyed-Hash Message Authentication Code (HMAC), FIPS PUB 198-1,” National Institute of Standards and Technology, Gaithersburg, 2008. doi: 10.6028/NIST.FIPS.198-1.</w:t>
-      </w:r>
-    </w:p>
-    <w:p>
-      <w:pPr>
-        <w:pStyle w:val="BodyText"/>
-      </w:pPr>
-      <w:r>
-        <w:t>[15] A. Rundgren, B. Jordan, and S. Erdtman, “JSON Canonicalization Scheme (JCS), RFC 8785,” Internet Engineering Task Force, 2020. [Online]. Available: https://www.rfc-editor.org/rfc/rfc8785</w:t>
-      </w:r>
-    </w:p>
-    <w:p>
-      <w:pPr>
-        <w:pStyle w:val="BodyText"/>
-      </w:pPr>
-      <w:r>
-        <w:t>[16] T. Sander, P. Fernandez, A. Durmus, M. Douze, and T. Furon, “Watermark Anything with Localized Messages,” 2025, Meta AI Research. [Online]. Available: https://github.com/facebookresearch/watermark-anything</w:t>
-      </w:r>
-    </w:p>
-    <w:p>
-      <w:pPr>
-        <w:pStyle w:val="BodyText"/>
-      </w:pPr>
-      <w:r>
-        <w:t>[17] ShieldMnt, “invisible-watermark: python library for invisible image watermark,” 2024, GitHub. [Online]. Available: https://github.com/ShieldMnt/invisible-watermark</w:t>
-      </w:r>
-    </w:p>
-    <w:p>
-      <w:pPr>
-        <w:pStyle w:val="BodyText"/>
-      </w:pPr>
-      <w:r>
-        <w:lastRenderedPageBreak/>
-        <w:t>[18] W. Stallings, Cryptography and Network Security: Principles and Practice, 7th ed. Boston: Pearson, 2017.</w:t>
-      </w:r>
-    </w:p>
-    <w:p>
-      <w:pPr>
-        <w:pStyle w:val="BodyText"/>
-      </w:pPr>
-      <w:r>
-        <w:t>[19] M. Tancik, B. Mildenhall, and R. Ng, “StegaStamp: Invisible Hyperlinks in Physical Photographs,” in Proceedings of the IEEE/CVF Conference on Computer Vision and Pattern Recognition, Seattle, 2020, pp. 2114-2123. doi: 10.1109/CVPR42600.2020.00219.</w:t>
-      </w:r>
-    </w:p>
-    <w:p>
-      <w:pPr>
-        <w:pStyle w:val="BodyText"/>
-      </w:pPr>
-      <w:r>
-        <w:t>[20] Thái Thanh Tùng, Giáo trình Mật mã học và Hệ thống Thông tin An toàn. Hà Nội: Nhà xuất bản Thông tin và Truyền thông, 2011.</w:t>
-      </w:r>
-    </w:p>
-    <w:p>
-      <w:pPr>
-        <w:pStyle w:val="BodyText"/>
-      </w:pPr>
-      <w:r>
-        <w:t>[21] wmbench contributors, “wmbench: image watermarking benchmark,” 2026, GitHub. [Online]. Available: https://github.com/alexandersolonsky/wmbench</w:t>
-      </w:r>
-    </w:p>
-    <w:p>
-      <w:pPr>
-        <w:pStyle w:val="BodyText"/>
-      </w:pPr>
-      <w:r>
-        <w:t>[22] J. Zhu, R. Kaplan, J. Johnson, and L. Fei-Fei, “HiDDeN: Hiding Data with Deep Networks,” in Proceedings of the European Conference on Computer Vision, Munich, 2018, pp. 682-697. doi: 10.1007/978-3-030-01267-0_40.</w:t>
-      </w:r>
-    </w:p>
+    <w:sdt>
+      <w:sdtPr>
+        <w:rPr>
+          <w:color w:val="000000"/>
+        </w:rPr>
+        <w:tag w:val="MENDELEY_BIBLIOGRAPHY"/>
+        <w:id w:val="1281605922"/>
+        <w:placeholder>
+          <w:docPart w:val="DefaultPlaceholder_-1854013440"/>
+        </w:placeholder>
+      </w:sdtPr>
+      <w:sdtContent>
+        <w:p>
+          <w:pPr>
+            <w:autoSpaceDE w:val="0"/>
+            <w:autoSpaceDN w:val="0"/>
+            <w:ind w:hanging="640"/>
+            <w:divId w:val="2095856562"/>
+            <w:rPr>
+              <w:color w:val="000000"/>
+              <w:szCs w:val="24"/>
+            </w:rPr>
+          </w:pPr>
+          <w:r>
+            <w:rPr>
+              <w:color w:val="000000"/>
+            </w:rPr>
+            <w:t>[1]</w:t>
+          </w:r>
+          <w:r>
+            <w:rPr>
+              <w:color w:val="000000"/>
+            </w:rPr>
+            <w:tab/>
+            <w:t xml:space="preserve">I. J. Cox, M. L. Miller, J. A. Bloom, J. Fridrich, and T. Kalker, </w:t>
+          </w:r>
+          <w:r>
+            <w:rPr>
+              <w:i/>
+              <w:iCs/>
+              <w:color w:val="000000"/>
+            </w:rPr>
+            <w:t>Digital Watermarking and Steganography</w:t>
+          </w:r>
+          <w:r>
+            <w:rPr>
+              <w:color w:val="000000"/>
+            </w:rPr>
+            <w:t>, 2nd ed. Burlington: Morgan Kaufmann, 2007.</w:t>
+          </w:r>
+        </w:p>
+        <w:p>
+          <w:pPr>
+            <w:autoSpaceDE w:val="0"/>
+            <w:autoSpaceDN w:val="0"/>
+            <w:ind w:hanging="640"/>
+            <w:divId w:val="1933009888"/>
+            <w:rPr>
+              <w:color w:val="000000"/>
+            </w:rPr>
+          </w:pPr>
+          <w:r>
+            <w:rPr>
+              <w:color w:val="000000"/>
+            </w:rPr>
+            <w:t>[2]</w:t>
+          </w:r>
+          <w:r>
+            <w:rPr>
+              <w:color w:val="000000"/>
+            </w:rPr>
+            <w:tab/>
+            <w:t xml:space="preserve">Hoàng Xuân Dậu, </w:t>
+          </w:r>
+          <w:r>
+            <w:rPr>
+              <w:i/>
+              <w:iCs/>
+              <w:color w:val="000000"/>
+            </w:rPr>
+            <w:t>Giáo trình Cơ sở An toàn Thông tin</w:t>
+          </w:r>
+          <w:r>
+            <w:rPr>
+              <w:color w:val="000000"/>
+            </w:rPr>
+            <w:t>. Hà Nội: Học viện Công nghệ Bưu chính Viễn thông, 2020.</w:t>
+          </w:r>
+        </w:p>
+        <w:p>
+          <w:pPr>
+            <w:autoSpaceDE w:val="0"/>
+            <w:autoSpaceDN w:val="0"/>
+            <w:ind w:hanging="640"/>
+            <w:divId w:val="464004928"/>
+            <w:rPr>
+              <w:color w:val="000000"/>
+            </w:rPr>
+          </w:pPr>
+          <w:r>
+            <w:rPr>
+              <w:color w:val="000000"/>
+            </w:rPr>
+            <w:t>[3]</w:t>
+          </w:r>
+          <w:r>
+            <w:rPr>
+              <w:color w:val="000000"/>
+            </w:rPr>
+            <w:tab/>
+            <w:t xml:space="preserve">B. Chen and G. W. Wornell, “Quantization index modulation: a class of provably good methods for digital watermarking and information embedding,” </w:t>
+          </w:r>
+          <w:r>
+            <w:rPr>
+              <w:i/>
+              <w:iCs/>
+              <w:color w:val="000000"/>
+            </w:rPr>
+            <w:t>IEEE Trans. Inf. Theory</w:t>
+          </w:r>
+          <w:r>
+            <w:rPr>
+              <w:color w:val="000000"/>
+            </w:rPr>
+            <w:t>, vol. 47, no. 4, pp. 1423–1443, 2001, doi: 10.1109/18.923725.</w:t>
+          </w:r>
+        </w:p>
+        <w:p>
+          <w:pPr>
+            <w:autoSpaceDE w:val="0"/>
+            <w:autoSpaceDN w:val="0"/>
+            <w:ind w:hanging="640"/>
+            <w:divId w:val="267351945"/>
+            <w:rPr>
+              <w:color w:val="000000"/>
+            </w:rPr>
+          </w:pPr>
+          <w:r>
+            <w:rPr>
+              <w:color w:val="000000"/>
+            </w:rPr>
+            <w:t>[4]</w:t>
+          </w:r>
+          <w:r>
+            <w:rPr>
+              <w:color w:val="000000"/>
+            </w:rPr>
+            <w:tab/>
+            <w:t xml:space="preserve">Thái Thanh Tùng, </w:t>
+          </w:r>
+          <w:r>
+            <w:rPr>
+              <w:i/>
+              <w:iCs/>
+              <w:color w:val="000000"/>
+            </w:rPr>
+            <w:t>Giáo trình Mật mã học và Hệ thống Thông tin An toàn</w:t>
+          </w:r>
+          <w:r>
+            <w:rPr>
+              <w:color w:val="000000"/>
+            </w:rPr>
+            <w:t>. Hà Nội: Nhà xuất bản Thông tin và Truyền thông, 2011.</w:t>
+          </w:r>
+        </w:p>
+        <w:p>
+          <w:pPr>
+            <w:autoSpaceDE w:val="0"/>
+            <w:autoSpaceDN w:val="0"/>
+            <w:ind w:hanging="640"/>
+            <w:divId w:val="1085497394"/>
+            <w:rPr>
+              <w:color w:val="000000"/>
+            </w:rPr>
+          </w:pPr>
+          <w:r>
+            <w:rPr>
+              <w:color w:val="000000"/>
+            </w:rPr>
+            <w:t>[5]</w:t>
+          </w:r>
+          <w:r>
+            <w:rPr>
+              <w:color w:val="000000"/>
+            </w:rPr>
+            <w:tab/>
+            <w:t>National Institute of Standards and Technology, “The Keyed-Hash Message Authentication Code (HMAC), FIPS PUB 198-1,” National Institute of Standards and Technology, Gaithersburg, 2008. doi: 10.6028/NIST.FIPS.198-1.</w:t>
+          </w:r>
+        </w:p>
+        <w:p>
+          <w:pPr>
+            <w:autoSpaceDE w:val="0"/>
+            <w:autoSpaceDN w:val="0"/>
+            <w:ind w:hanging="640"/>
+            <w:divId w:val="1195074869"/>
+            <w:rPr>
+              <w:color w:val="000000"/>
+            </w:rPr>
+          </w:pPr>
+          <w:r>
+            <w:rPr>
+              <w:color w:val="000000"/>
+            </w:rPr>
+            <w:t>[6]</w:t>
+          </w:r>
+          <w:r>
+            <w:rPr>
+              <w:color w:val="000000"/>
+            </w:rPr>
+            <w:tab/>
+            <w:t xml:space="preserve">J. Zhu, R. Kaplan, J. Johnson, and L. Fei-Fei, “HiDDeN: Hiding Data with Deep Networks,” in </w:t>
+          </w:r>
+          <w:r>
+            <w:rPr>
+              <w:i/>
+              <w:iCs/>
+              <w:color w:val="000000"/>
+            </w:rPr>
+            <w:t>Proceedings of the European Conference on Computer Vision</w:t>
+          </w:r>
+          <w:r>
+            <w:rPr>
+              <w:color w:val="000000"/>
+            </w:rPr>
+            <w:t>, Munich, 2018, pp. 682–697. doi: 10.1007/978-3-030-01267-0_40.</w:t>
+          </w:r>
+        </w:p>
+        <w:p>
+          <w:pPr>
+            <w:autoSpaceDE w:val="0"/>
+            <w:autoSpaceDN w:val="0"/>
+            <w:ind w:hanging="640"/>
+            <w:divId w:val="607548574"/>
+            <w:rPr>
+              <w:color w:val="000000"/>
+            </w:rPr>
+          </w:pPr>
+          <w:r>
+            <w:rPr>
+              <w:color w:val="000000"/>
+            </w:rPr>
+            <w:t>[7]</w:t>
+          </w:r>
+          <w:r>
+            <w:rPr>
+              <w:color w:val="000000"/>
+            </w:rPr>
+            <w:tab/>
+            <w:t xml:space="preserve">M. Tancik, B. Mildenhall, and R. Ng, “StegaStamp: Invisible Hyperlinks in Physical Photographs,” in </w:t>
+          </w:r>
+          <w:r>
+            <w:rPr>
+              <w:i/>
+              <w:iCs/>
+              <w:color w:val="000000"/>
+            </w:rPr>
+            <w:t>Proceedings of the IEEE/CVF Conference on Computer Vision and Pattern Recognition</w:t>
+          </w:r>
+          <w:r>
+            <w:rPr>
+              <w:color w:val="000000"/>
+            </w:rPr>
+            <w:t>, Seattle, 2020, pp. 2114–2123. doi: 10.1109/CVPR42600.2020.00219.</w:t>
+          </w:r>
+        </w:p>
+        <w:p>
+          <w:pPr>
+            <w:autoSpaceDE w:val="0"/>
+            <w:autoSpaceDN w:val="0"/>
+            <w:ind w:hanging="640"/>
+            <w:divId w:val="619454719"/>
+            <w:rPr>
+              <w:color w:val="000000"/>
+            </w:rPr>
+          </w:pPr>
+          <w:r>
+            <w:rPr>
+              <w:color w:val="000000"/>
+            </w:rPr>
+            <w:t>[8]</w:t>
+          </w:r>
+          <w:r>
+            <w:rPr>
+              <w:color w:val="000000"/>
+            </w:rPr>
+            <w:tab/>
+            <w:t>H. Krawczyk, M. Bellare, and R. Canetti, “HMAC: Keyed-Hashing for Message Authentication, RFC 2104,” Internet Engineering Task Force, 1997. [Online]. Available: https://www.rfc-editor.org/rfc/rfc2104</w:t>
+          </w:r>
+        </w:p>
+        <w:p>
+          <w:pPr>
+            <w:autoSpaceDE w:val="0"/>
+            <w:autoSpaceDN w:val="0"/>
+            <w:ind w:hanging="640"/>
+            <w:divId w:val="2077435001"/>
+            <w:rPr>
+              <w:color w:val="000000"/>
+            </w:rPr>
+          </w:pPr>
+          <w:r>
+            <w:rPr>
+              <w:color w:val="000000"/>
+            </w:rPr>
+            <w:lastRenderedPageBreak/>
+            <w:t>[9]</w:t>
+          </w:r>
+          <w:r>
+            <w:rPr>
+              <w:color w:val="000000"/>
+            </w:rPr>
+            <w:tab/>
+            <w:t>National Institute of Standards and Technology, “Implementation Guidance for FIPS 140-3 and the Cryptographic Module Verification Program,” NIST Computer Security Resource Center, 2026. [Online]. Available: https://csrc.nist.gov/projects/cryptographic-module-validation-program/fips-140-3-ig-announcements</w:t>
+          </w:r>
+        </w:p>
+        <w:p>
+          <w:pPr>
+            <w:autoSpaceDE w:val="0"/>
+            <w:autoSpaceDN w:val="0"/>
+            <w:ind w:hanging="640"/>
+            <w:divId w:val="168761899"/>
+            <w:rPr>
+              <w:color w:val="000000"/>
+            </w:rPr>
+          </w:pPr>
+          <w:r>
+            <w:rPr>
+              <w:color w:val="000000"/>
+            </w:rPr>
+            <w:t>[10]</w:t>
+          </w:r>
+          <w:r>
+            <w:rPr>
+              <w:color w:val="000000"/>
+            </w:rPr>
+            <w:tab/>
+            <w:t>National Institute of Standards and Technology, “Secure Hash Standard (SHS), FIPS PUB 180-4,” National Institute of Standards and Technology, Gaithersburg, 2015. doi: 10.6028/NIST.FIPS.180-4.</w:t>
+          </w:r>
+        </w:p>
+        <w:p>
+          <w:pPr>
+            <w:autoSpaceDE w:val="0"/>
+            <w:autoSpaceDN w:val="0"/>
+            <w:ind w:hanging="640"/>
+            <w:divId w:val="42825985"/>
+            <w:rPr>
+              <w:color w:val="000000"/>
+            </w:rPr>
+          </w:pPr>
+          <w:r>
+            <w:rPr>
+              <w:color w:val="000000"/>
+            </w:rPr>
+            <w:t>[11]</w:t>
+          </w:r>
+          <w:r>
+            <w:rPr>
+              <w:color w:val="000000"/>
+            </w:rPr>
+            <w:tab/>
+            <w:t>S. Josefsson and I. Liusvaara, “Edwards-Curve Digital Signature Algorithm (EdDSA), RFC 8032,” Internet Engineering Task Force, 2017. [Online]. Available: https://www.rfc-editor.org/rfc/rfc8032</w:t>
+          </w:r>
+        </w:p>
+        <w:p>
+          <w:pPr>
+            <w:autoSpaceDE w:val="0"/>
+            <w:autoSpaceDN w:val="0"/>
+            <w:ind w:hanging="640"/>
+            <w:divId w:val="1065491471"/>
+            <w:rPr>
+              <w:color w:val="000000"/>
+            </w:rPr>
+          </w:pPr>
+          <w:r>
+            <w:rPr>
+              <w:color w:val="000000"/>
+            </w:rPr>
+            <w:t>[12]</w:t>
+          </w:r>
+          <w:r>
+            <w:rPr>
+              <w:color w:val="000000"/>
+            </w:rPr>
+            <w:tab/>
+            <w:t>A. Rundgren, B. Jordan, and S. Erdtman, “JSON Canonicalization Scheme (JCS), RFC 8785,” Internet Engineering Task Force, 2020. [Online]. Available: https://www.rfc-editor.org/rfc/rfc8785</w:t>
+          </w:r>
+        </w:p>
+        <w:p>
+          <w:pPr>
+            <w:autoSpaceDE w:val="0"/>
+            <w:autoSpaceDN w:val="0"/>
+            <w:ind w:hanging="640"/>
+            <w:divId w:val="1256675222"/>
+            <w:rPr>
+              <w:color w:val="000000"/>
+            </w:rPr>
+          </w:pPr>
+          <w:r>
+            <w:rPr>
+              <w:color w:val="000000"/>
+            </w:rPr>
+            <w:t>[13]</w:t>
+          </w:r>
+          <w:r>
+            <w:rPr>
+              <w:color w:val="000000"/>
+            </w:rPr>
+            <w:tab/>
+            <w:t xml:space="preserve">W. Stallings, </w:t>
+          </w:r>
+          <w:r>
+            <w:rPr>
+              <w:i/>
+              <w:iCs/>
+              <w:color w:val="000000"/>
+            </w:rPr>
+            <w:t>Cryptography and Network Security: Principles and Practice</w:t>
+          </w:r>
+          <w:r>
+            <w:rPr>
+              <w:color w:val="000000"/>
+            </w:rPr>
+            <w:t>, 7th ed. Boston: Pearson, 2017.</w:t>
+          </w:r>
+        </w:p>
+        <w:p>
+          <w:pPr>
+            <w:autoSpaceDE w:val="0"/>
+            <w:autoSpaceDN w:val="0"/>
+            <w:ind w:hanging="640"/>
+            <w:divId w:val="1263033116"/>
+            <w:rPr>
+              <w:color w:val="000000"/>
+            </w:rPr>
+          </w:pPr>
+          <w:r>
+            <w:rPr>
+              <w:color w:val="000000"/>
+            </w:rPr>
+            <w:t>[14]</w:t>
+          </w:r>
+          <w:r>
+            <w:rPr>
+              <w:color w:val="000000"/>
+            </w:rPr>
+            <w:tab/>
+            <w:t xml:space="preserve">N. Hamid, A. Yahya, R. B. Ahmad, and O. M. Al-Qershi, “Image Steganography Techniques: An Overview,” </w:t>
+          </w:r>
+          <w:r>
+            <w:rPr>
+              <w:i/>
+              <w:iCs/>
+              <w:color w:val="000000"/>
+            </w:rPr>
+            <w:t>International Journal of Computer Science and Security</w:t>
+          </w:r>
+          <w:r>
+            <w:rPr>
+              <w:color w:val="000000"/>
+            </w:rPr>
+            <w:t>, vol. 6, no. 3, pp. 168–187, 2012.</w:t>
+          </w:r>
+        </w:p>
+        <w:p>
+          <w:pPr>
+            <w:autoSpaceDE w:val="0"/>
+            <w:autoSpaceDN w:val="0"/>
+            <w:ind w:hanging="640"/>
+            <w:divId w:val="1123697141"/>
+            <w:rPr>
+              <w:color w:val="000000"/>
+            </w:rPr>
+          </w:pPr>
+          <w:r>
+            <w:rPr>
+              <w:color w:val="000000"/>
+            </w:rPr>
+            <w:t>[15]</w:t>
+          </w:r>
+          <w:r>
+            <w:rPr>
+              <w:color w:val="000000"/>
+            </w:rPr>
+            <w:tab/>
+            <w:t xml:space="preserve">M. Douglas, K. Bailey, M. Leeney, and K. Curran, “An overview of steganography techniques applied to the protection of biometric data,” </w:t>
+          </w:r>
+          <w:r>
+            <w:rPr>
+              <w:i/>
+              <w:iCs/>
+              <w:color w:val="000000"/>
+            </w:rPr>
+            <w:t>Multimed. Tools Appl.</w:t>
+          </w:r>
+          <w:r>
+            <w:rPr>
+              <w:color w:val="000000"/>
+            </w:rPr>
+            <w:t>, vol. 77, no. 13, pp. 17333–17373, 2018, doi: 10.1007/s11042-017-5308-3.</w:t>
+          </w:r>
+        </w:p>
+        <w:p>
+          <w:pPr>
+            <w:autoSpaceDE w:val="0"/>
+            <w:autoSpaceDN w:val="0"/>
+            <w:ind w:hanging="640"/>
+            <w:divId w:val="307899508"/>
+            <w:rPr>
+              <w:color w:val="000000"/>
+            </w:rPr>
+          </w:pPr>
+          <w:r>
+            <w:rPr>
+              <w:color w:val="000000"/>
+            </w:rPr>
+            <w:t>[16]</w:t>
+          </w:r>
+          <w:r>
+            <w:rPr>
+              <w:color w:val="000000"/>
+            </w:rPr>
+            <w:tab/>
+            <w:t xml:space="preserve">wmbench contributors, “wmbench: image watermarking benchmark,” 2026, </w:t>
+          </w:r>
+          <w:r>
+            <w:rPr>
+              <w:i/>
+              <w:iCs/>
+              <w:color w:val="000000"/>
+            </w:rPr>
+            <w:t>GitHub</w:t>
+          </w:r>
+          <w:r>
+            <w:rPr>
+              <w:color w:val="000000"/>
+            </w:rPr>
+            <w:t>. [Online]. Available: https://github.com/alexandersolonsky/wmbench</w:t>
+          </w:r>
+        </w:p>
+        <w:p>
+          <w:pPr>
+            <w:autoSpaceDE w:val="0"/>
+            <w:autoSpaceDN w:val="0"/>
+            <w:ind w:hanging="640"/>
+            <w:divId w:val="898784236"/>
+            <w:rPr>
+              <w:color w:val="000000"/>
+            </w:rPr>
+          </w:pPr>
+          <w:r>
+            <w:rPr>
+              <w:color w:val="000000"/>
+            </w:rPr>
+            <w:lastRenderedPageBreak/>
+            <w:t>[17]</w:t>
+          </w:r>
+          <w:r>
+            <w:rPr>
+              <w:color w:val="000000"/>
+            </w:rPr>
+            <w:tab/>
+            <w:t xml:space="preserve">Adobe Research, “TrustMark: Universal Watermarking for Arbitrary Resolution Images,” 2026, </w:t>
+          </w:r>
+          <w:r>
+            <w:rPr>
+              <w:i/>
+              <w:iCs/>
+              <w:color w:val="000000"/>
+            </w:rPr>
+            <w:t>GitHub</w:t>
+          </w:r>
+          <w:r>
+            <w:rPr>
+              <w:color w:val="000000"/>
+            </w:rPr>
+            <w:t>. [Online]. Available: https://github.com/adobe/trustmark</w:t>
+          </w:r>
+        </w:p>
+        <w:p>
+          <w:pPr>
+            <w:autoSpaceDE w:val="0"/>
+            <w:autoSpaceDN w:val="0"/>
+            <w:ind w:hanging="640"/>
+            <w:divId w:val="639307677"/>
+            <w:rPr>
+              <w:color w:val="000000"/>
+            </w:rPr>
+          </w:pPr>
+          <w:r>
+            <w:rPr>
+              <w:color w:val="000000"/>
+            </w:rPr>
+            <w:t>[18]</w:t>
+          </w:r>
+          <w:r>
+            <w:rPr>
+              <w:color w:val="000000"/>
+            </w:rPr>
+            <w:tab/>
+            <w:t xml:space="preserve">T. Sander, P. Fernandez, A. Durmus, M. Douze, and T. Furon, “Watermark Anything with Localized Messages,” 2025, </w:t>
+          </w:r>
+          <w:r>
+            <w:rPr>
+              <w:i/>
+              <w:iCs/>
+              <w:color w:val="000000"/>
+            </w:rPr>
+            <w:t>Meta AI Research</w:t>
+          </w:r>
+          <w:r>
+            <w:rPr>
+              <w:color w:val="000000"/>
+            </w:rPr>
+            <w:t>. [Online]. Available: https://github.com/facebookresearch/watermark-anything</w:t>
+          </w:r>
+        </w:p>
+        <w:p>
+          <w:pPr>
+            <w:autoSpaceDE w:val="0"/>
+            <w:autoSpaceDN w:val="0"/>
+            <w:ind w:hanging="640"/>
+            <w:divId w:val="1260065829"/>
+            <w:rPr>
+              <w:color w:val="000000"/>
+            </w:rPr>
+          </w:pPr>
+          <w:r>
+            <w:rPr>
+              <w:color w:val="000000"/>
+            </w:rPr>
+            <w:t>[19]</w:t>
+          </w:r>
+          <w:r>
+            <w:rPr>
+              <w:color w:val="000000"/>
+            </w:rPr>
+            <w:tab/>
+            <w:t xml:space="preserve">Guo Fei, “blind_watermark: blind and invisible image watermark,” 2025, </w:t>
+          </w:r>
+          <w:r>
+            <w:rPr>
+              <w:i/>
+              <w:iCs/>
+              <w:color w:val="000000"/>
+            </w:rPr>
+            <w:t>GitHub</w:t>
+          </w:r>
+          <w:r>
+            <w:rPr>
+              <w:color w:val="000000"/>
+            </w:rPr>
+            <w:t>. [Online]. Available: https://github.com/guofei9987/blind_watermark</w:t>
+          </w:r>
+        </w:p>
+        <w:p>
+          <w:pPr>
+            <w:autoSpaceDE w:val="0"/>
+            <w:autoSpaceDN w:val="0"/>
+            <w:ind w:hanging="640"/>
+            <w:divId w:val="1729067254"/>
+            <w:rPr>
+              <w:color w:val="000000"/>
+            </w:rPr>
+          </w:pPr>
+          <w:r>
+            <w:rPr>
+              <w:color w:val="000000"/>
+            </w:rPr>
+            <w:t>[20]</w:t>
+          </w:r>
+          <w:r>
+            <w:rPr>
+              <w:color w:val="000000"/>
+            </w:rPr>
+            <w:tab/>
+            <w:t xml:space="preserve">gslxr, “Screen-Shooting-Resilient-Document-Image-Watermarking,” 2024, </w:t>
+          </w:r>
+          <w:r>
+            <w:rPr>
+              <w:i/>
+              <w:iCs/>
+              <w:color w:val="000000"/>
+            </w:rPr>
+            <w:t>GitHub</w:t>
+          </w:r>
+          <w:r>
+            <w:rPr>
+              <w:color w:val="000000"/>
+            </w:rPr>
+            <w:t>. [Online]. Available: https://github.com/gslxr/Screen-Shooting-Resilient-Document-Image-Watermarking</w:t>
+          </w:r>
+        </w:p>
+        <w:p>
+          <w:pPr>
+            <w:autoSpaceDE w:val="0"/>
+            <w:autoSpaceDN w:val="0"/>
+            <w:ind w:hanging="640"/>
+            <w:divId w:val="2097095090"/>
+            <w:rPr>
+              <w:color w:val="000000"/>
+            </w:rPr>
+          </w:pPr>
+          <w:r>
+            <w:rPr>
+              <w:color w:val="000000"/>
+            </w:rPr>
+            <w:t>[21]</w:t>
+          </w:r>
+          <w:r>
+            <w:rPr>
+              <w:color w:val="000000"/>
+            </w:rPr>
+            <w:tab/>
+            <w:t xml:space="preserve">H. Fang, W. Zhang, H. Zhou, H. Cui, and N. Yu, “Screen-shooting resilient watermarking,” </w:t>
+          </w:r>
+          <w:r>
+            <w:rPr>
+              <w:i/>
+              <w:iCs/>
+              <w:color w:val="000000"/>
+            </w:rPr>
+            <w:t>IEEE Transactions on Information Forensics and Security</w:t>
+          </w:r>
+          <w:r>
+            <w:rPr>
+              <w:color w:val="000000"/>
+            </w:rPr>
+            <w:t>, vol. 14, no. 6, pp. 1403–1418, 2019, doi: 10.1109/TIFS.2018.2878541.</w:t>
+          </w:r>
+        </w:p>
+        <w:p>
+          <w:pPr>
+            <w:autoSpaceDE w:val="0"/>
+            <w:autoSpaceDN w:val="0"/>
+            <w:ind w:hanging="640"/>
+            <w:divId w:val="490295725"/>
+            <w:rPr>
+              <w:color w:val="000000"/>
+            </w:rPr>
+          </w:pPr>
+          <w:r>
+            <w:rPr>
+              <w:color w:val="000000"/>
+            </w:rPr>
+            <w:t>[22]</w:t>
+          </w:r>
+          <w:r>
+            <w:rPr>
+              <w:color w:val="000000"/>
+            </w:rPr>
+            <w:tab/>
+            <w:t xml:space="preserve">ShieldMnt, “invisible-watermark: python library for invisible image watermark,” 2024, </w:t>
+          </w:r>
+          <w:r>
+            <w:rPr>
+              <w:i/>
+              <w:iCs/>
+              <w:color w:val="000000"/>
+            </w:rPr>
+            <w:t>GitHub</w:t>
+          </w:r>
+          <w:r>
+            <w:rPr>
+              <w:color w:val="000000"/>
+            </w:rPr>
+            <w:t>. [Online]. Available: https://github.com/ShieldMnt/invisible-watermark</w:t>
+          </w:r>
+        </w:p>
+        <w:p>
+          <w:pPr>
+            <w:pStyle w:val="BodyText"/>
+          </w:pPr>
+          <w:r>
+            <w:rPr>
+              <w:color w:val="000000"/>
+            </w:rPr>
+            <w:t> </w:t>
+          </w:r>
+        </w:p>
+      </w:sdtContent>
+    </w:sdt>
     <w:p>
       <w:pPr>
         <w:pStyle w:val="Heading1"/>
@@ -29835,6 +30437,7 @@
               <w:rPr>
                 <w:rStyle w:val="VerbatimChar"/>
               </w:rPr>
+              <w:lastRenderedPageBreak/>
               <w:t>version</w:t>
             </w:r>
             <w:r>
@@ -29874,6 +30477,7 @@
                 <w:i/>
                 <w:iCs/>
               </w:rPr>
+              <w:lastRenderedPageBreak/>
               <w:t>Đã hiện thực trong mã nguồn</w:t>
             </w:r>
           </w:p>
@@ -29900,6 +30504,7 @@
               <w:rPr>
                 <w:rStyle w:val="VerbatimChar"/>
               </w:rPr>
+              <w:lastRenderedPageBreak/>
               <w:t>research/python/src/splitbind_ref/payload.py: L18-L33</w:t>
             </w:r>
           </w:p>
@@ -29914,6 +30519,7 @@
               <w:spacing w:line="240" w:lineRule="auto"/>
             </w:pPr>
             <w:r>
+              <w:lastRenderedPageBreak/>
               <w:t xml:space="preserve">Đã kiểm chứng: 10/10 ca kiểm thử đạt trong </w:t>
             </w:r>
             <w:r>
@@ -29983,14 +30589,7 @@
               <w:rPr>
                 <w:rStyle w:val="VerbatimChar"/>
               </w:rPr>
-              <w:t>research/python/</w:t>
-            </w:r>
-            <w:r>
-              <w:rPr>
-                <w:rStyle w:val="VerbatimChar"/>
-              </w:rPr>
-              <w:lastRenderedPageBreak/>
-              <w:t>src/splitbind_ref/payload.py</w:t>
+              <w:t>research/python/src/splitbind_ref/payload.py</w:t>
             </w:r>
           </w:p>
         </w:tc>
@@ -30004,7 +30603,6 @@
               <w:spacing w:line="240" w:lineRule="auto"/>
             </w:pPr>
             <w:r>
-              <w:lastRenderedPageBreak/>
               <w:t>Đã kiểm chứng qua đặc tả thuật toán cố định.</w:t>
             </w:r>
           </w:p>
@@ -30285,7 +30883,11 @@
               <w:spacing w:line="240" w:lineRule="auto"/>
             </w:pPr>
             <w:r>
-              <w:t>Đã kiểm chứng: Đo lường khách quan trên trang PDF render 144 DPI.</w:t>
+              <w:t xml:space="preserve">Đã kiểm chứng: Đo lường khách quan trên trang </w:t>
+            </w:r>
+            <w:r>
+              <w:lastRenderedPageBreak/>
+              <w:t>PDF render 144 DPI.</w:t>
             </w:r>
           </w:p>
         </w:tc>
@@ -30301,6 +30903,7 @@
               <w:spacing w:line="240" w:lineRule="auto"/>
             </w:pPr>
             <w:r>
+              <w:lastRenderedPageBreak/>
               <w:t>Quy mô benchmark V1: 32.736 hàng thực nghiệm</w:t>
             </w:r>
           </w:p>
@@ -30348,11 +30951,7 @@
               <w:t>reports/fingerprint-baseline-v1/results.jsonl</w:t>
             </w:r>
             <w:r>
-              <w:t xml:space="preserve"> </w:t>
-            </w:r>
-            <w:r>
-              <w:lastRenderedPageBreak/>
-              <w:t xml:space="preserve">(Mã băm SHA-256: </w:t>
+              <w:t xml:space="preserve"> (Mã băm SHA-256: </w:t>
             </w:r>
             <w:r>
               <w:rPr>
@@ -30375,7 +30974,6 @@
               <w:spacing w:line="240" w:lineRule="auto"/>
             </w:pPr>
             <w:r>
-              <w:lastRenderedPageBreak/>
               <w:t xml:space="preserve">Đã kiểm chứng: 22 trang </w:t>
             </w:r>
             <m:oMath>
@@ -30810,7 +31408,11 @@
               <w:spacing w:line="240" w:lineRule="auto"/>
             </w:pPr>
             <w:r>
-              <w:t>Trạng thái giao diện minh bạch “Chưa tìm thấy bản cấp phát khớp”</w:t>
+              <w:t xml:space="preserve">Trạng thái giao diện minh bạch “Chưa tìm thấy </w:t>
+            </w:r>
+            <w:r>
+              <w:lastRenderedPageBreak/>
+              <w:t>bản cấp phát khớp”</w:t>
             </w:r>
           </w:p>
         </w:tc>
@@ -30828,10 +31430,15 @@
                 <w:i/>
                 <w:iCs/>
               </w:rPr>
+              <w:lastRenderedPageBreak/>
               <w:t>Đang vận hành trên hệ thống thật</w:t>
             </w:r>
             <w:r>
-              <w:t xml:space="preserve"> và </w:t>
+              <w:t xml:space="preserve"> </w:t>
+            </w:r>
+            <w:r>
+              <w:lastRenderedPageBreak/>
+              <w:t xml:space="preserve">và </w:t>
             </w:r>
             <w:r>
               <w:rPr>
@@ -30855,6 +31462,7 @@
               <w:rPr>
                 <w:rStyle w:val="VerbatimChar"/>
               </w:rPr>
+              <w:lastRenderedPageBreak/>
               <w:t>STATUS_COPY</w:t>
             </w:r>
             <w:r>
@@ -30873,6 +31481,7 @@
               <w:rPr>
                 <w:rStyle w:val="VerbatimChar"/>
               </w:rPr>
+              <w:lastRenderedPageBreak/>
               <w:t>apps/web/src/features/evidence/copy.ts</w:t>
             </w:r>
             <w:r>
@@ -30896,7 +31505,12 @@
               <w:spacing w:line="240" w:lineRule="auto"/>
             </w:pPr>
             <w:r>
-              <w:t>Đã kiểm chứng logic hiển thị trạng thái và thông báo phạm vi trên giao diện web production.</w:t>
+              <w:lastRenderedPageBreak/>
+              <w:t xml:space="preserve">Đã kiểm chứng logic hiển thị trạng thái và thông báo </w:t>
+            </w:r>
+            <w:r>
+              <w:lastRenderedPageBreak/>
+              <w:t>phạm vi trên giao diện web production.</w:t>
             </w:r>
           </w:p>
         </w:tc>
@@ -30912,11 +31526,8 @@
               <w:spacing w:line="240" w:lineRule="auto"/>
             </w:pPr>
             <w:r>
-              <w:t xml:space="preserve">Phân định rạch ròi ba cấp độ A (payload), B (kiến </w:t>
-            </w:r>
-            <w:r>
               <w:lastRenderedPageBreak/>
-              <w:t>trúc), C (hệ thống thật)</w:t>
+              <w:t>Phân định rạch ròi ba cấp độ A (payload), B (kiến trúc), C (hệ thống thật)</w:t>
             </w:r>
           </w:p>
         </w:tc>
@@ -30934,7 +31545,6 @@
                 <w:i/>
                 <w:iCs/>
               </w:rPr>
-              <w:lastRenderedPageBreak/>
               <w:t>Đã hiện thực trong mã nguồn</w:t>
             </w:r>
             <w:r>
@@ -30945,18 +31555,94 @@
                 <w:i/>
                 <w:iCs/>
               </w:rPr>
-              <w:t xml:space="preserve">Đang vận hành </w:t>
-            </w:r>
+              <w:t>Đang vận hành trên hệ thống thật</w:t>
+            </w:r>
+            <w:r>
+              <w:t xml:space="preserve"> (thiết kế kiến trúc dự án)</w:t>
+            </w:r>
+          </w:p>
+        </w:tc>
+        <w:tc>
+          <w:tcPr>
+            <w:tcW w:w="1980" w:type="dxa"/>
+          </w:tcPr>
+          <w:p>
+            <w:pPr>
+              <w:pStyle w:val="Compact"/>
+              <w:spacing w:line="240" w:lineRule="auto"/>
+            </w:pPr>
+            <w:r>
+              <w:rPr>
+                <w:rStyle w:val="VerbatimChar"/>
+              </w:rPr>
+              <w:t>docs/superpowers/specs/2026-08-13-splitbind-production-design.md: Section 1-3</w:t>
+            </w:r>
+            <w:r>
+              <w:t xml:space="preserve">, </w:t>
+            </w:r>
+            <w:r>
+              <w:rPr>
+                <w:rStyle w:val="VerbatimChar"/>
+              </w:rPr>
+              <w:t>docs/decisions/001-azure-production-architecture.md</w:t>
+            </w:r>
+          </w:p>
+        </w:tc>
+        <w:tc>
+          <w:tcPr>
+            <w:tcW w:w="1980" w:type="dxa"/>
+          </w:tcPr>
+          <w:p>
+            <w:pPr>
+              <w:pStyle w:val="Compact"/>
+              <w:spacing w:line="240" w:lineRule="auto"/>
+            </w:pPr>
+            <w:r>
+              <w:t>Đã kiểm chứng thống nhất trong hồ sơ đặc tả thiết kế kiến trúc SplitBind.</w:t>
+            </w:r>
+          </w:p>
+        </w:tc>
+      </w:tr>
+      <w:tr>
+        <w:tc>
+          <w:tcPr>
+            <w:tcW w:w="1980" w:type="dxa"/>
+          </w:tcPr>
+          <w:p>
+            <w:pPr>
+              <w:pStyle w:val="Compact"/>
+              <w:spacing w:line="240" w:lineRule="auto"/>
+            </w:pPr>
+            <w:r>
+              <w:t>Thủy vân đã bật trên production từ 12/09/2026; trong năm phép thử ngày hôm đó, không bản biến đổi nào được truy vết</w:t>
+            </w:r>
+          </w:p>
+        </w:tc>
+        <w:tc>
+          <w:tcPr>
+            <w:tcW w:w="1980" w:type="dxa"/>
+          </w:tcPr>
+          <w:p>
+            <w:pPr>
+              <w:pStyle w:val="Compact"/>
+              <w:spacing w:line="240" w:lineRule="auto"/>
+            </w:pPr>
             <w:r>
               <w:rPr>
                 <w:i/>
                 <w:iCs/>
               </w:rPr>
-              <w:lastRenderedPageBreak/>
-              <w:t>trên hệ thống thật</w:t>
-            </w:r>
-            <w:r>
-              <w:t xml:space="preserve"> (thiết kế kiến trúc dự án)</w:t>
+              <w:t>Đang vận hành trên hệ thống thật</w:t>
+            </w:r>
+            <w:r>
+              <w:t xml:space="preserve"> và </w:t>
+            </w:r>
+            <w:r>
+              <w:rPr>
+                <w:i/>
+                <w:iCs/>
+              </w:rPr>
+              <w:t>Giới hạn đã nhận diện</w:t>
             </w:r>
           </w:p>
         </w:tc>
@@ -30970,27 +31656,7 @@
               <w:spacing w:line="240" w:lineRule="auto"/>
             </w:pPr>
             <w:r>
-              <w:rPr>
-                <w:rStyle w:val="VerbatimChar"/>
-              </w:rPr>
-              <w:lastRenderedPageBreak/>
-              <w:t>docs/superpowers/specs/2026-08-13-splitbind-</w:t>
-            </w:r>
-            <w:r>
-              <w:rPr>
-                <w:rStyle w:val="VerbatimChar"/>
-              </w:rPr>
-              <w:lastRenderedPageBreak/>
-              <w:t>production-design.md: Section 1-3</w:t>
-            </w:r>
-            <w:r>
-              <w:t xml:space="preserve">, </w:t>
-            </w:r>
-            <w:r>
-              <w:rPr>
-                <w:rStyle w:val="VerbatimChar"/>
-              </w:rPr>
-              <w:t>docs/decisions/001-azure-production-architecture.md</w:t>
+              <w:t>Đo qua giao diện công khai; số liệu ở Bảng 4.9</w:t>
             </w:r>
           </w:p>
         </w:tc>
@@ -31004,12 +31670,7 @@
               <w:spacing w:line="240" w:lineRule="auto"/>
             </w:pPr>
             <w:r>
-              <w:lastRenderedPageBreak/>
-              <w:t xml:space="preserve">Đã kiểm chứng thống nhất trong hồ sơ đặc tả thiết </w:t>
-            </w:r>
-            <w:r>
-              <w:lastRenderedPageBreak/>
-              <w:t>kế kiến trúc SplitBind.</w:t>
+              <w:t>Đã kiểm chứng: 1 trong 5 giải được, và đó là bản nguyên vẹn mà mã băm đã trả lời xong. Đây là số liệu của ngày 12/09, đã bị Mục 4.2.4 thay thế sau khi sửa nguyên nhân gốc thứ ba.</w:t>
             </w:r>
           </w:p>
         </w:tc>
@@ -31025,8 +31686,7 @@
               <w:spacing w:line="240" w:lineRule="auto"/>
             </w:pPr>
             <w:r>
-              <w:lastRenderedPageBreak/>
-              <w:t>Thủy vân đã bật trên production từ 12/09/2026; trong năm phép thử ngày hôm đó, không bản biến đổi nào được truy vết</w:t>
+              <w:t>Mẫu đồng bộ ORB không phải mảnh còn thiếu của bộ giải mã</w:t>
             </w:r>
           </w:p>
         </w:tc>
@@ -31044,17 +31704,72 @@
                 <w:i/>
                 <w:iCs/>
               </w:rPr>
-              <w:t>Đang vận hành trên hệ thống thật</w:t>
-            </w:r>
-            <w:r>
-              <w:t xml:space="preserve"> và </w:t>
-            </w:r>
+              <w:t>Giới hạn đã nhận diện</w:t>
+            </w:r>
+            <w:r>
+              <w:t xml:space="preserve"> (giả thuyết bị bác bỏ)</w:t>
+            </w:r>
+          </w:p>
+        </w:tc>
+        <w:tc>
+          <w:tcPr>
+            <w:tcW w:w="1980" w:type="dxa"/>
+          </w:tcPr>
+          <w:p>
+            <w:pPr>
+              <w:pStyle w:val="Compact"/>
+              <w:spacing w:line="240" w:lineRule="auto"/>
+            </w:pPr>
+            <w:r>
+              <w:t>3 vật mang nhân 5 điều kiện, giải hai lần mỗi ô; Mục 4.2.3</w:t>
+            </w:r>
+          </w:p>
+        </w:tc>
+        <w:tc>
+          <w:tcPr>
+            <w:tcW w:w="1980" w:type="dxa"/>
+          </w:tcPr>
+          <w:p>
+            <w:pPr>
+              <w:pStyle w:val="Compact"/>
+              <w:spacing w:line="240" w:lineRule="auto"/>
+            </w:pPr>
+            <w:r>
+              <w:t>Đã kiểm chứng: 30/30 ô cho trạng thái giống hệt nhau khi có và không có mẫu đồng bộ.</w:t>
+            </w:r>
+          </w:p>
+        </w:tc>
+      </w:tr>
+      <w:tr>
+        <w:tc>
+          <w:tcPr>
+            <w:tcW w:w="1980" w:type="dxa"/>
+          </w:tcPr>
+          <w:p>
+            <w:pPr>
+              <w:pStyle w:val="Compact"/>
+              <w:spacing w:line="240" w:lineRule="auto"/>
+            </w:pPr>
+            <w:r>
+              <w:t>Trang văn bản là vật mang gần như tệ nhất cho thiết kế QIM trung tần</w:t>
+            </w:r>
+          </w:p>
+        </w:tc>
+        <w:tc>
+          <w:tcPr>
+            <w:tcW w:w="1980" w:type="dxa"/>
+          </w:tcPr>
+          <w:p>
+            <w:pPr>
+              <w:pStyle w:val="Compact"/>
+              <w:spacing w:line="240" w:lineRule="auto"/>
+            </w:pPr>
             <w:r>
               <w:rPr>
                 <w:i/>
                 <w:iCs/>
               </w:rPr>
-              <w:t>Giới hạn đã nhận diện</w:t>
+              <w:t>Số liệu đo thực nghiệm</w:t>
             </w:r>
           </w:p>
         </w:tc>
@@ -31068,7 +31783,7 @@
               <w:spacing w:line="240" w:lineRule="auto"/>
             </w:pPr>
             <w:r>
-              <w:t>Đo qua giao diện công khai; số liệu ở Bảng 4.9</w:t>
+              <w:t>Bảng 4.10</w:t>
             </w:r>
           </w:p>
         </w:tc>
@@ -31082,7 +31797,11 @@
               <w:spacing w:line="240" w:lineRule="auto"/>
             </w:pPr>
             <w:r>
-              <w:t>Đã kiểm chứng: 1 trong 5 giải được, và đó là bản nguyên vẹn mà mã băm đã trả lời xong. Đây là số liệu của ngày 12/09, đã bị Mục 4.2.4 thay thế sau khi sửa nguyên nhân gốc thứ ba.</w:t>
+              <w:t xml:space="preserve">Đã kiểm chứng: trang chuyển sắc giữ được bằng chứng payload qua thu nhỏ 0.50; trang văn bản không ra gì kể cả </w:t>
+            </w:r>
+            <w:r>
+              <w:lastRenderedPageBreak/>
+              <w:t>khi không tấn công.</w:t>
             </w:r>
           </w:p>
         </w:tc>
@@ -31098,133 +31817,7 @@
               <w:spacing w:line="240" w:lineRule="auto"/>
             </w:pPr>
             <w:r>
-              <w:t>Mẫu đồng bộ ORB không phải mảnh còn thiếu của bộ giải mã</w:t>
-            </w:r>
-          </w:p>
-        </w:tc>
-        <w:tc>
-          <w:tcPr>
-            <w:tcW w:w="1980" w:type="dxa"/>
-          </w:tcPr>
-          <w:p>
-            <w:pPr>
-              <w:pStyle w:val="Compact"/>
-              <w:spacing w:line="240" w:lineRule="auto"/>
-            </w:pPr>
-            <w:r>
-              <w:rPr>
-                <w:i/>
-                <w:iCs/>
-              </w:rPr>
-              <w:t>Giới hạn đã nhận diện</w:t>
-            </w:r>
-            <w:r>
-              <w:t xml:space="preserve"> (giả thuyết bị bác bỏ)</w:t>
-            </w:r>
-          </w:p>
-        </w:tc>
-        <w:tc>
-          <w:tcPr>
-            <w:tcW w:w="1980" w:type="dxa"/>
-          </w:tcPr>
-          <w:p>
-            <w:pPr>
-              <w:pStyle w:val="Compact"/>
-              <w:spacing w:line="240" w:lineRule="auto"/>
-            </w:pPr>
-            <w:r>
-              <w:t>3 vật mang nhân 5 điều kiện, giải hai lần mỗi ô; Mục 4.2.3</w:t>
-            </w:r>
-          </w:p>
-        </w:tc>
-        <w:tc>
-          <w:tcPr>
-            <w:tcW w:w="1980" w:type="dxa"/>
-          </w:tcPr>
-          <w:p>
-            <w:pPr>
-              <w:pStyle w:val="Compact"/>
-              <w:spacing w:line="240" w:lineRule="auto"/>
-            </w:pPr>
-            <w:r>
-              <w:t>Đã kiểm chứng: 30/30 ô cho trạng thái giống hệt nhau khi có và không có mẫu đồng bộ.</w:t>
-            </w:r>
-          </w:p>
-        </w:tc>
-      </w:tr>
-      <w:tr>
-        <w:tc>
-          <w:tcPr>
-            <w:tcW w:w="1980" w:type="dxa"/>
-          </w:tcPr>
-          <w:p>
-            <w:pPr>
-              <w:pStyle w:val="Compact"/>
-              <w:spacing w:line="240" w:lineRule="auto"/>
-            </w:pPr>
-            <w:r>
-              <w:t>Trang văn bản là vật mang gần như tệ nhất cho thiết kế QIM trung tần</w:t>
-            </w:r>
-          </w:p>
-        </w:tc>
-        <w:tc>
-          <w:tcPr>
-            <w:tcW w:w="1980" w:type="dxa"/>
-          </w:tcPr>
-          <w:p>
-            <w:pPr>
-              <w:pStyle w:val="Compact"/>
-              <w:spacing w:line="240" w:lineRule="auto"/>
-            </w:pPr>
-            <w:r>
-              <w:rPr>
-                <w:i/>
-                <w:iCs/>
-              </w:rPr>
-              <w:t>Số liệu đo thực nghiệm</w:t>
-            </w:r>
-          </w:p>
-        </w:tc>
-        <w:tc>
-          <w:tcPr>
-            <w:tcW w:w="1980" w:type="dxa"/>
-          </w:tcPr>
-          <w:p>
-            <w:pPr>
-              <w:pStyle w:val="Compact"/>
-              <w:spacing w:line="240" w:lineRule="auto"/>
-            </w:pPr>
-            <w:r>
-              <w:t>Bảng 4.10</w:t>
-            </w:r>
-          </w:p>
-        </w:tc>
-        <w:tc>
-          <w:tcPr>
-            <w:tcW w:w="1980" w:type="dxa"/>
-          </w:tcPr>
-          <w:p>
-            <w:pPr>
-              <w:pStyle w:val="Compact"/>
-              <w:spacing w:line="240" w:lineRule="auto"/>
-            </w:pPr>
-            <w:r>
-              <w:t>Đã kiểm chứng: trang chuyển sắc giữ được bằng chứng payload qua thu nhỏ 0.50; trang văn bản không ra gì kể cả khi không tấn công.</w:t>
-            </w:r>
-          </w:p>
-        </w:tc>
-      </w:tr>
-      <w:tr>
-        <w:tc>
-          <w:tcPr>
-            <w:tcW w:w="1980" w:type="dxa"/>
-          </w:tcPr>
-          <w:p>
-            <w:pPr>
-              <w:pStyle w:val="Compact"/>
-              <w:spacing w:line="240" w:lineRule="auto"/>
-            </w:pPr>
-            <w:r>
+              <w:lastRenderedPageBreak/>
               <w:t>Chuẩn hóa khung ảnh khôi phục nguyên vẹn payload sau thu nhỏ 0.75x, 0.50x và 0.35x</w:t>
             </w:r>
           </w:p>
@@ -31280,11 +31873,7 @@
               <w:t>,</w:t>
             </w:r>
             <w:r>
-              <w:t xml:space="preserve"> </w:t>
-            </w:r>
-            <w:r>
-              <w:lastRenderedPageBreak/>
-              <w:t>payload 64 bit; kết quả ở Bảng 4.7</w:t>
+              <w:t xml:space="preserve"> payload 64 bit; kết quả ở Bảng 4.7</w:t>
             </w:r>
           </w:p>
         </w:tc>
@@ -31298,7 +31887,6 @@
               <w:spacing w:line="240" w:lineRule="auto"/>
             </w:pPr>
             <w:r>
-              <w:lastRenderedPageBreak/>
               <w:t>Đã kiểm chứng: 0.453, 0.422 và 0.438 khi giải trực tiếp; 1.000 sau khi phục hồi khung.</w:t>
             </w:r>
           </w:p>
@@ -31608,7 +32196,14 @@
               <w:rPr>
                 <w:rStyle w:val="VerbatimChar"/>
               </w:rPr>
-              <w:t>contracts/algorithm/payload-profile.v1.json</w:t>
+              <w:t>contracts/algori</w:t>
+            </w:r>
+            <w:r>
+              <w:rPr>
+                <w:rStyle w:val="VerbatimChar"/>
+              </w:rPr>
+              <w:lastRenderedPageBreak/>
+              <w:t>thm/payload-profile.v1.json</w:t>
             </w:r>
           </w:p>
         </w:tc>
@@ -31622,6 +32217,7 @@
               <w:spacing w:line="240" w:lineRule="auto"/>
             </w:pPr>
             <w:r>
+              <w:lastRenderedPageBreak/>
               <w:t>Đã kiểm chứng: tỉ lệ lỗi bit 0,000 đi kèm 21-24 ký hiệu bị khai xoá, vượt ngưỡng 16 mà mã chịu được.</w:t>
             </w:r>
           </w:p>
@@ -31695,11 +32291,7 @@
               <w:t>services/api/splitbind/demo/verification.py</w:t>
             </w:r>
             <w:r>
-              <w:t xml:space="preserve"> </w:t>
-            </w:r>
-            <w:r>
-              <w:lastRenderedPageBreak/>
-              <w:t>(</w:t>
+              <w:t xml:space="preserve"> (</w:t>
             </w:r>
             <w:r>
               <w:rPr>
@@ -31722,7 +32314,6 @@
               <w:spacing w:line="240" w:lineRule="auto"/>
             </w:pPr>
             <w:r>
-              <w:lastRenderedPageBreak/>
               <w:t xml:space="preserve">Đã kiểm chứng bằng </w:t>
             </w:r>
             <w:r>
@@ -31732,11 +32323,7 @@
               <w:t>services/api/tests/demo/test_screenshot_frame_restore.py</w:t>
             </w:r>
             <w:r>
-              <w:t xml:space="preserve">: ảnh chụp màn hình có </w:t>
-            </w:r>
-            <w:r>
-              <w:lastRenderedPageBreak/>
-              <w:t xml:space="preserve">viền chuyển từ </w:t>
+              <w:t xml:space="preserve">: ảnh chụp màn hình có viền chuyển từ </w:t>
             </w:r>
             <w:r>
               <w:rPr>
@@ -31761,7 +32348,6 @@
               <w:spacing w:line="240" w:lineRule="auto"/>
             </w:pPr>
             <w:r>
-              <w:lastRenderedPageBreak/>
               <w:t>Ngưỡng hai kết quả khớp nhau khiến một tấm ảnh không bao giờ được quy kết</w:t>
             </w:r>
           </w:p>
@@ -31939,7 +32525,11 @@
               <w:spacing w:line="240" w:lineRule="auto"/>
             </w:pPr>
             <w:r>
-              <w:t>Trên hệ thống thật, ảnh chụp màn hình thu nhỏ còn 0.469 kèm viền đen vẫn truy được nguồn, nếu bản cấp phát đúng khung chuẩn</w:t>
+              <w:t xml:space="preserve">Trên hệ thống thật, ảnh chụp màn hình thu nhỏ còn 0.469 kèm viền đen vẫn truy </w:t>
+            </w:r>
+            <w:r>
+              <w:lastRenderedPageBreak/>
+              <w:t>được nguồn, nếu bản cấp phát đúng khung chuẩn</w:t>
             </w:r>
           </w:p>
         </w:tc>
@@ -31957,6 +32547,7 @@
                 <w:i/>
                 <w:iCs/>
               </w:rPr>
+              <w:lastRenderedPageBreak/>
               <w:t>Số liệu đo thực nghiệm</w:t>
             </w:r>
             <w:r>
@@ -31981,7 +32572,11 @@
               <w:spacing w:line="240" w:lineRule="auto"/>
             </w:pPr>
             <w:r>
-              <w:t xml:space="preserve">Phép so sánh có kiểm soát ngày 14/09/2026 qua đúng giao diện web; ảnh chụp màn hình ở </w:t>
+              <w:t xml:space="preserve">Phép so sánh có kiểm soát ngày 14/09/2026 qua đúng giao diện web; ảnh chụp </w:t>
+            </w:r>
+            <w:r>
+              <w:lastRenderedPageBreak/>
+              <w:t xml:space="preserve">màn hình ở </w:t>
             </w:r>
             <w:r>
               <w:rPr>
@@ -32004,7 +32599,12 @@
               <w:spacing w:line="240" w:lineRule="auto"/>
             </w:pPr>
             <w:r>
-              <w:t>Đã kiểm chứng: cùng cách dựng ảnh chụp màn hình, bản cấp phát lệch khung chuẩn thì trượt còn bản đúng khung chuẩn thì chỉ đúng mã hồ sơ, dù tệp bị thu nhỏ mạnh hơn.</w:t>
+              <w:lastRenderedPageBreak/>
+              <w:t xml:space="preserve">Đã kiểm chứng: cùng cách dựng ảnh chụp màn hình, bản cấp phát lệch khung chuẩn </w:t>
+            </w:r>
+            <w:r>
+              <w:lastRenderedPageBreak/>
+              <w:t>thì trượt còn bản đúng khung chuẩn thì chỉ đúng mã hồ sơ, dù tệp bị thu nhỏ mạnh hơn.</w:t>
             </w:r>
           </w:p>
         </w:tc>
@@ -32020,11 +32620,8 @@
               <w:spacing w:line="240" w:lineRule="auto"/>
             </w:pPr>
             <w:r>
-              <w:t xml:space="preserve">Giao diện hiện “Chưa đủ bằng </w:t>
-            </w:r>
-            <w:r>
               <w:lastRenderedPageBreak/>
-              <w:t>chứng xác minh” ngay cả khi hệ thống đã truy đúng nguồn</w:t>
+              <w:t>Giao diện hiện “Chưa đủ bằng chứng xác minh” ngay cả khi hệ thống đã truy đúng nguồn</w:t>
             </w:r>
           </w:p>
         </w:tc>
@@ -32042,7 +32639,6 @@
                 <w:i/>
                 <w:iCs/>
               </w:rPr>
-              <w:lastRenderedPageBreak/>
               <w:t>Đã hiện thực trong mã nguồn</w:t>
             </w:r>
             <w:r>
@@ -32053,7 +32649,6 @@
                 <w:i/>
                 <w:iCs/>
               </w:rPr>
-              <w:lastRenderedPageBreak/>
               <w:t>Giới hạn đã nhận diện</w:t>
             </w:r>
           </w:p>
@@ -32071,7 +32666,6 @@
               <w:rPr>
                 <w:rStyle w:val="VerbatimChar"/>
               </w:rPr>
-              <w:lastRenderedPageBreak/>
               <w:t>integrityVerdict</w:t>
             </w:r>
             <w:r>
@@ -32081,7 +32675,6 @@
               <w:rPr>
                 <w:rStyle w:val="VerbatimChar"/>
               </w:rPr>
-              <w:lastRenderedPageBreak/>
               <w:t>apps/web/src/features/evidence/copy.ts</w:t>
             </w:r>
             <w:r>
@@ -32108,12 +32701,7 @@
               <w:spacing w:line="240" w:lineRule="auto"/>
             </w:pPr>
             <w:r>
-              <w:lastRenderedPageBreak/>
-              <w:t xml:space="preserve">Đã kiểm chứng: hàm không có </w:t>
-            </w:r>
-            <w:r>
-              <w:lastRenderedPageBreak/>
-              <w:t xml:space="preserve">nhánh cho </w:t>
+              <w:t xml:space="preserve">Đã kiểm chứng: hàm không có nhánh cho </w:t>
             </w:r>
             <w:r>
               <w:rPr>
@@ -32147,7 +32735,6 @@
               <w:spacing w:line="240" w:lineRule="auto"/>
             </w:pPr>
             <w:r>
-              <w:lastRenderedPageBreak/>
               <w:t>Hồ sơ tham số mà hệ thống đang chạy ghim là hồ sơ yếu nhất trong lưới ứng viên</w:t>
             </w:r>
           </w:p>
@@ -32351,7 +32938,11 @@
               <w:spacing w:line="240" w:lineRule="auto"/>
             </w:pPr>
             <w:r>
-              <w:t>Tám ứng viên dùng ô 512 điểm ảnh; khung 1152 x 2304 chỉ chứa 8 ô không chồng lấn mà hồ sơ đòi 18</w:t>
+              <w:t xml:space="preserve">Tám ứng viên dùng ô 512 điểm ảnh; khung 1152 x 2304 chỉ chứa 8 ô </w:t>
+            </w:r>
+            <w:r>
+              <w:lastRenderedPageBreak/>
+              <w:t>không chồng lấn mà hồ sơ đòi 18</w:t>
             </w:r>
           </w:p>
         </w:tc>
@@ -32365,7 +32956,12 @@
               <w:spacing w:line="240" w:lineRule="auto"/>
             </w:pPr>
             <w:r>
-              <w:t>Đã kiểm chứng: khâu nhúng báo lỗi ngay, nên các ứng viên này chưa bao giờ chạy được.</w:t>
+              <w:lastRenderedPageBreak/>
+              <w:t xml:space="preserve">Đã kiểm chứng: khâu nhúng báo lỗi ngay, nên các ứng viên này chưa </w:t>
+            </w:r>
+            <w:r>
+              <w:lastRenderedPageBreak/>
+              <w:t>bao giờ chạy được.</w:t>
             </w:r>
           </w:p>
         </w:tc>
@@ -32381,6 +32977,7 @@
               <w:spacing w:line="240" w:lineRule="auto"/>
             </w:pPr>
             <w:r>
+              <w:lastRenderedPageBreak/>
               <w:t>Vật mang quyết định truy vết được hay không, phép tấn công và kích thước cấp phát thì không</w:t>
             </w:r>
           </w:p>
@@ -32464,11 +33061,7 @@
               <w:t>insufficient_sync_evidence</w:t>
             </w:r>
             <w:r>
-              <w:t xml:space="preserve"> cả sáu </w:t>
-            </w:r>
-            <w:r>
-              <w:lastRenderedPageBreak/>
-              <w:t>ô kể cả khi không tấn công.</w:t>
+              <w:t xml:space="preserve"> cả sáu ô kể cả khi không tấn công.</w:t>
             </w:r>
           </w:p>
         </w:tc>
@@ -32484,7 +33077,6 @@
               <w:spacing w:line="240" w:lineRule="auto"/>
             </w:pPr>
             <w:r>
-              <w:lastRenderedPageBreak/>
               <w:t>Trên hệ thống thật, một tệp có mã băm không khớp vẫn được truy đúng bản cấp phát nhờ thủy vân</w:t>
             </w:r>
           </w:p>
@@ -35010,6 +35602,21 @@
       <w:color w:val="666666"/>
     </w:rPr>
   </w:style>
+  <w:style w:type="paragraph" w:customStyle="1" w:styleId="msonormal0">
+    <w:name w:val="msonormal"/>
+    <w:basedOn w:val="Normal"/>
+    <w:rsid w:val="00135499"/>
+    <w:pPr>
+      <w:spacing w:before="100" w:beforeAutospacing="1" w:after="100" w:afterAutospacing="1" w:line="240" w:lineRule="auto"/>
+      <w:jc w:val="left"/>
+    </w:pPr>
+    <w:rPr>
+      <w:rFonts w:eastAsiaTheme="minorEastAsia"/>
+      <w:sz w:val="24"/>
+      <w:szCs w:val="24"/>
+      <w:lang w:val="en-US" w:eastAsia="en-US"/>
+    </w:rPr>
+  </w:style>
 </w:styles>
 </file>
 
@@ -35122,8 +35729,8 @@
   <w:rsids>
     <w:rsidRoot w:val="001F3D7D"/>
     <w:rsid w:val="001F3D7D"/>
+    <w:rsid w:val="00AF6049"/>
     <w:rsid w:val="00C24EF1"/>
-    <w:rsid w:val="00C311DC"/>
   </w:rsids>
   <m:mathPr>
     <m:mathFont m:val="Cambria Math"/>

</xml_diff>

<commit_message>
docs: regenerate the table of contents after the bibliography swap
The generated list is shorter than the hand-built one and the ten new citations
shifted the body, so every page number after chapter 1 had moved. 95 pages.

Co-Authored-By: Claude Opus 5 <noreply@anthropic.com>
Claude-Session: https://claude.ai/code/session_01SzJTThV64VAErHN4L42mg9
</commit_message>
<xml_diff>
--- a/docs/project/Nhom9_TruyVetToanVenVanBan.docx
+++ b/docs/project/Nhom9_TruyVetToanVenVanBan.docx
@@ -738,13 +738,13 @@
       <w:pPr>
         <w:pStyle w:val="Heading1"/>
       </w:pPr>
-      <w:bookmarkStart w:id="0" w:name="_Toc240370140"/>
-      <w:bookmarkStart w:id="1" w:name="mục-lục"/>
+      <w:bookmarkStart w:id="0" w:name="mục-lục"/>
+      <w:bookmarkStart w:id="1" w:name="_Toc240373025"/>
       <w:r>
         <w:lastRenderedPageBreak/>
         <w:t>MỤC LỤC</w:t>
       </w:r>
-      <w:bookmarkEnd w:id="0"/>
+      <w:bookmarkEnd w:id="1"/>
     </w:p>
     <w:sdt>
       <w:sdtPr>
@@ -763,7 +763,13 @@
               <w:tab w:val="right" w:leader="dot" w:pos="8778"/>
             </w:tabs>
             <w:rPr>
+              <w:rFonts w:asciiTheme="minorHAnsi" w:eastAsiaTheme="minorEastAsia" w:hAnsiTheme="minorHAnsi" w:cstheme="minorBidi"/>
               <w:noProof/>
+              <w:kern w:val="2"/>
+              <w:sz w:val="24"/>
+              <w:szCs w:val="24"/>
+              <w:lang w:val="en-US" w:eastAsia="en-US"/>
+              <w14:ligatures w14:val="standardContextual"/>
             </w:rPr>
           </w:pPr>
           <w:r>
@@ -775,7 +781,7 @@
           <w:r>
             <w:fldChar w:fldCharType="separate"/>
           </w:r>
-          <w:hyperlink w:anchor="_Toc240370140" w:history="1">
+          <w:hyperlink w:anchor="_Toc240373025" w:history="1">
             <w:r>
               <w:rPr>
                 <w:rStyle w:val="Hyperlink"/>
@@ -802,7 +808,7 @@
                 <w:noProof/>
                 <w:webHidden/>
               </w:rPr>
-              <w:instrText xml:space="preserve"> PAGEREF _Toc240370140 \h </w:instrText>
+              <w:instrText xml:space="preserve"> PAGEREF _Toc240373025 \h </w:instrText>
             </w:r>
             <w:r>
               <w:rPr>
@@ -840,10 +846,16 @@
               <w:tab w:val="right" w:leader="dot" w:pos="8778"/>
             </w:tabs>
             <w:rPr>
+              <w:rFonts w:asciiTheme="minorHAnsi" w:eastAsiaTheme="minorEastAsia" w:hAnsiTheme="minorHAnsi" w:cstheme="minorBidi"/>
               <w:noProof/>
+              <w:kern w:val="2"/>
+              <w:sz w:val="24"/>
+              <w:szCs w:val="24"/>
+              <w:lang w:val="en-US" w:eastAsia="en-US"/>
+              <w14:ligatures w14:val="standardContextual"/>
             </w:rPr>
           </w:pPr>
-          <w:hyperlink w:anchor="_Toc240370141" w:history="1">
+          <w:hyperlink w:anchor="_Toc240373026" w:history="1">
             <w:r>
               <w:rPr>
                 <w:rStyle w:val="Hyperlink"/>
@@ -870,7 +882,7 @@
                 <w:noProof/>
                 <w:webHidden/>
               </w:rPr>
-              <w:instrText xml:space="preserve"> PAGEREF _Toc240370141 \h </w:instrText>
+              <w:instrText xml:space="preserve"> PAGEREF _Toc240373026 \h </w:instrText>
             </w:r>
             <w:r>
               <w:rPr>
@@ -908,10 +920,16 @@
               <w:tab w:val="right" w:leader="dot" w:pos="8778"/>
             </w:tabs>
             <w:rPr>
+              <w:rFonts w:asciiTheme="minorHAnsi" w:eastAsiaTheme="minorEastAsia" w:hAnsiTheme="minorHAnsi" w:cstheme="minorBidi"/>
               <w:noProof/>
+              <w:kern w:val="2"/>
+              <w:sz w:val="24"/>
+              <w:szCs w:val="24"/>
+              <w:lang w:val="en-US" w:eastAsia="en-US"/>
+              <w14:ligatures w14:val="standardContextual"/>
             </w:rPr>
           </w:pPr>
-          <w:hyperlink w:anchor="_Toc240370142" w:history="1">
+          <w:hyperlink w:anchor="_Toc240373027" w:history="1">
             <w:r>
               <w:rPr>
                 <w:rStyle w:val="Hyperlink"/>
@@ -938,7 +956,7 @@
                 <w:noProof/>
                 <w:webHidden/>
               </w:rPr>
-              <w:instrText xml:space="preserve"> PAGEREF _Toc240370142 \h </w:instrText>
+              <w:instrText xml:space="preserve"> PAGEREF _Toc240373027 \h </w:instrText>
             </w:r>
             <w:r>
               <w:rPr>
@@ -976,10 +994,16 @@
               <w:tab w:val="right" w:leader="dot" w:pos="8778"/>
             </w:tabs>
             <w:rPr>
+              <w:rFonts w:asciiTheme="minorHAnsi" w:eastAsiaTheme="minorEastAsia" w:hAnsiTheme="minorHAnsi" w:cstheme="minorBidi"/>
               <w:noProof/>
+              <w:kern w:val="2"/>
+              <w:sz w:val="24"/>
+              <w:szCs w:val="24"/>
+              <w:lang w:val="en-US" w:eastAsia="en-US"/>
+              <w14:ligatures w14:val="standardContextual"/>
             </w:rPr>
           </w:pPr>
-          <w:hyperlink w:anchor="_Toc240370143" w:history="1">
+          <w:hyperlink w:anchor="_Toc240373028" w:history="1">
             <w:r>
               <w:rPr>
                 <w:rStyle w:val="Hyperlink"/>
@@ -1006,7 +1030,7 @@
                 <w:noProof/>
                 <w:webHidden/>
               </w:rPr>
-              <w:instrText xml:space="preserve"> PAGEREF _Toc240370143 \h </w:instrText>
+              <w:instrText xml:space="preserve"> PAGEREF _Toc240373028 \h </w:instrText>
             </w:r>
             <w:r>
               <w:rPr>
@@ -1044,10 +1068,16 @@
               <w:tab w:val="right" w:leader="dot" w:pos="8778"/>
             </w:tabs>
             <w:rPr>
+              <w:rFonts w:asciiTheme="minorHAnsi" w:eastAsiaTheme="minorEastAsia" w:hAnsiTheme="minorHAnsi" w:cstheme="minorBidi"/>
               <w:noProof/>
+              <w:kern w:val="2"/>
+              <w:sz w:val="24"/>
+              <w:szCs w:val="24"/>
+              <w:lang w:val="en-US" w:eastAsia="en-US"/>
+              <w14:ligatures w14:val="standardContextual"/>
             </w:rPr>
           </w:pPr>
-          <w:hyperlink w:anchor="_Toc240370144" w:history="1">
+          <w:hyperlink w:anchor="_Toc240373029" w:history="1">
             <w:r>
               <w:rPr>
                 <w:rStyle w:val="Hyperlink"/>
@@ -1074,7 +1104,7 @@
                 <w:noProof/>
                 <w:webHidden/>
               </w:rPr>
-              <w:instrText xml:space="preserve"> PAGEREF _Toc240370144 \h </w:instrText>
+              <w:instrText xml:space="preserve"> PAGEREF _Toc240373029 \h </w:instrText>
             </w:r>
             <w:r>
               <w:rPr>
@@ -1112,10 +1142,16 @@
               <w:tab w:val="right" w:leader="dot" w:pos="8778"/>
             </w:tabs>
             <w:rPr>
+              <w:rFonts w:asciiTheme="minorHAnsi" w:eastAsiaTheme="minorEastAsia" w:hAnsiTheme="minorHAnsi" w:cstheme="minorBidi"/>
               <w:noProof/>
+              <w:kern w:val="2"/>
+              <w:sz w:val="24"/>
+              <w:szCs w:val="24"/>
+              <w:lang w:val="en-US" w:eastAsia="en-US"/>
+              <w14:ligatures w14:val="standardContextual"/>
             </w:rPr>
           </w:pPr>
-          <w:hyperlink w:anchor="_Toc240370145" w:history="1">
+          <w:hyperlink w:anchor="_Toc240373030" w:history="1">
             <w:r>
               <w:rPr>
                 <w:rStyle w:val="Hyperlink"/>
@@ -1142,7 +1178,7 @@
                 <w:noProof/>
                 <w:webHidden/>
               </w:rPr>
-              <w:instrText xml:space="preserve"> PAGEREF _Toc240370145 \h </w:instrText>
+              <w:instrText xml:space="preserve"> PAGEREF _Toc240373030 \h </w:instrText>
             </w:r>
             <w:r>
               <w:rPr>
@@ -1180,10 +1216,16 @@
               <w:tab w:val="right" w:leader="dot" w:pos="8778"/>
             </w:tabs>
             <w:rPr>
+              <w:rFonts w:asciiTheme="minorHAnsi" w:eastAsiaTheme="minorEastAsia" w:hAnsiTheme="minorHAnsi" w:cstheme="minorBidi"/>
               <w:noProof/>
+              <w:kern w:val="2"/>
+              <w:sz w:val="24"/>
+              <w:szCs w:val="24"/>
+              <w:lang w:val="en-US" w:eastAsia="en-US"/>
+              <w14:ligatures w14:val="standardContextual"/>
             </w:rPr>
           </w:pPr>
-          <w:hyperlink w:anchor="_Toc240370146" w:history="1">
+          <w:hyperlink w:anchor="_Toc240373031" w:history="1">
             <w:r>
               <w:rPr>
                 <w:rStyle w:val="Hyperlink"/>
@@ -1210,7 +1252,7 @@
                 <w:noProof/>
                 <w:webHidden/>
               </w:rPr>
-              <w:instrText xml:space="preserve"> PAGEREF _Toc240370146 \h </w:instrText>
+              <w:instrText xml:space="preserve"> PAGEREF _Toc240373031 \h </w:instrText>
             </w:r>
             <w:r>
               <w:rPr>
@@ -1248,10 +1290,16 @@
               <w:tab w:val="right" w:leader="dot" w:pos="8778"/>
             </w:tabs>
             <w:rPr>
+              <w:rFonts w:asciiTheme="minorHAnsi" w:eastAsiaTheme="minorEastAsia" w:hAnsiTheme="minorHAnsi" w:cstheme="minorBidi"/>
               <w:noProof/>
+              <w:kern w:val="2"/>
+              <w:sz w:val="24"/>
+              <w:szCs w:val="24"/>
+              <w:lang w:val="en-US" w:eastAsia="en-US"/>
+              <w14:ligatures w14:val="standardContextual"/>
             </w:rPr>
           </w:pPr>
-          <w:hyperlink w:anchor="_Toc240370147" w:history="1">
+          <w:hyperlink w:anchor="_Toc240373032" w:history="1">
             <w:r>
               <w:rPr>
                 <w:rStyle w:val="Hyperlink"/>
@@ -1278,7 +1326,7 @@
                 <w:noProof/>
                 <w:webHidden/>
               </w:rPr>
-              <w:instrText xml:space="preserve"> PAGEREF _Toc240370147 \h </w:instrText>
+              <w:instrText xml:space="preserve"> PAGEREF _Toc240373032 \h </w:instrText>
             </w:r>
             <w:r>
               <w:rPr>
@@ -1316,10 +1364,16 @@
               <w:tab w:val="right" w:leader="dot" w:pos="8778"/>
             </w:tabs>
             <w:rPr>
+              <w:rFonts w:asciiTheme="minorHAnsi" w:eastAsiaTheme="minorEastAsia" w:hAnsiTheme="minorHAnsi" w:cstheme="minorBidi"/>
               <w:noProof/>
+              <w:kern w:val="2"/>
+              <w:sz w:val="24"/>
+              <w:szCs w:val="24"/>
+              <w:lang w:val="en-US" w:eastAsia="en-US"/>
+              <w14:ligatures w14:val="standardContextual"/>
             </w:rPr>
           </w:pPr>
-          <w:hyperlink w:anchor="_Toc240370148" w:history="1">
+          <w:hyperlink w:anchor="_Toc240373033" w:history="1">
             <w:r>
               <w:rPr>
                 <w:rStyle w:val="Hyperlink"/>
@@ -1346,7 +1400,7 @@
                 <w:noProof/>
                 <w:webHidden/>
               </w:rPr>
-              <w:instrText xml:space="preserve"> PAGEREF _Toc240370148 \h </w:instrText>
+              <w:instrText xml:space="preserve"> PAGEREF _Toc240373033 \h </w:instrText>
             </w:r>
             <w:r>
               <w:rPr>
@@ -1384,10 +1438,16 @@
               <w:tab w:val="right" w:leader="dot" w:pos="8778"/>
             </w:tabs>
             <w:rPr>
+              <w:rFonts w:asciiTheme="minorHAnsi" w:eastAsiaTheme="minorEastAsia" w:hAnsiTheme="minorHAnsi" w:cstheme="minorBidi"/>
               <w:noProof/>
+              <w:kern w:val="2"/>
+              <w:sz w:val="24"/>
+              <w:szCs w:val="24"/>
+              <w:lang w:val="en-US" w:eastAsia="en-US"/>
+              <w14:ligatures w14:val="standardContextual"/>
             </w:rPr>
           </w:pPr>
-          <w:hyperlink w:anchor="_Toc240370149" w:history="1">
+          <w:hyperlink w:anchor="_Toc240373034" w:history="1">
             <w:r>
               <w:rPr>
                 <w:rStyle w:val="Hyperlink"/>
@@ -1414,7 +1474,7 @@
                 <w:noProof/>
                 <w:webHidden/>
               </w:rPr>
-              <w:instrText xml:space="preserve"> PAGEREF _Toc240370149 \h </w:instrText>
+              <w:instrText xml:space="preserve"> PAGEREF _Toc240373034 \h </w:instrText>
             </w:r>
             <w:r>
               <w:rPr>
@@ -1452,10 +1512,16 @@
               <w:tab w:val="right" w:leader="dot" w:pos="8778"/>
             </w:tabs>
             <w:rPr>
+              <w:rFonts w:asciiTheme="minorHAnsi" w:eastAsiaTheme="minorEastAsia" w:hAnsiTheme="minorHAnsi" w:cstheme="minorBidi"/>
               <w:noProof/>
+              <w:kern w:val="2"/>
+              <w:sz w:val="24"/>
+              <w:szCs w:val="24"/>
+              <w:lang w:val="en-US" w:eastAsia="en-US"/>
+              <w14:ligatures w14:val="standardContextual"/>
             </w:rPr>
           </w:pPr>
-          <w:hyperlink w:anchor="_Toc240370150" w:history="1">
+          <w:hyperlink w:anchor="_Toc240373035" w:history="1">
             <w:r>
               <w:rPr>
                 <w:rStyle w:val="Hyperlink"/>
@@ -1482,7 +1548,7 @@
                 <w:noProof/>
                 <w:webHidden/>
               </w:rPr>
-              <w:instrText xml:space="preserve"> PAGEREF _Toc240370150 \h </w:instrText>
+              <w:instrText xml:space="preserve"> PAGEREF _Toc240373035 \h </w:instrText>
             </w:r>
             <w:r>
               <w:rPr>
@@ -1520,10 +1586,16 @@
               <w:tab w:val="right" w:leader="dot" w:pos="8778"/>
             </w:tabs>
             <w:rPr>
+              <w:rFonts w:asciiTheme="minorHAnsi" w:eastAsiaTheme="minorEastAsia" w:hAnsiTheme="minorHAnsi" w:cstheme="minorBidi"/>
               <w:noProof/>
+              <w:kern w:val="2"/>
+              <w:sz w:val="24"/>
+              <w:szCs w:val="24"/>
+              <w:lang w:val="en-US" w:eastAsia="en-US"/>
+              <w14:ligatures w14:val="standardContextual"/>
             </w:rPr>
           </w:pPr>
-          <w:hyperlink w:anchor="_Toc240370151" w:history="1">
+          <w:hyperlink w:anchor="_Toc240373036" w:history="1">
             <w:r>
               <w:rPr>
                 <w:rStyle w:val="Hyperlink"/>
@@ -1550,7 +1622,7 @@
                 <w:noProof/>
                 <w:webHidden/>
               </w:rPr>
-              <w:instrText xml:space="preserve"> PAGEREF _Toc240370151 \h </w:instrText>
+              <w:instrText xml:space="preserve"> PAGEREF _Toc240373036 \h </w:instrText>
             </w:r>
             <w:r>
               <w:rPr>
@@ -1588,10 +1660,16 @@
               <w:tab w:val="right" w:leader="dot" w:pos="8778"/>
             </w:tabs>
             <w:rPr>
+              <w:rFonts w:asciiTheme="minorHAnsi" w:eastAsiaTheme="minorEastAsia" w:hAnsiTheme="minorHAnsi" w:cstheme="minorBidi"/>
               <w:noProof/>
+              <w:kern w:val="2"/>
+              <w:sz w:val="24"/>
+              <w:szCs w:val="24"/>
+              <w:lang w:val="en-US" w:eastAsia="en-US"/>
+              <w14:ligatures w14:val="standardContextual"/>
             </w:rPr>
           </w:pPr>
-          <w:hyperlink w:anchor="_Toc240370152" w:history="1">
+          <w:hyperlink w:anchor="_Toc240373037" w:history="1">
             <w:r>
               <w:rPr>
                 <w:rStyle w:val="Hyperlink"/>
@@ -1618,7 +1696,7 @@
                 <w:noProof/>
                 <w:webHidden/>
               </w:rPr>
-              <w:instrText xml:space="preserve"> PAGEREF _Toc240370152 \h </w:instrText>
+              <w:instrText xml:space="preserve"> PAGEREF _Toc240373037 \h </w:instrText>
             </w:r>
             <w:r>
               <w:rPr>
@@ -1656,10 +1734,16 @@
               <w:tab w:val="right" w:leader="dot" w:pos="8778"/>
             </w:tabs>
             <w:rPr>
+              <w:rFonts w:asciiTheme="minorHAnsi" w:eastAsiaTheme="minorEastAsia" w:hAnsiTheme="minorHAnsi" w:cstheme="minorBidi"/>
               <w:noProof/>
+              <w:kern w:val="2"/>
+              <w:sz w:val="24"/>
+              <w:szCs w:val="24"/>
+              <w:lang w:val="en-US" w:eastAsia="en-US"/>
+              <w14:ligatures w14:val="standardContextual"/>
             </w:rPr>
           </w:pPr>
-          <w:hyperlink w:anchor="_Toc240370153" w:history="1">
+          <w:hyperlink w:anchor="_Toc240373038" w:history="1">
             <w:r>
               <w:rPr>
                 <w:rStyle w:val="Hyperlink"/>
@@ -1686,7 +1770,7 @@
                 <w:noProof/>
                 <w:webHidden/>
               </w:rPr>
-              <w:instrText xml:space="preserve"> PAGEREF _Toc240370153 \h </w:instrText>
+              <w:instrText xml:space="preserve"> PAGEREF _Toc240373038 \h </w:instrText>
             </w:r>
             <w:r>
               <w:rPr>
@@ -1724,10 +1808,16 @@
               <w:tab w:val="right" w:leader="dot" w:pos="8778"/>
             </w:tabs>
             <w:rPr>
+              <w:rFonts w:asciiTheme="minorHAnsi" w:eastAsiaTheme="minorEastAsia" w:hAnsiTheme="minorHAnsi" w:cstheme="minorBidi"/>
               <w:noProof/>
+              <w:kern w:val="2"/>
+              <w:sz w:val="24"/>
+              <w:szCs w:val="24"/>
+              <w:lang w:val="en-US" w:eastAsia="en-US"/>
+              <w14:ligatures w14:val="standardContextual"/>
             </w:rPr>
           </w:pPr>
-          <w:hyperlink w:anchor="_Toc240370154" w:history="1">
+          <w:hyperlink w:anchor="_Toc240373039" w:history="1">
             <w:r>
               <w:rPr>
                 <w:rStyle w:val="Hyperlink"/>
@@ -1754,7 +1844,7 @@
                 <w:noProof/>
                 <w:webHidden/>
               </w:rPr>
-              <w:instrText xml:space="preserve"> PAGEREF _Toc240370154 \h </w:instrText>
+              <w:instrText xml:space="preserve"> PAGEREF _Toc240373039 \h </w:instrText>
             </w:r>
             <w:r>
               <w:rPr>
@@ -1774,7 +1864,7 @@
                 <w:noProof/>
                 <w:webHidden/>
               </w:rPr>
-              <w:t>7</w:t>
+              <w:t>6</w:t>
             </w:r>
             <w:r>
               <w:rPr>
@@ -1792,10 +1882,16 @@
               <w:tab w:val="right" w:leader="dot" w:pos="8778"/>
             </w:tabs>
             <w:rPr>
+              <w:rFonts w:asciiTheme="minorHAnsi" w:eastAsiaTheme="minorEastAsia" w:hAnsiTheme="minorHAnsi" w:cstheme="minorBidi"/>
               <w:noProof/>
+              <w:kern w:val="2"/>
+              <w:sz w:val="24"/>
+              <w:szCs w:val="24"/>
+              <w:lang w:val="en-US" w:eastAsia="en-US"/>
+              <w14:ligatures w14:val="standardContextual"/>
             </w:rPr>
           </w:pPr>
-          <w:hyperlink w:anchor="_Toc240370155" w:history="1">
+          <w:hyperlink w:anchor="_Toc240373040" w:history="1">
             <w:r>
               <w:rPr>
                 <w:rStyle w:val="Hyperlink"/>
@@ -1822,7 +1918,7 @@
                 <w:noProof/>
                 <w:webHidden/>
               </w:rPr>
-              <w:instrText xml:space="preserve"> PAGEREF _Toc240370155 \h </w:instrText>
+              <w:instrText xml:space="preserve"> PAGEREF _Toc240373040 \h </w:instrText>
             </w:r>
             <w:r>
               <w:rPr>
@@ -1860,10 +1956,16 @@
               <w:tab w:val="right" w:leader="dot" w:pos="8778"/>
             </w:tabs>
             <w:rPr>
+              <w:rFonts w:asciiTheme="minorHAnsi" w:eastAsiaTheme="minorEastAsia" w:hAnsiTheme="minorHAnsi" w:cstheme="minorBidi"/>
               <w:noProof/>
+              <w:kern w:val="2"/>
+              <w:sz w:val="24"/>
+              <w:szCs w:val="24"/>
+              <w:lang w:val="en-US" w:eastAsia="en-US"/>
+              <w14:ligatures w14:val="standardContextual"/>
             </w:rPr>
           </w:pPr>
-          <w:hyperlink w:anchor="_Toc240370156" w:history="1">
+          <w:hyperlink w:anchor="_Toc240373041" w:history="1">
             <w:r>
               <w:rPr>
                 <w:rStyle w:val="Hyperlink"/>
@@ -1890,7 +1992,7 @@
                 <w:noProof/>
                 <w:webHidden/>
               </w:rPr>
-              <w:instrText xml:space="preserve"> PAGEREF _Toc240370156 \h </w:instrText>
+              <w:instrText xml:space="preserve"> PAGEREF _Toc240373041 \h </w:instrText>
             </w:r>
             <w:r>
               <w:rPr>
@@ -1928,10 +2030,16 @@
               <w:tab w:val="right" w:leader="dot" w:pos="8778"/>
             </w:tabs>
             <w:rPr>
+              <w:rFonts w:asciiTheme="minorHAnsi" w:eastAsiaTheme="minorEastAsia" w:hAnsiTheme="minorHAnsi" w:cstheme="minorBidi"/>
               <w:noProof/>
+              <w:kern w:val="2"/>
+              <w:sz w:val="24"/>
+              <w:szCs w:val="24"/>
+              <w:lang w:val="en-US" w:eastAsia="en-US"/>
+              <w14:ligatures w14:val="standardContextual"/>
             </w:rPr>
           </w:pPr>
-          <w:hyperlink w:anchor="_Toc240370157" w:history="1">
+          <w:hyperlink w:anchor="_Toc240373042" w:history="1">
             <w:r>
               <w:rPr>
                 <w:rStyle w:val="Hyperlink"/>
@@ -1958,7 +2066,7 @@
                 <w:noProof/>
                 <w:webHidden/>
               </w:rPr>
-              <w:instrText xml:space="preserve"> PAGEREF _Toc240370157 \h </w:instrText>
+              <w:instrText xml:space="preserve"> PAGEREF _Toc240373042 \h </w:instrText>
             </w:r>
             <w:r>
               <w:rPr>
@@ -1996,10 +2104,16 @@
               <w:tab w:val="right" w:leader="dot" w:pos="8778"/>
             </w:tabs>
             <w:rPr>
+              <w:rFonts w:asciiTheme="minorHAnsi" w:eastAsiaTheme="minorEastAsia" w:hAnsiTheme="minorHAnsi" w:cstheme="minorBidi"/>
               <w:noProof/>
+              <w:kern w:val="2"/>
+              <w:sz w:val="24"/>
+              <w:szCs w:val="24"/>
+              <w:lang w:val="en-US" w:eastAsia="en-US"/>
+              <w14:ligatures w14:val="standardContextual"/>
             </w:rPr>
           </w:pPr>
-          <w:hyperlink w:anchor="_Toc240370158" w:history="1">
+          <w:hyperlink w:anchor="_Toc240373043" w:history="1">
             <w:r>
               <w:rPr>
                 <w:rStyle w:val="Hyperlink"/>
@@ -2026,7 +2140,7 @@
                 <w:noProof/>
                 <w:webHidden/>
               </w:rPr>
-              <w:instrText xml:space="preserve"> PAGEREF _Toc240370158 \h </w:instrText>
+              <w:instrText xml:space="preserve"> PAGEREF _Toc240373043 \h </w:instrText>
             </w:r>
             <w:r>
               <w:rPr>
@@ -2064,10 +2178,16 @@
               <w:tab w:val="right" w:leader="dot" w:pos="8778"/>
             </w:tabs>
             <w:rPr>
+              <w:rFonts w:asciiTheme="minorHAnsi" w:eastAsiaTheme="minorEastAsia" w:hAnsiTheme="minorHAnsi" w:cstheme="minorBidi"/>
               <w:noProof/>
+              <w:kern w:val="2"/>
+              <w:sz w:val="24"/>
+              <w:szCs w:val="24"/>
+              <w:lang w:val="en-US" w:eastAsia="en-US"/>
+              <w14:ligatures w14:val="standardContextual"/>
             </w:rPr>
           </w:pPr>
-          <w:hyperlink w:anchor="_Toc240370159" w:history="1">
+          <w:hyperlink w:anchor="_Toc240373044" w:history="1">
             <w:r>
               <w:rPr>
                 <w:rStyle w:val="Hyperlink"/>
@@ -2094,7 +2214,7 @@
                 <w:noProof/>
                 <w:webHidden/>
               </w:rPr>
-              <w:instrText xml:space="preserve"> PAGEREF _Toc240370159 \h </w:instrText>
+              <w:instrText xml:space="preserve"> PAGEREF _Toc240373044 \h </w:instrText>
             </w:r>
             <w:r>
               <w:rPr>
@@ -2132,10 +2252,16 @@
               <w:tab w:val="right" w:leader="dot" w:pos="8778"/>
             </w:tabs>
             <w:rPr>
+              <w:rFonts w:asciiTheme="minorHAnsi" w:eastAsiaTheme="minorEastAsia" w:hAnsiTheme="minorHAnsi" w:cstheme="minorBidi"/>
               <w:noProof/>
+              <w:kern w:val="2"/>
+              <w:sz w:val="24"/>
+              <w:szCs w:val="24"/>
+              <w:lang w:val="en-US" w:eastAsia="en-US"/>
+              <w14:ligatures w14:val="standardContextual"/>
             </w:rPr>
           </w:pPr>
-          <w:hyperlink w:anchor="_Toc240370160" w:history="1">
+          <w:hyperlink w:anchor="_Toc240373045" w:history="1">
             <w:r>
               <w:rPr>
                 <w:rStyle w:val="Hyperlink"/>
@@ -2162,7 +2288,7 @@
                 <w:noProof/>
                 <w:webHidden/>
               </w:rPr>
-              <w:instrText xml:space="preserve"> PAGEREF _Toc240370160 \h </w:instrText>
+              <w:instrText xml:space="preserve"> PAGEREF _Toc240373045 \h </w:instrText>
             </w:r>
             <w:r>
               <w:rPr>
@@ -2200,10 +2326,16 @@
               <w:tab w:val="right" w:leader="dot" w:pos="8778"/>
             </w:tabs>
             <w:rPr>
+              <w:rFonts w:asciiTheme="minorHAnsi" w:eastAsiaTheme="minorEastAsia" w:hAnsiTheme="minorHAnsi" w:cstheme="minorBidi"/>
               <w:noProof/>
+              <w:kern w:val="2"/>
+              <w:sz w:val="24"/>
+              <w:szCs w:val="24"/>
+              <w:lang w:val="en-US" w:eastAsia="en-US"/>
+              <w14:ligatures w14:val="standardContextual"/>
             </w:rPr>
           </w:pPr>
-          <w:hyperlink w:anchor="_Toc240370161" w:history="1">
+          <w:hyperlink w:anchor="_Toc240373046" w:history="1">
             <w:r>
               <w:rPr>
                 <w:rStyle w:val="Hyperlink"/>
@@ -2230,7 +2362,7 @@
                 <w:noProof/>
                 <w:webHidden/>
               </w:rPr>
-              <w:instrText xml:space="preserve"> PAGEREF _Toc240370161 \h </w:instrText>
+              <w:instrText xml:space="preserve"> PAGEREF _Toc240373046 \h </w:instrText>
             </w:r>
             <w:r>
               <w:rPr>
@@ -2268,10 +2400,16 @@
               <w:tab w:val="right" w:leader="dot" w:pos="8778"/>
             </w:tabs>
             <w:rPr>
+              <w:rFonts w:asciiTheme="minorHAnsi" w:eastAsiaTheme="minorEastAsia" w:hAnsiTheme="minorHAnsi" w:cstheme="minorBidi"/>
               <w:noProof/>
+              <w:kern w:val="2"/>
+              <w:sz w:val="24"/>
+              <w:szCs w:val="24"/>
+              <w:lang w:val="en-US" w:eastAsia="en-US"/>
+              <w14:ligatures w14:val="standardContextual"/>
             </w:rPr>
           </w:pPr>
-          <w:hyperlink w:anchor="_Toc240370162" w:history="1">
+          <w:hyperlink w:anchor="_Toc240373047" w:history="1">
             <w:r>
               <w:rPr>
                 <w:rStyle w:val="Hyperlink"/>
@@ -2298,7 +2436,7 @@
                 <w:noProof/>
                 <w:webHidden/>
               </w:rPr>
-              <w:instrText xml:space="preserve"> PAGEREF _Toc240370162 \h </w:instrText>
+              <w:instrText xml:space="preserve"> PAGEREF _Toc240373047 \h </w:instrText>
             </w:r>
             <w:r>
               <w:rPr>
@@ -2336,10 +2474,16 @@
               <w:tab w:val="right" w:leader="dot" w:pos="8778"/>
             </w:tabs>
             <w:rPr>
+              <w:rFonts w:asciiTheme="minorHAnsi" w:eastAsiaTheme="minorEastAsia" w:hAnsiTheme="minorHAnsi" w:cstheme="minorBidi"/>
               <w:noProof/>
+              <w:kern w:val="2"/>
+              <w:sz w:val="24"/>
+              <w:szCs w:val="24"/>
+              <w:lang w:val="en-US" w:eastAsia="en-US"/>
+              <w14:ligatures w14:val="standardContextual"/>
             </w:rPr>
           </w:pPr>
-          <w:hyperlink w:anchor="_Toc240370163" w:history="1">
+          <w:hyperlink w:anchor="_Toc240373048" w:history="1">
             <w:r>
               <w:rPr>
                 <w:rStyle w:val="Hyperlink"/>
@@ -2366,7 +2510,7 @@
                 <w:noProof/>
                 <w:webHidden/>
               </w:rPr>
-              <w:instrText xml:space="preserve"> PAGEREF _Toc240370163 \h </w:instrText>
+              <w:instrText xml:space="preserve"> PAGEREF _Toc240373048 \h </w:instrText>
             </w:r>
             <w:r>
               <w:rPr>
@@ -2404,10 +2548,16 @@
               <w:tab w:val="right" w:leader="dot" w:pos="8778"/>
             </w:tabs>
             <w:rPr>
+              <w:rFonts w:asciiTheme="minorHAnsi" w:eastAsiaTheme="minorEastAsia" w:hAnsiTheme="minorHAnsi" w:cstheme="minorBidi"/>
               <w:noProof/>
+              <w:kern w:val="2"/>
+              <w:sz w:val="24"/>
+              <w:szCs w:val="24"/>
+              <w:lang w:val="en-US" w:eastAsia="en-US"/>
+              <w14:ligatures w14:val="standardContextual"/>
             </w:rPr>
           </w:pPr>
-          <w:hyperlink w:anchor="_Toc240370164" w:history="1">
+          <w:hyperlink w:anchor="_Toc240373049" w:history="1">
             <w:r>
               <w:rPr>
                 <w:rStyle w:val="Hyperlink"/>
@@ -2434,7 +2584,7 @@
                 <w:noProof/>
                 <w:webHidden/>
               </w:rPr>
-              <w:instrText xml:space="preserve"> PAGEREF _Toc240370164 \h </w:instrText>
+              <w:instrText xml:space="preserve"> PAGEREF _Toc240373049 \h </w:instrText>
             </w:r>
             <w:r>
               <w:rPr>
@@ -2472,10 +2622,16 @@
               <w:tab w:val="right" w:leader="dot" w:pos="8778"/>
             </w:tabs>
             <w:rPr>
+              <w:rFonts w:asciiTheme="minorHAnsi" w:eastAsiaTheme="minorEastAsia" w:hAnsiTheme="minorHAnsi" w:cstheme="minorBidi"/>
               <w:noProof/>
+              <w:kern w:val="2"/>
+              <w:sz w:val="24"/>
+              <w:szCs w:val="24"/>
+              <w:lang w:val="en-US" w:eastAsia="en-US"/>
+              <w14:ligatures w14:val="standardContextual"/>
             </w:rPr>
           </w:pPr>
-          <w:hyperlink w:anchor="_Toc240370165" w:history="1">
+          <w:hyperlink w:anchor="_Toc240373050" w:history="1">
             <w:r>
               <w:rPr>
                 <w:rStyle w:val="Hyperlink"/>
@@ -2502,7 +2658,7 @@
                 <w:noProof/>
                 <w:webHidden/>
               </w:rPr>
-              <w:instrText xml:space="preserve"> PAGEREF _Toc240370165 \h </w:instrText>
+              <w:instrText xml:space="preserve"> PAGEREF _Toc240373050 \h </w:instrText>
             </w:r>
             <w:r>
               <w:rPr>
@@ -2540,10 +2696,16 @@
               <w:tab w:val="right" w:leader="dot" w:pos="8778"/>
             </w:tabs>
             <w:rPr>
+              <w:rFonts w:asciiTheme="minorHAnsi" w:eastAsiaTheme="minorEastAsia" w:hAnsiTheme="minorHAnsi" w:cstheme="minorBidi"/>
               <w:noProof/>
+              <w:kern w:val="2"/>
+              <w:sz w:val="24"/>
+              <w:szCs w:val="24"/>
+              <w:lang w:val="en-US" w:eastAsia="en-US"/>
+              <w14:ligatures w14:val="standardContextual"/>
             </w:rPr>
           </w:pPr>
-          <w:hyperlink w:anchor="_Toc240370166" w:history="1">
+          <w:hyperlink w:anchor="_Toc240373051" w:history="1">
             <w:r>
               <w:rPr>
                 <w:rStyle w:val="Hyperlink"/>
@@ -2570,7 +2732,7 @@
                 <w:noProof/>
                 <w:webHidden/>
               </w:rPr>
-              <w:instrText xml:space="preserve"> PAGEREF _Toc240370166 \h </w:instrText>
+              <w:instrText xml:space="preserve"> PAGEREF _Toc240373051 \h </w:instrText>
             </w:r>
             <w:r>
               <w:rPr>
@@ -2608,10 +2770,16 @@
               <w:tab w:val="right" w:leader="dot" w:pos="8778"/>
             </w:tabs>
             <w:rPr>
+              <w:rFonts w:asciiTheme="minorHAnsi" w:eastAsiaTheme="minorEastAsia" w:hAnsiTheme="minorHAnsi" w:cstheme="minorBidi"/>
               <w:noProof/>
+              <w:kern w:val="2"/>
+              <w:sz w:val="24"/>
+              <w:szCs w:val="24"/>
+              <w:lang w:val="en-US" w:eastAsia="en-US"/>
+              <w14:ligatures w14:val="standardContextual"/>
             </w:rPr>
           </w:pPr>
-          <w:hyperlink w:anchor="_Toc240370167" w:history="1">
+          <w:hyperlink w:anchor="_Toc240373052" w:history="1">
             <w:r>
               <w:rPr>
                 <w:rStyle w:val="Hyperlink"/>
@@ -2638,7 +2806,7 @@
                 <w:noProof/>
                 <w:webHidden/>
               </w:rPr>
-              <w:instrText xml:space="preserve"> PAGEREF _Toc240370167 \h </w:instrText>
+              <w:instrText xml:space="preserve"> PAGEREF _Toc240373052 \h </w:instrText>
             </w:r>
             <w:r>
               <w:rPr>
@@ -2676,10 +2844,16 @@
               <w:tab w:val="right" w:leader="dot" w:pos="8778"/>
             </w:tabs>
             <w:rPr>
+              <w:rFonts w:asciiTheme="minorHAnsi" w:eastAsiaTheme="minorEastAsia" w:hAnsiTheme="minorHAnsi" w:cstheme="minorBidi"/>
               <w:noProof/>
+              <w:kern w:val="2"/>
+              <w:sz w:val="24"/>
+              <w:szCs w:val="24"/>
+              <w:lang w:val="en-US" w:eastAsia="en-US"/>
+              <w14:ligatures w14:val="standardContextual"/>
             </w:rPr>
           </w:pPr>
-          <w:hyperlink w:anchor="_Toc240370168" w:history="1">
+          <w:hyperlink w:anchor="_Toc240373053" w:history="1">
             <w:r>
               <w:rPr>
                 <w:rStyle w:val="Hyperlink"/>
@@ -2706,7 +2880,7 @@
                 <w:noProof/>
                 <w:webHidden/>
               </w:rPr>
-              <w:instrText xml:space="preserve"> PAGEREF _Toc240370168 \h </w:instrText>
+              <w:instrText xml:space="preserve"> PAGEREF _Toc240373053 \h </w:instrText>
             </w:r>
             <w:r>
               <w:rPr>
@@ -2744,10 +2918,16 @@
               <w:tab w:val="right" w:leader="dot" w:pos="8778"/>
             </w:tabs>
             <w:rPr>
+              <w:rFonts w:asciiTheme="minorHAnsi" w:eastAsiaTheme="minorEastAsia" w:hAnsiTheme="minorHAnsi" w:cstheme="minorBidi"/>
               <w:noProof/>
+              <w:kern w:val="2"/>
+              <w:sz w:val="24"/>
+              <w:szCs w:val="24"/>
+              <w:lang w:val="en-US" w:eastAsia="en-US"/>
+              <w14:ligatures w14:val="standardContextual"/>
             </w:rPr>
           </w:pPr>
-          <w:hyperlink w:anchor="_Toc240370169" w:history="1">
+          <w:hyperlink w:anchor="_Toc240373054" w:history="1">
             <w:r>
               <w:rPr>
                 <w:rStyle w:val="Hyperlink"/>
@@ -2774,7 +2954,7 @@
                 <w:noProof/>
                 <w:webHidden/>
               </w:rPr>
-              <w:instrText xml:space="preserve"> PAGEREF _Toc240370169 \h </w:instrText>
+              <w:instrText xml:space="preserve"> PAGEREF _Toc240373054 \h </w:instrText>
             </w:r>
             <w:r>
               <w:rPr>
@@ -2812,10 +2992,16 @@
               <w:tab w:val="right" w:leader="dot" w:pos="8778"/>
             </w:tabs>
             <w:rPr>
+              <w:rFonts w:asciiTheme="minorHAnsi" w:eastAsiaTheme="minorEastAsia" w:hAnsiTheme="minorHAnsi" w:cstheme="minorBidi"/>
               <w:noProof/>
+              <w:kern w:val="2"/>
+              <w:sz w:val="24"/>
+              <w:szCs w:val="24"/>
+              <w:lang w:val="en-US" w:eastAsia="en-US"/>
+              <w14:ligatures w14:val="standardContextual"/>
             </w:rPr>
           </w:pPr>
-          <w:hyperlink w:anchor="_Toc240370170" w:history="1">
+          <w:hyperlink w:anchor="_Toc240373055" w:history="1">
             <w:r>
               <w:rPr>
                 <w:rStyle w:val="Hyperlink"/>
@@ -2857,7 +3043,7 @@
                 <w:noProof/>
                 <w:webHidden/>
               </w:rPr>
-              <w:instrText xml:space="preserve"> PAGEREF _Toc240370170 \h </w:instrText>
+              <w:instrText xml:space="preserve"> PAGEREF _Toc240373055 \h </w:instrText>
             </w:r>
             <w:r>
               <w:rPr>
@@ -2895,10 +3081,16 @@
               <w:tab w:val="right" w:leader="dot" w:pos="8778"/>
             </w:tabs>
             <w:rPr>
+              <w:rFonts w:asciiTheme="minorHAnsi" w:eastAsiaTheme="minorEastAsia" w:hAnsiTheme="minorHAnsi" w:cstheme="minorBidi"/>
               <w:noProof/>
+              <w:kern w:val="2"/>
+              <w:sz w:val="24"/>
+              <w:szCs w:val="24"/>
+              <w:lang w:val="en-US" w:eastAsia="en-US"/>
+              <w14:ligatures w14:val="standardContextual"/>
             </w:rPr>
           </w:pPr>
-          <w:hyperlink w:anchor="_Toc240370171" w:history="1">
+          <w:hyperlink w:anchor="_Toc240373056" w:history="1">
             <w:r>
               <w:rPr>
                 <w:rStyle w:val="Hyperlink"/>
@@ -2925,7 +3117,7 @@
                 <w:noProof/>
                 <w:webHidden/>
               </w:rPr>
-              <w:instrText xml:space="preserve"> PAGEREF _Toc240370171 \h </w:instrText>
+              <w:instrText xml:space="preserve"> PAGEREF _Toc240373056 \h </w:instrText>
             </w:r>
             <w:r>
               <w:rPr>
@@ -2963,10 +3155,16 @@
               <w:tab w:val="right" w:leader="dot" w:pos="8778"/>
             </w:tabs>
             <w:rPr>
+              <w:rFonts w:asciiTheme="minorHAnsi" w:eastAsiaTheme="minorEastAsia" w:hAnsiTheme="minorHAnsi" w:cstheme="minorBidi"/>
               <w:noProof/>
+              <w:kern w:val="2"/>
+              <w:sz w:val="24"/>
+              <w:szCs w:val="24"/>
+              <w:lang w:val="en-US" w:eastAsia="en-US"/>
+              <w14:ligatures w14:val="standardContextual"/>
             </w:rPr>
           </w:pPr>
-          <w:hyperlink w:anchor="_Toc240370172" w:history="1">
+          <w:hyperlink w:anchor="_Toc240373057" w:history="1">
             <w:r>
               <w:rPr>
                 <w:rStyle w:val="Hyperlink"/>
@@ -2993,7 +3191,7 @@
                 <w:noProof/>
                 <w:webHidden/>
               </w:rPr>
-              <w:instrText xml:space="preserve"> PAGEREF _Toc240370172 \h </w:instrText>
+              <w:instrText xml:space="preserve"> PAGEREF _Toc240373057 \h </w:instrText>
             </w:r>
             <w:r>
               <w:rPr>
@@ -3031,10 +3229,16 @@
               <w:tab w:val="right" w:leader="dot" w:pos="8778"/>
             </w:tabs>
             <w:rPr>
+              <w:rFonts w:asciiTheme="minorHAnsi" w:eastAsiaTheme="minorEastAsia" w:hAnsiTheme="minorHAnsi" w:cstheme="minorBidi"/>
               <w:noProof/>
+              <w:kern w:val="2"/>
+              <w:sz w:val="24"/>
+              <w:szCs w:val="24"/>
+              <w:lang w:val="en-US" w:eastAsia="en-US"/>
+              <w14:ligatures w14:val="standardContextual"/>
             </w:rPr>
           </w:pPr>
-          <w:hyperlink w:anchor="_Toc240370173" w:history="1">
+          <w:hyperlink w:anchor="_Toc240373058" w:history="1">
             <w:r>
               <w:rPr>
                 <w:rStyle w:val="Hyperlink"/>
@@ -3061,7 +3265,7 @@
                 <w:noProof/>
                 <w:webHidden/>
               </w:rPr>
-              <w:instrText xml:space="preserve"> PAGEREF _Toc240370173 \h </w:instrText>
+              <w:instrText xml:space="preserve"> PAGEREF _Toc240373058 \h </w:instrText>
             </w:r>
             <w:r>
               <w:rPr>
@@ -3081,7 +3285,7 @@
                 <w:noProof/>
                 <w:webHidden/>
               </w:rPr>
-              <w:t>24</w:t>
+              <w:t>23</w:t>
             </w:r>
             <w:r>
               <w:rPr>
@@ -3099,10 +3303,16 @@
               <w:tab w:val="right" w:leader="dot" w:pos="8778"/>
             </w:tabs>
             <w:rPr>
+              <w:rFonts w:asciiTheme="minorHAnsi" w:eastAsiaTheme="minorEastAsia" w:hAnsiTheme="minorHAnsi" w:cstheme="minorBidi"/>
               <w:noProof/>
+              <w:kern w:val="2"/>
+              <w:sz w:val="24"/>
+              <w:szCs w:val="24"/>
+              <w:lang w:val="en-US" w:eastAsia="en-US"/>
+              <w14:ligatures w14:val="standardContextual"/>
             </w:rPr>
           </w:pPr>
-          <w:hyperlink w:anchor="_Toc240370174" w:history="1">
+          <w:hyperlink w:anchor="_Toc240373059" w:history="1">
             <w:r>
               <w:rPr>
                 <w:rStyle w:val="Hyperlink"/>
@@ -3129,7 +3339,7 @@
                 <w:noProof/>
                 <w:webHidden/>
               </w:rPr>
-              <w:instrText xml:space="preserve"> PAGEREF _Toc240370174 \h </w:instrText>
+              <w:instrText xml:space="preserve"> PAGEREF _Toc240373059 \h </w:instrText>
             </w:r>
             <w:r>
               <w:rPr>
@@ -3167,10 +3377,16 @@
               <w:tab w:val="right" w:leader="dot" w:pos="8778"/>
             </w:tabs>
             <w:rPr>
+              <w:rFonts w:asciiTheme="minorHAnsi" w:eastAsiaTheme="minorEastAsia" w:hAnsiTheme="minorHAnsi" w:cstheme="minorBidi"/>
               <w:noProof/>
+              <w:kern w:val="2"/>
+              <w:sz w:val="24"/>
+              <w:szCs w:val="24"/>
+              <w:lang w:val="en-US" w:eastAsia="en-US"/>
+              <w14:ligatures w14:val="standardContextual"/>
             </w:rPr>
           </w:pPr>
-          <w:hyperlink w:anchor="_Toc240370175" w:history="1">
+          <w:hyperlink w:anchor="_Toc240373060" w:history="1">
             <w:r>
               <w:rPr>
                 <w:rStyle w:val="Hyperlink"/>
@@ -3197,7 +3413,7 @@
                 <w:noProof/>
                 <w:webHidden/>
               </w:rPr>
-              <w:instrText xml:space="preserve"> PAGEREF _Toc240370175 \h </w:instrText>
+              <w:instrText xml:space="preserve"> PAGEREF _Toc240373060 \h </w:instrText>
             </w:r>
             <w:r>
               <w:rPr>
@@ -3235,10 +3451,16 @@
               <w:tab w:val="right" w:leader="dot" w:pos="8778"/>
             </w:tabs>
             <w:rPr>
+              <w:rFonts w:asciiTheme="minorHAnsi" w:eastAsiaTheme="minorEastAsia" w:hAnsiTheme="minorHAnsi" w:cstheme="minorBidi"/>
               <w:noProof/>
+              <w:kern w:val="2"/>
+              <w:sz w:val="24"/>
+              <w:szCs w:val="24"/>
+              <w:lang w:val="en-US" w:eastAsia="en-US"/>
+              <w14:ligatures w14:val="standardContextual"/>
             </w:rPr>
           </w:pPr>
-          <w:hyperlink w:anchor="_Toc240370176" w:history="1">
+          <w:hyperlink w:anchor="_Toc240373061" w:history="1">
             <w:r>
               <w:rPr>
                 <w:rStyle w:val="Hyperlink"/>
@@ -3265,7 +3487,7 @@
                 <w:noProof/>
                 <w:webHidden/>
               </w:rPr>
-              <w:instrText xml:space="preserve"> PAGEREF _Toc240370176 \h </w:instrText>
+              <w:instrText xml:space="preserve"> PAGEREF _Toc240373061 \h </w:instrText>
             </w:r>
             <w:r>
               <w:rPr>
@@ -3303,10 +3525,16 @@
               <w:tab w:val="right" w:leader="dot" w:pos="8778"/>
             </w:tabs>
             <w:rPr>
+              <w:rFonts w:asciiTheme="minorHAnsi" w:eastAsiaTheme="minorEastAsia" w:hAnsiTheme="minorHAnsi" w:cstheme="minorBidi"/>
               <w:noProof/>
+              <w:kern w:val="2"/>
+              <w:sz w:val="24"/>
+              <w:szCs w:val="24"/>
+              <w:lang w:val="en-US" w:eastAsia="en-US"/>
+              <w14:ligatures w14:val="standardContextual"/>
             </w:rPr>
           </w:pPr>
-          <w:hyperlink w:anchor="_Toc240370177" w:history="1">
+          <w:hyperlink w:anchor="_Toc240373062" w:history="1">
             <w:r>
               <w:rPr>
                 <w:rStyle w:val="Hyperlink"/>
@@ -3333,7 +3561,7 @@
                 <w:noProof/>
                 <w:webHidden/>
               </w:rPr>
-              <w:instrText xml:space="preserve"> PAGEREF _Toc240370177 \h </w:instrText>
+              <w:instrText xml:space="preserve"> PAGEREF _Toc240373062 \h </w:instrText>
             </w:r>
             <w:r>
               <w:rPr>
@@ -3371,10 +3599,16 @@
               <w:tab w:val="right" w:leader="dot" w:pos="8778"/>
             </w:tabs>
             <w:rPr>
+              <w:rFonts w:asciiTheme="minorHAnsi" w:eastAsiaTheme="minorEastAsia" w:hAnsiTheme="minorHAnsi" w:cstheme="minorBidi"/>
               <w:noProof/>
+              <w:kern w:val="2"/>
+              <w:sz w:val="24"/>
+              <w:szCs w:val="24"/>
+              <w:lang w:val="en-US" w:eastAsia="en-US"/>
+              <w14:ligatures w14:val="standardContextual"/>
             </w:rPr>
           </w:pPr>
-          <w:hyperlink w:anchor="_Toc240370178" w:history="1">
+          <w:hyperlink w:anchor="_Toc240373063" w:history="1">
             <w:r>
               <w:rPr>
                 <w:rStyle w:val="Hyperlink"/>
@@ -3401,7 +3635,7 @@
                 <w:noProof/>
                 <w:webHidden/>
               </w:rPr>
-              <w:instrText xml:space="preserve"> PAGEREF _Toc240370178 \h </w:instrText>
+              <w:instrText xml:space="preserve"> PAGEREF _Toc240373063 \h </w:instrText>
             </w:r>
             <w:r>
               <w:rPr>
@@ -3439,10 +3673,16 @@
               <w:tab w:val="right" w:leader="dot" w:pos="8778"/>
             </w:tabs>
             <w:rPr>
+              <w:rFonts w:asciiTheme="minorHAnsi" w:eastAsiaTheme="minorEastAsia" w:hAnsiTheme="minorHAnsi" w:cstheme="minorBidi"/>
               <w:noProof/>
+              <w:kern w:val="2"/>
+              <w:sz w:val="24"/>
+              <w:szCs w:val="24"/>
+              <w:lang w:val="en-US" w:eastAsia="en-US"/>
+              <w14:ligatures w14:val="standardContextual"/>
             </w:rPr>
           </w:pPr>
-          <w:hyperlink w:anchor="_Toc240370179" w:history="1">
+          <w:hyperlink w:anchor="_Toc240373064" w:history="1">
             <w:r>
               <w:rPr>
                 <w:rStyle w:val="Hyperlink"/>
@@ -3469,7 +3709,7 @@
                 <w:noProof/>
                 <w:webHidden/>
               </w:rPr>
-              <w:instrText xml:space="preserve"> PAGEREF _Toc240370179 \h </w:instrText>
+              <w:instrText xml:space="preserve"> PAGEREF _Toc240373064 \h </w:instrText>
             </w:r>
             <w:r>
               <w:rPr>
@@ -3507,10 +3747,16 @@
               <w:tab w:val="right" w:leader="dot" w:pos="8778"/>
             </w:tabs>
             <w:rPr>
+              <w:rFonts w:asciiTheme="minorHAnsi" w:eastAsiaTheme="minorEastAsia" w:hAnsiTheme="minorHAnsi" w:cstheme="minorBidi"/>
               <w:noProof/>
+              <w:kern w:val="2"/>
+              <w:sz w:val="24"/>
+              <w:szCs w:val="24"/>
+              <w:lang w:val="en-US" w:eastAsia="en-US"/>
+              <w14:ligatures w14:val="standardContextual"/>
             </w:rPr>
           </w:pPr>
-          <w:hyperlink w:anchor="_Toc240370180" w:history="1">
+          <w:hyperlink w:anchor="_Toc240373065" w:history="1">
             <w:r>
               <w:rPr>
                 <w:rStyle w:val="Hyperlink"/>
@@ -3537,7 +3783,7 @@
                 <w:noProof/>
                 <w:webHidden/>
               </w:rPr>
-              <w:instrText xml:space="preserve"> PAGEREF _Toc240370180 \h </w:instrText>
+              <w:instrText xml:space="preserve"> PAGEREF _Toc240373065 \h </w:instrText>
             </w:r>
             <w:r>
               <w:rPr>
@@ -3575,10 +3821,16 @@
               <w:tab w:val="right" w:leader="dot" w:pos="8778"/>
             </w:tabs>
             <w:rPr>
+              <w:rFonts w:asciiTheme="minorHAnsi" w:eastAsiaTheme="minorEastAsia" w:hAnsiTheme="minorHAnsi" w:cstheme="minorBidi"/>
               <w:noProof/>
+              <w:kern w:val="2"/>
+              <w:sz w:val="24"/>
+              <w:szCs w:val="24"/>
+              <w:lang w:val="en-US" w:eastAsia="en-US"/>
+              <w14:ligatures w14:val="standardContextual"/>
             </w:rPr>
           </w:pPr>
-          <w:hyperlink w:anchor="_Toc240370181" w:history="1">
+          <w:hyperlink w:anchor="_Toc240373066" w:history="1">
             <w:r>
               <w:rPr>
                 <w:rStyle w:val="Hyperlink"/>
@@ -3605,7 +3857,7 @@
                 <w:noProof/>
                 <w:webHidden/>
               </w:rPr>
-              <w:instrText xml:space="preserve"> PAGEREF _Toc240370181 \h </w:instrText>
+              <w:instrText xml:space="preserve"> PAGEREF _Toc240373066 \h </w:instrText>
             </w:r>
             <w:r>
               <w:rPr>
@@ -3643,10 +3895,16 @@
               <w:tab w:val="right" w:leader="dot" w:pos="8778"/>
             </w:tabs>
             <w:rPr>
+              <w:rFonts w:asciiTheme="minorHAnsi" w:eastAsiaTheme="minorEastAsia" w:hAnsiTheme="minorHAnsi" w:cstheme="minorBidi"/>
               <w:noProof/>
+              <w:kern w:val="2"/>
+              <w:sz w:val="24"/>
+              <w:szCs w:val="24"/>
+              <w:lang w:val="en-US" w:eastAsia="en-US"/>
+              <w14:ligatures w14:val="standardContextual"/>
             </w:rPr>
           </w:pPr>
-          <w:hyperlink w:anchor="_Toc240370182" w:history="1">
+          <w:hyperlink w:anchor="_Toc240373067" w:history="1">
             <w:r>
               <w:rPr>
                 <w:rStyle w:val="Hyperlink"/>
@@ -3673,7 +3931,7 @@
                 <w:noProof/>
                 <w:webHidden/>
               </w:rPr>
-              <w:instrText xml:space="preserve"> PAGEREF _Toc240370182 \h </w:instrText>
+              <w:instrText xml:space="preserve"> PAGEREF _Toc240373067 \h </w:instrText>
             </w:r>
             <w:r>
               <w:rPr>
@@ -3711,10 +3969,16 @@
               <w:tab w:val="right" w:leader="dot" w:pos="8778"/>
             </w:tabs>
             <w:rPr>
+              <w:rFonts w:asciiTheme="minorHAnsi" w:eastAsiaTheme="minorEastAsia" w:hAnsiTheme="minorHAnsi" w:cstheme="minorBidi"/>
               <w:noProof/>
+              <w:kern w:val="2"/>
+              <w:sz w:val="24"/>
+              <w:szCs w:val="24"/>
+              <w:lang w:val="en-US" w:eastAsia="en-US"/>
+              <w14:ligatures w14:val="standardContextual"/>
             </w:rPr>
           </w:pPr>
-          <w:hyperlink w:anchor="_Toc240370183" w:history="1">
+          <w:hyperlink w:anchor="_Toc240373068" w:history="1">
             <w:r>
               <w:rPr>
                 <w:rStyle w:val="Hyperlink"/>
@@ -3741,7 +4005,7 @@
                 <w:noProof/>
                 <w:webHidden/>
               </w:rPr>
-              <w:instrText xml:space="preserve"> PAGEREF _Toc240370183 \h </w:instrText>
+              <w:instrText xml:space="preserve"> PAGEREF _Toc240373068 \h </w:instrText>
             </w:r>
             <w:r>
               <w:rPr>
@@ -3779,10 +4043,16 @@
               <w:tab w:val="right" w:leader="dot" w:pos="8778"/>
             </w:tabs>
             <w:rPr>
+              <w:rFonts w:asciiTheme="minorHAnsi" w:eastAsiaTheme="minorEastAsia" w:hAnsiTheme="minorHAnsi" w:cstheme="minorBidi"/>
               <w:noProof/>
+              <w:kern w:val="2"/>
+              <w:sz w:val="24"/>
+              <w:szCs w:val="24"/>
+              <w:lang w:val="en-US" w:eastAsia="en-US"/>
+              <w14:ligatures w14:val="standardContextual"/>
             </w:rPr>
           </w:pPr>
-          <w:hyperlink w:anchor="_Toc240370184" w:history="1">
+          <w:hyperlink w:anchor="_Toc240373069" w:history="1">
             <w:r>
               <w:rPr>
                 <w:rStyle w:val="Hyperlink"/>
@@ -3809,7 +4079,7 @@
                 <w:noProof/>
                 <w:webHidden/>
               </w:rPr>
-              <w:instrText xml:space="preserve"> PAGEREF _Toc240370184 \h </w:instrText>
+              <w:instrText xml:space="preserve"> PAGEREF _Toc240373069 \h </w:instrText>
             </w:r>
             <w:r>
               <w:rPr>
@@ -3847,10 +4117,16 @@
               <w:tab w:val="right" w:leader="dot" w:pos="8778"/>
             </w:tabs>
             <w:rPr>
+              <w:rFonts w:asciiTheme="minorHAnsi" w:eastAsiaTheme="minorEastAsia" w:hAnsiTheme="minorHAnsi" w:cstheme="minorBidi"/>
               <w:noProof/>
+              <w:kern w:val="2"/>
+              <w:sz w:val="24"/>
+              <w:szCs w:val="24"/>
+              <w:lang w:val="en-US" w:eastAsia="en-US"/>
+              <w14:ligatures w14:val="standardContextual"/>
             </w:rPr>
           </w:pPr>
-          <w:hyperlink w:anchor="_Toc240370185" w:history="1">
+          <w:hyperlink w:anchor="_Toc240373070" w:history="1">
             <w:r>
               <w:rPr>
                 <w:rStyle w:val="Hyperlink"/>
@@ -3877,7 +4153,7 @@
                 <w:noProof/>
                 <w:webHidden/>
               </w:rPr>
-              <w:instrText xml:space="preserve"> PAGEREF _Toc240370185 \h </w:instrText>
+              <w:instrText xml:space="preserve"> PAGEREF _Toc240373070 \h </w:instrText>
             </w:r>
             <w:r>
               <w:rPr>
@@ -3915,10 +4191,16 @@
               <w:tab w:val="right" w:leader="dot" w:pos="8778"/>
             </w:tabs>
             <w:rPr>
+              <w:rFonts w:asciiTheme="minorHAnsi" w:eastAsiaTheme="minorEastAsia" w:hAnsiTheme="minorHAnsi" w:cstheme="minorBidi"/>
               <w:noProof/>
+              <w:kern w:val="2"/>
+              <w:sz w:val="24"/>
+              <w:szCs w:val="24"/>
+              <w:lang w:val="en-US" w:eastAsia="en-US"/>
+              <w14:ligatures w14:val="standardContextual"/>
             </w:rPr>
           </w:pPr>
-          <w:hyperlink w:anchor="_Toc240370186" w:history="1">
+          <w:hyperlink w:anchor="_Toc240373071" w:history="1">
             <w:r>
               <w:rPr>
                 <w:rStyle w:val="Hyperlink"/>
@@ -3945,7 +4227,7 @@
                 <w:noProof/>
                 <w:webHidden/>
               </w:rPr>
-              <w:instrText xml:space="preserve"> PAGEREF _Toc240370186 \h </w:instrText>
+              <w:instrText xml:space="preserve"> PAGEREF _Toc240373071 \h </w:instrText>
             </w:r>
             <w:r>
               <w:rPr>
@@ -3983,10 +4265,16 @@
               <w:tab w:val="right" w:leader="dot" w:pos="8778"/>
             </w:tabs>
             <w:rPr>
+              <w:rFonts w:asciiTheme="minorHAnsi" w:eastAsiaTheme="minorEastAsia" w:hAnsiTheme="minorHAnsi" w:cstheme="minorBidi"/>
               <w:noProof/>
+              <w:kern w:val="2"/>
+              <w:sz w:val="24"/>
+              <w:szCs w:val="24"/>
+              <w:lang w:val="en-US" w:eastAsia="en-US"/>
+              <w14:ligatures w14:val="standardContextual"/>
             </w:rPr>
           </w:pPr>
-          <w:hyperlink w:anchor="_Toc240370187" w:history="1">
+          <w:hyperlink w:anchor="_Toc240373072" w:history="1">
             <w:r>
               <w:rPr>
                 <w:rStyle w:val="Hyperlink"/>
@@ -4013,7 +4301,7 @@
                 <w:noProof/>
                 <w:webHidden/>
               </w:rPr>
-              <w:instrText xml:space="preserve"> PAGEREF _Toc240370187 \h </w:instrText>
+              <w:instrText xml:space="preserve"> PAGEREF _Toc240373072 \h </w:instrText>
             </w:r>
             <w:r>
               <w:rPr>
@@ -4051,10 +4339,16 @@
               <w:tab w:val="right" w:leader="dot" w:pos="8778"/>
             </w:tabs>
             <w:rPr>
+              <w:rFonts w:asciiTheme="minorHAnsi" w:eastAsiaTheme="minorEastAsia" w:hAnsiTheme="minorHAnsi" w:cstheme="minorBidi"/>
               <w:noProof/>
+              <w:kern w:val="2"/>
+              <w:sz w:val="24"/>
+              <w:szCs w:val="24"/>
+              <w:lang w:val="en-US" w:eastAsia="en-US"/>
+              <w14:ligatures w14:val="standardContextual"/>
             </w:rPr>
           </w:pPr>
-          <w:hyperlink w:anchor="_Toc240370188" w:history="1">
+          <w:hyperlink w:anchor="_Toc240373073" w:history="1">
             <w:r>
               <w:rPr>
                 <w:rStyle w:val="Hyperlink"/>
@@ -4081,7 +4375,7 @@
                 <w:noProof/>
                 <w:webHidden/>
               </w:rPr>
-              <w:instrText xml:space="preserve"> PAGEREF _Toc240370188 \h </w:instrText>
+              <w:instrText xml:space="preserve"> PAGEREF _Toc240373073 \h </w:instrText>
             </w:r>
             <w:r>
               <w:rPr>
@@ -4119,10 +4413,16 @@
               <w:tab w:val="right" w:leader="dot" w:pos="8778"/>
             </w:tabs>
             <w:rPr>
+              <w:rFonts w:asciiTheme="minorHAnsi" w:eastAsiaTheme="minorEastAsia" w:hAnsiTheme="minorHAnsi" w:cstheme="minorBidi"/>
               <w:noProof/>
+              <w:kern w:val="2"/>
+              <w:sz w:val="24"/>
+              <w:szCs w:val="24"/>
+              <w:lang w:val="en-US" w:eastAsia="en-US"/>
+              <w14:ligatures w14:val="standardContextual"/>
             </w:rPr>
           </w:pPr>
-          <w:hyperlink w:anchor="_Toc240370189" w:history="1">
+          <w:hyperlink w:anchor="_Toc240373074" w:history="1">
             <w:r>
               <w:rPr>
                 <w:rStyle w:val="Hyperlink"/>
@@ -4149,7 +4449,7 @@
                 <w:noProof/>
                 <w:webHidden/>
               </w:rPr>
-              <w:instrText xml:space="preserve"> PAGEREF _Toc240370189 \h </w:instrText>
+              <w:instrText xml:space="preserve"> PAGEREF _Toc240373074 \h </w:instrText>
             </w:r>
             <w:r>
               <w:rPr>
@@ -4187,10 +4487,16 @@
               <w:tab w:val="right" w:leader="dot" w:pos="8778"/>
             </w:tabs>
             <w:rPr>
+              <w:rFonts w:asciiTheme="minorHAnsi" w:eastAsiaTheme="minorEastAsia" w:hAnsiTheme="minorHAnsi" w:cstheme="minorBidi"/>
               <w:noProof/>
+              <w:kern w:val="2"/>
+              <w:sz w:val="24"/>
+              <w:szCs w:val="24"/>
+              <w:lang w:val="en-US" w:eastAsia="en-US"/>
+              <w14:ligatures w14:val="standardContextual"/>
             </w:rPr>
           </w:pPr>
-          <w:hyperlink w:anchor="_Toc240370190" w:history="1">
+          <w:hyperlink w:anchor="_Toc240373075" w:history="1">
             <w:r>
               <w:rPr>
                 <w:rStyle w:val="Hyperlink"/>
@@ -4217,7 +4523,7 @@
                 <w:noProof/>
                 <w:webHidden/>
               </w:rPr>
-              <w:instrText xml:space="preserve"> PAGEREF _Toc240370190 \h </w:instrText>
+              <w:instrText xml:space="preserve"> PAGEREF _Toc240373075 \h </w:instrText>
             </w:r>
             <w:r>
               <w:rPr>
@@ -4255,10 +4561,16 @@
               <w:tab w:val="right" w:leader="dot" w:pos="8778"/>
             </w:tabs>
             <w:rPr>
+              <w:rFonts w:asciiTheme="minorHAnsi" w:eastAsiaTheme="minorEastAsia" w:hAnsiTheme="minorHAnsi" w:cstheme="minorBidi"/>
               <w:noProof/>
+              <w:kern w:val="2"/>
+              <w:sz w:val="24"/>
+              <w:szCs w:val="24"/>
+              <w:lang w:val="en-US" w:eastAsia="en-US"/>
+              <w14:ligatures w14:val="standardContextual"/>
             </w:rPr>
           </w:pPr>
-          <w:hyperlink w:anchor="_Toc240370191" w:history="1">
+          <w:hyperlink w:anchor="_Toc240373076" w:history="1">
             <w:r>
               <w:rPr>
                 <w:rStyle w:val="Hyperlink"/>
@@ -4285,7 +4597,7 @@
                 <w:noProof/>
                 <w:webHidden/>
               </w:rPr>
-              <w:instrText xml:space="preserve"> PAGEREF _Toc240370191 \h </w:instrText>
+              <w:instrText xml:space="preserve"> PAGEREF _Toc240373076 \h </w:instrText>
             </w:r>
             <w:r>
               <w:rPr>
@@ -4323,10 +4635,16 @@
               <w:tab w:val="right" w:leader="dot" w:pos="8778"/>
             </w:tabs>
             <w:rPr>
+              <w:rFonts w:asciiTheme="minorHAnsi" w:eastAsiaTheme="minorEastAsia" w:hAnsiTheme="minorHAnsi" w:cstheme="minorBidi"/>
               <w:noProof/>
+              <w:kern w:val="2"/>
+              <w:sz w:val="24"/>
+              <w:szCs w:val="24"/>
+              <w:lang w:val="en-US" w:eastAsia="en-US"/>
+              <w14:ligatures w14:val="standardContextual"/>
             </w:rPr>
           </w:pPr>
-          <w:hyperlink w:anchor="_Toc240370192" w:history="1">
+          <w:hyperlink w:anchor="_Toc240373077" w:history="1">
             <w:r>
               <w:rPr>
                 <w:rStyle w:val="Hyperlink"/>
@@ -4353,7 +4671,7 @@
                 <w:noProof/>
                 <w:webHidden/>
               </w:rPr>
-              <w:instrText xml:space="preserve"> PAGEREF _Toc240370192 \h </w:instrText>
+              <w:instrText xml:space="preserve"> PAGEREF _Toc240373077 \h </w:instrText>
             </w:r>
             <w:r>
               <w:rPr>
@@ -4391,10 +4709,16 @@
               <w:tab w:val="right" w:leader="dot" w:pos="8778"/>
             </w:tabs>
             <w:rPr>
+              <w:rFonts w:asciiTheme="minorHAnsi" w:eastAsiaTheme="minorEastAsia" w:hAnsiTheme="minorHAnsi" w:cstheme="minorBidi"/>
               <w:noProof/>
+              <w:kern w:val="2"/>
+              <w:sz w:val="24"/>
+              <w:szCs w:val="24"/>
+              <w:lang w:val="en-US" w:eastAsia="en-US"/>
+              <w14:ligatures w14:val="standardContextual"/>
             </w:rPr>
           </w:pPr>
-          <w:hyperlink w:anchor="_Toc240370193" w:history="1">
+          <w:hyperlink w:anchor="_Toc240373078" w:history="1">
             <w:r>
               <w:rPr>
                 <w:rStyle w:val="Hyperlink"/>
@@ -4421,7 +4745,7 @@
                 <w:noProof/>
                 <w:webHidden/>
               </w:rPr>
-              <w:instrText xml:space="preserve"> PAGEREF _Toc240370193 \h </w:instrText>
+              <w:instrText xml:space="preserve"> PAGEREF _Toc240373078 \h </w:instrText>
             </w:r>
             <w:r>
               <w:rPr>
@@ -4459,10 +4783,16 @@
               <w:tab w:val="right" w:leader="dot" w:pos="8778"/>
             </w:tabs>
             <w:rPr>
+              <w:rFonts w:asciiTheme="minorHAnsi" w:eastAsiaTheme="minorEastAsia" w:hAnsiTheme="minorHAnsi" w:cstheme="minorBidi"/>
               <w:noProof/>
+              <w:kern w:val="2"/>
+              <w:sz w:val="24"/>
+              <w:szCs w:val="24"/>
+              <w:lang w:val="en-US" w:eastAsia="en-US"/>
+              <w14:ligatures w14:val="standardContextual"/>
             </w:rPr>
           </w:pPr>
-          <w:hyperlink w:anchor="_Toc240370194" w:history="1">
+          <w:hyperlink w:anchor="_Toc240373079" w:history="1">
             <w:r>
               <w:rPr>
                 <w:rStyle w:val="Hyperlink"/>
@@ -4489,7 +4819,7 @@
                 <w:noProof/>
                 <w:webHidden/>
               </w:rPr>
-              <w:instrText xml:space="preserve"> PAGEREF _Toc240370194 \h </w:instrText>
+              <w:instrText xml:space="preserve"> PAGEREF _Toc240373079 \h </w:instrText>
             </w:r>
             <w:r>
               <w:rPr>
@@ -4531,13 +4861,13 @@
       <w:pPr>
         <w:pStyle w:val="Heading1"/>
       </w:pPr>
-      <w:bookmarkStart w:id="2" w:name="_Toc240370141"/>
-      <w:bookmarkStart w:id="3" w:name="danh-mục-từ-viết-tắt-và-thuật-ngữ"/>
-      <w:bookmarkEnd w:id="1"/>
+      <w:bookmarkStart w:id="2" w:name="danh-mục-từ-viết-tắt-và-thuật-ngữ"/>
+      <w:bookmarkStart w:id="3" w:name="_Toc240373026"/>
+      <w:bookmarkEnd w:id="0"/>
       <w:r>
         <w:t>DANH MỤC TỪ VIẾT TẮT VÀ THUẬT NGỮ</w:t>
       </w:r>
-      <w:bookmarkEnd w:id="2"/>
+      <w:bookmarkEnd w:id="3"/>
     </w:p>
     <w:tbl>
       <w:tblPr>
@@ -6383,13 +6713,13 @@
       <w:pPr>
         <w:pStyle w:val="Heading1"/>
       </w:pPr>
-      <w:bookmarkStart w:id="4" w:name="_Toc240370142"/>
-      <w:bookmarkStart w:id="5" w:name="danh-mục-các-bảng"/>
-      <w:bookmarkEnd w:id="3"/>
+      <w:bookmarkStart w:id="4" w:name="danh-mục-các-bảng"/>
+      <w:bookmarkStart w:id="5" w:name="_Toc240373027"/>
+      <w:bookmarkEnd w:id="2"/>
       <w:r>
         <w:t>DANH MỤC CÁC BẢNG</w:t>
       </w:r>
-      <w:bookmarkEnd w:id="4"/>
+      <w:bookmarkEnd w:id="5"/>
     </w:p>
     <w:tbl>
       <w:tblPr>
@@ -7072,13 +7402,13 @@
       <w:pPr>
         <w:pStyle w:val="Heading1"/>
       </w:pPr>
-      <w:bookmarkStart w:id="6" w:name="_Toc240370143"/>
-      <w:bookmarkStart w:id="7" w:name="danh-mục-các-hình"/>
-      <w:bookmarkEnd w:id="5"/>
+      <w:bookmarkStart w:id="6" w:name="danh-mục-các-hình"/>
+      <w:bookmarkStart w:id="7" w:name="_Toc240373028"/>
+      <w:bookmarkEnd w:id="4"/>
       <w:r>
         <w:t>DANH MỤC CÁC HÌNH</w:t>
       </w:r>
-      <w:bookmarkEnd w:id="6"/>
+      <w:bookmarkEnd w:id="7"/>
     </w:p>
     <w:tbl>
       <w:tblPr>
@@ -7382,13 +7712,13 @@
         </w:sectPr>
       </w:pPr>
       <w:bookmarkStart w:id="8" w:name="lời-mở-đầu"/>
-      <w:bookmarkEnd w:id="7"/>
+      <w:bookmarkEnd w:id="6"/>
     </w:p>
     <w:p>
       <w:pPr>
         <w:pStyle w:val="Heading1"/>
       </w:pPr>
-      <w:bookmarkStart w:id="9" w:name="_Toc240370144"/>
+      <w:bookmarkStart w:id="9" w:name="_Toc240373029"/>
       <w:r>
         <w:lastRenderedPageBreak/>
         <w:t>LỜI MỞ ĐẦU</w:t>
@@ -7473,12 +7803,12 @@
       <w:pPr>
         <w:pStyle w:val="Heading3"/>
       </w:pPr>
-      <w:bookmarkStart w:id="10" w:name="_Toc240370145"/>
-      <w:bookmarkStart w:id="11" w:name="thông-tin-đề-tài-chính-thức"/>
+      <w:bookmarkStart w:id="10" w:name="thông-tin-đề-tài-chính-thức"/>
+      <w:bookmarkStart w:id="11" w:name="_Toc240373030"/>
       <w:r>
         <w:t>Thông tin đề tài chính thức</w:t>
       </w:r>
-      <w:bookmarkEnd w:id="10"/>
+      <w:bookmarkEnd w:id="11"/>
     </w:p>
     <w:p>
       <w:pPr>
@@ -7587,13 +7917,13 @@
       <w:pPr>
         <w:pStyle w:val="Heading3"/>
       </w:pPr>
-      <w:bookmarkStart w:id="12" w:name="_Toc240370146"/>
-      <w:bookmarkStart w:id="13" w:name="Xf6b985d06e86b68dd2de5566ba01dd2ddc40424"/>
-      <w:bookmarkEnd w:id="11"/>
+      <w:bookmarkStart w:id="12" w:name="Xf6b985d06e86b68dd2de5566ba01dd2ddc40424"/>
+      <w:bookmarkStart w:id="13" w:name="_Toc240373031"/>
+      <w:bookmarkEnd w:id="10"/>
       <w:r>
         <w:t>Thống nhất ngữ nghĩa: “văn bản” (document) so với “hình ảnh” (image)</w:t>
       </w:r>
-      <w:bookmarkEnd w:id="12"/>
+      <w:bookmarkEnd w:id="13"/>
     </w:p>
     <w:p>
       <w:pPr>
@@ -7763,26 +8093,26 @@
       <w:pPr>
         <w:pStyle w:val="Heading1"/>
       </w:pPr>
-      <w:bookmarkStart w:id="14" w:name="_Toc240370147"/>
-      <w:bookmarkStart w:id="15" w:name="X73852470e9fc27a6dee2a641dd4c49aad269013"/>
+      <w:bookmarkStart w:id="14" w:name="X73852470e9fc27a6dee2a641dd4c49aad269013"/>
+      <w:bookmarkStart w:id="15" w:name="_Toc240373032"/>
       <w:bookmarkEnd w:id="8"/>
-      <w:bookmarkEnd w:id="13"/>
+      <w:bookmarkEnd w:id="12"/>
       <w:r>
         <w:lastRenderedPageBreak/>
         <w:t>CHƯƠNG 1. CƠ SỞ LÝ THUYẾT KỸ THUẬT THỦY VÂN SỐ</w:t>
       </w:r>
-      <w:bookmarkEnd w:id="14"/>
+      <w:bookmarkEnd w:id="15"/>
     </w:p>
     <w:p>
       <w:pPr>
         <w:pStyle w:val="Heading2"/>
       </w:pPr>
-      <w:bookmarkStart w:id="16" w:name="_Toc240370148"/>
-      <w:bookmarkStart w:id="17" w:name="khái-niệm-và-định-nghĩa-chuẩn-mực"/>
+      <w:bookmarkStart w:id="16" w:name="khái-niệm-và-định-nghĩa-chuẩn-mực"/>
+      <w:bookmarkStart w:id="17" w:name="_Toc240373033"/>
       <w:r>
         <w:t>1.1. Khái niệm và định nghĩa chuẩn mực</w:t>
       </w:r>
-      <w:bookmarkEnd w:id="16"/>
+      <w:bookmarkEnd w:id="17"/>
     </w:p>
     <w:p>
       <w:pPr>
@@ -7884,24 +8214,24 @@
       <w:pPr>
         <w:pStyle w:val="Heading2"/>
       </w:pPr>
-      <w:bookmarkStart w:id="18" w:name="_Toc240370149"/>
-      <w:bookmarkStart w:id="19" w:name="phân-loại-kỹ-thuật-thủy-vân-số"/>
-      <w:bookmarkEnd w:id="17"/>
+      <w:bookmarkStart w:id="18" w:name="phân-loại-kỹ-thuật-thủy-vân-số"/>
+      <w:bookmarkStart w:id="19" w:name="_Toc240373034"/>
+      <w:bookmarkEnd w:id="16"/>
       <w:r>
         <w:t>1.2. Phân loại kỹ thuật thủy vân số</w:t>
       </w:r>
-      <w:bookmarkEnd w:id="18"/>
+      <w:bookmarkEnd w:id="19"/>
     </w:p>
     <w:p>
       <w:pPr>
         <w:pStyle w:val="Heading3"/>
       </w:pPr>
-      <w:bookmarkStart w:id="20" w:name="_Toc240370150"/>
-      <w:bookmarkStart w:id="21" w:name="X344359457ba084d15006b2faef4503914a46c44"/>
+      <w:bookmarkStart w:id="20" w:name="X344359457ba084d15006b2faef4503914a46c44"/>
+      <w:bookmarkStart w:id="21" w:name="_Toc240373035"/>
       <w:r>
         <w:t>1.2.1. Phân loại theo miền nhúng (embedding domain)</w:t>
       </w:r>
-      <w:bookmarkEnd w:id="20"/>
+      <w:bookmarkEnd w:id="21"/>
     </w:p>
     <w:p>
       <w:pPr>
@@ -8108,13 +8438,13 @@
       <w:pPr>
         <w:pStyle w:val="Heading3"/>
       </w:pPr>
-      <w:bookmarkStart w:id="22" w:name="_Toc240370151"/>
-      <w:bookmarkStart w:id="23" w:name="Xdf8795802ccd7c55605228d4c2bb9b0a6052b25"/>
-      <w:bookmarkEnd w:id="21"/>
+      <w:bookmarkStart w:id="22" w:name="Xdf8795802ccd7c55605228d4c2bb9b0a6052b25"/>
+      <w:bookmarkStart w:id="23" w:name="_Toc240373036"/>
+      <w:bookmarkEnd w:id="20"/>
       <w:r>
         <w:t>1.2.2. Phân loại theo mức độ bền vững và mục đích sử dụng</w:t>
       </w:r>
-      <w:bookmarkEnd w:id="22"/>
+      <w:bookmarkEnd w:id="23"/>
     </w:p>
     <w:p>
       <w:pPr>
@@ -8283,14 +8613,14 @@
       <w:pPr>
         <w:pStyle w:val="Heading2"/>
       </w:pPr>
-      <w:bookmarkStart w:id="24" w:name="_Toc240370152"/>
-      <w:bookmarkStart w:id="25" w:name="Xe512d1925d137a9b04feca38113dfa82c8b8562"/>
-      <w:bookmarkEnd w:id="19"/>
-      <w:bookmarkEnd w:id="23"/>
+      <w:bookmarkStart w:id="24" w:name="Xe512d1925d137a9b04feca38113dfa82c8b8562"/>
+      <w:bookmarkStart w:id="25" w:name="_Toc240373037"/>
+      <w:bookmarkEnd w:id="18"/>
+      <w:bookmarkEnd w:id="22"/>
       <w:r>
         <w:t>1.3. Tam giác đánh đổi cốt lõi (fundamental trade-off triangle)</w:t>
       </w:r>
-      <w:bookmarkEnd w:id="24"/>
+      <w:bookmarkEnd w:id="25"/>
     </w:p>
     <w:p>
       <w:pPr>
@@ -8444,13 +8774,13 @@
       <w:pPr>
         <w:pStyle w:val="Heading2"/>
       </w:pPr>
-      <w:bookmarkStart w:id="26" w:name="_Toc240370153"/>
-      <w:bookmarkStart w:id="27" w:name="X0749a89c140d67f1fd6e10e019df7faaf4f2896"/>
-      <w:bookmarkEnd w:id="25"/>
+      <w:bookmarkStart w:id="26" w:name="X0749a89c140d67f1fd6e10e019df7faaf4f2896"/>
+      <w:bookmarkStart w:id="27" w:name="_Toc240373038"/>
+      <w:bookmarkEnd w:id="24"/>
       <w:r>
         <w:t>1.4. Kỹ thuật điều chế chỉ số lượng tử hóa (QIM - Quantization Index Modulation)</w:t>
       </w:r>
-      <w:bookmarkEnd w:id="26"/>
+      <w:bookmarkEnd w:id="27"/>
     </w:p>
     <w:p>
       <w:pPr>
@@ -8738,14 +9068,14 @@
       <w:pPr>
         <w:pStyle w:val="Heading1"/>
       </w:pPr>
-      <w:bookmarkStart w:id="28" w:name="_Toc240370154"/>
-      <w:bookmarkStart w:id="29" w:name="Xd94a0078451e1b9a5730e25f1ec289ca206f45a"/>
-      <w:bookmarkEnd w:id="15"/>
-      <w:bookmarkEnd w:id="27"/>
+      <w:bookmarkStart w:id="28" w:name="Xd94a0078451e1b9a5730e25f1ec289ca206f45a"/>
+      <w:bookmarkStart w:id="29" w:name="_Toc240373039"/>
+      <w:bookmarkEnd w:id="14"/>
+      <w:bookmarkEnd w:id="26"/>
       <w:r>
         <w:t>CHƯƠNG 2. ỨNG DỤNG THỦY VÂN TRONG TRUY VẾT VÀ TOÀN VẸN HÌNH ẢNH</w:t>
       </w:r>
-      <w:bookmarkEnd w:id="28"/>
+      <w:bookmarkEnd w:id="29"/>
     </w:p>
     <w:p>
       <w:pPr>
@@ -8783,23 +9113,23 @@
       <w:pPr>
         <w:pStyle w:val="Heading2"/>
       </w:pPr>
-      <w:bookmarkStart w:id="30" w:name="_Toc240370155"/>
-      <w:bookmarkStart w:id="31" w:name="X309070127ac9b595d19338b9992d494ea1f4902"/>
+      <w:bookmarkStart w:id="30" w:name="X309070127ac9b595d19338b9992d494ea1f4902"/>
+      <w:bookmarkStart w:id="31" w:name="_Toc240373040"/>
       <w:r>
         <w:t>2.1. Bài toán A: truy vết nguồn phát hành (traitor tracing)</w:t>
       </w:r>
-      <w:bookmarkEnd w:id="30"/>
+      <w:bookmarkEnd w:id="31"/>
     </w:p>
     <w:p>
       <w:pPr>
         <w:pStyle w:val="Heading3"/>
       </w:pPr>
-      <w:bookmarkStart w:id="32" w:name="_Toc240370156"/>
-      <w:bookmarkStart w:id="33" w:name="cấu-trúc-payload-thực-tế-trong-mã-nguồn"/>
+      <w:bookmarkStart w:id="32" w:name="cấu-trúc-payload-thực-tế-trong-mã-nguồn"/>
+      <w:bookmarkStart w:id="33" w:name="_Toc240373041"/>
       <w:r>
         <w:t>2.1.1. Cấu trúc payload thực tế trong mã nguồn</w:t>
       </w:r>
-      <w:bookmarkEnd w:id="32"/>
+      <w:bookmarkEnd w:id="33"/>
     </w:p>
     <w:p>
       <w:pPr>
@@ -9335,13 +9665,13 @@
       <w:pPr>
         <w:pStyle w:val="Heading3"/>
       </w:pPr>
-      <w:bookmarkStart w:id="34" w:name="_Toc240370157"/>
-      <w:bookmarkStart w:id="35" w:name="X1603ecaffd529b8f98fee9a64474d35d4c0fe76"/>
-      <w:bookmarkEnd w:id="33"/>
+      <w:bookmarkStart w:id="34" w:name="X1603ecaffd529b8f98fee9a64474d35d4c0fe76"/>
+      <w:bookmarkStart w:id="35" w:name="_Toc240373042"/>
+      <w:bookmarkEnd w:id="32"/>
       <w:r>
         <w:t>2.1.2. Chuỗi xử lý nhúng và trích xuất thủy vân DWT-DCT-QIM</w:t>
       </w:r>
-      <w:bookmarkEnd w:id="34"/>
+      <w:bookmarkEnd w:id="35"/>
     </w:p>
     <w:p>
       <w:pPr>
@@ -9590,13 +9920,13 @@
       <w:pPr>
         <w:pStyle w:val="Heading3"/>
       </w:pPr>
-      <w:bookmarkStart w:id="36" w:name="_Toc240370158"/>
-      <w:bookmarkStart w:id="37" w:name="X8f21b7f9b4ca7a89c516ce99c97d095ae0a7c9b"/>
-      <w:bookmarkEnd w:id="35"/>
+      <w:bookmarkStart w:id="36" w:name="X8f21b7f9b4ca7a89c516ce99c97d095ae0a7c9b"/>
+      <w:bookmarkStart w:id="37" w:name="_Toc240373043"/>
+      <w:bookmarkEnd w:id="34"/>
       <w:r>
         <w:t>2.1.3. Số liệu thực nghiệm đo lường thật từ benchmark V1</w:t>
       </w:r>
-      <w:bookmarkEnd w:id="36"/>
+      <w:bookmarkEnd w:id="37"/>
     </w:p>
     <w:p>
       <w:pPr>
@@ -9800,13 +10130,13 @@
       <w:pPr>
         <w:pStyle w:val="Heading3"/>
       </w:pPr>
-      <w:bookmarkStart w:id="38" w:name="_Toc240370159"/>
-      <w:bookmarkStart w:id="39" w:name="giới-hạn-kỹ-thuật-đã-nhận-diện"/>
-      <w:bookmarkEnd w:id="37"/>
+      <w:bookmarkStart w:id="38" w:name="giới-hạn-kỹ-thuật-đã-nhận-diện"/>
+      <w:bookmarkStart w:id="39" w:name="_Toc240373044"/>
+      <w:bookmarkEnd w:id="36"/>
       <w:r>
         <w:t>2.1.4. Giới hạn kỹ thuật đã nhận diện</w:t>
       </w:r>
-      <w:bookmarkEnd w:id="38"/>
+      <w:bookmarkEnd w:id="39"/>
     </w:p>
     <w:p>
       <w:pPr>
@@ -10113,25 +10443,25 @@
       <w:pPr>
         <w:pStyle w:val="Heading2"/>
       </w:pPr>
-      <w:bookmarkStart w:id="40" w:name="_Toc240370160"/>
-      <w:bookmarkStart w:id="41" w:name="X977abff2802fd0052c7bb64c3dd76a7236a21c1"/>
-      <w:bookmarkEnd w:id="31"/>
-      <w:bookmarkEnd w:id="39"/>
+      <w:bookmarkStart w:id="40" w:name="X977abff2802fd0052c7bb64c3dd76a7236a21c1"/>
+      <w:bookmarkStart w:id="41" w:name="_Toc240373045"/>
+      <w:bookmarkEnd w:id="30"/>
+      <w:bookmarkEnd w:id="38"/>
       <w:r>
         <w:t>2.2. Bài toán B: thủy vân bán dễ vỡ phát hiện và định vị sửa đổi (tamper localization)</w:t>
       </w:r>
-      <w:bookmarkEnd w:id="40"/>
+      <w:bookmarkEnd w:id="41"/>
     </w:p>
     <w:p>
       <w:pPr>
         <w:pStyle w:val="Heading3"/>
       </w:pPr>
-      <w:bookmarkStart w:id="42" w:name="_Toc240370161"/>
-      <w:bookmarkStart w:id="43" w:name="kiến-trúc-thuật-toán-bán-dễ-vỡ-phân-tán"/>
+      <w:bookmarkStart w:id="42" w:name="kiến-trúc-thuật-toán-bán-dễ-vỡ-phân-tán"/>
+      <w:bookmarkStart w:id="43" w:name="_Toc240373046"/>
       <w:r>
         <w:t>2.2.1. Kiến trúc thuật toán bán dễ vỡ phân tán</w:t>
       </w:r>
-      <w:bookmarkEnd w:id="42"/>
+      <w:bookmarkEnd w:id="43"/>
     </w:p>
     <w:p>
       <w:pPr>
@@ -10712,13 +11042,13 @@
       <w:pPr>
         <w:pStyle w:val="Heading3"/>
       </w:pPr>
-      <w:bookmarkStart w:id="44" w:name="_Toc240370162"/>
-      <w:bookmarkStart w:id="45" w:name="cơ-chế-xác-minh-và-định-vị"/>
-      <w:bookmarkEnd w:id="43"/>
+      <w:bookmarkStart w:id="44" w:name="cơ-chế-xác-minh-và-định-vị"/>
+      <w:bookmarkStart w:id="45" w:name="_Toc240373047"/>
+      <w:bookmarkEnd w:id="42"/>
       <w:r>
         <w:t>2.2.2. Cơ chế xác minh và định vị</w:t>
       </w:r>
-      <w:bookmarkEnd w:id="44"/>
+      <w:bookmarkEnd w:id="45"/>
     </w:p>
     <w:p>
       <w:pPr>
@@ -10766,13 +11096,13 @@
       <w:pPr>
         <w:pStyle w:val="Heading3"/>
       </w:pPr>
-      <w:bookmarkStart w:id="46" w:name="_Toc240370163"/>
-      <w:bookmarkStart w:id="47" w:name="số-liệu-đo-lường-thực-nghiệm-thật"/>
-      <w:bookmarkEnd w:id="45"/>
+      <w:bookmarkStart w:id="46" w:name="số-liệu-đo-lường-thực-nghiệm-thật"/>
+      <w:bookmarkStart w:id="47" w:name="_Toc240373048"/>
+      <w:bookmarkEnd w:id="44"/>
       <w:r>
         <w:t>2.2.3. Số liệu đo lường thực nghiệm thật</w:t>
       </w:r>
-      <w:bookmarkEnd w:id="46"/>
+      <w:bookmarkEnd w:id="47"/>
     </w:p>
     <w:p>
       <w:pPr>
@@ -11169,13 +11499,13 @@
       <w:pPr>
         <w:pStyle w:val="Heading3"/>
       </w:pPr>
-      <w:bookmarkStart w:id="48" w:name="_Toc240370164"/>
-      <w:bookmarkStart w:id="49" w:name="Xf9dc94f62311947b9e6b5d307672673c0cae5ce"/>
-      <w:bookmarkEnd w:id="47"/>
+      <w:bookmarkStart w:id="48" w:name="Xf9dc94f62311947b9e6b5d307672673c0cae5ce"/>
+      <w:bookmarkStart w:id="49" w:name="_Toc240373049"/>
+      <w:bookmarkEnd w:id="46"/>
       <w:r>
         <w:t>2.2.4. Giải thích nguyên nhân kỹ thuật và giới hạn thực nghiệm</w:t>
       </w:r>
-      <w:bookmarkEnd w:id="48"/>
+      <w:bookmarkEnd w:id="49"/>
     </w:p>
     <w:p>
       <w:pPr>
@@ -11337,37 +11667,37 @@
       <w:pPr>
         <w:pStyle w:val="Heading1"/>
       </w:pPr>
-      <w:bookmarkStart w:id="50" w:name="_Toc240370165"/>
-      <w:bookmarkStart w:id="51" w:name="X93dc4866f1b906f867f417f7358c62b2eea4247"/>
-      <w:bookmarkEnd w:id="29"/>
-      <w:bookmarkEnd w:id="41"/>
-      <w:bookmarkEnd w:id="49"/>
+      <w:bookmarkStart w:id="50" w:name="X93dc4866f1b906f867f417f7358c62b2eea4247"/>
+      <w:bookmarkStart w:id="51" w:name="_Toc240373050"/>
+      <w:bookmarkEnd w:id="28"/>
+      <w:bookmarkEnd w:id="40"/>
+      <w:bookmarkEnd w:id="48"/>
       <w:r>
         <w:t>CHƯƠNG 3. ỨNG DỤNG CHỮ KÝ SỐ VÀ SO SÁNH CÁC KỸ THUẬT TOÀN VẸN</w:t>
       </w:r>
-      <w:bookmarkEnd w:id="50"/>
+      <w:bookmarkEnd w:id="51"/>
     </w:p>
     <w:p>
       <w:pPr>
         <w:pStyle w:val="Heading2"/>
       </w:pPr>
-      <w:bookmarkStart w:id="52" w:name="_Toc240370166"/>
-      <w:bookmarkStart w:id="53" w:name="X77bb241011ad2959aacc0c18a6152971fec02b5"/>
+      <w:bookmarkStart w:id="52" w:name="X77bb241011ad2959aacc0c18a6152971fec02b5"/>
+      <w:bookmarkStart w:id="53" w:name="_Toc240373051"/>
       <w:r>
         <w:t>3.1. Ứng dụng chữ ký số trong bảo vệ thông tin truy vết</w:t>
       </w:r>
-      <w:bookmarkEnd w:id="52"/>
+      <w:bookmarkEnd w:id="53"/>
     </w:p>
     <w:p>
       <w:pPr>
         <w:pStyle w:val="Heading3"/>
       </w:pPr>
-      <w:bookmarkStart w:id="54" w:name="_Toc240370167"/>
-      <w:bookmarkStart w:id="55" w:name="X93f43f39a15f2b2e9f1ab28406ed334a7faa634"/>
+      <w:bookmarkStart w:id="54" w:name="X93f43f39a15f2b2e9f1ab28406ed334a7faa634"/>
+      <w:bookmarkStart w:id="55" w:name="_Toc240373052"/>
       <w:r>
         <w:t>3.1.1. Phân định ba cấp độ kiến trúc, không được đánh đồng với nhau</w:t>
       </w:r>
-      <w:bookmarkEnd w:id="54"/>
+      <w:bookmarkEnd w:id="55"/>
     </w:p>
     <w:p>
       <w:pPr>
@@ -11631,13 +11961,13 @@
       <w:pPr>
         <w:pStyle w:val="Heading3"/>
       </w:pPr>
-      <w:bookmarkStart w:id="56" w:name="_Toc240370168"/>
-      <w:bookmarkStart w:id="57" w:name="Xa8597b961700287943beef87fac9e21cd92c65e"/>
-      <w:bookmarkEnd w:id="55"/>
+      <w:bookmarkStart w:id="56" w:name="Xa8597b961700287943beef87fac9e21cd92c65e"/>
+      <w:bookmarkStart w:id="57" w:name="_Toc240373053"/>
+      <w:bookmarkEnd w:id="54"/>
       <w:r>
         <w:t>3.1.2. Kiến trúc hồ sơ toàn vẹn có chữ ký (signed manifest)</w:t>
       </w:r>
-      <w:bookmarkEnd w:id="56"/>
+      <w:bookmarkEnd w:id="57"/>
     </w:p>
     <w:p>
       <w:pPr>
@@ -12369,13 +12699,13 @@
       <w:pPr>
         <w:pStyle w:val="Heading3"/>
       </w:pPr>
-      <w:bookmarkStart w:id="58" w:name="_Toc240370169"/>
-      <w:bookmarkStart w:id="59" w:name="Xfd66fde48663576034bdac7bc1475bfd74472d4"/>
-      <w:bookmarkEnd w:id="57"/>
+      <w:bookmarkStart w:id="58" w:name="Xfd66fde48663576034bdac7bc1475bfd74472d4"/>
+      <w:bookmarkStart w:id="59" w:name="_Toc240373054"/>
+      <w:bookmarkEnd w:id="56"/>
       <w:r>
         <w:t>3.1.3. Giải quyết “Mâu thuẫn giữa thủy vân số và chữ ký số”</w:t>
       </w:r>
-      <w:bookmarkEnd w:id="58"/>
+      <w:bookmarkEnd w:id="59"/>
     </w:p>
     <w:p>
       <w:pPr>
@@ -12988,9 +13318,9 @@
       <w:pPr>
         <w:pStyle w:val="Heading3"/>
       </w:pPr>
-      <w:bookmarkStart w:id="60" w:name="_Toc240370170"/>
-      <w:bookmarkStart w:id="61" w:name="X0312fa8f0b5c3bf9d42aa6b97dc89cc58c0c60c"/>
-      <w:bookmarkEnd w:id="59"/>
+      <w:bookmarkStart w:id="60" w:name="X0312fa8f0b5c3bf9d42aa6b97dc89cc58c0c60c"/>
+      <w:bookmarkStart w:id="61" w:name="_Toc240373055"/>
+      <w:bookmarkEnd w:id="58"/>
       <w:r>
         <w:t>3.1.4. Minh bạch ngữ nghĩa trạng thái trên production (</w:t>
       </w:r>
@@ -13003,7 +13333,7 @@
       <w:r>
         <w:t>)</w:t>
       </w:r>
-      <w:bookmarkEnd w:id="60"/>
+      <w:bookmarkEnd w:id="61"/>
     </w:p>
     <w:p>
       <w:pPr>
@@ -13242,15 +13572,15 @@
       <w:pPr>
         <w:pStyle w:val="Heading2"/>
       </w:pPr>
-      <w:bookmarkStart w:id="62" w:name="_Toc240370171"/>
-      <w:bookmarkStart w:id="63" w:name="X3d625d17d1f0504f98071dc287a38f8831705d6"/>
-      <w:bookmarkEnd w:id="53"/>
-      <w:bookmarkEnd w:id="61"/>
+      <w:bookmarkStart w:id="62" w:name="X3d625d17d1f0504f98071dc287a38f8831705d6"/>
+      <w:bookmarkStart w:id="63" w:name="_Toc240373056"/>
+      <w:bookmarkEnd w:id="52"/>
+      <w:bookmarkEnd w:id="60"/>
       <w:r>
         <w:lastRenderedPageBreak/>
         <w:t>3.2. So sánh với các kỹ thuật xác minh bảo vệ tính toàn vẹn khác</w:t>
       </w:r>
-      <w:bookmarkEnd w:id="62"/>
+      <w:bookmarkEnd w:id="63"/>
     </w:p>
     <w:p>
       <w:pPr>
@@ -13360,12 +13690,12 @@
       <w:pPr>
         <w:pStyle w:val="Heading3"/>
       </w:pPr>
-      <w:bookmarkStart w:id="64" w:name="_Toc240370172"/>
-      <w:bookmarkStart w:id="65" w:name="X731dd5071b32ee17cfdf115e5fb1cc74bfa1fef"/>
+      <w:bookmarkStart w:id="64" w:name="X731dd5071b32ee17cfdf115e5fb1cc74bfa1fef"/>
+      <w:bookmarkStart w:id="65" w:name="_Toc240373057"/>
       <w:r>
         <w:t>3.2.1. Ma trận so sánh: bảy tiêu chí trên sáu kỹ thuật</w:t>
       </w:r>
-      <w:bookmarkEnd w:id="64"/>
+      <w:bookmarkEnd w:id="65"/>
     </w:p>
     <w:p>
       <w:pPr>
@@ -14300,13 +14630,13 @@
       <w:pPr>
         <w:pStyle w:val="Heading3"/>
       </w:pPr>
-      <w:bookmarkStart w:id="66" w:name="_Toc240370173"/>
-      <w:bookmarkStart w:id="67" w:name="Xe7db50e2b15f38fb2460a20c566d37b6de66f7f"/>
-      <w:bookmarkEnd w:id="65"/>
+      <w:bookmarkStart w:id="66" w:name="Xe7db50e2b15f38fb2460a20c566d37b6de66f7f"/>
+      <w:bookmarkStart w:id="67" w:name="_Toc240373058"/>
+      <w:bookmarkEnd w:id="64"/>
       <w:r>
         <w:t>3.2.2. Phân tích tương phản chuyên sâu giữa các cặp kỹ thuật</w:t>
       </w:r>
-      <w:bookmarkEnd w:id="66"/>
+      <w:bookmarkEnd w:id="67"/>
     </w:p>
     <w:p>
       <w:pPr>
@@ -14456,38 +14786,38 @@
       <w:pPr>
         <w:pStyle w:val="Heading1"/>
       </w:pPr>
-      <w:bookmarkStart w:id="70" w:name="_Toc240370174"/>
-      <w:bookmarkStart w:id="71" w:name="X9841bc93db205883626cadedc2ca5d988da25b0"/>
-      <w:bookmarkEnd w:id="51"/>
-      <w:bookmarkEnd w:id="63"/>
-      <w:bookmarkEnd w:id="67"/>
+      <w:bookmarkStart w:id="70" w:name="X9841bc93db205883626cadedc2ca5d988da25b0"/>
+      <w:bookmarkStart w:id="71" w:name="_Toc240373059"/>
+      <w:bookmarkEnd w:id="50"/>
+      <w:bookmarkEnd w:id="62"/>
+      <w:bookmarkEnd w:id="66"/>
       <w:bookmarkEnd w:id="69"/>
       <w:r>
         <w:t>CHƯƠNG 4. HỆ THỐNG SPLITBIND: XÂY DỰNG, THỰC NGHIỆM VÀ ĐỀ XUẤT</w:t>
       </w:r>
-      <w:bookmarkEnd w:id="70"/>
+      <w:bookmarkEnd w:id="71"/>
     </w:p>
     <w:p>
       <w:pPr>
         <w:pStyle w:val="Heading2"/>
       </w:pPr>
-      <w:bookmarkStart w:id="72" w:name="_Toc240370175"/>
-      <w:bookmarkStart w:id="73" w:name="kiến-trúc-và-cách-xây-dựng-hệ-thống"/>
+      <w:bookmarkStart w:id="72" w:name="kiến-trúc-và-cách-xây-dựng-hệ-thống"/>
+      <w:bookmarkStart w:id="73" w:name="_Toc240373060"/>
       <w:r>
         <w:t>4.1. Kiến trúc và cách xây dựng hệ thống</w:t>
       </w:r>
-      <w:bookmarkEnd w:id="72"/>
+      <w:bookmarkEnd w:id="73"/>
     </w:p>
     <w:p>
       <w:pPr>
         <w:pStyle w:val="Heading3"/>
       </w:pPr>
-      <w:bookmarkStart w:id="74" w:name="_Toc240370176"/>
-      <w:bookmarkStart w:id="75" w:name="sơ-đồ-kiến-trúc-hệ-thống-splitbind"/>
+      <w:bookmarkStart w:id="74" w:name="sơ-đồ-kiến-trúc-hệ-thống-splitbind"/>
+      <w:bookmarkStart w:id="75" w:name="_Toc240373061"/>
       <w:r>
         <w:t>4.1.1. Sơ đồ kiến trúc hệ thống SplitBind</w:t>
       </w:r>
-      <w:bookmarkEnd w:id="74"/>
+      <w:bookmarkEnd w:id="75"/>
     </w:p>
     <w:p>
       <w:pPr>
@@ -15171,13 +15501,13 @@
       <w:pPr>
         <w:pStyle w:val="Heading3"/>
       </w:pPr>
-      <w:bookmarkStart w:id="76" w:name="_Toc240370177"/>
-      <w:bookmarkStart w:id="77" w:name="hai-quy-trình-nghiệp-vụ-cốt-lõi"/>
-      <w:bookmarkEnd w:id="75"/>
+      <w:bookmarkStart w:id="76" w:name="hai-quy-trình-nghiệp-vụ-cốt-lõi"/>
+      <w:bookmarkStart w:id="77" w:name="_Toc240373062"/>
+      <w:bookmarkEnd w:id="74"/>
       <w:r>
         <w:t>4.1.2. Hai quy trình nghiệp vụ cốt lõi</w:t>
       </w:r>
-      <w:bookmarkEnd w:id="76"/>
+      <w:bookmarkEnd w:id="77"/>
     </w:p>
     <w:p>
       <w:pPr>
@@ -15645,15 +15975,15 @@
       <w:pPr>
         <w:pStyle w:val="Heading2"/>
       </w:pPr>
-      <w:bookmarkStart w:id="78" w:name="_Toc240370178"/>
-      <w:bookmarkStart w:id="79" w:name="kết-quả-thực-nghiệm"/>
-      <w:bookmarkEnd w:id="73"/>
-      <w:bookmarkEnd w:id="77"/>
+      <w:bookmarkStart w:id="78" w:name="kết-quả-thực-nghiệm"/>
+      <w:bookmarkStart w:id="79" w:name="_Toc240373063"/>
+      <w:bookmarkEnd w:id="72"/>
+      <w:bookmarkEnd w:id="76"/>
       <w:r>
         <w:lastRenderedPageBreak/>
         <w:t>4.2. Kết quả thực nghiệm</w:t>
       </w:r>
-      <w:bookmarkEnd w:id="78"/>
+      <w:bookmarkEnd w:id="79"/>
     </w:p>
     <w:p>
       <w:pPr>
@@ -16713,13 +17043,13 @@
       <w:pPr>
         <w:pStyle w:val="Heading3"/>
       </w:pPr>
-      <w:bookmarkStart w:id="80" w:name="_Toc240370179"/>
-      <w:bookmarkStart w:id="81" w:name="X945e946a6bb16552800ca0d5e17c450b179f4c4"/>
+      <w:bookmarkStart w:id="80" w:name="X945e946a6bb16552800ca0d5e17c450b179f4c4"/>
+      <w:bookmarkStart w:id="81" w:name="_Toc240373064"/>
       <w:r>
         <w:lastRenderedPageBreak/>
         <w:t>4.2.1. Kết quả đo thế hệ V3, bổ sung chứ không thay thế bộ số liệu V1 đã khoá</w:t>
       </w:r>
-      <w:bookmarkEnd w:id="80"/>
+      <w:bookmarkEnd w:id="81"/>
     </w:p>
     <w:p>
       <w:pPr>
@@ -18714,14 +19044,14 @@
       <w:pPr>
         <w:pStyle w:val="Heading3"/>
       </w:pPr>
-      <w:bookmarkStart w:id="86" w:name="_Toc240370180"/>
-      <w:bookmarkStart w:id="87" w:name="X9e5117aed0b98f2ae84f72360c6c1c707755942"/>
-      <w:bookmarkEnd w:id="81"/>
+      <w:bookmarkStart w:id="86" w:name="X9e5117aed0b98f2ae84f72360c6c1c707755942"/>
+      <w:bookmarkStart w:id="87" w:name="_Toc240373065"/>
+      <w:bookmarkEnd w:id="80"/>
       <w:bookmarkEnd w:id="85"/>
       <w:r>
         <w:t>4.2.2. Định vị kết quả của nhóm so với các công trình mã nguồn mở</w:t>
       </w:r>
-      <w:bookmarkEnd w:id="86"/>
+      <w:bookmarkEnd w:id="87"/>
     </w:p>
     <w:p>
       <w:pPr>
@@ -20703,14 +21033,14 @@
       <w:pPr>
         <w:pStyle w:val="Heading3"/>
       </w:pPr>
-      <w:bookmarkStart w:id="93" w:name="_Toc240370181"/>
-      <w:bookmarkStart w:id="94" w:name="X62980232c1274514aff6c8d65887e138697f9f6"/>
-      <w:bookmarkEnd w:id="87"/>
+      <w:bookmarkStart w:id="93" w:name="X62980232c1274514aff6c8d65887e138697f9f6"/>
+      <w:bookmarkStart w:id="94" w:name="_Toc240373066"/>
+      <w:bookmarkEnd w:id="86"/>
       <w:bookmarkEnd w:id="92"/>
       <w:r>
         <w:t>4.2.3. Bật thủy vân trên hệ thống đang chạy: số đo thực tế và nguyên nhân gốc thứ hai</w:t>
       </w:r>
-      <w:bookmarkEnd w:id="93"/>
+      <w:bookmarkEnd w:id="94"/>
     </w:p>
     <w:p>
       <w:pPr>
@@ -21913,14 +22243,14 @@
       <w:pPr>
         <w:pStyle w:val="Heading3"/>
       </w:pPr>
-      <w:bookmarkStart w:id="100" w:name="_Toc240370182"/>
-      <w:bookmarkStart w:id="101" w:name="Xaa3cbbd97bf041b76ccecd0af2f6ed2d1419554"/>
-      <w:bookmarkEnd w:id="94"/>
+      <w:bookmarkStart w:id="100" w:name="Xaa3cbbd97bf041b76ccecd0af2f6ed2d1419554"/>
+      <w:bookmarkStart w:id="101" w:name="_Toc240373067"/>
+      <w:bookmarkEnd w:id="93"/>
       <w:bookmarkEnd w:id="99"/>
       <w:r>
         <w:t>4.2.4. Nguyên nhân gốc thứ ba và phần chẩn đoán ở mục 4.2.3 phải sửa lại</w:t>
       </w:r>
-      <w:bookmarkEnd w:id="100"/>
+      <w:bookmarkEnd w:id="101"/>
     </w:p>
     <w:p>
       <w:pPr>
@@ -24717,15 +25047,15 @@
       <w:pPr>
         <w:pStyle w:val="Heading2"/>
       </w:pPr>
-      <w:bookmarkStart w:id="110" w:name="_Toc240370183"/>
-      <w:bookmarkStart w:id="111" w:name="Xd10a6691ac2b0db7535ed8552e88863d8a3547c"/>
-      <w:bookmarkEnd w:id="79"/>
-      <w:bookmarkEnd w:id="101"/>
+      <w:bookmarkStart w:id="110" w:name="Xd10a6691ac2b0db7535ed8552e88863d8a3547c"/>
+      <w:bookmarkStart w:id="111" w:name="_Toc240373068"/>
+      <w:bookmarkEnd w:id="78"/>
+      <w:bookmarkEnd w:id="100"/>
       <w:bookmarkEnd w:id="109"/>
       <w:r>
         <w:t>4.3. Đề xuất kiến trúc V4: chẩn đoán nguyên nhân gốc</w:t>
       </w:r>
-      <w:bookmarkEnd w:id="110"/>
+      <w:bookmarkEnd w:id="111"/>
     </w:p>
     <w:p>
       <w:pPr>
@@ -24739,12 +25069,12 @@
       <w:pPr>
         <w:pStyle w:val="Heading3"/>
       </w:pPr>
-      <w:bookmarkStart w:id="112" w:name="_Toc240370184"/>
-      <w:bookmarkStart w:id="113" w:name="X0651d2b7cd31d31794fed8f37ddbb746a11fa57"/>
+      <w:bookmarkStart w:id="112" w:name="X0651d2b7cd31d31794fed8f37ddbb746a11fa57"/>
+      <w:bookmarkStart w:id="113" w:name="_Toc240373069"/>
       <w:r>
         <w:t>4.3.1. Chẩn đoán: nút thắt nằm ở tập giả thuyết hình học, không ở thủy vân</w:t>
       </w:r>
-      <w:bookmarkEnd w:id="112"/>
+      <w:bookmarkEnd w:id="113"/>
     </w:p>
     <w:p>
       <w:pPr>
@@ -24856,13 +25186,13 @@
       <w:pPr>
         <w:pStyle w:val="Heading3"/>
       </w:pPr>
-      <w:bookmarkStart w:id="114" w:name="_Toc240370185"/>
-      <w:bookmarkStart w:id="115" w:name="X8a123a0c5c0d87d3b402adff01804f1a478ef59"/>
-      <w:bookmarkEnd w:id="113"/>
+      <w:bookmarkStart w:id="114" w:name="X8a123a0c5c0d87d3b402adff01804f1a478ef59"/>
+      <w:bookmarkStart w:id="115" w:name="_Toc240373070"/>
+      <w:bookmarkEnd w:id="112"/>
       <w:r>
         <w:t>4.3.2. Bằng chứng: tương quan hoàn hảo giữa “có giả thuyết” và “truy vết được”</w:t>
       </w:r>
-      <w:bookmarkEnd w:id="114"/>
+      <w:bookmarkEnd w:id="115"/>
     </w:p>
     <w:p>
       <w:pPr>
@@ -26145,14 +26475,14 @@
       <w:pPr>
         <w:pStyle w:val="Heading3"/>
       </w:pPr>
-      <w:bookmarkStart w:id="117" w:name="_Toc240370186"/>
-      <w:bookmarkStart w:id="118" w:name="X925063a5d95bd2b2f70d081962403c8bd062d71"/>
-      <w:bookmarkEnd w:id="115"/>
+      <w:bookmarkStart w:id="117" w:name="X925063a5d95bd2b2f70d081962403c8bd062d71"/>
+      <w:bookmarkStart w:id="118" w:name="_Toc240373071"/>
+      <w:bookmarkEnd w:id="114"/>
       <w:bookmarkEnd w:id="116"/>
       <w:r>
         <w:t>4.3.3. Kiểm chứng: bóc viền letterbox khôi phục truy vết ảnh chụp màn hình</w:t>
       </w:r>
-      <w:bookmarkEnd w:id="117"/>
+      <w:bookmarkEnd w:id="118"/>
     </w:p>
     <w:p>
       <w:pPr>
@@ -26519,13 +26849,13 @@
       <w:pPr>
         <w:pStyle w:val="Heading3"/>
       </w:pPr>
-      <w:bookmarkStart w:id="119" w:name="_Toc240370187"/>
-      <w:bookmarkStart w:id="120" w:name="X4d538943e8b5d22bccd729b48e1609b31a834d6"/>
-      <w:bookmarkEnd w:id="118"/>
+      <w:bookmarkStart w:id="119" w:name="X4d538943e8b5d22bccd729b48e1609b31a834d6"/>
+      <w:bookmarkStart w:id="120" w:name="_Toc240373072"/>
+      <w:bookmarkEnd w:id="117"/>
       <w:r>
         <w:t>4.3.4. Quét toàn bộ lưới ứng viên: hồ sơ đang chạy là hồ sơ yếu nhất</w:t>
       </w:r>
-      <w:bookmarkEnd w:id="119"/>
+      <w:bookmarkEnd w:id="120"/>
     </w:p>
     <w:p>
       <w:pPr>
@@ -28888,14 +29218,14 @@
       <w:pPr>
         <w:pStyle w:val="Heading3"/>
       </w:pPr>
-      <w:bookmarkStart w:id="123" w:name="_Toc240370188"/>
-      <w:bookmarkStart w:id="124" w:name="Xaa532e4a1fa2fd6b350d447a5422868d3bab935"/>
-      <w:bookmarkEnd w:id="120"/>
+      <w:bookmarkStart w:id="123" w:name="Xaa532e4a1fa2fd6b350d447a5422868d3bab935"/>
+      <w:bookmarkStart w:id="124" w:name="_Toc240373073"/>
+      <w:bookmarkEnd w:id="119"/>
       <w:bookmarkEnd w:id="122"/>
       <w:r>
         <w:t>4.3.5. Đối chiếu ba công trình mã nguồn mở về đúng bài toán trang văn bản</w:t>
       </w:r>
-      <w:bookmarkEnd w:id="123"/>
+      <w:bookmarkEnd w:id="124"/>
     </w:p>
     <w:p>
       <w:pPr>
@@ -29214,14 +29544,14 @@
       <w:pPr>
         <w:pStyle w:val="Heading3"/>
       </w:pPr>
-      <w:bookmarkStart w:id="129" w:name="_Toc240370189"/>
-      <w:bookmarkStart w:id="130" w:name="kiến-trúc-v4-đề-xuất"/>
-      <w:bookmarkEnd w:id="124"/>
+      <w:bookmarkStart w:id="129" w:name="kiến-trúc-v4-đề-xuất"/>
+      <w:bookmarkStart w:id="130" w:name="_Toc240373074"/>
+      <w:bookmarkEnd w:id="123"/>
       <w:bookmarkEnd w:id="128"/>
       <w:r>
         <w:t>4.3.6. Kiến trúc V4 đề xuất</w:t>
       </w:r>
-      <w:bookmarkEnd w:id="129"/>
+      <w:bookmarkEnd w:id="130"/>
     </w:p>
     <w:p>
       <w:pPr>
@@ -29309,13 +29639,13 @@
       <w:pPr>
         <w:pStyle w:val="Heading3"/>
       </w:pPr>
-      <w:bookmarkStart w:id="131" w:name="_Toc240370190"/>
-      <w:bookmarkStart w:id="132" w:name="cái-gì-kiến-trúc-này-không-sửa-được"/>
-      <w:bookmarkEnd w:id="130"/>
+      <w:bookmarkStart w:id="131" w:name="cái-gì-kiến-trúc-này-không-sửa-được"/>
+      <w:bookmarkStart w:id="132" w:name="_Toc240373075"/>
+      <w:bookmarkEnd w:id="129"/>
       <w:r>
         <w:t>4.3.7. Cái gì kiến trúc này không sửa được</w:t>
       </w:r>
-      <w:bookmarkEnd w:id="131"/>
+      <w:bookmarkEnd w:id="132"/>
     </w:p>
     <w:p>
       <w:pPr>
@@ -29396,13 +29726,13 @@
       <w:pPr>
         <w:pStyle w:val="Heading3"/>
       </w:pPr>
-      <w:bookmarkStart w:id="133" w:name="_Toc240370191"/>
-      <w:bookmarkStart w:id="134" w:name="vì-sao-chẩn-đoán-này-có-được"/>
-      <w:bookmarkEnd w:id="132"/>
+      <w:bookmarkStart w:id="133" w:name="vì-sao-chẩn-đoán-này-có-được"/>
+      <w:bookmarkStart w:id="134" w:name="_Toc240373076"/>
+      <w:bookmarkEnd w:id="131"/>
       <w:r>
         <w:t>4.3.8. Vì sao chẩn đoán này có được</w:t>
       </w:r>
-      <w:bookmarkEnd w:id="133"/>
+      <w:bookmarkEnd w:id="134"/>
     </w:p>
     <w:p>
       <w:pPr>
@@ -29444,16 +29774,16 @@
       <w:pPr>
         <w:pStyle w:val="Heading1"/>
       </w:pPr>
-      <w:bookmarkStart w:id="135" w:name="_Toc240370192"/>
-      <w:bookmarkStart w:id="136" w:name="kết-luận"/>
-      <w:bookmarkEnd w:id="71"/>
-      <w:bookmarkEnd w:id="111"/>
-      <w:bookmarkEnd w:id="134"/>
+      <w:bookmarkStart w:id="135" w:name="kết-luận"/>
+      <w:bookmarkStart w:id="136" w:name="_Toc240373077"/>
+      <w:bookmarkEnd w:id="70"/>
+      <w:bookmarkEnd w:id="110"/>
+      <w:bookmarkEnd w:id="133"/>
       <w:r>
         <w:lastRenderedPageBreak/>
         <w:t>KẾT LUẬN</w:t>
       </w:r>
-      <w:bookmarkEnd w:id="135"/>
+      <w:bookmarkEnd w:id="136"/>
     </w:p>
     <w:p>
       <w:pPr>
@@ -29527,14 +29857,14 @@
       <w:pPr>
         <w:pStyle w:val="Heading1"/>
       </w:pPr>
-      <w:bookmarkStart w:id="137" w:name="_Toc240370193"/>
-      <w:bookmarkStart w:id="138" w:name="tài-liệu-tham-khảo"/>
-      <w:bookmarkEnd w:id="136"/>
+      <w:bookmarkStart w:id="137" w:name="tài-liệu-tham-khảo"/>
+      <w:bookmarkStart w:id="138" w:name="_Toc240373078"/>
+      <w:bookmarkEnd w:id="135"/>
       <w:r>
         <w:lastRenderedPageBreak/>
         <w:t>TÀI LIỆU THAM KHẢO</w:t>
       </w:r>
-      <w:bookmarkEnd w:id="137"/>
+      <w:bookmarkEnd w:id="138"/>
     </w:p>
     <w:sdt>
       <w:sdtPr>
@@ -30320,13 +30650,13 @@
       <w:pPr>
         <w:pStyle w:val="Heading1"/>
       </w:pPr>
-      <w:bookmarkStart w:id="139" w:name="_Toc240370194"/>
-      <w:bookmarkStart w:id="140" w:name="X8c9d602fdee431516a1a95beedefebdd94fb169"/>
-      <w:bookmarkEnd w:id="138"/>
+      <w:bookmarkStart w:id="139" w:name="X8c9d602fdee431516a1a95beedefebdd94fb169"/>
+      <w:bookmarkStart w:id="140" w:name="_Toc240373079"/>
+      <w:bookmarkEnd w:id="137"/>
       <w:r>
         <w:t>PHỤ LỤC A. MA TRẬN TRUY VẾT KHẲNG ĐỊNH VÀ BẰNG CHỨNG</w:t>
       </w:r>
-      <w:bookmarkEnd w:id="139"/>
+      <w:bookmarkEnd w:id="140"/>
     </w:p>
     <w:p>
       <w:pPr>
@@ -33294,7 +33624,7 @@
           </w:p>
         </w:tc>
       </w:tr>
-      <w:bookmarkEnd w:id="140"/>
+      <w:bookmarkEnd w:id="139"/>
     </w:tbl>
     <w:p/>
     <w:sectPr>
@@ -35729,8 +36059,8 @@
   <w:rsids>
     <w:rsidRoot w:val="001F3D7D"/>
     <w:rsid w:val="001F3D7D"/>
-    <w:rsid w:val="00AF6049"/>
     <w:rsid w:val="00C24EF1"/>
+    <w:rsid w:val="00F67E63"/>
   </w:rsids>
   <m:mathPr>
     <m:mathFont m:val="Cambria Math"/>

</xml_diff>

<commit_message>
docs: name every table and figure in the prose, as the form requires
BM-BTL-07: "Khi de cap den bang bieu va hinh ve phai neu ro so cua bang bieu
va hinh do". Eleven tables and six figures had no numbered mention anywhere in
the body; most leads ended in a colon and dropped the table underneath, which is
the same defect as writing "bang duoi day" with extra steps.

Twelve leads rewritten to carry the number, three sentences added where the
caption followed a heading or a hash with nothing in between. One lead said
"con so duoi day", which the form names explicitly as forbidden; it now says
"con so o Bang 4.11".

31 captions, all cited, all placed correctly: 21 tables with the caption above,
10 figures with the caption below. 97 pages, no blank pages in the export.

Co-Authored-By: Claude Opus 5 <noreply@anthropic.com>
Claude-Session: https://claude.ai/code/session_01SzJTThV64VAErHN4L42mg9
</commit_message>
<xml_diff>
--- a/docs/project/Nhom9_TruyVetToanVenVanBan.docx
+++ b/docs/project/Nhom9_TruyVetToanVenVanBan.docx
@@ -789,7 +789,7 @@
           <w:r>
             <w:fldChar w:fldCharType="separate"/>
           </w:r>
-          <w:hyperlink w:anchor="_Toc240377088" w:history="1">
+          <w:hyperlink w:anchor="_Toc240378324" w:history="1">
             <w:r>
               <w:rPr>
                 <w:rStyle w:val="Hyperlink"/>
@@ -816,7 +816,7 @@
                 <w:noProof/>
                 <w:webHidden/>
               </w:rPr>
-              <w:instrText xml:space="preserve"> PAGEREF _Toc240377088 \h </w:instrText>
+              <w:instrText xml:space="preserve"> PAGEREF _Toc240378324 \h </w:instrText>
             </w:r>
             <w:r>
               <w:rPr>
@@ -863,7 +863,7 @@
               <w14:ligatures w14:val="standardContextual"/>
             </w:rPr>
           </w:pPr>
-          <w:hyperlink w:anchor="_Toc240377089" w:history="1">
+          <w:hyperlink w:anchor="_Toc240378325" w:history="1">
             <w:r>
               <w:rPr>
                 <w:rStyle w:val="Hyperlink"/>
@@ -890,7 +890,7 @@
                 <w:noProof/>
                 <w:webHidden/>
               </w:rPr>
-              <w:instrText xml:space="preserve"> PAGEREF _Toc240377089 \h </w:instrText>
+              <w:instrText xml:space="preserve"> PAGEREF _Toc240378325 \h </w:instrText>
             </w:r>
             <w:r>
               <w:rPr>
@@ -937,7 +937,7 @@
               <w14:ligatures w14:val="standardContextual"/>
             </w:rPr>
           </w:pPr>
-          <w:hyperlink w:anchor="_Toc240377090" w:history="1">
+          <w:hyperlink w:anchor="_Toc240378326" w:history="1">
             <w:r>
               <w:rPr>
                 <w:rStyle w:val="Hyperlink"/>
@@ -964,7 +964,7 @@
                 <w:noProof/>
                 <w:webHidden/>
               </w:rPr>
-              <w:instrText xml:space="preserve"> PAGEREF _Toc240377090 \h </w:instrText>
+              <w:instrText xml:space="preserve"> PAGEREF _Toc240378326 \h </w:instrText>
             </w:r>
             <w:r>
               <w:rPr>
@@ -1011,7 +1011,7 @@
               <w14:ligatures w14:val="standardContextual"/>
             </w:rPr>
           </w:pPr>
-          <w:hyperlink w:anchor="_Toc240377091" w:history="1">
+          <w:hyperlink w:anchor="_Toc240378327" w:history="1">
             <w:r>
               <w:rPr>
                 <w:rStyle w:val="Hyperlink"/>
@@ -1038,7 +1038,7 @@
                 <w:noProof/>
                 <w:webHidden/>
               </w:rPr>
-              <w:instrText xml:space="preserve"> PAGEREF _Toc240377091 \h </w:instrText>
+              <w:instrText xml:space="preserve"> PAGEREF _Toc240378327 \h </w:instrText>
             </w:r>
             <w:r>
               <w:rPr>
@@ -1085,7 +1085,7 @@
               <w14:ligatures w14:val="standardContextual"/>
             </w:rPr>
           </w:pPr>
-          <w:hyperlink w:anchor="_Toc240377092" w:history="1">
+          <w:hyperlink w:anchor="_Toc240378328" w:history="1">
             <w:r>
               <w:rPr>
                 <w:rStyle w:val="Hyperlink"/>
@@ -1112,7 +1112,7 @@
                 <w:noProof/>
                 <w:webHidden/>
               </w:rPr>
-              <w:instrText xml:space="preserve"> PAGEREF _Toc240377092 \h </w:instrText>
+              <w:instrText xml:space="preserve"> PAGEREF _Toc240378328 \h </w:instrText>
             </w:r>
             <w:r>
               <w:rPr>
@@ -1159,7 +1159,7 @@
               <w14:ligatures w14:val="standardContextual"/>
             </w:rPr>
           </w:pPr>
-          <w:hyperlink w:anchor="_Toc240377093" w:history="1">
+          <w:hyperlink w:anchor="_Toc240378329" w:history="1">
             <w:r>
               <w:rPr>
                 <w:rStyle w:val="Hyperlink"/>
@@ -1186,7 +1186,7 @@
                 <w:noProof/>
                 <w:webHidden/>
               </w:rPr>
-              <w:instrText xml:space="preserve"> PAGEREF _Toc240377093 \h </w:instrText>
+              <w:instrText xml:space="preserve"> PAGEREF _Toc240378329 \h </w:instrText>
             </w:r>
             <w:r>
               <w:rPr>
@@ -1233,7 +1233,7 @@
               <w14:ligatures w14:val="standardContextual"/>
             </w:rPr>
           </w:pPr>
-          <w:hyperlink w:anchor="_Toc240377094" w:history="1">
+          <w:hyperlink w:anchor="_Toc240378330" w:history="1">
             <w:r>
               <w:rPr>
                 <w:rStyle w:val="Hyperlink"/>
@@ -1260,7 +1260,7 @@
                 <w:noProof/>
                 <w:webHidden/>
               </w:rPr>
-              <w:instrText xml:space="preserve"> PAGEREF _Toc240377094 \h </w:instrText>
+              <w:instrText xml:space="preserve"> PAGEREF _Toc240378330 \h </w:instrText>
             </w:r>
             <w:r>
               <w:rPr>
@@ -1307,7 +1307,7 @@
               <w14:ligatures w14:val="standardContextual"/>
             </w:rPr>
           </w:pPr>
-          <w:hyperlink w:anchor="_Toc240377095" w:history="1">
+          <w:hyperlink w:anchor="_Toc240378331" w:history="1">
             <w:r>
               <w:rPr>
                 <w:rStyle w:val="Hyperlink"/>
@@ -1334,7 +1334,7 @@
                 <w:noProof/>
                 <w:webHidden/>
               </w:rPr>
-              <w:instrText xml:space="preserve"> PAGEREF _Toc240377095 \h </w:instrText>
+              <w:instrText xml:space="preserve"> PAGEREF _Toc240378331 \h </w:instrText>
             </w:r>
             <w:r>
               <w:rPr>
@@ -1381,7 +1381,7 @@
               <w14:ligatures w14:val="standardContextual"/>
             </w:rPr>
           </w:pPr>
-          <w:hyperlink w:anchor="_Toc240377096" w:history="1">
+          <w:hyperlink w:anchor="_Toc240378332" w:history="1">
             <w:r>
               <w:rPr>
                 <w:rStyle w:val="Hyperlink"/>
@@ -1408,7 +1408,7 @@
                 <w:noProof/>
                 <w:webHidden/>
               </w:rPr>
-              <w:instrText xml:space="preserve"> PAGEREF _Toc240377096 \h </w:instrText>
+              <w:instrText xml:space="preserve"> PAGEREF _Toc240378332 \h </w:instrText>
             </w:r>
             <w:r>
               <w:rPr>
@@ -1455,7 +1455,7 @@
               <w14:ligatures w14:val="standardContextual"/>
             </w:rPr>
           </w:pPr>
-          <w:hyperlink w:anchor="_Toc240377097" w:history="1">
+          <w:hyperlink w:anchor="_Toc240378333" w:history="1">
             <w:r>
               <w:rPr>
                 <w:rStyle w:val="Hyperlink"/>
@@ -1482,7 +1482,7 @@
                 <w:noProof/>
                 <w:webHidden/>
               </w:rPr>
-              <w:instrText xml:space="preserve"> PAGEREF _Toc240377097 \h </w:instrText>
+              <w:instrText xml:space="preserve"> PAGEREF _Toc240378333 \h </w:instrText>
             </w:r>
             <w:r>
               <w:rPr>
@@ -1529,7 +1529,7 @@
               <w14:ligatures w14:val="standardContextual"/>
             </w:rPr>
           </w:pPr>
-          <w:hyperlink w:anchor="_Toc240377098" w:history="1">
+          <w:hyperlink w:anchor="_Toc240378334" w:history="1">
             <w:r>
               <w:rPr>
                 <w:rStyle w:val="Hyperlink"/>
@@ -1556,7 +1556,7 @@
                 <w:noProof/>
                 <w:webHidden/>
               </w:rPr>
-              <w:instrText xml:space="preserve"> PAGEREF _Toc240377098 \h </w:instrText>
+              <w:instrText xml:space="preserve"> PAGEREF _Toc240378334 \h </w:instrText>
             </w:r>
             <w:r>
               <w:rPr>
@@ -1603,7 +1603,7 @@
               <w14:ligatures w14:val="standardContextual"/>
             </w:rPr>
           </w:pPr>
-          <w:hyperlink w:anchor="_Toc240377099" w:history="1">
+          <w:hyperlink w:anchor="_Toc240378335" w:history="1">
             <w:r>
               <w:rPr>
                 <w:rStyle w:val="Hyperlink"/>
@@ -1630,7 +1630,7 @@
                 <w:noProof/>
                 <w:webHidden/>
               </w:rPr>
-              <w:instrText xml:space="preserve"> PAGEREF _Toc240377099 \h </w:instrText>
+              <w:instrText xml:space="preserve"> PAGEREF _Toc240378335 \h </w:instrText>
             </w:r>
             <w:r>
               <w:rPr>
@@ -1677,7 +1677,7 @@
               <w14:ligatures w14:val="standardContextual"/>
             </w:rPr>
           </w:pPr>
-          <w:hyperlink w:anchor="_Toc240377100" w:history="1">
+          <w:hyperlink w:anchor="_Toc240378336" w:history="1">
             <w:r>
               <w:rPr>
                 <w:rStyle w:val="Hyperlink"/>
@@ -1704,7 +1704,7 @@
                 <w:noProof/>
                 <w:webHidden/>
               </w:rPr>
-              <w:instrText xml:space="preserve"> PAGEREF _Toc240377100 \h </w:instrText>
+              <w:instrText xml:space="preserve"> PAGEREF _Toc240378336 \h </w:instrText>
             </w:r>
             <w:r>
               <w:rPr>
@@ -1751,7 +1751,7 @@
               <w14:ligatures w14:val="standardContextual"/>
             </w:rPr>
           </w:pPr>
-          <w:hyperlink w:anchor="_Toc240377101" w:history="1">
+          <w:hyperlink w:anchor="_Toc240378337" w:history="1">
             <w:r>
               <w:rPr>
                 <w:rStyle w:val="Hyperlink"/>
@@ -1778,7 +1778,7 @@
                 <w:noProof/>
                 <w:webHidden/>
               </w:rPr>
-              <w:instrText xml:space="preserve"> PAGEREF _Toc240377101 \h </w:instrText>
+              <w:instrText xml:space="preserve"> PAGEREF _Toc240378337 \h </w:instrText>
             </w:r>
             <w:r>
               <w:rPr>
@@ -1825,7 +1825,7 @@
               <w14:ligatures w14:val="standardContextual"/>
             </w:rPr>
           </w:pPr>
-          <w:hyperlink w:anchor="_Toc240377102" w:history="1">
+          <w:hyperlink w:anchor="_Toc240378338" w:history="1">
             <w:r>
               <w:rPr>
                 <w:rStyle w:val="Hyperlink"/>
@@ -1852,7 +1852,7 @@
                 <w:noProof/>
                 <w:webHidden/>
               </w:rPr>
-              <w:instrText xml:space="preserve"> PAGEREF _Toc240377102 \h </w:instrText>
+              <w:instrText xml:space="preserve"> PAGEREF _Toc240378338 \h </w:instrText>
             </w:r>
             <w:r>
               <w:rPr>
@@ -1899,7 +1899,7 @@
               <w14:ligatures w14:val="standardContextual"/>
             </w:rPr>
           </w:pPr>
-          <w:hyperlink w:anchor="_Toc240377103" w:history="1">
+          <w:hyperlink w:anchor="_Toc240378339" w:history="1">
             <w:r>
               <w:rPr>
                 <w:rStyle w:val="Hyperlink"/>
@@ -1926,7 +1926,7 @@
                 <w:noProof/>
                 <w:webHidden/>
               </w:rPr>
-              <w:instrText xml:space="preserve"> PAGEREF _Toc240377103 \h </w:instrText>
+              <w:instrText xml:space="preserve"> PAGEREF _Toc240378339 \h </w:instrText>
             </w:r>
             <w:r>
               <w:rPr>
@@ -1973,7 +1973,7 @@
               <w14:ligatures w14:val="standardContextual"/>
             </w:rPr>
           </w:pPr>
-          <w:hyperlink w:anchor="_Toc240377104" w:history="1">
+          <w:hyperlink w:anchor="_Toc240378340" w:history="1">
             <w:r>
               <w:rPr>
                 <w:rStyle w:val="Hyperlink"/>
@@ -2000,7 +2000,7 @@
                 <w:noProof/>
                 <w:webHidden/>
               </w:rPr>
-              <w:instrText xml:space="preserve"> PAGEREF _Toc240377104 \h </w:instrText>
+              <w:instrText xml:space="preserve"> PAGEREF _Toc240378340 \h </w:instrText>
             </w:r>
             <w:r>
               <w:rPr>
@@ -2047,7 +2047,7 @@
               <w14:ligatures w14:val="standardContextual"/>
             </w:rPr>
           </w:pPr>
-          <w:hyperlink w:anchor="_Toc240377105" w:history="1">
+          <w:hyperlink w:anchor="_Toc240378341" w:history="1">
             <w:r>
               <w:rPr>
                 <w:rStyle w:val="Hyperlink"/>
@@ -2074,7 +2074,7 @@
                 <w:noProof/>
                 <w:webHidden/>
               </w:rPr>
-              <w:instrText xml:space="preserve"> PAGEREF _Toc240377105 \h </w:instrText>
+              <w:instrText xml:space="preserve"> PAGEREF _Toc240378341 \h </w:instrText>
             </w:r>
             <w:r>
               <w:rPr>
@@ -2121,7 +2121,7 @@
               <w14:ligatures w14:val="standardContextual"/>
             </w:rPr>
           </w:pPr>
-          <w:hyperlink w:anchor="_Toc240377106" w:history="1">
+          <w:hyperlink w:anchor="_Toc240378342" w:history="1">
             <w:r>
               <w:rPr>
                 <w:rStyle w:val="Hyperlink"/>
@@ -2148,7 +2148,7 @@
                 <w:noProof/>
                 <w:webHidden/>
               </w:rPr>
-              <w:instrText xml:space="preserve"> PAGEREF _Toc240377106 \h </w:instrText>
+              <w:instrText xml:space="preserve"> PAGEREF _Toc240378342 \h </w:instrText>
             </w:r>
             <w:r>
               <w:rPr>
@@ -2195,7 +2195,7 @@
               <w14:ligatures w14:val="standardContextual"/>
             </w:rPr>
           </w:pPr>
-          <w:hyperlink w:anchor="_Toc240377107" w:history="1">
+          <w:hyperlink w:anchor="_Toc240378343" w:history="1">
             <w:r>
               <w:rPr>
                 <w:rStyle w:val="Hyperlink"/>
@@ -2222,7 +2222,7 @@
                 <w:noProof/>
                 <w:webHidden/>
               </w:rPr>
-              <w:instrText xml:space="preserve"> PAGEREF _Toc240377107 \h </w:instrText>
+              <w:instrText xml:space="preserve"> PAGEREF _Toc240378343 \h </w:instrText>
             </w:r>
             <w:r>
               <w:rPr>
@@ -2269,7 +2269,7 @@
               <w14:ligatures w14:val="standardContextual"/>
             </w:rPr>
           </w:pPr>
-          <w:hyperlink w:anchor="_Toc240377108" w:history="1">
+          <w:hyperlink w:anchor="_Toc240378344" w:history="1">
             <w:r>
               <w:rPr>
                 <w:rStyle w:val="Hyperlink"/>
@@ -2296,7 +2296,7 @@
                 <w:noProof/>
                 <w:webHidden/>
               </w:rPr>
-              <w:instrText xml:space="preserve"> PAGEREF _Toc240377108 \h </w:instrText>
+              <w:instrText xml:space="preserve"> PAGEREF _Toc240378344 \h </w:instrText>
             </w:r>
             <w:r>
               <w:rPr>
@@ -2343,7 +2343,7 @@
               <w14:ligatures w14:val="standardContextual"/>
             </w:rPr>
           </w:pPr>
-          <w:hyperlink w:anchor="_Toc240377109" w:history="1">
+          <w:hyperlink w:anchor="_Toc240378345" w:history="1">
             <w:r>
               <w:rPr>
                 <w:rStyle w:val="Hyperlink"/>
@@ -2370,7 +2370,7 @@
                 <w:noProof/>
                 <w:webHidden/>
               </w:rPr>
-              <w:instrText xml:space="preserve"> PAGEREF _Toc240377109 \h </w:instrText>
+              <w:instrText xml:space="preserve"> PAGEREF _Toc240378345 \h </w:instrText>
             </w:r>
             <w:r>
               <w:rPr>
@@ -2417,7 +2417,7 @@
               <w14:ligatures w14:val="standardContextual"/>
             </w:rPr>
           </w:pPr>
-          <w:hyperlink w:anchor="_Toc240377110" w:history="1">
+          <w:hyperlink w:anchor="_Toc240378346" w:history="1">
             <w:r>
               <w:rPr>
                 <w:rStyle w:val="Hyperlink"/>
@@ -2444,7 +2444,7 @@
                 <w:noProof/>
                 <w:webHidden/>
               </w:rPr>
-              <w:instrText xml:space="preserve"> PAGEREF _Toc240377110 \h </w:instrText>
+              <w:instrText xml:space="preserve"> PAGEREF _Toc240378346 \h </w:instrText>
             </w:r>
             <w:r>
               <w:rPr>
@@ -2491,7 +2491,7 @@
               <w14:ligatures w14:val="standardContextual"/>
             </w:rPr>
           </w:pPr>
-          <w:hyperlink w:anchor="_Toc240377111" w:history="1">
+          <w:hyperlink w:anchor="_Toc240378347" w:history="1">
             <w:r>
               <w:rPr>
                 <w:rStyle w:val="Hyperlink"/>
@@ -2518,7 +2518,7 @@
                 <w:noProof/>
                 <w:webHidden/>
               </w:rPr>
-              <w:instrText xml:space="preserve"> PAGEREF _Toc240377111 \h </w:instrText>
+              <w:instrText xml:space="preserve"> PAGEREF _Toc240378347 \h </w:instrText>
             </w:r>
             <w:r>
               <w:rPr>
@@ -2565,7 +2565,7 @@
               <w14:ligatures w14:val="standardContextual"/>
             </w:rPr>
           </w:pPr>
-          <w:hyperlink w:anchor="_Toc240377112" w:history="1">
+          <w:hyperlink w:anchor="_Toc240378348" w:history="1">
             <w:r>
               <w:rPr>
                 <w:rStyle w:val="Hyperlink"/>
@@ -2592,7 +2592,7 @@
                 <w:noProof/>
                 <w:webHidden/>
               </w:rPr>
-              <w:instrText xml:space="preserve"> PAGEREF _Toc240377112 \h </w:instrText>
+              <w:instrText xml:space="preserve"> PAGEREF _Toc240378348 \h </w:instrText>
             </w:r>
             <w:r>
               <w:rPr>
@@ -2639,7 +2639,7 @@
               <w14:ligatures w14:val="standardContextual"/>
             </w:rPr>
           </w:pPr>
-          <w:hyperlink w:anchor="_Toc240377113" w:history="1">
+          <w:hyperlink w:anchor="_Toc240378349" w:history="1">
             <w:r>
               <w:rPr>
                 <w:rStyle w:val="Hyperlink"/>
@@ -2666,7 +2666,7 @@
                 <w:noProof/>
                 <w:webHidden/>
               </w:rPr>
-              <w:instrText xml:space="preserve"> PAGEREF _Toc240377113 \h </w:instrText>
+              <w:instrText xml:space="preserve"> PAGEREF _Toc240378349 \h </w:instrText>
             </w:r>
             <w:r>
               <w:rPr>
@@ -2713,7 +2713,7 @@
               <w14:ligatures w14:val="standardContextual"/>
             </w:rPr>
           </w:pPr>
-          <w:hyperlink w:anchor="_Toc240377114" w:history="1">
+          <w:hyperlink w:anchor="_Toc240378350" w:history="1">
             <w:r>
               <w:rPr>
                 <w:rStyle w:val="Hyperlink"/>
@@ -2740,7 +2740,7 @@
                 <w:noProof/>
                 <w:webHidden/>
               </w:rPr>
-              <w:instrText xml:space="preserve"> PAGEREF _Toc240377114 \h </w:instrText>
+              <w:instrText xml:space="preserve"> PAGEREF _Toc240378350 \h </w:instrText>
             </w:r>
             <w:r>
               <w:rPr>
@@ -2787,7 +2787,7 @@
               <w14:ligatures w14:val="standardContextual"/>
             </w:rPr>
           </w:pPr>
-          <w:hyperlink w:anchor="_Toc240377115" w:history="1">
+          <w:hyperlink w:anchor="_Toc240378351" w:history="1">
             <w:r>
               <w:rPr>
                 <w:rStyle w:val="Hyperlink"/>
@@ -2814,7 +2814,7 @@
                 <w:noProof/>
                 <w:webHidden/>
               </w:rPr>
-              <w:instrText xml:space="preserve"> PAGEREF _Toc240377115 \h </w:instrText>
+              <w:instrText xml:space="preserve"> PAGEREF _Toc240378351 \h </w:instrText>
             </w:r>
             <w:r>
               <w:rPr>
@@ -2861,7 +2861,7 @@
               <w14:ligatures w14:val="standardContextual"/>
             </w:rPr>
           </w:pPr>
-          <w:hyperlink w:anchor="_Toc240377116" w:history="1">
+          <w:hyperlink w:anchor="_Toc240378352" w:history="1">
             <w:r>
               <w:rPr>
                 <w:rStyle w:val="Hyperlink"/>
@@ -2888,7 +2888,7 @@
                 <w:noProof/>
                 <w:webHidden/>
               </w:rPr>
-              <w:instrText xml:space="preserve"> PAGEREF _Toc240377116 \h </w:instrText>
+              <w:instrText xml:space="preserve"> PAGEREF _Toc240378352 \h </w:instrText>
             </w:r>
             <w:r>
               <w:rPr>
@@ -2935,7 +2935,7 @@
               <w14:ligatures w14:val="standardContextual"/>
             </w:rPr>
           </w:pPr>
-          <w:hyperlink w:anchor="_Toc240377117" w:history="1">
+          <w:hyperlink w:anchor="_Toc240378353" w:history="1">
             <w:r>
               <w:rPr>
                 <w:rStyle w:val="Hyperlink"/>
@@ -2962,7 +2962,7 @@
                 <w:noProof/>
                 <w:webHidden/>
               </w:rPr>
-              <w:instrText xml:space="preserve"> PAGEREF _Toc240377117 \h </w:instrText>
+              <w:instrText xml:space="preserve"> PAGEREF _Toc240378353 \h </w:instrText>
             </w:r>
             <w:r>
               <w:rPr>
@@ -3009,7 +3009,7 @@
               <w14:ligatures w14:val="standardContextual"/>
             </w:rPr>
           </w:pPr>
-          <w:hyperlink w:anchor="_Toc240377118" w:history="1">
+          <w:hyperlink w:anchor="_Toc240378354" w:history="1">
             <w:r>
               <w:rPr>
                 <w:rStyle w:val="Hyperlink"/>
@@ -3036,7 +3036,7 @@
                 <w:noProof/>
                 <w:webHidden/>
               </w:rPr>
-              <w:instrText xml:space="preserve"> PAGEREF _Toc240377118 \h </w:instrText>
+              <w:instrText xml:space="preserve"> PAGEREF _Toc240378354 \h </w:instrText>
             </w:r>
             <w:r>
               <w:rPr>
@@ -3083,7 +3083,7 @@
               <w14:ligatures w14:val="standardContextual"/>
             </w:rPr>
           </w:pPr>
-          <w:hyperlink w:anchor="_Toc240377119" w:history="1">
+          <w:hyperlink w:anchor="_Toc240378355" w:history="1">
             <w:r>
               <w:rPr>
                 <w:rStyle w:val="Hyperlink"/>
@@ -3110,7 +3110,7 @@
                 <w:noProof/>
                 <w:webHidden/>
               </w:rPr>
-              <w:instrText xml:space="preserve"> PAGEREF _Toc240377119 \h </w:instrText>
+              <w:instrText xml:space="preserve"> PAGEREF _Toc240378355 \h </w:instrText>
             </w:r>
             <w:r>
               <w:rPr>
@@ -3157,7 +3157,7 @@
               <w14:ligatures w14:val="standardContextual"/>
             </w:rPr>
           </w:pPr>
-          <w:hyperlink w:anchor="_Toc240377120" w:history="1">
+          <w:hyperlink w:anchor="_Toc240378356" w:history="1">
             <w:r>
               <w:rPr>
                 <w:rStyle w:val="Hyperlink"/>
@@ -3184,7 +3184,7 @@
                 <w:noProof/>
                 <w:webHidden/>
               </w:rPr>
-              <w:instrText xml:space="preserve"> PAGEREF _Toc240377120 \h </w:instrText>
+              <w:instrText xml:space="preserve"> PAGEREF _Toc240378356 \h </w:instrText>
             </w:r>
             <w:r>
               <w:rPr>
@@ -3231,7 +3231,7 @@
               <w14:ligatures w14:val="standardContextual"/>
             </w:rPr>
           </w:pPr>
-          <w:hyperlink w:anchor="_Toc240377121" w:history="1">
+          <w:hyperlink w:anchor="_Toc240378357" w:history="1">
             <w:r>
               <w:rPr>
                 <w:rStyle w:val="Hyperlink"/>
@@ -3258,7 +3258,7 @@
                 <w:noProof/>
                 <w:webHidden/>
               </w:rPr>
-              <w:instrText xml:space="preserve"> PAGEREF _Toc240377121 \h </w:instrText>
+              <w:instrText xml:space="preserve"> PAGEREF _Toc240378357 \h </w:instrText>
             </w:r>
             <w:r>
               <w:rPr>
@@ -3305,7 +3305,7 @@
               <w14:ligatures w14:val="standardContextual"/>
             </w:rPr>
           </w:pPr>
-          <w:hyperlink w:anchor="_Toc240377122" w:history="1">
+          <w:hyperlink w:anchor="_Toc240378358" w:history="1">
             <w:r>
               <w:rPr>
                 <w:rStyle w:val="Hyperlink"/>
@@ -3332,7 +3332,7 @@
                 <w:noProof/>
                 <w:webHidden/>
               </w:rPr>
-              <w:instrText xml:space="preserve"> PAGEREF _Toc240377122 \h </w:instrText>
+              <w:instrText xml:space="preserve"> PAGEREF _Toc240378358 \h </w:instrText>
             </w:r>
             <w:r>
               <w:rPr>
@@ -3379,7 +3379,7 @@
               <w14:ligatures w14:val="standardContextual"/>
             </w:rPr>
           </w:pPr>
-          <w:hyperlink w:anchor="_Toc240377123" w:history="1">
+          <w:hyperlink w:anchor="_Toc240378359" w:history="1">
             <w:r>
               <w:rPr>
                 <w:rStyle w:val="Hyperlink"/>
@@ -3406,7 +3406,7 @@
                 <w:noProof/>
                 <w:webHidden/>
               </w:rPr>
-              <w:instrText xml:space="preserve"> PAGEREF _Toc240377123 \h </w:instrText>
+              <w:instrText xml:space="preserve"> PAGEREF _Toc240378359 \h </w:instrText>
             </w:r>
             <w:r>
               <w:rPr>
@@ -3453,7 +3453,7 @@
               <w14:ligatures w14:val="standardContextual"/>
             </w:rPr>
           </w:pPr>
-          <w:hyperlink w:anchor="_Toc240377124" w:history="1">
+          <w:hyperlink w:anchor="_Toc240378360" w:history="1">
             <w:r>
               <w:rPr>
                 <w:rStyle w:val="Hyperlink"/>
@@ -3480,7 +3480,7 @@
                 <w:noProof/>
                 <w:webHidden/>
               </w:rPr>
-              <w:instrText xml:space="preserve"> PAGEREF _Toc240377124 \h </w:instrText>
+              <w:instrText xml:space="preserve"> PAGEREF _Toc240378360 \h </w:instrText>
             </w:r>
             <w:r>
               <w:rPr>
@@ -3527,7 +3527,7 @@
               <w14:ligatures w14:val="standardContextual"/>
             </w:rPr>
           </w:pPr>
-          <w:hyperlink w:anchor="_Toc240377125" w:history="1">
+          <w:hyperlink w:anchor="_Toc240378361" w:history="1">
             <w:r>
               <w:rPr>
                 <w:rStyle w:val="Hyperlink"/>
@@ -3554,7 +3554,7 @@
                 <w:noProof/>
                 <w:webHidden/>
               </w:rPr>
-              <w:instrText xml:space="preserve"> PAGEREF _Toc240377125 \h </w:instrText>
+              <w:instrText xml:space="preserve"> PAGEREF _Toc240378361 \h </w:instrText>
             </w:r>
             <w:r>
               <w:rPr>
@@ -3601,7 +3601,7 @@
               <w14:ligatures w14:val="standardContextual"/>
             </w:rPr>
           </w:pPr>
-          <w:hyperlink w:anchor="_Toc240377126" w:history="1">
+          <w:hyperlink w:anchor="_Toc240378362" w:history="1">
             <w:r>
               <w:rPr>
                 <w:rStyle w:val="Hyperlink"/>
@@ -3628,7 +3628,7 @@
                 <w:noProof/>
                 <w:webHidden/>
               </w:rPr>
-              <w:instrText xml:space="preserve"> PAGEREF _Toc240377126 \h </w:instrText>
+              <w:instrText xml:space="preserve"> PAGEREF _Toc240378362 \h </w:instrText>
             </w:r>
             <w:r>
               <w:rPr>
@@ -3675,7 +3675,7 @@
               <w14:ligatures w14:val="standardContextual"/>
             </w:rPr>
           </w:pPr>
-          <w:hyperlink w:anchor="_Toc240377127" w:history="1">
+          <w:hyperlink w:anchor="_Toc240378363" w:history="1">
             <w:r>
               <w:rPr>
                 <w:rStyle w:val="Hyperlink"/>
@@ -3702,7 +3702,7 @@
                 <w:noProof/>
                 <w:webHidden/>
               </w:rPr>
-              <w:instrText xml:space="preserve"> PAGEREF _Toc240377127 \h </w:instrText>
+              <w:instrText xml:space="preserve"> PAGEREF _Toc240378363 \h </w:instrText>
             </w:r>
             <w:r>
               <w:rPr>
@@ -3749,7 +3749,7 @@
               <w14:ligatures w14:val="standardContextual"/>
             </w:rPr>
           </w:pPr>
-          <w:hyperlink w:anchor="_Toc240377128" w:history="1">
+          <w:hyperlink w:anchor="_Toc240378364" w:history="1">
             <w:r>
               <w:rPr>
                 <w:rStyle w:val="Hyperlink"/>
@@ -3776,7 +3776,7 @@
                 <w:noProof/>
                 <w:webHidden/>
               </w:rPr>
-              <w:instrText xml:space="preserve"> PAGEREF _Toc240377128 \h </w:instrText>
+              <w:instrText xml:space="preserve"> PAGEREF _Toc240378364 \h </w:instrText>
             </w:r>
             <w:r>
               <w:rPr>
@@ -3823,7 +3823,7 @@
               <w14:ligatures w14:val="standardContextual"/>
             </w:rPr>
           </w:pPr>
-          <w:hyperlink w:anchor="_Toc240377129" w:history="1">
+          <w:hyperlink w:anchor="_Toc240378365" w:history="1">
             <w:r>
               <w:rPr>
                 <w:rStyle w:val="Hyperlink"/>
@@ -3850,7 +3850,7 @@
                 <w:noProof/>
                 <w:webHidden/>
               </w:rPr>
-              <w:instrText xml:space="preserve"> PAGEREF _Toc240377129 \h </w:instrText>
+              <w:instrText xml:space="preserve"> PAGEREF _Toc240378365 \h </w:instrText>
             </w:r>
             <w:r>
               <w:rPr>
@@ -3897,7 +3897,7 @@
               <w14:ligatures w14:val="standardContextual"/>
             </w:rPr>
           </w:pPr>
-          <w:hyperlink w:anchor="_Toc240377130" w:history="1">
+          <w:hyperlink w:anchor="_Toc240378366" w:history="1">
             <w:r>
               <w:rPr>
                 <w:rStyle w:val="Hyperlink"/>
@@ -3924,7 +3924,7 @@
                 <w:noProof/>
                 <w:webHidden/>
               </w:rPr>
-              <w:instrText xml:space="preserve"> PAGEREF _Toc240377130 \h </w:instrText>
+              <w:instrText xml:space="preserve"> PAGEREF _Toc240378366 \h </w:instrText>
             </w:r>
             <w:r>
               <w:rPr>
@@ -3944,7 +3944,7 @@
                 <w:noProof/>
                 <w:webHidden/>
               </w:rPr>
-              <w:t>57</w:t>
+              <w:t>58</w:t>
             </w:r>
             <w:r>
               <w:rPr>
@@ -3971,7 +3971,7 @@
               <w14:ligatures w14:val="standardContextual"/>
             </w:rPr>
           </w:pPr>
-          <w:hyperlink w:anchor="_Toc240377131" w:history="1">
+          <w:hyperlink w:anchor="_Toc240378367" w:history="1">
             <w:r>
               <w:rPr>
                 <w:rStyle w:val="Hyperlink"/>
@@ -3998,7 +3998,7 @@
                 <w:noProof/>
                 <w:webHidden/>
               </w:rPr>
-              <w:instrText xml:space="preserve"> PAGEREF _Toc240377131 \h </w:instrText>
+              <w:instrText xml:space="preserve"> PAGEREF _Toc240378367 \h </w:instrText>
             </w:r>
             <w:r>
               <w:rPr>
@@ -4018,7 +4018,7 @@
                 <w:noProof/>
                 <w:webHidden/>
               </w:rPr>
-              <w:t>57</w:t>
+              <w:t>58</w:t>
             </w:r>
             <w:r>
               <w:rPr>
@@ -4045,7 +4045,7 @@
               <w14:ligatures w14:val="standardContextual"/>
             </w:rPr>
           </w:pPr>
-          <w:hyperlink w:anchor="_Toc240377132" w:history="1">
+          <w:hyperlink w:anchor="_Toc240378368" w:history="1">
             <w:r>
               <w:rPr>
                 <w:rStyle w:val="Hyperlink"/>
@@ -4072,7 +4072,7 @@
                 <w:noProof/>
                 <w:webHidden/>
               </w:rPr>
-              <w:instrText xml:space="preserve"> PAGEREF _Toc240377132 \h </w:instrText>
+              <w:instrText xml:space="preserve"> PAGEREF _Toc240378368 \h </w:instrText>
             </w:r>
             <w:r>
               <w:rPr>
@@ -4119,7 +4119,7 @@
               <w14:ligatures w14:val="standardContextual"/>
             </w:rPr>
           </w:pPr>
-          <w:hyperlink w:anchor="_Toc240377133" w:history="1">
+          <w:hyperlink w:anchor="_Toc240378369" w:history="1">
             <w:r>
               <w:rPr>
                 <w:rStyle w:val="Hyperlink"/>
@@ -4146,7 +4146,7 @@
                 <w:noProof/>
                 <w:webHidden/>
               </w:rPr>
-              <w:instrText xml:space="preserve"> PAGEREF _Toc240377133 \h </w:instrText>
+              <w:instrText xml:space="preserve"> PAGEREF _Toc240378369 \h </w:instrText>
             </w:r>
             <w:r>
               <w:rPr>
@@ -4166,7 +4166,7 @@
                 <w:noProof/>
                 <w:webHidden/>
               </w:rPr>
-              <w:t>61</w:t>
+              <w:t>62</w:t>
             </w:r>
             <w:r>
               <w:rPr>
@@ -4193,7 +4193,7 @@
               <w14:ligatures w14:val="standardContextual"/>
             </w:rPr>
           </w:pPr>
-          <w:hyperlink w:anchor="_Toc240377134" w:history="1">
+          <w:hyperlink w:anchor="_Toc240378370" w:history="1">
             <w:r>
               <w:rPr>
                 <w:rStyle w:val="Hyperlink"/>
@@ -4220,7 +4220,7 @@
                 <w:noProof/>
                 <w:webHidden/>
               </w:rPr>
-              <w:instrText xml:space="preserve"> PAGEREF _Toc240377134 \h </w:instrText>
+              <w:instrText xml:space="preserve"> PAGEREF _Toc240378370 \h </w:instrText>
             </w:r>
             <w:r>
               <w:rPr>
@@ -4240,7 +4240,7 @@
                 <w:noProof/>
                 <w:webHidden/>
               </w:rPr>
-              <w:t>62</w:t>
+              <w:t>64</w:t>
             </w:r>
             <w:r>
               <w:rPr>
@@ -4267,7 +4267,7 @@
               <w14:ligatures w14:val="standardContextual"/>
             </w:rPr>
           </w:pPr>
-          <w:hyperlink w:anchor="_Toc240377135" w:history="1">
+          <w:hyperlink w:anchor="_Toc240378371" w:history="1">
             <w:r>
               <w:rPr>
                 <w:rStyle w:val="Hyperlink"/>
@@ -4294,7 +4294,7 @@
                 <w:noProof/>
                 <w:webHidden/>
               </w:rPr>
-              <w:instrText xml:space="preserve"> PAGEREF _Toc240377135 \h </w:instrText>
+              <w:instrText xml:space="preserve"> PAGEREF _Toc240378371 \h </w:instrText>
             </w:r>
             <w:r>
               <w:rPr>
@@ -4314,7 +4314,7 @@
                 <w:noProof/>
                 <w:webHidden/>
               </w:rPr>
-              <w:t>67</w:t>
+              <w:t>68</w:t>
             </w:r>
             <w:r>
               <w:rPr>
@@ -4341,7 +4341,7 @@
               <w14:ligatures w14:val="standardContextual"/>
             </w:rPr>
           </w:pPr>
-          <w:hyperlink w:anchor="_Toc240377136" w:history="1">
+          <w:hyperlink w:anchor="_Toc240378372" w:history="1">
             <w:r>
               <w:rPr>
                 <w:rStyle w:val="Hyperlink"/>
@@ -4368,7 +4368,7 @@
                 <w:noProof/>
                 <w:webHidden/>
               </w:rPr>
-              <w:instrText xml:space="preserve"> PAGEREF _Toc240377136 \h </w:instrText>
+              <w:instrText xml:space="preserve"> PAGEREF _Toc240378372 \h </w:instrText>
             </w:r>
             <w:r>
               <w:rPr>
@@ -4388,7 +4388,7 @@
                 <w:noProof/>
                 <w:webHidden/>
               </w:rPr>
-              <w:t>70</w:t>
+              <w:t>71</w:t>
             </w:r>
             <w:r>
               <w:rPr>
@@ -4415,7 +4415,7 @@
               <w14:ligatures w14:val="standardContextual"/>
             </w:rPr>
           </w:pPr>
-          <w:hyperlink w:anchor="_Toc240377137" w:history="1">
+          <w:hyperlink w:anchor="_Toc240378373" w:history="1">
             <w:r>
               <w:rPr>
                 <w:rStyle w:val="Hyperlink"/>
@@ -4442,7 +4442,7 @@
                 <w:noProof/>
                 <w:webHidden/>
               </w:rPr>
-              <w:instrText xml:space="preserve"> PAGEREF _Toc240377137 \h </w:instrText>
+              <w:instrText xml:space="preserve"> PAGEREF _Toc240378373 \h </w:instrText>
             </w:r>
             <w:r>
               <w:rPr>
@@ -4462,7 +4462,7 @@
                 <w:noProof/>
                 <w:webHidden/>
               </w:rPr>
-              <w:t>70</w:t>
+              <w:t>72</w:t>
             </w:r>
             <w:r>
               <w:rPr>
@@ -4489,7 +4489,7 @@
               <w14:ligatures w14:val="standardContextual"/>
             </w:rPr>
           </w:pPr>
-          <w:hyperlink w:anchor="_Toc240377138" w:history="1">
+          <w:hyperlink w:anchor="_Toc240378374" w:history="1">
             <w:r>
               <w:rPr>
                 <w:rStyle w:val="Hyperlink"/>
@@ -4516,7 +4516,7 @@
                 <w:noProof/>
                 <w:webHidden/>
               </w:rPr>
-              <w:instrText xml:space="preserve"> PAGEREF _Toc240377138 \h </w:instrText>
+              <w:instrText xml:space="preserve"> PAGEREF _Toc240378374 \h </w:instrText>
             </w:r>
             <w:r>
               <w:rPr>
@@ -4536,7 +4536,7 @@
                 <w:noProof/>
                 <w:webHidden/>
               </w:rPr>
-              <w:t>71</w:t>
+              <w:t>73</w:t>
             </w:r>
             <w:r>
               <w:rPr>
@@ -4563,7 +4563,7 @@
               <w14:ligatures w14:val="standardContextual"/>
             </w:rPr>
           </w:pPr>
-          <w:hyperlink w:anchor="_Toc240377139" w:history="1">
+          <w:hyperlink w:anchor="_Toc240378375" w:history="1">
             <w:r>
               <w:rPr>
                 <w:rStyle w:val="Hyperlink"/>
@@ -4590,7 +4590,7 @@
                 <w:noProof/>
                 <w:webHidden/>
               </w:rPr>
-              <w:instrText xml:space="preserve"> PAGEREF _Toc240377139 \h </w:instrText>
+              <w:instrText xml:space="preserve"> PAGEREF _Toc240378375 \h </w:instrText>
             </w:r>
             <w:r>
               <w:rPr>
@@ -4610,7 +4610,7 @@
                 <w:noProof/>
                 <w:webHidden/>
               </w:rPr>
-              <w:t>72</w:t>
+              <w:t>73</w:t>
             </w:r>
             <w:r>
               <w:rPr>
@@ -4637,7 +4637,7 @@
               <w14:ligatures w14:val="standardContextual"/>
             </w:rPr>
           </w:pPr>
-          <w:hyperlink w:anchor="_Toc240377140" w:history="1">
+          <w:hyperlink w:anchor="_Toc240378376" w:history="1">
             <w:r>
               <w:rPr>
                 <w:rStyle w:val="Hyperlink"/>
@@ -4664,7 +4664,7 @@
                 <w:noProof/>
                 <w:webHidden/>
               </w:rPr>
-              <w:instrText xml:space="preserve"> PAGEREF _Toc240377140 \h </w:instrText>
+              <w:instrText xml:space="preserve"> PAGEREF _Toc240378376 \h </w:instrText>
             </w:r>
             <w:r>
               <w:rPr>
@@ -4684,7 +4684,7 @@
                 <w:noProof/>
                 <w:webHidden/>
               </w:rPr>
-              <w:t>74</w:t>
+              <w:t>75</w:t>
             </w:r>
             <w:r>
               <w:rPr>
@@ -4711,7 +4711,7 @@
               <w14:ligatures w14:val="standardContextual"/>
             </w:rPr>
           </w:pPr>
-          <w:hyperlink w:anchor="_Toc240377141" w:history="1">
+          <w:hyperlink w:anchor="_Toc240378377" w:history="1">
             <w:r>
               <w:rPr>
                 <w:rStyle w:val="Hyperlink"/>
@@ -4738,7 +4738,7 @@
                 <w:noProof/>
                 <w:webHidden/>
               </w:rPr>
-              <w:instrText xml:space="preserve"> PAGEREF _Toc240377141 \h </w:instrText>
+              <w:instrText xml:space="preserve"> PAGEREF _Toc240378377 \h </w:instrText>
             </w:r>
             <w:r>
               <w:rPr>
@@ -4758,7 +4758,7 @@
                 <w:noProof/>
                 <w:webHidden/>
               </w:rPr>
-              <w:t>76</w:t>
+              <w:t>78</w:t>
             </w:r>
             <w:r>
               <w:rPr>
@@ -4781,7 +4781,7 @@
         <w:pStyle w:val="Heading1"/>
       </w:pPr>
       <w:bookmarkStart w:id="1" w:name="danh-mục-từ-viết-tắt-và-thuật-ngữ"/>
-      <w:bookmarkStart w:id="2" w:name="_Toc240377088"/>
+      <w:bookmarkStart w:id="2" w:name="_Toc240378324"/>
       <w:bookmarkEnd w:id="0"/>
       <w:r>
         <w:t>DANH MỤC TỪ VIẾT TẮT VÀ THUẬT NGỮ</w:t>
@@ -6633,7 +6633,7 @@
         <w:pStyle w:val="Heading1"/>
       </w:pPr>
       <w:bookmarkStart w:id="3" w:name="danh-mục-các-bảng"/>
-      <w:bookmarkStart w:id="4" w:name="_Toc240377089"/>
+      <w:bookmarkStart w:id="4" w:name="_Toc240378325"/>
       <w:bookmarkEnd w:id="1"/>
       <w:r>
         <w:t>DANH MỤC CÁC BẢNG</w:t>
@@ -7322,7 +7322,7 @@
         <w:pStyle w:val="Heading1"/>
       </w:pPr>
       <w:bookmarkStart w:id="5" w:name="danh-mục-các-hình"/>
-      <w:bookmarkStart w:id="6" w:name="_Toc240377090"/>
+      <w:bookmarkStart w:id="6" w:name="_Toc240378326"/>
       <w:bookmarkEnd w:id="3"/>
       <w:r>
         <w:t>DANH MỤC CÁC HÌNH</w:t>
@@ -7693,7 +7693,7 @@
       <w:pPr>
         <w:pStyle w:val="Heading1"/>
       </w:pPr>
-      <w:bookmarkStart w:id="8" w:name="_Toc240377091"/>
+      <w:bookmarkStart w:id="8" w:name="_Toc240378327"/>
       <w:r>
         <w:lastRenderedPageBreak/>
         <w:t>LỜI MỞ ĐẦU</w:t>
@@ -7779,7 +7779,7 @@
         <w:pStyle w:val="Heading3"/>
       </w:pPr>
       <w:bookmarkStart w:id="9" w:name="thông-tin-đề-tài-chính-thức"/>
-      <w:bookmarkStart w:id="10" w:name="_Toc240377092"/>
+      <w:bookmarkStart w:id="10" w:name="_Toc240378328"/>
       <w:r>
         <w:t>Thông tin đề tài chính thức</w:t>
       </w:r>
@@ -7893,7 +7893,7 @@
         <w:pStyle w:val="Heading3"/>
       </w:pPr>
       <w:bookmarkStart w:id="11" w:name="Xf6b985d06e86b68dd2de5566ba01dd2ddc40424"/>
-      <w:bookmarkStart w:id="12" w:name="_Toc240377093"/>
+      <w:bookmarkStart w:id="12" w:name="_Toc240378329"/>
       <w:bookmarkEnd w:id="9"/>
       <w:r>
         <w:t>Thống nhất ngữ nghĩa: “văn bản” (document) so với “hình ảnh” (image)</w:t>
@@ -8068,7 +8068,7 @@
         <w:pStyle w:val="Heading1"/>
       </w:pPr>
       <w:bookmarkStart w:id="13" w:name="X73852470e9fc27a6dee2a641dd4c49aad269013"/>
-      <w:bookmarkStart w:id="14" w:name="_Toc240377094"/>
+      <w:bookmarkStart w:id="14" w:name="_Toc240378330"/>
       <w:bookmarkEnd w:id="7"/>
       <w:bookmarkEnd w:id="11"/>
       <w:r>
@@ -8082,7 +8082,7 @@
         <w:pStyle w:val="Heading2"/>
       </w:pPr>
       <w:bookmarkStart w:id="15" w:name="khái-niệm-và-định-nghĩa-chuẩn-mực"/>
-      <w:bookmarkStart w:id="16" w:name="_Toc240377095"/>
+      <w:bookmarkStart w:id="16" w:name="_Toc240378331"/>
       <w:r>
         <w:t>1.1. Khái niệm và định nghĩa chuẩn mực</w:t>
       </w:r>
@@ -8189,7 +8189,7 @@
         <w:pStyle w:val="Heading2"/>
       </w:pPr>
       <w:bookmarkStart w:id="17" w:name="phân-loại-kỹ-thuật-thủy-vân-số"/>
-      <w:bookmarkStart w:id="18" w:name="_Toc240377096"/>
+      <w:bookmarkStart w:id="18" w:name="_Toc240378332"/>
       <w:bookmarkEnd w:id="15"/>
       <w:r>
         <w:t>1.2. Phân loại kỹ thuật thủy vân số</w:t>
@@ -8201,7 +8201,7 @@
         <w:pStyle w:val="Heading3"/>
       </w:pPr>
       <w:bookmarkStart w:id="19" w:name="X344359457ba084d15006b2faef4503914a46c44"/>
-      <w:bookmarkStart w:id="20" w:name="_Toc240377097"/>
+      <w:bookmarkStart w:id="20" w:name="_Toc240378333"/>
       <w:r>
         <w:t>1.2.1. Phân loại theo miền nhúng (embedding domain)</w:t>
       </w:r>
@@ -8413,7 +8413,7 @@
         <w:pStyle w:val="Heading3"/>
       </w:pPr>
       <w:bookmarkStart w:id="21" w:name="Xdf8795802ccd7c55605228d4c2bb9b0a6052b25"/>
-      <w:bookmarkStart w:id="22" w:name="_Toc240377098"/>
+      <w:bookmarkStart w:id="22" w:name="_Toc240378334"/>
       <w:bookmarkEnd w:id="19"/>
       <w:r>
         <w:t>1.2.2. Phân loại theo mức độ bền vững và mục đích sử dụng</w:t>
@@ -8588,7 +8588,7 @@
         <w:pStyle w:val="Heading2"/>
       </w:pPr>
       <w:bookmarkStart w:id="23" w:name="Xe512d1925d137a9b04feca38113dfa82c8b8562"/>
-      <w:bookmarkStart w:id="24" w:name="_Toc240377099"/>
+      <w:bookmarkStart w:id="24" w:name="_Toc240378335"/>
       <w:bookmarkEnd w:id="17"/>
       <w:bookmarkEnd w:id="21"/>
       <w:r>
@@ -8749,7 +8749,7 @@
         <w:pStyle w:val="Heading2"/>
       </w:pPr>
       <w:bookmarkStart w:id="25" w:name="X0749a89c140d67f1fd6e10e019df7faaf4f2896"/>
-      <w:bookmarkStart w:id="26" w:name="_Toc240377100"/>
+      <w:bookmarkStart w:id="26" w:name="_Toc240378336"/>
       <w:bookmarkEnd w:id="23"/>
       <w:r>
         <w:t>1.4. Kỹ thuật điều chế chỉ số lượng tử hóa (QIM - Quantization Index Modulation)</w:t>
@@ -9043,7 +9043,7 @@
         <w:pStyle w:val="Heading1"/>
       </w:pPr>
       <w:bookmarkStart w:id="27" w:name="Xd94a0078451e1b9a5730e25f1ec289ca206f45a"/>
-      <w:bookmarkStart w:id="28" w:name="_Toc240377101"/>
+      <w:bookmarkStart w:id="28" w:name="_Toc240378337"/>
       <w:bookmarkEnd w:id="13"/>
       <w:bookmarkEnd w:id="25"/>
       <w:r>
@@ -9085,7 +9085,7 @@
         <w:pStyle w:val="Heading2"/>
       </w:pPr>
       <w:bookmarkStart w:id="29" w:name="X309070127ac9b595d19338b9992d494ea1f4902"/>
-      <w:bookmarkStart w:id="30" w:name="_Toc240377102"/>
+      <w:bookmarkStart w:id="30" w:name="_Toc240378338"/>
       <w:r>
         <w:t>2.1. Bài toán A: truy vết nguồn phát hành (traitor tracing)</w:t>
       </w:r>
@@ -9096,7 +9096,7 @@
         <w:pStyle w:val="Heading3"/>
       </w:pPr>
       <w:bookmarkStart w:id="31" w:name="cấu-trúc-payload-thực-tế-trong-mã-nguồn"/>
-      <w:bookmarkStart w:id="32" w:name="_Toc240377103"/>
+      <w:bookmarkStart w:id="32" w:name="_Toc240378339"/>
       <w:r>
         <w:t>2.1.1. Cấu trúc payload thực tế trong mã nguồn</w:t>
       </w:r>
@@ -9638,7 +9638,7 @@
         <w:pStyle w:val="Heading3"/>
       </w:pPr>
       <w:bookmarkStart w:id="33" w:name="X1603ecaffd529b8f98fee9a64474d35d4c0fe76"/>
-      <w:bookmarkStart w:id="34" w:name="_Toc240377104"/>
+      <w:bookmarkStart w:id="34" w:name="_Toc240378340"/>
       <w:bookmarkEnd w:id="31"/>
       <w:r>
         <w:t>2.1.2. Chuỗi xử lý nhúng và trích xuất thủy vân DWT-DCT-QIM</w:t>
@@ -9896,7 +9896,7 @@
         <w:pStyle w:val="Heading3"/>
       </w:pPr>
       <w:bookmarkStart w:id="35" w:name="X8f21b7f9b4ca7a89c516ce99c97d095ae0a7c9b"/>
-      <w:bookmarkStart w:id="36" w:name="_Toc240377105"/>
+      <w:bookmarkStart w:id="36" w:name="_Toc240378341"/>
       <w:bookmarkEnd w:id="33"/>
       <w:r>
         <w:t>2.1.3. Số liệu thực nghiệm đo lường thật từ benchmark V1</w:t>
@@ -10102,7 +10102,7 @@
         <w:pStyle w:val="Heading3"/>
       </w:pPr>
       <w:bookmarkStart w:id="37" w:name="giới-hạn-kỹ-thuật-đã-nhận-diện"/>
-      <w:bookmarkStart w:id="38" w:name="_Toc240377106"/>
+      <w:bookmarkStart w:id="38" w:name="_Toc240378342"/>
       <w:bookmarkEnd w:id="35"/>
       <w:r>
         <w:t>2.1.4. Giới hạn kỹ thuật đã nhận diện</w:t>
@@ -10420,7 +10420,7 @@
         <w:pStyle w:val="Heading2"/>
       </w:pPr>
       <w:bookmarkStart w:id="39" w:name="X977abff2802fd0052c7bb64c3dd76a7236a21c1"/>
-      <w:bookmarkStart w:id="40" w:name="_Toc240377107"/>
+      <w:bookmarkStart w:id="40" w:name="_Toc240378343"/>
       <w:bookmarkEnd w:id="29"/>
       <w:bookmarkEnd w:id="37"/>
       <w:r>
@@ -10433,7 +10433,7 @@
         <w:pStyle w:val="Heading3"/>
       </w:pPr>
       <w:bookmarkStart w:id="41" w:name="kiến-trúc-thuật-toán-bán-dễ-vỡ-phân-tán"/>
-      <w:bookmarkStart w:id="42" w:name="_Toc240377108"/>
+      <w:bookmarkStart w:id="42" w:name="_Toc240378344"/>
       <w:r>
         <w:t>2.2.1. Kiến trúc thuật toán bán dễ vỡ phân tán</w:t>
       </w:r>
@@ -11019,7 +11019,7 @@
         <w:pStyle w:val="Heading3"/>
       </w:pPr>
       <w:bookmarkStart w:id="43" w:name="cơ-chế-xác-minh-và-định-vị"/>
-      <w:bookmarkStart w:id="44" w:name="_Toc240377109"/>
+      <w:bookmarkStart w:id="44" w:name="_Toc240378345"/>
       <w:bookmarkEnd w:id="41"/>
       <w:r>
         <w:t>2.2.2. Cơ chế xác minh và định vị</w:t>
@@ -11073,7 +11073,7 @@
         <w:pStyle w:val="Heading3"/>
       </w:pPr>
       <w:bookmarkStart w:id="45" w:name="số-liệu-đo-lường-thực-nghiệm-thật"/>
-      <w:bookmarkStart w:id="46" w:name="_Toc240377110"/>
+      <w:bookmarkStart w:id="46" w:name="_Toc240378346"/>
       <w:bookmarkEnd w:id="43"/>
       <w:r>
         <w:t>2.2.3. Số liệu đo lường thực nghiệm thật</w:t>
@@ -11476,7 +11476,7 @@
         <w:pStyle w:val="Heading3"/>
       </w:pPr>
       <w:bookmarkStart w:id="47" w:name="Xf9dc94f62311947b9e6b5d307672673c0cae5ce"/>
-      <w:bookmarkStart w:id="48" w:name="_Toc240377111"/>
+      <w:bookmarkStart w:id="48" w:name="_Toc240378347"/>
       <w:bookmarkEnd w:id="45"/>
       <w:r>
         <w:t>2.2.4. Giải thích nguyên nhân kỹ thuật và giới hạn thực nghiệm</w:t>
@@ -11647,7 +11647,7 @@
         <w:pStyle w:val="Heading1"/>
       </w:pPr>
       <w:bookmarkStart w:id="49" w:name="X93dc4866f1b906f867f417f7358c62b2eea4247"/>
-      <w:bookmarkStart w:id="50" w:name="_Toc240377112"/>
+      <w:bookmarkStart w:id="50" w:name="_Toc240378348"/>
       <w:bookmarkEnd w:id="27"/>
       <w:bookmarkEnd w:id="39"/>
       <w:bookmarkEnd w:id="47"/>
@@ -11661,7 +11661,7 @@
         <w:pStyle w:val="Heading2"/>
       </w:pPr>
       <w:bookmarkStart w:id="51" w:name="X77bb241011ad2959aacc0c18a6152971fec02b5"/>
-      <w:bookmarkStart w:id="52" w:name="_Toc240377113"/>
+      <w:bookmarkStart w:id="52" w:name="_Toc240378349"/>
       <w:r>
         <w:t>3.1. Ứng dụng chữ ký số trong bảo vệ thông tin truy vết</w:t>
       </w:r>
@@ -11672,7 +11672,7 @@
         <w:pStyle w:val="Heading3"/>
       </w:pPr>
       <w:bookmarkStart w:id="53" w:name="X93f43f39a15f2b2e9f1ab28406ed334a7faa634"/>
-      <w:bookmarkStart w:id="54" w:name="_Toc240377114"/>
+      <w:bookmarkStart w:id="54" w:name="_Toc240378350"/>
       <w:r>
         <w:t>3.1.1. Phân định ba cấp độ kiến trúc, không được đánh đồng với nhau</w:t>
       </w:r>
@@ -11941,7 +11941,7 @@
         <w:pStyle w:val="Heading3"/>
       </w:pPr>
       <w:bookmarkStart w:id="55" w:name="Xa8597b961700287943beef87fac9e21cd92c65e"/>
-      <w:bookmarkStart w:id="56" w:name="_Toc240377115"/>
+      <w:bookmarkStart w:id="56" w:name="_Toc240378351"/>
       <w:bookmarkEnd w:id="53"/>
       <w:r>
         <w:t>3.1.2. Kiến trúc hồ sơ toàn vẹn có chữ ký (signed manifest)</w:t>
@@ -12269,7 +12269,7 @@
         <w:pStyle w:val="Heading3"/>
       </w:pPr>
       <w:bookmarkStart w:id="57" w:name="Xfd66fde48663576034bdac7bc1475bfd74472d4"/>
-      <w:bookmarkStart w:id="58" w:name="_Toc240377116"/>
+      <w:bookmarkStart w:id="58" w:name="_Toc240378352"/>
       <w:bookmarkEnd w:id="55"/>
       <w:r>
         <w:t>3.1.3. Giải quyết “Mâu thuẫn giữa thủy vân số và chữ ký số”</w:t>
@@ -12877,7 +12877,7 @@
         <w:pStyle w:val="Heading3"/>
       </w:pPr>
       <w:bookmarkStart w:id="59" w:name="X0312fa8f0b5c3bf9d42aa6b97dc89cc58c0c60c"/>
-      <w:bookmarkStart w:id="60" w:name="_Toc240377117"/>
+      <w:bookmarkStart w:id="60" w:name="_Toc240378353"/>
       <w:bookmarkEnd w:id="57"/>
       <w:r>
         <w:t>3.1.4. Minh bạch ngữ nghĩa trạng thái trên production (</w:t>
@@ -13126,7 +13126,7 @@
         <w:pStyle w:val="Heading2"/>
       </w:pPr>
       <w:bookmarkStart w:id="61" w:name="X3d625d17d1f0504f98071dc287a38f8831705d6"/>
-      <w:bookmarkStart w:id="62" w:name="_Toc240377118"/>
+      <w:bookmarkStart w:id="62" w:name="_Toc240378354"/>
       <w:bookmarkEnd w:id="51"/>
       <w:bookmarkEnd w:id="59"/>
       <w:r>
@@ -13243,11 +13243,24 @@
         <w:pStyle w:val="Heading3"/>
       </w:pPr>
       <w:bookmarkStart w:id="63" w:name="X731dd5071b32ee17cfdf115e5fb1cc74bfa1fef"/>
-      <w:bookmarkStart w:id="64" w:name="_Toc240377119"/>
+      <w:bookmarkStart w:id="64" w:name="_Toc240378355"/>
       <w:r>
         <w:t>3.2.1. Ma trận so sánh: bảy tiêu chí trên sáu kỹ thuật</w:t>
       </w:r>
       <w:bookmarkEnd w:id="64"/>
+    </w:p>
+    <w:p>
+      <w:pPr>
+        <w:pStyle w:val="BodyText"/>
+      </w:pPr>
+    </w:p>
+    <w:p>
+      <w:pPr>
+        <w:pStyle w:val="BodyText"/>
+      </w:pPr>
+      <w:r>
+        <w:t>Bảng 3.1 đặt sáu kỹ thuật bảo vệ toàn vẹn cạnh nhau trên bảy tiêu chí an ninh.</w:t>
+      </w:r>
     </w:p>
     <w:p>
       <w:pPr>
@@ -13399,7 +13412,15 @@
                 <w:b/>
                 <w:bCs/>
               </w:rPr>
-              <w:t>1. Mục tiêu an ninh chính</w:t>
+              <w:t xml:space="preserve">1. Mục tiêu an </w:t>
+            </w:r>
+            <w:r>
+              <w:rPr>
+                <w:b/>
+                <w:bCs/>
+              </w:rPr>
+              <w:lastRenderedPageBreak/>
+              <w:t>ninh chính</w:t>
             </w:r>
           </w:p>
         </w:tc>
@@ -13413,7 +13434,12 @@
               <w:spacing w:line="240" w:lineRule="auto"/>
             </w:pPr>
             <w:r>
-              <w:t>Kiểm tra toàn vẹn bit thô (đối soát nguyên bản, phát hiện lỗi).</w:t>
+              <w:lastRenderedPageBreak/>
+              <w:t xml:space="preserve">Kiểm tra toàn vẹn bit thô (đối soát </w:t>
+            </w:r>
+            <w:r>
+              <w:lastRenderedPageBreak/>
+              <w:t>nguyên bản, phát hiện lỗi).</w:t>
             </w:r>
           </w:p>
         </w:tc>
@@ -13427,11 +13453,12 @@
               <w:spacing w:line="240" w:lineRule="auto"/>
             </w:pPr>
             <w:r>
-              <w:t xml:space="preserve">Xác thực nguồn gốc và tính toàn vẹn thông điệp giữa các bên </w:t>
-            </w:r>
-            <w:r>
               <w:lastRenderedPageBreak/>
-              <w:t>chia sẻ khóa.</w:t>
+              <w:t xml:space="preserve">Xác thực nguồn gốc và tính toàn </w:t>
+            </w:r>
+            <w:r>
+              <w:lastRenderedPageBreak/>
+              <w:t>vẹn thông điệp giữa các bên chia sẻ khóa.</w:t>
             </w:r>
           </w:p>
         </w:tc>
@@ -13446,7 +13473,11 @@
             </w:pPr>
             <w:r>
               <w:lastRenderedPageBreak/>
-              <w:t>Xác thực nguồn gốc phát hành, toàn vẹn bit, chống chối bỏ.</w:t>
+              <w:t xml:space="preserve">Xác thực nguồn gốc phát hành, </w:t>
+            </w:r>
+            <w:r>
+              <w:lastRenderedPageBreak/>
+              <w:t>toàn vẹn bit, chống chối bỏ.</w:t>
             </w:r>
           </w:p>
         </w:tc>
@@ -13460,11 +13491,12 @@
               <w:spacing w:line="240" w:lineRule="auto"/>
             </w:pPr>
             <w:r>
-              <w:t xml:space="preserve">Truy vết rò rỉ (traitor tracing), bảo vệ bản quyền qua kênh </w:t>
-            </w:r>
-            <w:r>
               <w:lastRenderedPageBreak/>
-              <w:t>có tổn hao.</w:t>
+              <w:t xml:space="preserve">Truy vết rò rỉ (traitor tracing), </w:t>
+            </w:r>
+            <w:r>
+              <w:lastRenderedPageBreak/>
+              <w:t>bảo vệ bản quyền qua kênh có tổn hao.</w:t>
             </w:r>
           </w:p>
         </w:tc>
@@ -13479,7 +13511,11 @@
             </w:pPr>
             <w:r>
               <w:lastRenderedPageBreak/>
-              <w:t>Phát hiện can thiệp và định vị vùng bị sửa đổi nội dung trên ảnh.</w:t>
+              <w:t xml:space="preserve">Phát hiện can thiệp và định vị vùng </w:t>
+            </w:r>
+            <w:r>
+              <w:lastRenderedPageBreak/>
+              <w:t>bị sửa đổi nội dung trên ảnh.</w:t>
             </w:r>
           </w:p>
         </w:tc>
@@ -13493,7 +13529,12 @@
               <w:spacing w:line="240" w:lineRule="auto"/>
             </w:pPr>
             <w:r>
-              <w:t>Giấu sự tồn tại của kênh liên lạc bí mật trong vật mang.</w:t>
+              <w:lastRenderedPageBreak/>
+              <w:t xml:space="preserve">Giấu sự tồn tại của kênh liên lạc bí </w:t>
+            </w:r>
+            <w:r>
+              <w:lastRenderedPageBreak/>
+              <w:t>mật trong vật mang.</w:t>
             </w:r>
           </w:p>
         </w:tc>
@@ -13735,11 +13776,11 @@
               <w:spacing w:line="240" w:lineRule="auto"/>
             </w:pPr>
             <w:r>
-              <w:t xml:space="preserve">Rất nhạy với thay đổi bit, có hiệu ứng thác lũ (avalanche effect): bất kỳ thay đổi nhỏ nào đều được kỳ vọng </w:t>
+              <w:t xml:space="preserve">Rất nhạy với thay đổi bit, có hiệu ứng thác lũ (avalanche effect): bất kỳ </w:t>
             </w:r>
             <w:r>
               <w:lastRenderedPageBreak/>
-              <w:t>về mặt thống kê sẽ tạo ra bản tóm lược (digest) khác biệt hoàn toàn.</w:t>
+              <w:t>thay đổi nhỏ nào đều được kỳ vọng về mặt thống kê sẽ tạo ra bản tóm lược (digest) khác biệt hoàn toàn.</w:t>
             </w:r>
           </w:p>
         </w:tc>
@@ -13754,11 +13795,11 @@
             </w:pPr>
             <w:r>
               <w:lastRenderedPageBreak/>
-              <w:t xml:space="preserve">Thay đổi thông điệp làm thẻ MAC hợp lệ cũ không còn xác minh được, dưới các giả định an toàn của hàm </w:t>
+              <w:t xml:space="preserve">Thay đổi thông điệp làm thẻ MAC hợp lệ cũ không còn xác minh được, </w:t>
             </w:r>
             <w:r>
               <w:lastRenderedPageBreak/>
-              <w:t>băm và HMAC.</w:t>
+              <w:t>dưới các giả định an toàn của hàm băm và HMAC.</w:t>
             </w:r>
           </w:p>
         </w:tc>
@@ -13773,7 +13814,11 @@
             </w:pPr>
             <w:r>
               <w:lastRenderedPageBreak/>
-              <w:t>Thay đổi biểu diễn được ký làm phép xác minh chữ ký số thất bại, dưới các giả định an toàn của thuật toán ký.</w:t>
+              <w:t xml:space="preserve">Thay đổi biểu diễn được ký làm phép xác minh chữ ký số thất bại, dưới các giả định </w:t>
+            </w:r>
+            <w:r>
+              <w:lastRenderedPageBreak/>
+              <w:t>an toàn của thuật toán ký.</w:t>
             </w:r>
           </w:p>
         </w:tc>
@@ -13787,6 +13832,7 @@
               <w:spacing w:line="240" w:lineRule="auto"/>
             </w:pPr>
             <w:r>
+              <w:lastRenderedPageBreak/>
               <w:t>Rất thấp (chống chịu biến đổi tín hiệu trong ngưỡng thiết kế).</w:t>
             </w:r>
           </w:p>
@@ -14007,7 +14053,11 @@
               <w:spacing w:line="240" w:lineRule="auto"/>
             </w:pPr>
             <w:r>
-              <w:t>Cặp khóa bất đối xứng (Private/Public). Phân phối qua PKI CA, pinning hoặc Web of Trust.</w:t>
+              <w:t xml:space="preserve">Cặp khóa bất đối xứng (Private/Public). Phân phối qua PKI CA, pinning hoặc </w:t>
+            </w:r>
+            <w:r>
+              <w:lastRenderedPageBreak/>
+              <w:t>Web of Trust.</w:t>
             </w:r>
           </w:p>
         </w:tc>
@@ -14021,7 +14071,12 @@
               <w:spacing w:line="240" w:lineRule="auto"/>
             </w:pPr>
             <w:r>
-              <w:t>Có thể dùng khóa/seed tùy thiết kế; SplitBind dùng secret seed/key để chọn vị trí nhúng.</w:t>
+              <w:lastRenderedPageBreak/>
+              <w:t xml:space="preserve">Có thể dùng khóa/seed tùy thiết kế; SplitBind dùng secret seed/key để chọn </w:t>
+            </w:r>
+            <w:r>
+              <w:lastRenderedPageBreak/>
+              <w:t>vị trí nhúng.</w:t>
             </w:r>
           </w:p>
         </w:tc>
@@ -14035,6 +14090,7 @@
               <w:spacing w:line="240" w:lineRule="auto"/>
             </w:pPr>
             <w:r>
+              <w:lastRenderedPageBreak/>
               <w:t>Khóa đối xứng HMAC tạo thẻ và khóa định tuyến đối tác (ring key).</w:t>
             </w:r>
           </w:p>
@@ -14049,7 +14105,11 @@
               <w:spacing w:line="240" w:lineRule="auto"/>
             </w:pPr>
             <w:r>
-              <w:t>Có thể dùng stego-key tùy lược đồ; cũng tồn tại phương pháp không dùng khóa.</w:t>
+              <w:t xml:space="preserve">Có thể dùng stego-key tùy lược đồ; cũng tồn tại phương pháp không </w:t>
+            </w:r>
+            <w:r>
+              <w:lastRenderedPageBreak/>
+              <w:t>dùng khóa.</w:t>
             </w:r>
           </w:p>
         </w:tc>
@@ -14069,15 +14129,8 @@
                 <w:b/>
                 <w:bCs/>
               </w:rPr>
-              <w:t xml:space="preserve">7. Giá trị pháp lý / </w:t>
-            </w:r>
-            <w:r>
-              <w:rPr>
-                <w:b/>
-                <w:bCs/>
-              </w:rPr>
               <w:lastRenderedPageBreak/>
-              <w:t>chống chối bỏ</w:t>
+              <w:t>7. Giá trị pháp lý / chống chối bỏ</w:t>
             </w:r>
           </w:p>
         </w:tc>
@@ -14091,12 +14144,7 @@
               <w:spacing w:line="240" w:lineRule="auto"/>
             </w:pPr>
             <w:r>
-              <w:lastRenderedPageBreak/>
-              <w:t xml:space="preserve">Không có tính </w:t>
-            </w:r>
-            <w:r>
-              <w:lastRenderedPageBreak/>
-              <w:t>chứng thực nguồn gốc hay chống chối bỏ.</w:t>
+              <w:t>Không có tính chứng thực nguồn gốc hay chống chối bỏ.</w:t>
             </w:r>
           </w:p>
         </w:tc>
@@ -14110,12 +14158,7 @@
               <w:spacing w:line="240" w:lineRule="auto"/>
             </w:pPr>
             <w:r>
-              <w:lastRenderedPageBreak/>
-              <w:t xml:space="preserve">Không có tính </w:t>
-            </w:r>
-            <w:r>
-              <w:lastRenderedPageBreak/>
-              <w:t>chống chối bỏ (bên nhận có cùng khóa có thể tự tạo MAC).</w:t>
+              <w:t>Không có tính chống chối bỏ (bên nhận có cùng khóa có thể tự tạo MAC).</w:t>
             </w:r>
           </w:p>
         </w:tc>
@@ -14129,12 +14172,7 @@
               <w:spacing w:line="240" w:lineRule="auto"/>
             </w:pPr>
             <w:r>
-              <w:lastRenderedPageBreak/>
-              <w:t xml:space="preserve">Cung cấp tính </w:t>
-            </w:r>
-            <w:r>
-              <w:lastRenderedPageBreak/>
-              <w:t>chống chối bỏ mật mã học; giá trị pháp lý phụ thuộc quản lý khóa và luật sở tại.</w:t>
+              <w:t>Cung cấp tính chống chối bỏ mật mã học; giá trị pháp lý phụ thuộc quản lý khóa và luật sở tại.</w:t>
             </w:r>
           </w:p>
         </w:tc>
@@ -14148,12 +14186,7 @@
               <w:spacing w:line="240" w:lineRule="auto"/>
             </w:pPr>
             <w:r>
-              <w:lastRenderedPageBreak/>
-              <w:t xml:space="preserve">Bằng chứng kỹ </w:t>
-            </w:r>
-            <w:r>
-              <w:lastRenderedPageBreak/>
-              <w:t>thuật hỗ trợ điều tra số nội bộ; cần bằng chứng bổ trợ.</w:t>
+              <w:t>Bằng chứng kỹ thuật hỗ trợ điều tra số nội bộ; cần bằng chứng bổ trợ.</w:t>
             </w:r>
           </w:p>
         </w:tc>
@@ -14167,12 +14200,7 @@
               <w:spacing w:line="240" w:lineRule="auto"/>
             </w:pPr>
             <w:r>
-              <w:lastRenderedPageBreak/>
-              <w:t xml:space="preserve">Bằng chứng kỹ </w:t>
-            </w:r>
-            <w:r>
-              <w:lastRenderedPageBreak/>
-              <w:t>thuật định vị vùng sửa đổi phục vụ giám định số.</w:t>
+              <w:t>Bằng chứng kỹ thuật định vị vùng sửa đổi phục vụ giám định số.</w:t>
             </w:r>
           </w:p>
         </w:tc>
@@ -14186,12 +14214,7 @@
               <w:spacing w:line="240" w:lineRule="auto"/>
             </w:pPr>
             <w:r>
-              <w:lastRenderedPageBreak/>
-              <w:t xml:space="preserve">Không có giá trị </w:t>
-            </w:r>
-            <w:r>
-              <w:lastRenderedPageBreak/>
-              <w:t>chứng cứ pháp lý công khai.</w:t>
+              <w:t>Không có giá trị chứng cứ pháp lý công khai.</w:t>
             </w:r>
           </w:p>
         </w:tc>
@@ -14202,10 +14225,9 @@
         <w:pStyle w:val="Heading3"/>
       </w:pPr>
       <w:bookmarkStart w:id="65" w:name="Xe7db50e2b15f38fb2460a20c566d37b6de66f7f"/>
-      <w:bookmarkStart w:id="66" w:name="_Toc240377120"/>
+      <w:bookmarkStart w:id="66" w:name="_Toc240378356"/>
       <w:bookmarkEnd w:id="63"/>
       <w:r>
-        <w:lastRenderedPageBreak/>
         <w:t>3.2.2. Phân tích tương phản chuyên sâu giữa các cặp kỹ thuật</w:t>
       </w:r>
       <w:bookmarkEnd w:id="66"/>
@@ -14289,11 +14311,11 @@
         <w:t>Thủy vân số:</w:t>
       </w:r>
       <w:r>
-        <w:t xml:space="preserve"> Sự tồn tại của thủy vân có thể được công bố công khai. Mục tiêu tối thượng là gắn chặt thông điệp vào vật mang; thuật toán được thiết kế để gây khó khăn tối đa cho kẻ tấn công khi cố loại bỏ thủy vân mà không làm suy giảm nghiêm trọng giá trị sử dụng của vật </w:t>
+        <w:t xml:space="preserve"> Sự tồn tại của thủy vân có thể được công bố công khai. Mục tiêu tối thượng là gắn chặt thông điệp vào vật mang; thuật toán </w:t>
       </w:r>
       <w:r>
         <w:lastRenderedPageBreak/>
-        <w:t>mang trong ngưỡng thiết kế xác định. Tuy nhiên, không có thủy vân nào mặc nhiên bất khả xóa trong mọi điều kiện tấn công tùy ý.</w:t>
+        <w:t>được thiết kế để gây khó khăn tối đa cho kẻ tấn công khi cố loại bỏ thủy vân mà không làm suy giảm nghiêm trọng giá trị sử dụng của vật mang trong ngưỡng thiết kế xác định. Tuy nhiên, không có thủy vân nào mặc nhiên bất khả xóa trong mọi điều kiện tấn công tùy ý.</w:t>
       </w:r>
     </w:p>
     <w:p>
@@ -14358,7 +14380,7 @@
         <w:pStyle w:val="Heading1"/>
       </w:pPr>
       <w:bookmarkStart w:id="69" w:name="X9841bc93db205883626cadedc2ca5d988da25b0"/>
-      <w:bookmarkStart w:id="70" w:name="_Toc240377121"/>
+      <w:bookmarkStart w:id="70" w:name="_Toc240378357"/>
       <w:bookmarkEnd w:id="49"/>
       <w:bookmarkEnd w:id="61"/>
       <w:bookmarkEnd w:id="65"/>
@@ -14374,7 +14396,7 @@
         <w:pStyle w:val="Heading2"/>
       </w:pPr>
       <w:bookmarkStart w:id="71" w:name="kiến-trúc-và-cách-xây-dựng-hệ-thống"/>
-      <w:bookmarkStart w:id="72" w:name="_Toc240377122"/>
+      <w:bookmarkStart w:id="72" w:name="_Toc240378358"/>
       <w:r>
         <w:t>4.1. Kiến trúc và cách xây dựng hệ thống</w:t>
       </w:r>
@@ -14385,7 +14407,7 @@
         <w:pStyle w:val="Heading3"/>
       </w:pPr>
       <w:bookmarkStart w:id="73" w:name="sơ-đồ-kiến-trúc-hệ-thống-splitbind"/>
-      <w:bookmarkStart w:id="74" w:name="_Toc240377123"/>
+      <w:bookmarkStart w:id="74" w:name="_Toc240378359"/>
       <w:r>
         <w:t>4.1.1. Sơ đồ kiến trúc hệ thống SplitBind</w:t>
       </w:r>
@@ -14476,7 +14498,7 @@
         <w:pStyle w:val="Heading3"/>
       </w:pPr>
       <w:bookmarkStart w:id="75" w:name="hai-quy-trình-nghiệp-vụ-cốt-lõi"/>
-      <w:bookmarkStart w:id="76" w:name="_Toc240377124"/>
+      <w:bookmarkStart w:id="76" w:name="_Toc240378360"/>
       <w:bookmarkEnd w:id="73"/>
       <w:r>
         <w:t>4.1.2. Hai quy trình nghiệp vụ cốt lõi</w:t>
@@ -14652,7 +14674,10 @@
         <w:t>SB1-</w:t>
       </w:r>
       <w:r>
-        <w:t xml:space="preserve"> ghép với 20 ký tự đầu của mã cấp phát mã hoá base32 thay cho thủy vân ẩn. Đây là đường dự phòng, không phải cấu hình đang chạy trên môi trường production.</w:t>
+        <w:t xml:space="preserve"> ghép với 20 ký tự đầu của mã cấp phát mã hoá base32 thay cho thủy vân ẩn. Đây là đường dự phòng, </w:t>
+      </w:r>
+      <w:r>
+        <w:t>không phải cấu hình đang chạy trên môi trường production. Hình 4.2 là màn hình cấp phát của hệ thống đang vận hành.</w:t>
       </w:r>
     </w:p>
     <w:p>
@@ -14835,7 +14860,10 @@
         <w:t>NO_WATERMARK</w:t>
       </w:r>
       <w:r>
-        <w:t xml:space="preserve"> khi không tìm được nguồn nào.</w:t>
+        <w:t xml:space="preserve"> </w:t>
+      </w:r>
+      <w:r>
+        <w:t>khi không tìm được nguồn nào. Hình 4.3 là kết quả khi tệp khớp bản cấp phát, Hình 4.4 là kết quả khi không tìm được bản cấp phát nào trùng mã băm.</w:t>
       </w:r>
     </w:p>
     <w:p>
@@ -14994,7 +15022,7 @@
         <w:pStyle w:val="Heading2"/>
       </w:pPr>
       <w:bookmarkStart w:id="77" w:name="kết-quả-thực-nghiệm"/>
-      <w:bookmarkStart w:id="78" w:name="_Toc240377125"/>
+      <w:bookmarkStart w:id="78" w:name="_Toc240378361"/>
       <w:bookmarkEnd w:id="71"/>
       <w:bookmarkEnd w:id="75"/>
       <w:r>
@@ -16096,7 +16124,7 @@
         <w:pStyle w:val="Heading3"/>
       </w:pPr>
       <w:bookmarkStart w:id="79" w:name="X945e946a6bb16552800ca0d5e17c450b179f4c4"/>
-      <w:bookmarkStart w:id="80" w:name="_Toc240377126"/>
+      <w:bookmarkStart w:id="80" w:name="_Toc240378362"/>
       <w:r>
         <w:t>4.2.1. Kết quả đo thế hệ V3, bổ sung chứ không thay thế bộ số liệu V1 đã khoá</w:t>
       </w:r>
@@ -16271,6 +16299,19 @@
       </w:r>
       <w:r>
         <w:t>.</w:t>
+      </w:r>
+    </w:p>
+    <w:p>
+      <w:pPr>
+        <w:pStyle w:val="BodyText"/>
+      </w:pPr>
+    </w:p>
+    <w:p>
+      <w:pPr>
+        <w:pStyle w:val="BodyText"/>
+      </w:pPr>
+      <w:r>
+        <w:t>Bảng 4.2 đối chiếu hai thế hệ trên cùng một bộ trang mẫu, Hình 4.5 vẽ lại cùng số liệu đó.</w:t>
       </w:r>
     </w:p>
     <w:p>
@@ -16854,6 +16895,7 @@
           <w:b/>
           <w:bCs/>
         </w:rPr>
+        <w:lastRenderedPageBreak/>
         <w:t>Phép so sánh này có kiểm soát.</w:t>
       </w:r>
       <w:r>
@@ -16866,11 +16908,7 @@
         <w:t>e5837cd446ab9c9959ba3fc4b85d205ec9d80e91efc6f801d139810b088a77ef</w:t>
       </w:r>
       <w:r>
-        <w:t xml:space="preserve">, cùng định nghĩa cổng (JPEG-70 và resize-0.75 tối thiểu 0.95, crop-0.25 tối thiểu 0.90, </w:t>
-      </w:r>
-      <w:r>
-        <w:lastRenderedPageBreak/>
-        <w:t>quần thể chất lượng đúng 12) và cùng mẫu số 12 cặp ứng viên/trang dương tính. Do đó chênh lệch quy được cho thế hệ thuật toán, không phải do đổi tập dữ liệu hay đổi cách đo.</w:t>
+        <w:t>, cùng định nghĩa cổng (JPEG-70 và resize-0.75 tối thiểu 0.95, crop-0.25 tối thiểu 0.90, quần thể chất lượng đúng 12) và cùng mẫu số 12 cặp ứng viên/trang dương tính. Do đó chênh lệch quy được cho thế hệ thuật toán, không phải do đổi tập dữ liệu hay đổi cách đo.</w:t>
       </w:r>
     </w:p>
     <w:p>
@@ -16912,7 +16950,10 @@
         <w:pStyle w:val="FirstParagraph"/>
       </w:pPr>
       <w:r>
-        <w:t>Đọc 9/12 thành “V3 sống sót 75% trước JPEG-70” là sai. Phân rã 88 hàng của ứng viên tốt nhất theo trang bị trượt:</w:t>
+        <w:t xml:space="preserve">Đọc 9/12 thành “V3 sống sót 75% trước JPEG-70” là sai. Phân rã 88 hàng của ứng viên tốt nhất </w:t>
+      </w:r>
+      <w:r>
+        <w:t>theo trang bị trượt nêu trong Bảng 4.3.</w:t>
       </w:r>
     </w:p>
     <w:p>
@@ -17265,6 +17306,7 @@
         <w:jc w:val="left"/>
       </w:pPr>
       <w:r>
+        <w:lastRenderedPageBreak/>
         <w:t xml:space="preserve">Cả 3 trang trượt của </w:t>
       </w:r>
       <w:r>
@@ -17328,7 +17370,6 @@
         <w:jc w:val="left"/>
       </w:pPr>
       <w:r>
-        <w:lastRenderedPageBreak/>
         <w:t xml:space="preserve">Phát biểu đúng là: dưới JPEG-70 và cắt cúp trung tâm 0.25, V3 giải mã đúng bằng mức nó đạt được trên kênh không bị tấn công - không mất thêm hàng nào. Khoảng trống 3/12 còn lại là giới hạn đặt tile và độ phủ phiếu trên một fixture đa trang, không phải thiệt hại do nén hay cắt cúp. Chỉ Resize-0.75 gây thiệt hại tấn công thật sự, và đúng một hàng: </w:t>
       </w:r>
       <w:r>
@@ -17401,7 +17442,7 @@
         <w:pStyle w:val="FirstParagraph"/>
       </w:pPr>
       <w:r>
-        <w:t>Đo trên toàn bộ 352 hàng:</w:t>
+        <w:t>Bảng 4.4 đo trên toàn bộ 352 hàng.</w:t>
       </w:r>
     </w:p>
     <w:p>
@@ -17707,6 +17748,7 @@
               <w:spacing w:line="240" w:lineRule="auto"/>
             </w:pPr>
             <w:r>
+              <w:lastRenderedPageBreak/>
               <w:t>Tệp tạm ghi ra đĩa (MiB)</w:t>
             </w:r>
           </w:p>
@@ -17788,7 +17830,10 @@
         <w:pStyle w:val="BodyText"/>
       </w:pPr>
       <w:r>
-        <w:t>Chất lượng ảnh sau khi nhúng, đo trên 192 hàng có PSNR hữu hạn bằng cách so ảnh gốc với ảnh đã nhúng thủy vân trước khi tấn công, thang dữ liệu 255:</w:t>
+        <w:t xml:space="preserve">Chất lượng ảnh sau khi nhúng, đo trên 192 hàng có PSNR hữu hạn bằng cách so ảnh gốc với ảnh đã nhúng thủy vân </w:t>
+      </w:r>
+      <w:r>
+        <w:t>trước khi tấn công, thang dữ liệu 255, nêu trong Bảng 4.5.</w:t>
       </w:r>
     </w:p>
     <w:p>
@@ -17800,7 +17845,6 @@
           <w:b/>
           <w:bCs/>
         </w:rPr>
-        <w:lastRenderedPageBreak/>
         <w:t>Bảng 4.5:</w:t>
       </w:r>
       <w:r>
@@ -18085,7 +18129,11 @@
         </w:numPr>
       </w:pPr>
       <w:r>
-        <w:t>Không slide hay đoạn báo cáo nào được mô tả V3 như năng lực đã phát hành. Cần phân biệt hai mốc: ở thời điểm lần chạy này (06/09/2026), bản đang chạy trên production là Integrity Release 0.1, chỉ xác thực toàn vẹn tệp chính xác và không nhúng thủy vân ở bất kỳ thế hệ nào. Từ 12/09/2026, bản đang chạy có nhúng và có đọc thủy vân, nhưng là thế hệ V2 chứ không phải V3 (Mục 4.2.3 và 4.2.4). Nói cách khác, các con số trong mục này vẫn không phải số liệu của bản đang chạy.</w:t>
+        <w:t xml:space="preserve">Không slide hay đoạn báo cáo nào được mô tả V3 như năng lực đã phát hành. Cần phân biệt hai mốc: ở thời điểm lần chạy này (06/09/2026), bản đang chạy trên production là Integrity Release 0.1, chỉ xác thực toàn vẹn tệp chính xác và không nhúng thủy vân ở bất kỳ thế hệ nào. Từ 12/09/2026, bản </w:t>
+      </w:r>
+      <w:r>
+        <w:lastRenderedPageBreak/>
+        <w:t>đang chạy có nhúng và có đọc thủy vân, nhưng là thế hệ V2 chứ không phải V3 (Mục 4.2.3 và 4.2.4). Nói cách khác, các con số trong mục này vẫn không phải số liệu của bản đang chạy.</w:t>
       </w:r>
     </w:p>
     <w:p>
@@ -18105,11 +18153,10 @@
         <w:pStyle w:val="Heading3"/>
       </w:pPr>
       <w:bookmarkStart w:id="85" w:name="X9e5117aed0b98f2ae84f72360c6c1c707755942"/>
-      <w:bookmarkStart w:id="86" w:name="_Toc240377127"/>
+      <w:bookmarkStart w:id="86" w:name="_Toc240378363"/>
       <w:bookmarkEnd w:id="79"/>
       <w:bookmarkEnd w:id="84"/>
       <w:r>
-        <w:lastRenderedPageBreak/>
         <w:t>4.2.2. Định vị kết quả của nhóm so với các công trình mã nguồn mở</w:t>
       </w:r>
       <w:bookmarkEnd w:id="86"/>
@@ -18514,6 +18561,7 @@
               <w:spacing w:line="240" w:lineRule="auto"/>
             </w:pPr>
             <w:r>
+              <w:lastRenderedPageBreak/>
               <w:t>Meta PixelSeal (BCH 40)</w:t>
             </w:r>
           </w:p>
@@ -18746,7 +18794,6 @@
                 <w:b/>
                 <w:bCs/>
               </w:rPr>
-              <w:lastRenderedPageBreak/>
               <w:t>SplitBind V3</w:t>
             </w:r>
           </w:p>
@@ -18974,6 +19021,7 @@
               <w:spacing w:line="240" w:lineRule="auto"/>
             </w:pPr>
             <w:r>
+              <w:lastRenderedPageBreak/>
               <w:t>Phép tấn công</w:t>
             </w:r>
           </w:p>
@@ -19285,7 +19333,6 @@
         <w:pStyle w:val="BodyText"/>
       </w:pPr>
       <w:r>
-        <w:lastRenderedPageBreak/>
         <w:t>Kết quả tách bạch hai loại thất bại vốn bị gộp chung dưới nhãn “thủy vân không đủ bền”:</w:t>
       </w:r>
     </w:p>
@@ -19403,6 +19450,7 @@
           <w:b/>
           <w:bCs/>
         </w:rPr>
+        <w:lastRenderedPageBreak/>
         <w:t>Bảng 4.8:</w:t>
       </w:r>
       <w:r>
@@ -19953,7 +20001,6 @@
         <w:pStyle w:val="BodyText"/>
       </w:pPr>
       <w:r>
-        <w:lastRenderedPageBreak/>
         <w:t>Khả năng sống sót qua nén JPEG không đơn điệu theo bước lượng tử, trong khi độ trung thực suy giảm 13 dB trên toàn dải quét. Một cơ sở mã nguồn hoàn toàn khác, chạy trên vật mang của chính dự án, tái lập đúng kết luận mà nhóm đã rút ra sau ba thế hệ thuật toán: bước lượng tử không phải là đòn bẩy cần kéo. Ngược lại, cột chuẩn hóa khung giữ nguyên 1.000 ở mọi cường độ, tức Loại A được giải triệt để mà không phải trả bất kỳ chi phí trung thực nào.</w:t>
       </w:r>
     </w:p>
@@ -20026,7 +20073,11 @@
         <w:t xml:space="preserve"> </w:t>
       </w:r>
       <w:r>
-        <w:t>dò vét 200 mốc tỉ lệ trong dải 0.5 đến 2.0 bằng tương quan chuẩn hóa, và hàm ước lượng tham số cắt của nó còn đòi hỏi ảnh gốc. SplitBind giữ hồ sơ cấp phát nên có thể render lại trang gốc bất kỳ lúc nào; thứ mà thư viện phải đoán thì hệ thống của nhóm chỉ việc tra ra.</w:t>
+        <w:t xml:space="preserve">dò vét 200 mốc tỉ lệ trong dải 0.5 đến 2.0 bằng tương quan chuẩn hóa, và hàm ước lượng tham số cắt của nó còn đòi hỏi ảnh gốc. SplitBind giữ hồ sơ cấp </w:t>
+      </w:r>
+      <w:r>
+        <w:lastRenderedPageBreak/>
+        <w:t>phát nên có thể render lại trang gốc bất kỳ lúc nào; thứ mà thư viện phải đoán thì hệ thống của nhóm chỉ việc tra ra.</w:t>
       </w:r>
     </w:p>
     <w:p>
@@ -20058,7 +20109,6 @@
         <w:pStyle w:val="FirstParagraph"/>
       </w:pPr>
       <w:r>
-        <w:lastRenderedPageBreak/>
         <w:t>Một quan sát bổ sung đáng lưu ý cho tầng sửa lỗi: PixelSeal đạt 0% khôi phục chính xác khi không bật biến thể mã sửa lỗi BCH, và 89 đến 94% khi bật. Dưới tiêu chí khớp payload tuyệt đối, mã sửa lỗi không phải phần tô điểm thêm lên một bộ giải mã đã hoạt động, mà là điều kiện làm cho khôi phục chính xác trở nên khả thi. Kết luận này cần được đặt cạnh tầng Reed-Solomon 23 sang 39 byte của SplitBind trước khi quy bất kỳ thất bại nào cho cường độ nhúng.</w:t>
       </w:r>
     </w:p>
@@ -20085,7 +20135,7 @@
         <w:pStyle w:val="Heading3"/>
       </w:pPr>
       <w:bookmarkStart w:id="92" w:name="X62980232c1274514aff6c8d65887e138697f9f6"/>
-      <w:bookmarkStart w:id="93" w:name="_Toc240377128"/>
+      <w:bookmarkStart w:id="93" w:name="_Toc240378364"/>
       <w:bookmarkEnd w:id="85"/>
       <w:bookmarkEnd w:id="91"/>
       <w:r>
@@ -20120,6 +20170,7 @@
         <w:pStyle w:val="BodyText"/>
       </w:pPr>
       <w:r>
+        <w:lastRenderedPageBreak/>
         <w:t>Ngày 12/09/2026 nhóm đưa phân hệ thủy vân lên chính hệ thống đang vận hành, thay vì chỉ đo trong phòng thí nghiệm. Mỗi bản cấp phát nhúng thủy vân V2 vào biểu diễn ảnh trang, mỗi lần xác minh chạy bộ giải mã. Mục đích không phải công bố một năng lực mới mà để trả lời một câu hỏi mà benchmark không trả lời được: khi rời khỏi harness nghiên cứu, thuật toán còn làm được gì?</w:t>
       </w:r>
     </w:p>
@@ -20192,7 +20243,6 @@
               <w:spacing w:line="240" w:lineRule="auto"/>
             </w:pPr>
             <w:r>
-              <w:lastRenderedPageBreak/>
               <w:t>Hình học trang</w:t>
             </w:r>
           </w:p>
@@ -20651,6 +20701,7 @@
         <w:pStyle w:val="BodyText"/>
       </w:pPr>
       <w:r>
+        <w:lastRenderedPageBreak/>
         <w:t>Thứ hai, bản A4 chưa hề bị đụng vào cũng không giải được. A4 chính là khổ tài liệu thật mà sản phẩm phục vụ.</w:t>
       </w:r>
     </w:p>
@@ -20692,7 +20743,6 @@
         <w:rPr>
           <w:rStyle w:val="VerbatimChar"/>
         </w:rPr>
-        <w:lastRenderedPageBreak/>
         <w:t>splitbind_bench/runner.py</w:t>
       </w:r>
       <w:r>
@@ -20769,6 +20819,7 @@
           <w:b/>
           <w:bCs/>
         </w:rPr>
+        <w:lastRenderedPageBreak/>
         <w:t>Bảng 4.10:</w:t>
       </w:r>
       <w:r>
@@ -21151,7 +21202,6 @@
         <w:jc w:val="left"/>
       </w:pPr>
       <w:r>
-        <w:lastRenderedPageBreak/>
         <w:t xml:space="preserve">“Một phần” là </w:t>
       </w:r>
       <w:r>
@@ -21221,6 +21271,7 @@
       <w:bookmarkStart w:id="97" w:name="hệ-quả-cho-kiến-trúc-v4"/>
       <w:bookmarkEnd w:id="96"/>
       <w:r>
+        <w:lastRenderedPageBreak/>
         <w:t>4.2.3.4. Hệ quả cho kiến trúc V4</w:t>
       </w:r>
     </w:p>
@@ -21253,7 +21304,6 @@
         <w:pStyle w:val="BodyText"/>
       </w:pPr>
       <w:r>
-        <w:lastRenderedPageBreak/>
         <w:t>Và tiêu chí nghiệm thu phải đổi: mọi cổng phát hành về sau phải đo trên corpus gồm trang văn bản render từ PDF thật, không phải ảnh chuyển sắc hay hình vector. Một con số đo trên vật mang không đại diện là một con số không dùng được, dù quy mô benchmark có lớn đến đâu.</w:t>
       </w:r>
     </w:p>
@@ -21295,7 +21345,7 @@
         <w:pStyle w:val="Heading3"/>
       </w:pPr>
       <w:bookmarkStart w:id="99" w:name="Xaa3cbbd97bf041b76ccecd0af2f6ed2d1419554"/>
-      <w:bookmarkStart w:id="100" w:name="_Toc240377129"/>
+      <w:bookmarkStart w:id="100" w:name="_Toc240378365"/>
       <w:bookmarkEnd w:id="92"/>
       <w:bookmarkEnd w:id="98"/>
       <w:r>
@@ -21340,6 +21390,7 @@
         <w:pStyle w:val="BodyText"/>
       </w:pPr>
       <w:r>
+        <w:lastRenderedPageBreak/>
         <w:t>Hai ngày 13 và 14/09/2026 nhóm tiếp tục điều tra kết quả âm tính ở Mục 4.2.3 và tìm được nguyên nhân gốc thứ ba. Kết quả buộc nhóm rút lại một phần chẩn đoán đã công bố ở Mục 4.2.3.3. Nhóm giữ lại cả hai phiên bản trong báo cáo vì quá trình tự bác bỏ là một phần của đóng góp, và vì việc xoá đi một chẩn đoán sai sẽ khiến người đọc không kiểm chứng được đường đi của lập luận.</w:t>
       </w:r>
     </w:p>
@@ -21374,11 +21425,7 @@
         <w:t>guofei9987/blind_watermark</w:t>
       </w:r>
       <w:r>
-        <w:t xml:space="preserve"> làm: lượng tử hoá giá trị kỳ dị lớn nhất của mỗi khối, thay vì lượng tử hoá hiệu hai hệ số DCT như thiết kế đang dùng. </w:t>
-      </w:r>
-      <w:r>
-        <w:lastRenderedPageBreak/>
-        <w:t>Hai vật mang dùng chung cách chọn vị trí, cách lặp và cách đếm ký hiệu bị khai là xoá, nên chỉ khác đúng đại lượng được lượng tử hoá.</w:t>
+        <w:t xml:space="preserve"> làm: lượng tử hoá giá trị kỳ dị lớn nhất của mỗi khối, thay vì lượng tử hoá hiệu hai hệ số DCT như thiết kế đang dùng. Hai vật mang dùng chung cách chọn vị trí, cách lặp và cách đếm ký hiệu bị khai là xoá, nên chỉ khác đúng đại lượng được lượng tử hoá.</w:t>
       </w:r>
     </w:p>
     <w:p>
@@ -21386,7 +21433,10 @@
         <w:pStyle w:val="BodyText"/>
       </w:pPr>
       <w:r>
-        <w:t>Đo trên cùng một ô (tile) 512 px kiểu trang văn bản, cùng một từ mã, độ chính xác bit sau một vòng thu nhỏ rồi phóng lại. Đây là kích thước ô của bộ khung thực nghiệm V3; hồ sơ tham số đang chạy trên dịch vụ dùng ô 384 px, nên con số dưới đây mô tả vật mang chứ không mô tả sản phẩm:</w:t>
+        <w:t xml:space="preserve">Đo trên cùng một ô (tile) 512 px kiểu trang văn bản, cùng một từ mã, độ chính xác bit sau một vòng thu nhỏ rồi phóng lại. Đây là kích thước ô của bộ khung thực nghiệm V3; hồ sơ tham số đang chạy trên dịch vụ dùng ô 384 px, </w:t>
+      </w:r>
+      <w:r>
+        <w:t>nên con số ở Bảng 4.11 mô tả vật mang chứ không mô tả sản phẩm.</w:t>
       </w:r>
     </w:p>
     <w:p>
@@ -21693,7 +21743,11 @@
               <w:spacing w:line="240" w:lineRule="auto"/>
             </w:pPr>
             <w:r>
-              <w:t>Giá trị kỳ dị lớn nhất (kiểu blind_watermark)</w:t>
+              <w:t xml:space="preserve">Giá trị kỳ dị lớn nhất </w:t>
+            </w:r>
+            <w:r>
+              <w:lastRenderedPageBreak/>
+              <w:t>(kiểu blind_watermark)</w:t>
             </w:r>
           </w:p>
         </w:tc>
@@ -21707,6 +21761,7 @@
               <w:spacing w:line="240" w:lineRule="auto"/>
             </w:pPr>
             <w:r>
+              <w:lastRenderedPageBreak/>
               <w:t>50.27</w:t>
             </w:r>
           </w:p>
@@ -21834,7 +21889,6 @@
       <w:bookmarkStart w:id="102" w:name="X31af38327ab66bcaa102546184020961156e248"/>
       <w:bookmarkEnd w:id="101"/>
       <w:r>
-        <w:lastRenderedPageBreak/>
         <w:t>4.2.4.2. Nguyên nhân gốc thứ ba: bên nhận tự xoá nhiều hơn mức mã sửa được</w:t>
       </w:r>
     </w:p>
@@ -21948,6 +22002,7 @@
         <w:pStyle w:val="BodyText"/>
       </w:pPr>
       <w:r>
+        <w:lastRenderedPageBreak/>
         <w:t>Cách sửa nằm ở bên nhận, không phải ở vật mang. Hệ thống xếp các vị trí byte theo độ tin cậy từ thấp đến cao, rồi thử lần lượt các ngưỡng 16, 12, 8, 4 và 0 ký hiệu xoá, lấy khai báo ban đầu trước tiên. Mã kiểm CRC của payload xác thực từng lần thử, nên một tập xoá lỏng hơn không thể tạo ra một danh tính giả. Không đổi khâu nhúng, không đổi định danh profile, không phải cấp phát lại tài liệu cũ.</w:t>
       </w:r>
     </w:p>
@@ -21973,7 +22028,6 @@
       <w:bookmarkStart w:id="103" w:name="X741b01e9c407d2ec7e7014c32c4d57e40a45a75"/>
       <w:bookmarkEnd w:id="102"/>
       <w:r>
-        <w:lastRenderedPageBreak/>
         <w:t>4.2.4.3. Ca ảnh chụp màn hình: cần đủ cả hai mảnh ghép</w:t>
       </w:r>
     </w:p>
@@ -21999,7 +22053,10 @@
         <w:t>research/python/scripts/run_v5_envelope.py</w:t>
       </w:r>
       <w:r>
-        <w:t>), chia vừa đúng 3 x 6 = 18 ô; khung chuẩn của dịch vụ đang chạy là 1152 x 2304. Đó là lý do nó nằm đúng bên thua của vách xoá nói trên. Cùng một trang, cùng khoá, cùng profile, sau khi sửa ngân sách xoá:</w:t>
+        <w:t xml:space="preserve">), chia vừa đúng 3 x 6 = 18 ô; khung chuẩn của dịch vụ đang chạy là 1152 x 2304. Đó là lý do nó nằm đúng bên thua của vách xoá nói trên. Cùng một trang, cùng khoá, </w:t>
+      </w:r>
+      <w:r>
+        <w:t>cùng profile, kết quả sau khi sửa ngân sách xoá nêu trong Bảng 4.12.</w:t>
       </w:r>
     </w:p>
     <w:p>
@@ -22248,6 +22305,7 @@
         <w:jc w:val="left"/>
       </w:pPr>
       <w:r>
+        <w:lastRenderedPageBreak/>
         <w:t xml:space="preserve">Ca ảnh chụp màn hình cần cả hai mảnh ghép và không mảnh nào đủ một mình: bóc viền để đưa trang về khung chuẩn, và sửa ngân sách xoá để bên nhận đừng vứt đi từ mã mà khung đã bóc trao cho nó. Ghi nhận ở Mục 4.3.3, bóc viền một mình chỉ chuyển ca này từ </w:t>
       </w:r>
       <w:r>
@@ -22291,7 +22349,6 @@
       <w:bookmarkStart w:id="104" w:name="X57775d58aae8705d39be6c12cd4b5dfff58ab06"/>
       <w:bookmarkEnd w:id="103"/>
       <w:r>
-        <w:lastRenderedPageBreak/>
         <w:t>4.2.4.4. Một lớp thất bại không nằm ở thuật toán: dịch vụ không được phép kết luận</w:t>
       </w:r>
     </w:p>
@@ -22372,6 +22429,7 @@
           <w:i/>
           <w:iCs/>
         </w:rPr>
+        <w:lastRenderedPageBreak/>
         <w:t>Số liệu đo thực nghiệm</w:t>
       </w:r>
       <w:r>
@@ -22391,7 +22449,6 @@
         <w:pStyle w:val="BodyText"/>
       </w:pPr>
       <w:r>
-        <w:lastRenderedPageBreak/>
         <w:t>Chốt an toàn thật nằm ở chỗ khác và đã có sẵn: danh tính giải mã được phải tra ra một hồ sơ cấp phát có thật trong cùng tổ chức, nếu không hệ thống tự hạ xuống mức bằng chứng một phần. Một kết quả giả mạo vì thế phải sinh ra một định danh 128 bit trùng với một bản ghi đang tồn tại, sau khi đã vượt qua mã sửa lỗi, chuỗi nhận dạng, byte phiên bản và mã kiểm CRC.</w:t>
       </w:r>
     </w:p>
@@ -22478,7 +22535,11 @@
         <w:t>services/api/splitbind/demo/models.py: L20</w:t>
       </w:r>
       <w:r>
-        <w:t>). Thủy vân được nhúng trong khung méo đó, rồi ảnh mới được kéo ngược về kích thước ban đầu. Người dùng không thấy sự méo vì nó bị hoàn tác, nhưng tín hiệu thì đã đi qua hai lần lấy mẫu lại.</w:t>
+        <w:t xml:space="preserve">). Thủy vân được nhúng trong khung méo đó, rồi ảnh mới được kéo ngược về kích thước ban đầu. </w:t>
+      </w:r>
+      <w:r>
+        <w:lastRenderedPageBreak/>
+        <w:t>Người dùng không thấy sự méo vì nó bị hoàn tác, nhưng tín hiệu thì đã đi qua hai lần lấy mẫu lại.</w:t>
       </w:r>
     </w:p>
     <w:p>
@@ -22541,7 +22602,6 @@
         </w:numPr>
       </w:pPr>
       <w:r>
-        <w:lastRenderedPageBreak/>
         <w:t xml:space="preserve">Phép kiểm cuối chạy bằng khoá thật trong container đang phục vụ: một ảnh JPEG 1400 x 900 đi qua đúng hàm cấp phát của hệ thống, rồi đem kết quả qua đúng hàm xác minh, cho ra </w:t>
       </w:r>
       <w:r>
@@ -22708,6 +22768,7 @@
               <w:spacing w:line="240" w:lineRule="auto"/>
             </w:pPr>
             <w:r>
+              <w:lastRenderedPageBreak/>
               <w:t>Ảnh nền phẳng 1400 x 900</w:t>
             </w:r>
           </w:p>
@@ -22929,11 +22990,7 @@
         <w:t>Hình 4.6</w:t>
       </w:r>
       <w:r>
-        <w:t xml:space="preserve">: mã băm của tệp nộp lên khác hẳn mã băm đã ký, giao diện ghi rõ “hai giá trị khác nhau”, vậy mà hệ thống vẫn chỉ đúng bản cấp </w:t>
-      </w:r>
-      <w:r>
-        <w:lastRenderedPageBreak/>
-        <w:t>phát đã sinh ra tệp đó. Kết luận ấy không thể đến từ đối chiếu mã băm, nên nó chứng minh chuỗi cấp phát, nhúng, lưu trữ, giải mã và tra cứu hồ sơ chạy thông suốt trên môi trường thật. Năm hàng sau đó đều âm tính, và nếu dừng ở đây thì kết luận sẽ là hệ thống chỉ truy được bản sao giống hệt từng điểm ảnh.</w:t>
+        <w:t>: mã băm của tệp nộp lên khác hẳn mã băm đã ký, giao diện ghi rõ “hai giá trị khác nhau”, vậy mà hệ thống vẫn chỉ đúng bản cấp phát đã sinh ra tệp đó. Kết luận ấy không thể đến từ đối chiếu mã băm, nên nó chứng minh chuỗi cấp phát, nhúng, lưu trữ, giải mã và tra cứu hồ sơ chạy thông suốt trên môi trường thật. Năm hàng sau đó đều âm tính, và nếu dừng ở đây thì kết luận sẽ là hệ thống chỉ truy được bản sao giống hệt từng điểm ảnh.</w:t>
       </w:r>
     </w:p>
     <w:p>
@@ -22998,6 +23055,7 @@
           <w:b/>
           <w:bCs/>
         </w:rPr>
+        <w:lastRenderedPageBreak/>
         <w:t>Hình 4.6</w:t>
       </w:r>
       <w:r>
@@ -23026,7 +23084,10 @@
         <w:t>test_letterboxed_screenshot_is_attributed</w:t>
       </w:r>
       <w:r>
-        <w:t xml:space="preserve"> vốn luôn xanh trong kho mã.</w:t>
+        <w:t xml:space="preserve"> </w:t>
+      </w:r>
+      <w:r>
+        <w:t>vốn luôn xanh trong kho mã. Bảng 4.14 đặt hai phép thử đó cạnh nhau.</w:t>
       </w:r>
     </w:p>
     <w:p>
@@ -23159,7 +23220,6 @@
               <w:spacing w:line="240" w:lineRule="auto"/>
             </w:pPr>
             <w:r>
-              <w:lastRenderedPageBreak/>
               <w:t>Ảnh chuyển sắc 1152 x 2304</w:t>
             </w:r>
           </w:p>
@@ -23280,6 +23340,7 @@
               <w:spacing w:line="240" w:lineRule="auto"/>
             </w:pPr>
             <w:r>
+              <w:lastRenderedPageBreak/>
               <w:t>Vật mang</w:t>
             </w:r>
           </w:p>
@@ -23706,7 +23767,6 @@
           <w:b/>
           <w:bCs/>
         </w:rPr>
-        <w:lastRenderedPageBreak/>
         <w:t>Phép tấn công không phải nguyên nhân.</w:t>
       </w:r>
       <w:r>
@@ -23761,7 +23821,11 @@
         <w:t>Giới hạn đã nhận diện</w:t>
       </w:r>
       <w:r>
-        <w:t xml:space="preserve"> Phát biểu trung thực nhất về năng lực truy vết của bản đang chạy vì thế là một phát biểu về nội dung tài liệu, không phải về phép tấn công: hệ thống đọc được thủy vân trên ảnh có vùng màu chuyển mượt, và không đồng bộ được trên trang chữ dày đặc. Với một sản phẩm mà đối tượng chính là văn bản, đây là giới hạn nghiêm trọng nhất mà báo cáo này ghi nhận.</w:t>
+        <w:t xml:space="preserve"> Phát biểu trung thực nhất về năng lực truy vết của bản đang chạy vì thế là một phát biểu về nội dung tài liệu, không phải về phép tấn công: hệ thống đọc được thủy vân trên ảnh có vùng màu chuyển mượt, và không đồng bộ được </w:t>
+      </w:r>
+      <w:r>
+        <w:lastRenderedPageBreak/>
+        <w:t>trên trang chữ dày đặc. Với một sản phẩm mà đối tượng chính là văn bản, đây là giới hạn nghiêm trọng nhất mà báo cáo này ghi nhận.</w:t>
       </w:r>
     </w:p>
     <w:p>
@@ -23848,7 +23912,6 @@
         <w:pStyle w:val="BodyText"/>
       </w:pPr>
       <w:r>
-        <w:lastRenderedPageBreak/>
         <w:t>Nói cách khác, hệ thống đang chạy chưa bao giờ chứa thuật toán đạt 9/12. Chính thế hệ V2 đang chạy, khi được đo trong phòng thí nghiệm với mọi điều kiện thuận lợi, cũng chưa bao giờ vượt 3/12 trước JPEG-70 ở bất kỳ mức bước lượng tử nào. Các kết quả âm tính trước phép nén ở đây vì thế đúng như dự đoán, không phải một sự cố.</w:t>
       </w:r>
     </w:p>
@@ -23885,6 +23948,7 @@
           <w:i/>
           <w:iCs/>
         </w:rPr>
+        <w:lastRenderedPageBreak/>
         <w:t>Giới hạn đã nhận diện</w:t>
       </w:r>
       <w:r>
@@ -23927,11 +23991,7 @@
         <w:t>Giới hạn đã nhận diện</w:t>
       </w:r>
       <w:r>
-        <w:t xml:space="preserve"> Tổng kết lại, phát biểu đúng về năng lực truy vết của bản đang chạy gồm hai vế và cả hai đều nói về nội dung tài liệu chứ không nói về phép tấn công. Vế khẳng định: với ảnh có vùng màu chuyển mượt, hệ thống truy được nguồn </w:t>
-      </w:r>
-      <w:r>
-        <w:lastRenderedPageBreak/>
-        <w:t>qua cả ảnh chụp màn hình thu nhỏ hơn một nửa lẫn nén JPEG chất lượng 70. Vế phủ định: với trang chữ dày đặc, khâu đồng bộ có khoá không bắt được mẫu pilot, nên không truy được ngay cả khi tệp chưa hề bị đụng tới.</w:t>
+        <w:t xml:space="preserve"> Tổng kết lại, phát biểu đúng về năng lực truy vết của bản đang chạy gồm hai vế và cả hai đều nói về nội dung tài liệu chứ không nói về phép tấn công. Vế khẳng định: với ảnh có vùng màu chuyển mượt, hệ thống truy được nguồn qua cả ảnh chụp màn hình thu nhỏ hơn một nửa lẫn nén JPEG chất lượng 70. Vế phủ định: với trang chữ dày đặc, khâu đồng bộ có khoá không bắt được mẫu pilot, nên không truy được ngay cả khi tệp chưa hề bị đụng tới.</w:t>
       </w:r>
     </w:p>
     <w:p>
@@ -23992,7 +24052,11 @@
         <w:t>STATUS_COPY</w:t>
       </w:r>
       <w:r>
-        <w:t xml:space="preserve"> đã có sẵn nhãn “Khớp nguồn, có dấu hiệu thay đổi” cho nó. Hệ quả là kết quả có giá trị nhất của cả hệ thống lại được trình bày như một kết quả không kết luận được, và người dùng chỉ thấy sự thật nếu mở phần chi tiết kỹ thuật.</w:t>
+        <w:t xml:space="preserve"> đã có sẵn nhãn “Khớp nguồn, có dấu hiệu thay đổi” cho nó. Hệ quả là kết quả có giá trị nhất </w:t>
+      </w:r>
+      <w:r>
+        <w:lastRenderedPageBreak/>
+        <w:t>của cả hệ thống lại được trình bày như một kết quả không kết luận được, và người dùng chỉ thấy sự thật nếu mở phần chi tiết kỹ thuật.</w:t>
       </w:r>
     </w:p>
     <w:p>
@@ -24079,7 +24143,6 @@
         </w:numPr>
       </w:pPr>
       <w:r>
-        <w:lastRenderedPageBreak/>
         <w:t>Nguyên nhân thật nằm ở cách bên nhận đếm số ký hiệu bị khai là xoá (Mục 4.2.4.2), và sửa nó khôi phục được cả JPEG q50 lẫn ảnh chụp màn hình mà không đụng tới vật mang.</w:t>
       </w:r>
     </w:p>
@@ -24103,7 +24166,11 @@
         <w:t>Bài học phương pháp.</w:t>
       </w:r>
       <w:r>
-        <w:t xml:space="preserve"> Ba giả thuyết đầu đều nói về kênh truyền, và kênh truyền không hỏng. Phép đo kết thúc cuộc điều tra chỉ thêm đúng một cột: tỉ lệ lỗi bit đặt cạnh số ký hiệu bị khai xoá. So sánh cái đã khôi phục được với cái lẽ ra phải khôi phục được, thay vì chỉ xem việc giải mã thành công hay thất bại, là thứ tách được “dữ liệu không tới nơi” khỏi “dữ liệu tới nơi rồi bị vứt đi”. Nên in cả hai vế của phân biệt đó từ sớm.</w:t>
+        <w:t xml:space="preserve"> Ba giả thuyết đầu đều nói về kênh truyền, và kênh truyền không hỏng. Phép đo kết thúc cuộc điều tra chỉ thêm đúng một cột: tỉ lệ lỗi bit đặt cạnh số ký hiệu bị khai xoá. So sánh cái đã khôi phục được với cái lẽ ra phải khôi phục được, thay vì chỉ xem việc giải mã thành công hay thất bại, là thứ tách được “dữ </w:t>
+      </w:r>
+      <w:r>
+        <w:lastRenderedPageBreak/>
+        <w:t>liệu không tới nơi” khỏi “dữ liệu tới nơi rồi bị vứt đi”. Nên in cả hai vế của phân biệt đó từ sớm.</w:t>
       </w:r>
     </w:p>
     <w:p>
@@ -24111,7 +24178,7 @@
         <w:pStyle w:val="Heading2"/>
       </w:pPr>
       <w:bookmarkStart w:id="109" w:name="Xd10a6691ac2b0db7535ed8552e88863d8a3547c"/>
-      <w:bookmarkStart w:id="110" w:name="_Toc240377130"/>
+      <w:bookmarkStart w:id="110" w:name="_Toc240378366"/>
       <w:bookmarkEnd w:id="77"/>
       <w:bookmarkEnd w:id="99"/>
       <w:bookmarkEnd w:id="108"/>
@@ -24133,7 +24200,7 @@
         <w:pStyle w:val="Heading3"/>
       </w:pPr>
       <w:bookmarkStart w:id="111" w:name="X0651d2b7cd31d31794fed8f37ddbb746a11fa57"/>
-      <w:bookmarkStart w:id="112" w:name="_Toc240377131"/>
+      <w:bookmarkStart w:id="112" w:name="_Toc240378367"/>
       <w:r>
         <w:t>4.3.1. Chẩn đoán: nút thắt nằm ở tập giả thuyết hình học, không ở thủy vân</w:t>
       </w:r>
@@ -24242,7 +24309,6 @@
         <w:pStyle w:val="FirstParagraph"/>
       </w:pPr>
       <w:r>
-        <w:lastRenderedPageBreak/>
         <w:t>Ngoài ba trường hợp đó, bộ giải mã không sinh được giả thuyết hình học nào, nên tầng payload không bao giờ được chạy tới - bất kể vật mang mạnh đến đâu.</w:t>
       </w:r>
     </w:p>
@@ -24251,7 +24317,7 @@
         <w:pStyle w:val="Heading3"/>
       </w:pPr>
       <w:bookmarkStart w:id="113" w:name="X8a123a0c5c0d87d3b402adff01804f1a478ef59"/>
-      <w:bookmarkStart w:id="114" w:name="_Toc240377132"/>
+      <w:bookmarkStart w:id="114" w:name="_Toc240378368"/>
       <w:bookmarkEnd w:id="111"/>
       <w:r>
         <w:t>4.3.2. Bằng chứng: tương quan hoàn hảo giữa “có giả thuyết” và “truy vết được”</w:t>
@@ -24263,7 +24329,7 @@
         <w:pStyle w:val="FirstParagraph"/>
       </w:pPr>
       <w:r>
-        <w:t>Đo trên 286 hàng, 0 lỗi thực thi (</w:t>
+        <w:t>Bảng 4.16 đo trên 286 hàng, 0 lỗi thực thi (</w:t>
       </w:r>
       <w:r>
         <w:rPr>
@@ -24484,6 +24550,7 @@
               <w:spacing w:line="240" w:lineRule="auto"/>
             </w:pPr>
             <w:r>
+              <w:lastRenderedPageBreak/>
               <w:t>crop 0.25 (cạnh 0.8660)</w:t>
             </w:r>
           </w:p>
@@ -25001,7 +25068,10 @@
         <w:pStyle w:val="BodyText"/>
       </w:pPr>
       <w:r>
-        <w:t>Mọi phép biến đổi có sẵn giả thuyết đúng đều đạt 7-11/12, trừ JPEG-50. Mọi phép thiếu giả thuyết đúng đều đạt 0-2/12.</w:t>
+        <w:t xml:space="preserve">Mọi phép biến đổi có sẵn giả thuyết đúng đều đạt 7-11/12, trừ JPEG-50. </w:t>
+      </w:r>
+      <w:r>
+        <w:t>Mọi phép thiếu giả thuyết đúng đều đạt 0-2/12. Hình 4.7 vẽ lại toàn bộ mười ba phép đo theo ba lớp nguyên nhân thất bại.</w:t>
       </w:r>
     </w:p>
     <w:p>
@@ -25155,6 +25225,19 @@
     </w:p>
     <w:p>
       <w:pPr>
+        <w:pStyle w:val="BodyText"/>
+      </w:pPr>
+    </w:p>
+    <w:p>
+      <w:pPr>
+        <w:pStyle w:val="BodyText"/>
+      </w:pPr>
+      <w:r>
+        <w:t>Bảng 4.17 tách ba lớp nguyên nhân thất bại và nêu biện pháp tương ứng với từng lớp.</w:t>
+      </w:r>
+    </w:p>
+    <w:p>
+      <w:pPr>
         <w:pStyle w:val="FirstParagraph"/>
       </w:pPr>
       <w:r>
@@ -25497,7 +25580,11 @@
         <w:t>crop_fraction = 0.25</w:t>
       </w:r>
       <w:r>
-        <w:t xml:space="preserve"> tạo ra - đúng phép cắt duy nhất mà pre-gate đo. Bộ giải mã được cứng hoá để hoàn tác đúng phép tấn công mà nó bị chấm điểm. Đó là lý do một phép cắt nhẹ hơn (10%) lại tệ hơn một phép cắt nặng hơn (25%): vô lý nếu giải thích bằng cường độ tín hiệu, hoàn toàn hợp lý nếu giải thích bằng độ phủ giả thuyết.</w:t>
+        <w:t xml:space="preserve"> tạo ra - đúng phép cắt duy nhất mà pre-gate đo. Bộ giải mã được cứng hoá để hoàn tác đúng phép tấn công mà nó bị chấm điểm. Đó là lý do một phép cắt nhẹ hơn (10%) lại tệ hơn một phép cắt nặng hơn </w:t>
+      </w:r>
+      <w:r>
+        <w:lastRenderedPageBreak/>
+        <w:t>(25%): vô lý nếu giải thích bằng cường độ tín hiệu, hoàn toàn hợp lý nếu giải thích bằng độ phủ giả thuyết.</w:t>
       </w:r>
     </w:p>
     <w:p>
@@ -25509,11 +25596,7 @@
         </w:numPr>
       </w:pPr>
       <w:r>
-        <w:t xml:space="preserve">Ảnh chụp màn hình hỏng vì một lý do cơ bản hơn và không liên quan. Đặt trang 1536×3072 vào màn hình 1920×1080 kèm viền letterbox cho hai tỉ lệ </w:t>
-      </w:r>
-      <w:r>
-        <w:lastRenderedPageBreak/>
-        <w:t xml:space="preserve">0.703 và 0.625 - không khớp, nên cả </w:t>
+        <w:t xml:space="preserve">Ảnh chụp màn hình hỏng vì một lý do cơ bản hơn và không liên quan. Đặt trang 1536×3072 vào màn hình 1920×1080 kèm viền letterbox cho hai tỉ lệ 0.703 và 0.625 - không khớp, nên cả </w:t>
       </w:r>
       <w:r>
         <w:rPr>
@@ -25548,7 +25631,7 @@
         <w:pStyle w:val="Heading3"/>
       </w:pPr>
       <w:bookmarkStart w:id="116" w:name="X925063a5d95bd2b2f70d081962403c8bd062d71"/>
-      <w:bookmarkStart w:id="117" w:name="_Toc240377133"/>
+      <w:bookmarkStart w:id="117" w:name="_Toc240378369"/>
       <w:bookmarkEnd w:id="113"/>
       <w:bookmarkEnd w:id="115"/>
       <w:r>
@@ -25570,7 +25653,10 @@
         <w:t>pure_resize</w:t>
       </w:r>
       <w:r>
-        <w:t xml:space="preserve"> sẵn có sẽ kích hoạt. Kết quả đo trên 12 trang dương tính:</w:t>
+        <w:t xml:space="preserve"> sẵn có sẽ kích hoạt. </w:t>
+      </w:r>
+      <w:r>
+        <w:t>Kết quả đo trên 12 trang dương tính nêu trong Bảng 4.18.</w:t>
       </w:r>
     </w:p>
     <w:p>
@@ -25752,7 +25838,10 @@
         <w:t>9/12 đúng bằng tỉ lệ của resize-0.50</w:t>
       </w:r>
       <w:r>
-        <w:t xml:space="preserve"> - chính là điều dự đoán đòi hỏi: bỏ viền đi thì ảnh chụp màn hình chính là một phép co giãn đều, mà bộ giải mã vốn đã xử lý được. Thủy vân, ECC, tham số trải phổ và vị trí tile giữ nguyên không đổi; phần sửa chỉ khoảng hai mươi dòng tiền xử lý tất định: tìm màu viền theo trung vị bốn cạnh rồi cắt các hàng/cột nằm trong dung sai của màu đó.</w:t>
+        <w:t xml:space="preserve"> - chính là điều dự đoán đòi hỏi: bỏ viền đi thì ảnh chụp màn hình chính là một phép co giãn đều, mà bộ giải mã vốn đã xử lý được. Thủy vân, ECC, tham số trải phổ và vị trí tile giữ nguyên không đổi; phần sửa chỉ khoảng hai mươi dòng tiền xử lý tất định: tìm màu viền theo trung vị bốn cạnh rồi cắt các hàng/cột </w:t>
+      </w:r>
+      <w:r>
+        <w:t>nằm trong dung sai của màu đó. Hình 4.8 so tỉ lệ truy vết trước và sau bước bóc viền.</w:t>
       </w:r>
     </w:p>
     <w:p>
@@ -25764,6 +25853,7 @@
         <w:rPr>
           <w:noProof/>
         </w:rPr>
+        <w:lastRenderedPageBreak/>
         <w:drawing>
           <wp:inline distT="0" distB="0" distL="0" distR="0" wp14:anchorId="04140113" wp14:editId="0E79F49F">
             <wp:extent cx="5367230" cy="2371939"/>
@@ -25817,7 +25907,6 @@
           <w:b/>
           <w:bCs/>
         </w:rPr>
-        <w:lastRenderedPageBreak/>
         <w:t>Hình 4.8</w:t>
       </w:r>
       <w:r>
@@ -25931,9 +26020,10 @@
         <w:pStyle w:val="Heading3"/>
       </w:pPr>
       <w:bookmarkStart w:id="118" w:name="X4d538943e8b5d22bccd729b48e1609b31a834d6"/>
-      <w:bookmarkStart w:id="119" w:name="_Toc240377134"/>
+      <w:bookmarkStart w:id="119" w:name="_Toc240378370"/>
       <w:bookmarkEnd w:id="116"/>
       <w:r>
+        <w:lastRenderedPageBreak/>
         <w:t>4.3.4. Quét toàn bộ lưới ứng viên: hồ sơ đang chạy là hồ sơ yếu nhất</w:t>
       </w:r>
       <w:bookmarkEnd w:id="119"/>
@@ -26008,7 +26098,6 @@
               <w:spacing w:line="240" w:lineRule="auto"/>
             </w:pPr>
             <w:r>
-              <w:lastRenderedPageBreak/>
               <w:t>#</w:t>
             </w:r>
           </w:p>
@@ -26815,6 +26904,7 @@
               <w:spacing w:line="240" w:lineRule="auto"/>
             </w:pPr>
             <w:r>
+              <w:lastRenderedPageBreak/>
               <w:t>12</w:t>
             </w:r>
           </w:p>
@@ -27058,7 +27148,6 @@
         </w:numPr>
       </w:pPr>
       <w:r>
-        <w:lastRenderedPageBreak/>
         <w:t>Chênh lệch giữa trượt sạch và giải được chỉ là một bậc tham số. Từ số 0 sang số 4 chỉ nâng bước lượng tử từ 24 lên 32 và cường độ pilot từ 1.5 lên 2.0. Cái giá là 2,07 dB PSNR, đưa 44.09 xuống 42.02, vẫn cách cổng chất lượng 38 dB một khoảng rộng.</w:t>
       </w:r>
     </w:p>
@@ -27114,6 +27203,7 @@
           <w:b/>
           <w:bCs/>
         </w:rPr>
+        <w:lastRenderedPageBreak/>
         <w:t>Bảng 4.20:</w:t>
       </w:r>
       <w:r>
@@ -28057,7 +28147,6 @@
         </w:numPr>
       </w:pPr>
       <w:r>
-        <w:lastRenderedPageBreak/>
         <w:t>Không ứng viên nào sống sót qua nén JPEG 70 trên trang chữ thật. Cả tám đều mất đồng bộ.</w:t>
       </w:r>
     </w:p>
@@ -28105,6 +28194,7 @@
         <w:rPr>
           <w:noProof/>
         </w:rPr>
+        <w:lastRenderedPageBreak/>
         <w:drawing>
           <wp:inline distT="0" distB="0" distL="0" distR="0" wp14:anchorId="77AA2C82" wp14:editId="567A72A2">
             <wp:extent cx="4908884" cy="3772186"/>
@@ -28158,7 +28248,6 @@
           <w:b/>
           <w:bCs/>
         </w:rPr>
-        <w:lastRenderedPageBreak/>
         <w:t>Hình 4.9</w:t>
       </w:r>
       <w:r>
@@ -28218,7 +28307,11 @@
         <w:t>integrity-v0.2.3</w:t>
       </w:r>
       <w:r>
-        <w:t>. Cần nói rõ thay đổi này mua được gì: trên trang chữ thô nó đưa kết quả từ mất đồng bộ hoàn toàn sang giải được kể cả khi nén JPEG 70, còn trên trang chữ thật thì không đổi gì, cả hồ sơ cũ lẫn mới đều mất đồng bộ. Nhóm giữ hồ sơ mới vì nó không thua hồ sơ cũ ở bất kỳ phép đo nào và chất lượng vẫn ở 41,91 dB, nhưng không trình bày nó như lời giải cho bài toán trang văn bản.</w:t>
+        <w:t xml:space="preserve">. Cần nói rõ thay đổi này mua được gì: trên trang chữ thô nó đưa kết quả từ mất đồng bộ hoàn toàn sang giải được kể cả khi nén JPEG 70, còn trên trang chữ thật thì không đổi gì, cả hồ sơ cũ lẫn mới đều mất đồng bộ. Nhóm giữ hồ sơ mới vì nó không thua hồ sơ cũ ở bất kỳ phép </w:t>
+      </w:r>
+      <w:r>
+        <w:lastRenderedPageBreak/>
+        <w:t>đo nào và chất lượng vẫn ở 41,91 dB, nhưng không trình bày nó như lời giải cho bài toán trang văn bản.</w:t>
       </w:r>
     </w:p>
     <w:p>
@@ -28285,11 +28378,7 @@
         <w:t>Thứ tự thử có ý nghĩa về chi phí.</w:t>
       </w:r>
       <w:r>
-        <w:t xml:space="preserve"> Bộ giải mã căn hình học lại cho từng hồ sơ, nên đưa cả hai hồ sơ vào một lần gọi sẽ bắt mọi tệp hiện hành trả giá gấp </w:t>
-      </w:r>
-      <w:r>
-        <w:lastRenderedPageBreak/>
-        <w:t>đôi. Dịch vụ vì thế gọi lần lượt và dừng ngay khi một hồ sơ chạm tới tầng payload.</w:t>
+        <w:t xml:space="preserve"> Bộ giải mã căn hình học lại cho từng hồ sơ, nên đưa cả hai hồ sơ vào một lần gọi sẽ bắt mọi tệp hiện hành trả giá gấp đôi. Dịch vụ vì thế gọi lần lượt và dừng ngay khi một hồ sơ chạm tới tầng payload.</w:t>
       </w:r>
     </w:p>
     <w:p>
@@ -28312,7 +28401,7 @@
         <w:pStyle w:val="Heading3"/>
       </w:pPr>
       <w:bookmarkStart w:id="122" w:name="Xaa532e4a1fa2fd6b350d447a5422868d3bab935"/>
-      <w:bookmarkStart w:id="123" w:name="_Toc240377135"/>
+      <w:bookmarkStart w:id="123" w:name="_Toc240378371"/>
       <w:bookmarkEnd w:id="118"/>
       <w:bookmarkEnd w:id="121"/>
       <w:r>
@@ -28363,7 +28452,11 @@
         <w:pStyle w:val="FirstParagraph"/>
       </w:pPr>
       <w:r>
-        <w:t>Đây là công trình gần bài toán của nhóm nhất, vì đối tượng của nó đúng là ảnh trang tài liệu. Cách làm là học sâu kiểu StegaStamp: một bộ mã hoá và một bộ giải mã cùng huấn luyện, ở giữa là một tầng biến dạng khả vi gồm làm mờ, nhiễu, đổi tương phản, đổi độ sáng, đổi sắc độ và nén JPEG khả vi tới chất lượng 50. Ô làm việc 400 x 400 điểm ảnh, tải trọng 100 bit.</w:t>
+        <w:t xml:space="preserve">Đây là công trình gần bài toán của nhóm nhất, vì đối tượng của nó đúng là ảnh trang tài liệu. Cách làm là học sâu kiểu StegaStamp: một bộ mã hoá và một bộ giải mã cùng </w:t>
+      </w:r>
+      <w:r>
+        <w:lastRenderedPageBreak/>
+        <w:t>huấn luyện, ở giữa là một tầng biến dạng khả vi gồm làm mờ, nhiễu, đổi tương phản, đổi độ sáng, đổi sắc độ và nén JPEG khả vi tới chất lượng 50. Ô làm việc 400 x 400 điểm ảnh, tải trọng 100 bit.</w:t>
       </w:r>
     </w:p>
     <w:p>
@@ -28407,7 +28500,6 @@
         <w:pStyle w:val="BodyText"/>
       </w:pPr>
       <w:r>
-        <w:lastRenderedPageBreak/>
         <w:t>Điều này tương phản trực tiếp với thiết kế đang chạy của SplitBind. Bộ mã hoá hiện tại rải ô đều khắp khung chuẩn và dùng một bước lượng tử cố định, nên trên một trang chữ thì phần lớn ô rơi vào nền trắng gần như không có sức chứa, còn số ít ô còn lại nằm vắt qua biên nét chữ tương phản cao, đúng chỗ mà thay đổi vừa dễ thấy vừa dễ mất.</w:t>
       </w:r>
     </w:p>
@@ -28449,7 +28541,11 @@
         <w:jc w:val="left"/>
       </w:pPr>
       <w:r>
-        <w:t xml:space="preserve">Khác biệt thứ nhất là cách đồng bộ. Thay vì cài một mẫu pilot vào miền tần số rồi dò lại, công trình này chạy SIFT để tìm điểm đặc trưng của chính nội dung ảnh, lọc lấy các điểm cách nhau tối thiểu 64 điểm ảnh và cách mép tối thiểu 32 điểm ảnh, rồi nhúng vào các vùng 64 x 64 lấy điểm đặc trưng làm tâm. Lúc trích, chạy lại SIFT trên ảnh nhận được để tìm lại đúng những vùng ấy. Đồng bộ vì thế bám vào nội dung, và nội dung trang chữ thì rất giàu điểm đặc trưng. Đây đúng là thứ mà đường đang chạy của nhóm thiếu: phép đo ở Mục 4.2.4.5 cho thấy trang chữ trượt ngay ở trạng thái </w:t>
+        <w:t xml:space="preserve">Khác biệt thứ nhất là cách đồng bộ. Thay vì cài một mẫu pilot vào miền tần số rồi dò lại, công trình này chạy SIFT để tìm điểm đặc trưng của chính nội dung ảnh, lọc lấy các điểm cách nhau tối thiểu 64 điểm ảnh và cách mép tối thiểu 32 điểm ảnh, rồi nhúng vào các vùng 64 x 64 lấy điểm đặc trưng làm tâm. Lúc trích, chạy lại SIFT </w:t>
+      </w:r>
+      <w:r>
+        <w:lastRenderedPageBreak/>
+        <w:t xml:space="preserve">trên ảnh nhận được để tìm lại đúng những vùng ấy. Đồng bộ vì thế bám vào nội dung, và nội dung trang chữ thì rất giàu điểm đặc trưng. Đây đúng là thứ mà đường đang chạy của nhóm thiếu: phép đo ở Mục 4.2.4.5 cho thấy trang chữ trượt ngay ở trạng thái </w:t>
       </w:r>
       <w:r>
         <w:rPr>
@@ -28482,7 +28578,6 @@
         <w:pStyle w:val="BodyText"/>
       </w:pPr>
       <w:r>
-        <w:lastRenderedPageBreak/>
         <w:t>Tải trọng của nó cũng nhỏ hơn nhiều: 30 bit thông tin, thêm CRC8, mã hoá BCH(63,36) thành 64 bit xếp vào ma trận 8 x 8. SplitBind đang đòi mang một định danh 128 bit, tức gấp hơn bốn lần, trên cùng một họ vật mang.</w:t>
       </w:r>
     </w:p>
@@ -28533,6 +28628,7 @@
       <w:bookmarkStart w:id="127" w:name="bốn-điều-rút-ra-cho-kiến-trúc-v4"/>
       <w:bookmarkEnd w:id="126"/>
       <w:r>
+        <w:lastRenderedPageBreak/>
         <w:t>4.3.5.4. Bốn điều rút ra cho kiến trúc V4</w:t>
       </w:r>
     </w:p>
@@ -28611,11 +28707,7 @@
         <w:t>Xem lại kích thước tải trọng.</w:t>
       </w:r>
       <w:r>
-        <w:t xml:space="preserve"> Ba công trình dùng 30, 32 đến 64, và 100 bit. Nhóm đang đòi 128 bit trên vật mang khó nhất. Một hướng khả thi là nhúng </w:t>
-      </w:r>
-      <w:r>
-        <w:lastRenderedPageBreak/>
-        <w:t>một mã ngắn rồi tra ngược ra định danh đầy đủ trong cơ sở dữ liệu, vì hệ thống vốn đã giữ hồ sơ cấp phát.</w:t>
+        <w:t xml:space="preserve"> Ba công trình dùng 30, 32 đến 64, và 100 bit. Nhóm đang đòi 128 bit trên vật mang khó nhất. Một hướng khả thi là nhúng một mã ngắn rồi tra ngược ra định danh đầy đủ trong cơ sở dữ liệu, vì hệ thống vốn đã giữ hồ sơ cấp phát.</w:t>
       </w:r>
     </w:p>
     <w:p>
@@ -28638,7 +28730,7 @@
         <w:pStyle w:val="Heading3"/>
       </w:pPr>
       <w:bookmarkStart w:id="128" w:name="kiến-trúc-v4-đề-xuất"/>
-      <w:bookmarkStart w:id="129" w:name="_Toc240377136"/>
+      <w:bookmarkStart w:id="129" w:name="_Toc240378372"/>
       <w:bookmarkEnd w:id="122"/>
       <w:bookmarkEnd w:id="127"/>
       <w:r>
@@ -28705,6 +28797,7 @@
           <w:b/>
           <w:bCs/>
         </w:rPr>
+        <w:lastRenderedPageBreak/>
         <w:t>Tầng 3 - Cho phép hai trục co giãn độc lập.</w:t>
       </w:r>
       <w:r>
@@ -28733,7 +28826,7 @@
         <w:pStyle w:val="Heading3"/>
       </w:pPr>
       <w:bookmarkStart w:id="130" w:name="cái-gì-kiến-trúc-này-không-sửa-được"/>
-      <w:bookmarkStart w:id="131" w:name="_Toc240377137"/>
+      <w:bookmarkStart w:id="131" w:name="_Toc240378373"/>
       <w:bookmarkEnd w:id="128"/>
       <w:r>
         <w:t>4.3.7. Cái gì kiến trúc này không sửa được</w:t>
@@ -28749,11 +28842,7 @@
         </w:numPr>
       </w:pPr>
       <w:r>
-        <w:t xml:space="preserve">Giới hạn phân giải là thật, nhưng ngưỡng đã dịch. Ở thời điểm đo này, dưới tỉ lệ khoảng 0.45 payload chết kể cả khi hình học hoàn hảo; sau khi sửa ngân </w:t>
-      </w:r>
-      <w:r>
-        <w:lastRenderedPageBreak/>
-        <w:t xml:space="preserve">sách ký hiệu xoá, ngưỡng đó hạ xuống thấp hơn (Mục 4.2.4.2). Phần vẫn đúng là bản chất của giới hạn: tồn tại một tỉ lệ đủ nhỏ để payload không còn khôi phục được. Không tầng nào ở trên chạm tới điều đó; muốn sửa phải tăng dung lượng hoặc giảm payload, và nhóm đã đo được rằng nâng </w:t>
+        <w:t xml:space="preserve">Giới hạn phân giải là thật, nhưng ngưỡng đã dịch. Ở thời điểm đo này, dưới tỉ lệ khoảng 0.45 payload chết kể cả khi hình học hoàn hảo; sau khi sửa ngân sách ký hiệu xoá, ngưỡng đó hạ xuống thấp hơn (Mục 4.2.4.2). Phần vẫn đúng là bản chất của giới hạn: tồn tại một tỉ lệ đủ nhỏ để payload không còn khôi phục được. Không tầng nào ở trên chạm tới điều đó; muốn sửa phải tăng dung lượng hoặc giảm payload, và nhóm đã đo được rằng nâng </w:t>
       </w:r>
       <w:r>
         <w:rPr>
@@ -28812,7 +28901,11 @@
         </w:numPr>
       </w:pPr>
       <w:r>
-        <w:t>Toàn bộ số trong phần này đến từ harness nghiên cứu, không phải pre-gate, và khác pre-gate ở cách dẫn xuất RNG tấn công cùng việc cấp mẫu đồng bộ ORB cho bộ giải mã. Không được trộn với Mục 4.2.1, và không được trình bày như năng lực đã phát hành. Từ 12/09/2026 production có bật chuỗi xử lý nhúng và giải thủy vân. Mục 4.2.3 ghi lại kết quả âm tính ban đầu, còn Mục 4.2.4 ghi lại trạng thái sau khi sửa nguyên nhân gốc; kết luận chắc chắn trả cho người dùng vẫn dựa trên đối chiếu tệp chính xác và chữ ký, còn kết quả truy vết luôn kèm nhãn giới hạn.</w:t>
+        <w:t xml:space="preserve">Toàn bộ số trong phần này đến từ harness nghiên cứu, không phải pre-gate, và khác pre-gate ở cách dẫn xuất RNG tấn công cùng việc cấp mẫu đồng bộ </w:t>
+      </w:r>
+      <w:r>
+        <w:lastRenderedPageBreak/>
+        <w:t>ORB cho bộ giải mã. Không được trộn với Mục 4.2.1, và không được trình bày như năng lực đã phát hành. Từ 12/09/2026 production có bật chuỗi xử lý nhúng và giải thủy vân. Mục 4.2.3 ghi lại kết quả âm tính ban đầu, còn Mục 4.2.4 ghi lại trạng thái sau khi sửa nguyên nhân gốc; kết luận chắc chắn trả cho người dùng vẫn dựa trên đối chiếu tệp chính xác và chữ ký, còn kết quả truy vết luôn kèm nhãn giới hạn.</w:t>
       </w:r>
     </w:p>
     <w:p>
@@ -28820,7 +28913,7 @@
         <w:pStyle w:val="Heading3"/>
       </w:pPr>
       <w:bookmarkStart w:id="132" w:name="vì-sao-chẩn-đoán-này-có-được"/>
-      <w:bookmarkStart w:id="133" w:name="_Toc240377138"/>
+      <w:bookmarkStart w:id="133" w:name="_Toc240378374"/>
       <w:bookmarkEnd w:id="130"/>
       <w:r>
         <w:t>4.3.8. Vì sao chẩn đoán này có được</w:t>
@@ -28851,11 +28944,7 @@
         <w:t>payload_not_detected</w:t>
       </w:r>
       <w:r>
-        <w:t xml:space="preserve"> là thứ tách được hai nguyên nhân; đặc tả tấn công có sẵn </w:t>
-      </w:r>
-      <w:r>
-        <w:lastRenderedPageBreak/>
-        <w:t xml:space="preserve">họ </w:t>
+        <w:t xml:space="preserve"> là thứ tách được hai nguyên nhân; đặc tả tấn công có sẵn họ </w:t>
       </w:r>
       <w:r>
         <w:rPr>
@@ -28872,7 +28961,7 @@
         <w:pStyle w:val="Heading1"/>
       </w:pPr>
       <w:bookmarkStart w:id="134" w:name="kết-luận"/>
-      <w:bookmarkStart w:id="135" w:name="_Toc240377139"/>
+      <w:bookmarkStart w:id="135" w:name="_Toc240378375"/>
       <w:bookmarkEnd w:id="69"/>
       <w:bookmarkEnd w:id="109"/>
       <w:bookmarkEnd w:id="132"/>
@@ -28902,7 +28991,11 @@
         <w:pStyle w:val="BodyText"/>
       </w:pPr>
       <w:r>
-        <w:t>Đóng góp chính của nhóm không phải một con số độ bền, mà là một chẩn đoán nguyên nhân gốc. Qua ba thế hệ thuật toán, nhóm đã lần lượt kiểm chứng và bác bỏ cả ba hướng tinh chỉnh tham số, mỗi lần bằng một loại bằng chứng khác nhau: một sweep 1408 hàng, một lần đọc mã nguồn, và một thí nghiệm 192 hàng. Kết quả âm tính đó dẫn tới câu hỏi đúng, và câu trả lời là: độ bền của hệ thống không bị giới hạn bởi thủy vân, mà bởi tập giả thuyết hình học của bộ giải mã. Bằng chứng là một tương quan không có ngoại lệ trên 286 hàng đo, sau đó được xác nhận bằng một phép thử có tính tiên đoán: bóc viền letterbox đưa tỉ lệ truy vết của ảnh chụp màn hình 1920×1080 từ 0 trên 12 lên 9 trên 12, mà không thay đổi bất kỳ tham số nào của thủy vân. Ở 1366×768 phép bóc viền không khôi phục được hàng nào, và chính sự khác biệt giữa hai độ phân giải là thứ tách bạch được hai lớp thất bại.</w:t>
+        <w:t xml:space="preserve">Đóng góp chính của nhóm không phải một con số độ bền, mà là một chẩn đoán nguyên nhân gốc. Qua ba thế hệ thuật toán, nhóm đã lần lượt kiểm chứng và bác bỏ cả ba hướng tinh chỉnh tham số, mỗi lần bằng một loại bằng chứng khác nhau: một sweep 1408 hàng, một lần đọc mã nguồn, và một thí nghiệm 192 hàng. Kết quả âm </w:t>
+      </w:r>
+      <w:r>
+        <w:lastRenderedPageBreak/>
+        <w:t>tính đó dẫn tới câu hỏi đúng, và câu trả lời là: độ bền của hệ thống không bị giới hạn bởi thủy vân, mà bởi tập giả thuyết hình học của bộ giải mã. Bằng chứng là một tương quan không có ngoại lệ trên 286 hàng đo, sau đó được xác nhận bằng một phép thử có tính tiên đoán: bóc viền letterbox đưa tỉ lệ truy vết của ảnh chụp màn hình 1920×1080 từ 0 trên 12 lên 9 trên 12, mà không thay đổi bất kỳ tham số nào của thủy vân. Ở 1366×768 phép bóc viền không khôi phục được hàng nào, và chính sự khác biệt giữa hai độ phân giải là thứ tách bạch được hai lớp thất bại.</w:t>
       </w:r>
     </w:p>
     <w:p>
@@ -28918,8 +29011,27 @@
         <w:pStyle w:val="BodyText"/>
       </w:pPr>
       <w:r>
+        <w:t>Điều tra tiếp trong hai ngày cuối tìm ra một nguyên nhân gốc thứ ba, và nó buộc nhóm rút lại một phần chẩn đoán của chính mình. Lớp thất bại thứ ba hoá ra không phải vật mang chết: bộ giải mã đo độ tin cậy ở mức bit nhưng khai ký hiệu bị xoá ở mức byte, nên một bit yếu làm cả tám bit cùng byte bị khai xoá, và số ký hiệu xoá vượt quá mức mã Reed-Solomon sửa được. Hệ thống từ chối đúng những từ mã mà nó đã khôi phục ở tỉ lệ lỗi bit bằng 0,000. Một vật mang thay thế được cài đặt để kiểm chứng giả thuyết vật mang đã đo kém hơn ở mọi tỉ lệ và bị loại bỏ. Sửa kế toán ký hiệu xoá khôi phục được nén JPEG q50 và cả ca ảnh chụp màn hình có viền, mà không đụng tới khâu nhúng và không phải cấp phát lại tài liệu cũ. Chi tiết và bảng số liệu ở Mục 4.2.4.</w:t>
+      </w:r>
+    </w:p>
+    <w:p>
+      <w:pPr>
+        <w:pStyle w:val="BodyText"/>
+      </w:pPr>
+      <w:r>
+        <w:t>Nhóm cũng ghi nhận một lớp thất bại nằm ngoài thuật toán: dịch vụ đòi hai kết quả giải mã khớp nhau mới công bố danh tính, trong khi số trang là thành phần của phép dẫn xuất có khoá nên một tấm ảnh chỉ sinh được đúng một kết quả. Đường truy vết ảnh vì thế không thể kết luận dù thuật toán hoạt động đúng. Điều này định vị lại mọi bảng độ bền trong báo cáo: chúng được đo bằng cách gọi thẳng bộ giải mã và truyền sẵn số trang, tức mô tả thư viện chứ chưa mô tả sản phẩm.</w:t>
+      </w:r>
+    </w:p>
+    <w:p>
+      <w:pPr>
+        <w:pStyle w:val="BodyText"/>
+      </w:pPr>
+      <w:r>
+        <w:t xml:space="preserve">Về các giới hạn đã nhận diện, phân hệ thủy vân đã được bật trên hệ thống vận hành và mọi kết quả truy vết vẫn mang nhãn độ thu hồi chưa đạt cổng phát hành do chính hệ thống gắn. Ranh giới còn lại là tổn thất chồng nhau chứ không phải một phép biến </w:t>
+      </w:r>
+      <w:r>
         <w:lastRenderedPageBreak/>
-        <w:t>Điều tra tiếp trong hai ngày cuối tìm ra một nguyên nhân gốc thứ ba, và nó buộc nhóm rút lại một phần chẩn đoán của chính mình. Lớp thất bại thứ ba hoá ra không phải vật mang chết: bộ giải mã đo độ tin cậy ở mức bit nhưng khai ký hiệu bị xoá ở mức byte, nên một bit yếu làm cả tám bit cùng byte bị khai xoá, và số ký hiệu xoá vượt quá mức mã Reed-Solomon sửa được. Hệ thống từ chối đúng những từ mã mà nó đã khôi phục ở tỉ lệ lỗi bit bằng 0,000. Một vật mang thay thế được cài đặt để kiểm chứng giả thuyết vật mang đã đo kém hơn ở mọi tỉ lệ và bị loại bỏ. Sửa kế toán ký hiệu xoá khôi phục được nén JPEG q50 và cả ca ảnh chụp màn hình có viền, mà không đụng tới khâu nhúng và không phải cấp phát lại tài liệu cũ. Chi tiết và bảng số liệu ở Mục 4.2.4.</w:t>
+        <w:t>đổi đơn lẻ: ảnh chụp màn hình cộng nén JPEG q60 thất bại trong khi từng phép một đều sống. Cắt ảnh quá nửa và xoay vẫn chưa giải được ở đây lẫn ở mọi công trình mã nguồn mở đã đối chiếu. Định vị can thiệp đạt IoU tổng hợp khoảng 0.09 do cơ chế fail-safe kích hoạt trên phần lớn kịch bản có diện tích can thiệp lớn. Và quan trọng nhất: không kết quả nào trong báo cáo chứng minh danh tính người làm rò rỉ, chỉnh sửa hay phát tán tài liệu; thủy vân và chữ ký số cung cấp tín hiệu kỹ thuật phục vụ điều tra, không phải kết luận pháp lý về hành vi của một cá nhân.</w:t>
       </w:r>
     </w:p>
     <w:p>
@@ -28927,27 +29039,7 @@
         <w:pStyle w:val="BodyText"/>
       </w:pPr>
       <w:r>
-        <w:t>Nhóm cũng ghi nhận một lớp thất bại nằm ngoài thuật toán: dịch vụ đòi hai kết quả giải mã khớp nhau mới công bố danh tính, trong khi số trang là thành phần của phép dẫn xuất có khoá nên một tấm ảnh chỉ sinh được đúng một kết quả. Đường truy vết ảnh vì thế không thể kết luận dù thuật toán hoạt động đúng. Điều này định vị lại mọi bảng độ bền trong báo cáo: chúng được đo bằng cách gọi thẳng bộ giải mã và truyền sẵn số trang, tức mô tả thư viện chứ chưa mô tả sản phẩm.</w:t>
-      </w:r>
-    </w:p>
-    <w:p>
-      <w:pPr>
-        <w:pStyle w:val="BodyText"/>
-      </w:pPr>
-      <w:r>
-        <w:t>Về các giới hạn đã nhận diện, phân hệ thủy vân đã được bật trên hệ thống vận hành và mọi kết quả truy vết vẫn mang nhãn độ thu hồi chưa đạt cổng phát hành do chính hệ thống gắn. Ranh giới còn lại là tổn thất chồng nhau chứ không phải một phép biến đổi đơn lẻ: ảnh chụp màn hình cộng nén JPEG q60 thất bại trong khi từng phép một đều sống. Cắt ảnh quá nửa và xoay vẫn chưa giải được ở đây lẫn ở mọi công trình mã nguồn mở đã đối chiếu. Định vị can thiệp đạt IoU tổng hợp khoảng 0.09 do cơ chế fail-safe kích hoạt trên phần lớn kịch bản có diện tích can thiệp lớn. Và quan trọng nhất: không kết quả nào trong báo cáo chứng minh danh tính người làm rò rỉ, chỉnh sửa hay phát tán tài liệu; thủy vân và chữ ký số cung cấp tín hiệu kỹ thuật phục vụ điều tra, không phải kết luận pháp lý về hành vi của một cá nhân.</w:t>
-      </w:r>
-    </w:p>
-    <w:p>
-      <w:pPr>
-        <w:pStyle w:val="BodyText"/>
-      </w:pPr>
-      <w:r>
-        <w:t xml:space="preserve">Hướng phát triển rút ra trực tiếp từ chẩn đoán: chuẩn hoá khung ảnh trước khi giải mã, ước lượng tỉ lệ cắt thay vì liệt kê một giá trị cứng, cho phép hai trục co giãn độc lập, và cuối cùng mới là chọn vật mang theo nội dung. Xa hơn, bước lượng tử thích </w:t>
-      </w:r>
-      <w:r>
-        <w:lastRenderedPageBreak/>
-        <w:t>nghi theo mô hình thị giác người và các kiến trúc học sâu là lối đi cho lớp thất bại thứ ba.</w:t>
+        <w:t>Hướng phát triển rút ra trực tiếp từ chẩn đoán: chuẩn hoá khung ảnh trước khi giải mã, ước lượng tỉ lệ cắt thay vì liệt kê một giá trị cứng, cho phép hai trục co giãn độc lập, và cuối cùng mới là chọn vật mang theo nội dung. Xa hơn, bước lượng tử thích nghi theo mô hình thị giác người và các kiến trúc học sâu là lối đi cho lớp thất bại thứ ba.</w:t>
       </w:r>
     </w:p>
     <w:p>
@@ -28955,7 +29047,7 @@
         <w:pStyle w:val="Heading1"/>
       </w:pPr>
       <w:bookmarkStart w:id="136" w:name="tài-liệu-tham-khảo"/>
-      <w:bookmarkStart w:id="137" w:name="_Toc240377140"/>
+      <w:bookmarkStart w:id="137" w:name="_Toc240378376"/>
       <w:bookmarkEnd w:id="134"/>
       <w:r>
         <w:t>TÀI LIỆU THAM KHẢO</w:t>
@@ -29148,7 +29240,14 @@
               <w:color w:val="000000"/>
             </w:rPr>
             <w:tab/>
-            <w:t>National Institute of Standards and Technology, “The Keyed-Hash Message Authentication Code (HMAC), FIPS PUB 198-1,” National Institute of Standards and Technology, Gaithersburg, 2008. doi: 10.6028/NIST.FIPS.198-1.</w:t>
+            <w:t xml:space="preserve">National Institute of Standards and Technology, “The Keyed-Hash Message Authentication Code (HMAC), FIPS PUB 198-1,” National Institute of </w:t>
+          </w:r>
+          <w:r>
+            <w:rPr>
+              <w:color w:val="000000"/>
+            </w:rPr>
+            <w:lastRenderedPageBreak/>
+            <w:t>Standards and Technology, Gaithersburg, 2008. doi: 10.6028/NIST.FIPS.198-1.</w:t>
           </w:r>
         </w:p>
         <w:p>
@@ -29241,7 +29340,6 @@
             <w:rPr>
               <w:color w:val="000000"/>
             </w:rPr>
-            <w:lastRenderedPageBreak/>
             <w:t>[8]</w:t>
           </w:r>
           <w:r>
@@ -29362,6 +29460,7 @@
             <w:rPr>
               <w:color w:val="000000"/>
             </w:rPr>
+            <w:lastRenderedPageBreak/>
             <w:t>[13]</w:t>
           </w:r>
           <w:r>
@@ -29476,7 +29575,6 @@
             <w:rPr>
               <w:color w:val="000000"/>
             </w:rPr>
-            <w:lastRenderedPageBreak/>
             <w:t>[16]</w:t>
           </w:r>
           <w:r>
@@ -29705,6 +29803,7 @@
             <w:rPr>
               <w:color w:val="000000"/>
             </w:rPr>
+            <w:lastRenderedPageBreak/>
             <w:t>[22]</w:t>
           </w:r>
           <w:r>
@@ -29747,7 +29846,7 @@
         <w:pStyle w:val="Heading1"/>
       </w:pPr>
       <w:bookmarkStart w:id="138" w:name="X8c9d602fdee431516a1a95beedefebdd94fb169"/>
-      <w:bookmarkStart w:id="139" w:name="_Toc240377141"/>
+      <w:bookmarkStart w:id="139" w:name="_Toc240378377"/>
       <w:bookmarkEnd w:id="136"/>
       <w:r>
         <w:t>PHỤ LỤC A. MA TRẬN TRUY VẾT KHẲNG ĐỊNH VÀ BẰNG CHỨNG</w:t>
@@ -29790,7 +29889,6 @@
               <w:spacing w:line="240" w:lineRule="auto"/>
             </w:pPr>
             <w:r>
-              <w:lastRenderedPageBreak/>
               <w:t>Khẳng định kỹ thuật hoặc số liệu</w:t>
             </w:r>
           </w:p>
@@ -30140,6 +30238,7 @@
               <w:spacing w:line="240" w:lineRule="auto"/>
             </w:pPr>
             <w:r>
+              <w:lastRenderedPageBreak/>
               <w:t>Đồng bộ hình học của phiên bản đang chạy dùng pilot, không dùng ORB-RANSAC</w:t>
             </w:r>
           </w:p>
@@ -30252,7 +30351,6 @@
               <w:spacing w:line="240" w:lineRule="auto"/>
             </w:pPr>
             <w:r>
-              <w:lastRenderedPageBreak/>
               <w:t>Số liệu PSNR 41.69 dB và SSIM 0.9825 trên trang PDF</w:t>
             </w:r>
           </w:p>
@@ -30645,6 +30743,7 @@
               <w:spacing w:line="240" w:lineRule="auto"/>
             </w:pPr>
             <w:r>
+              <w:lastRenderedPageBreak/>
               <w:t>Quy mô benchmark can thiệp 48 hàng, IoU tổng hợp bằng 0.089981</w:t>
             </w:r>
           </w:p>
@@ -30814,7 +30913,6 @@
               <w:spacing w:line="240" w:lineRule="auto"/>
             </w:pPr>
             <w:r>
-              <w:lastRenderedPageBreak/>
               <w:t>Trạng thái giao diện minh bạch “Chưa tìm thấy bản cấp phát khớp”</w:t>
             </w:r>
           </w:p>
@@ -31054,7 +31152,11 @@
               <w:spacing w:line="240" w:lineRule="auto"/>
             </w:pPr>
             <w:r>
-              <w:t>Đã kiểm chứng: 1 trong 5 giải được, và đó là bản nguyên vẹn mà mã băm đã trả lời xong. Đây là số liệu của ngày 12/09, đã bị Mục 4.2.4 thay thế sau khi sửa nguyên nhân gốc thứ ba.</w:t>
+              <w:t xml:space="preserve">Đã kiểm chứng: 1 trong 5 giải được, và đó là bản nguyên vẹn mà mã băm đã trả lời xong. Đây là số liệu của ngày 12/09, đã bị Mục 4.2.4 thay thế sau </w:t>
+            </w:r>
+            <w:r>
+              <w:lastRenderedPageBreak/>
+              <w:t>khi sửa nguyên nhân gốc thứ ba.</w:t>
             </w:r>
           </w:p>
         </w:tc>
@@ -31070,6 +31172,7 @@
               <w:spacing w:line="240" w:lineRule="auto"/>
             </w:pPr>
             <w:r>
+              <w:lastRenderedPageBreak/>
               <w:t>Mẫu đồng bộ ORB không phải mảnh còn thiếu của bộ giải mã</w:t>
             </w:r>
           </w:p>
@@ -31179,11 +31282,7 @@
               <w:spacing w:line="240" w:lineRule="auto"/>
             </w:pPr>
             <w:r>
-              <w:t xml:space="preserve">Đã kiểm chứng: trang chuyển sắc giữ được bằng chứng payload qua thu nhỏ 0.50; </w:t>
-            </w:r>
-            <w:r>
-              <w:lastRenderedPageBreak/>
-              <w:t>trang văn bản không ra gì kể cả khi không tấn công.</w:t>
+              <w:t>Đã kiểm chứng: trang chuyển sắc giữ được bằng chứng payload qua thu nhỏ 0.50; trang văn bản không ra gì kể cả khi không tấn công.</w:t>
             </w:r>
           </w:p>
         </w:tc>
@@ -31449,6 +31548,7 @@
               <w:spacing w:line="240" w:lineRule="auto"/>
             </w:pPr>
             <w:r>
+              <w:lastRenderedPageBreak/>
               <w:t>Vật mang kiểu blind_watermark đo kém hơn vật mang đang dùng ở mọi tỉ lệ</w:t>
             </w:r>
           </w:p>
@@ -31565,11 +31665,7 @@
               <w:t>research/python/src/splitbind_ref/fingerprint_v2_codec.py</w:t>
             </w:r>
             <w:r>
-              <w:t xml:space="preserve">; đặc tả </w:t>
-            </w:r>
-            <w:r>
-              <w:lastRenderedPageBreak/>
-              <w:t xml:space="preserve">mã ở </w:t>
+              <w:t xml:space="preserve">; đặc tả mã ở </w:t>
             </w:r>
             <w:r>
               <w:rPr>
@@ -31589,7 +31685,6 @@
               <w:spacing w:line="240" w:lineRule="auto"/>
             </w:pPr>
             <w:r>
-              <w:lastRenderedPageBreak/>
               <w:t>Đã kiểm chứng: tỉ lệ lỗi bit 0,000 đi kèm 21-24 ký hiệu bị khai xoá, vượt ngưỡng 16 mà mã chịu được.</w:t>
             </w:r>
           </w:p>
@@ -31800,6 +31895,7 @@
               <w:spacing w:line="240" w:lineRule="auto"/>
             </w:pPr>
             <w:r>
+              <w:lastRenderedPageBreak/>
               <w:t>Cấp phát ảnh: đầu vào PNG hoặc JPEG, nội dung đầu ra luôn là PNG, giữ nguyên kích thước gốc</w:t>
             </w:r>
           </w:p>
@@ -31891,11 +31987,7 @@
               <w:spacing w:line="240" w:lineRule="auto"/>
             </w:pPr>
             <w:r>
-              <w:t xml:space="preserve">Trên hệ thống thật, ảnh chụp màn hình thu nhỏ </w:t>
-            </w:r>
-            <w:r>
-              <w:lastRenderedPageBreak/>
-              <w:t>còn 0.469 kèm viền đen vẫn truy được nguồn, nếu bản cấp phát đúng khung chuẩn</w:t>
+              <w:t>Trên hệ thống thật, ảnh chụp màn hình thu nhỏ còn 0.469 kèm viền đen vẫn truy được nguồn, nếu bản cấp phát đúng khung chuẩn</w:t>
             </w:r>
           </w:p>
         </w:tc>
@@ -31912,7 +32004,6 @@
               <w:rPr>
                 <w:iCs/>
               </w:rPr>
-              <w:lastRenderedPageBreak/>
               <w:t>Số liệu đo thực nghiệm</w:t>
             </w:r>
             <w:r>
@@ -31922,14 +32013,7 @@
               <w:rPr>
                 <w:iCs/>
               </w:rPr>
-              <w:t xml:space="preserve">Đang </w:t>
-            </w:r>
-            <w:r>
-              <w:rPr>
-                <w:iCs/>
-              </w:rPr>
-              <w:lastRenderedPageBreak/>
-              <w:t>vận hành trên hệ thống thật</w:t>
+              <w:t>Đang vận hành trên hệ thống thật</w:t>
             </w:r>
           </w:p>
         </w:tc>
@@ -31943,12 +32027,7 @@
               <w:spacing w:line="240" w:lineRule="auto"/>
             </w:pPr>
             <w:r>
-              <w:lastRenderedPageBreak/>
-              <w:t xml:space="preserve">Phép so sánh có kiểm soát ngày 14/09/2026 qua </w:t>
-            </w:r>
-            <w:r>
-              <w:lastRenderedPageBreak/>
-              <w:t xml:space="preserve">đúng giao diện web; ảnh chụp màn hình ở </w:t>
+              <w:t xml:space="preserve">Phép so sánh có kiểm soát ngày 14/09/2026 qua đúng giao diện web; ảnh chụp màn hình ở </w:t>
             </w:r>
             <w:r>
               <w:rPr>
@@ -31971,12 +32050,7 @@
               <w:spacing w:line="240" w:lineRule="auto"/>
             </w:pPr>
             <w:r>
-              <w:lastRenderedPageBreak/>
-              <w:t xml:space="preserve">Đã kiểm chứng: cùng cách dựng ảnh chụp màn </w:t>
-            </w:r>
-            <w:r>
-              <w:lastRenderedPageBreak/>
-              <w:t>hình, bản cấp phát lệch khung chuẩn thì trượt còn bản đúng khung chuẩn thì chỉ đúng mã hồ sơ, dù tệp bị thu nhỏ mạnh hơn.</w:t>
+              <w:t>Đã kiểm chứng: cùng cách dựng ảnh chụp màn hình, bản cấp phát lệch khung chuẩn thì trượt còn bản đúng khung chuẩn thì chỉ đúng mã hồ sơ, dù tệp bị thu nhỏ mạnh hơn.</w:t>
             </w:r>
           </w:p>
         </w:tc>
@@ -32144,7 +32218,11 @@
               <w:t>contracts/algorithm/fingerprint-candidates.v2.json</w:t>
             </w:r>
             <w:r>
-              <w:t xml:space="preserve"> trên trang chữ thô ở khung chuẩn; bảng ở Mục 4.3.4</w:t>
+              <w:t xml:space="preserve"> trên trang chữ </w:t>
+            </w:r>
+            <w:r>
+              <w:lastRenderedPageBreak/>
+              <w:t>thô ở khung chuẩn; bảng ở Mục 4.3.4</w:t>
             </w:r>
           </w:p>
         </w:tc>
@@ -32158,7 +32236,12 @@
               <w:spacing w:line="240" w:lineRule="auto"/>
             </w:pPr>
             <w:r>
-              <w:t>Đã kiểm chứng: ứng viên số 0 là cái duy nhất trượt hoàn toàn, bảy ứng viên còn lại đều giải được trang chữ thô không bị tấn công.</w:t>
+              <w:lastRenderedPageBreak/>
+              <w:t xml:space="preserve">Đã kiểm chứng: ứng viên số 0 là cái duy nhất trượt hoàn toàn, bảy ứng viên còn lại đều giải được </w:t>
+            </w:r>
+            <w:r>
+              <w:lastRenderedPageBreak/>
+              <w:t>trang chữ thô không bị tấn công.</w:t>
             </w:r>
           </w:p>
         </w:tc>
@@ -32174,6 +32257,7 @@
               <w:spacing w:line="240" w:lineRule="auto"/>
             </w:pPr>
             <w:r>
+              <w:lastRenderedPageBreak/>
               <w:t>Trên trang chữ có nét mảnh, không cấu hình V2 nào sống sót qua nén JPEG 70</w:t>
             </w:r>
           </w:p>
@@ -32262,11 +32346,7 @@
               <w:spacing w:line="240" w:lineRule="auto"/>
             </w:pPr>
             <w:r>
-              <w:t xml:space="preserve">Một nửa lưới ứng viên V2 không </w:t>
-            </w:r>
-            <w:r>
-              <w:lastRenderedPageBreak/>
-              <w:t>dùng được trên khung chuẩn</w:t>
+              <w:t>Một nửa lưới ứng viên V2 không dùng được trên khung chuẩn</w:t>
             </w:r>
           </w:p>
         </w:tc>
@@ -32283,7 +32363,6 @@
               <w:rPr>
                 <w:iCs/>
               </w:rPr>
-              <w:lastRenderedPageBreak/>
               <w:t>Số liệu đo thực nghiệm</w:t>
             </w:r>
             <w:r>
@@ -32307,11 +32386,7 @@
               <w:spacing w:line="240" w:lineRule="auto"/>
             </w:pPr>
             <w:r>
-              <w:t xml:space="preserve">Tám ứng viên dùng ô 512 điểm ảnh; khung 1152 x </w:t>
-            </w:r>
-            <w:r>
-              <w:lastRenderedPageBreak/>
-              <w:t>2304 chỉ chứa 8 ô không chồng lấn mà hồ sơ đòi 18</w:t>
+              <w:t>Tám ứng viên dùng ô 512 điểm ảnh; khung 1152 x 2304 chỉ chứa 8 ô không chồng lấn mà hồ sơ đòi 18</w:t>
             </w:r>
           </w:p>
         </w:tc>
@@ -32325,12 +32400,7 @@
               <w:spacing w:line="240" w:lineRule="auto"/>
             </w:pPr>
             <w:r>
-              <w:lastRenderedPageBreak/>
-              <w:t xml:space="preserve">Đã kiểm chứng: khâu nhúng báo lỗi ngay, nên các </w:t>
-            </w:r>
-            <w:r>
-              <w:lastRenderedPageBreak/>
-              <w:t>ứng viên này chưa bao giờ chạy được.</w:t>
+              <w:t>Đã kiểm chứng: khâu nhúng báo lỗi ngay, nên các ứng viên này chưa bao giờ chạy được.</w:t>
             </w:r>
           </w:p>
         </w:tc>
@@ -32534,6 +32604,7 @@
               <w:spacing w:line="240" w:lineRule="auto"/>
             </w:pPr>
             <w:r>
+              <w:lastRenderedPageBreak/>
               <w:t>Đuôi tệp cấp phát suy từ kiểu nội dung của tài liệu nguồn, ở cả ba nơi quyết định</w:t>
             </w:r>
           </w:p>
@@ -35100,8 +35171,8 @@
   <w:rsids>
     <w:rsidRoot w:val="001F3D7D"/>
     <w:rsid w:val="001F3D7D"/>
-    <w:rsid w:val="00AB1E69"/>
     <w:rsid w:val="00C24EF1"/>
+    <w:rsid w:val="00FC79FC"/>
   </w:rsids>
   <m:mathPr>
     <m:mathFont m:val="Cambria Math"/>

</xml_diff>